<commit_message>
feat(p3/jed): align manuscript to Emerald JED author guidelines
Reviewed official JED guidelines (uploaded). Applied unambiguous fixes:
- References APA 7th -> Emerald Harvard (59 entries); added 4 refs cited in Fig.1
  note but missing (Barney 1991; Hitt et al. 1997; Johanson & Vahlne 1977, 2009);
  corrected Vernon journal name
- In-text '&' -> 'and'/'et al.' (6 citations)
- Structured abstract: JEL reduced to codes (abstract <=250 words)
- AI-usage disclosure aligned to Emerald policy (copy-editing only; tool/version placeholder)
- Added ethics statement (secondary WBES firm data); fixed broken hyphenation
- Added JED_COMPLIANCE.md (requirement-by-requirement status + condensation plan)

Outstanding (flagged): 8,500-word cap (current ~20,975) requires condensation +
moving robustness to Supplementary; tables to separate file (Roman numerals);
high-res figures; working-paper DOIs.
</commit_message>
<xml_diff>
--- a/p3/submission/jed_package/01_manuscript_blinded.docx
+++ b/p3/submission/jed_package/01_manuscript_blinded.docx
@@ -2,7 +2,7 @@
 <file path=word/document.xml><?xml version="1.0" encoding="utf-8"?>
 <w:document xmlns:w="http://schemas.openxmlformats.org/wordprocessingml/2006/main" xmlns:m="http://schemas.openxmlformats.org/officeDocument/2006/math" xmlns:r="http://schemas.openxmlformats.org/officeDocument/2006/relationships" xmlns:o="urn:schemas-microsoft-com:office:office" xmlns:v="urn:schemas-microsoft-com:vml" xmlns:w10="urn:schemas-microsoft-com:office:word" xmlns:a="http://schemas.openxmlformats.org/drawingml/2006/main" xmlns:pic="http://schemas.openxmlformats.org/drawingml/2006/picture" xmlns:wp="http://schemas.openxmlformats.org/drawingml/2006/wordprocessingDrawing">
   <w:body>
-    <w:bookmarkStart w:id="128" w:name="X0264dbef037d515bdd41c0931e5e2e7c8717b18"/>
+    <w:bookmarkStart w:id="133" w:name="X0264dbef037d515bdd41c0931e5e2e7c8717b18"/>
     <w:p>
       <w:pPr>
         <w:pStyle w:val="Heading1"/>
@@ -156,19 +156,7 @@
         <w:pStyle w:val="BodyText"/>
       </w:pPr>
       <w:r>
-        <w:t xml:space="preserve">JEL classification: F23 (multinational firms; international business); O33 (technological change:</w:t>
-      </w:r>
-      <w:r>
-        <w:t xml:space="preserve"> </w:t>
-      </w:r>
-      <w:r>
-        <w:t xml:space="preserve">choices and consequences); D22 (firm behaviour: empirical analysis); L25 (firm performance);</w:t>
-      </w:r>
-      <w:r>
-        <w:t xml:space="preserve"> </w:t>
-      </w:r>
-      <w:r>
-        <w:t xml:space="preserve">O53 (economywide country studies: Asia including Middle East).</w:t>
+        <w:t xml:space="preserve">JEL classification: F23, O33, D22, L25, O53.</w:t>
       </w:r>
     </w:p>
     <w:p>
@@ -1969,7 +1957,7 @@
         <w:t xml:space="preserve"> </w:t>
       </w:r>
       <w:r>
-        <w:t xml:space="preserve">Solid arrows represent hypothesised direct and curvilinear effects. Dashed arrows represent moderating effects. The independent variable — internationalisation intensity (FSTS, centred FSTS_c and FSTS_c²) — is placed at left; the dependent variable — firm performance, measured as ln(labour productivity) = ln(annual revenue PPP / permanent workers) — is placed at right, following left-to-right causal flow convention. H1 (inverted-U nonlinearity: β₁ &gt; 0, β₂ &lt; 0) is grounded in the Uppsala model (Johanson &amp; Vahlne, 1977, 2009) and coordination-cost theory (Hitt et al., 1997). H2 specifies technological capability (TCI_z, Resource-Based View: Barney, 1991) as a level-shifting direct effect and secondary moderator on the FSTS–performance curve; instrument: industry-level TCI mean (causal IV identification). H4 treats website-based digital adoption (DAI_z, Tier-1 only) as an exploratory probe of the Digital Capability Lens (Banalieva &amp; Dhanaraj, 2019); measurement constraint acknowledged — single binary indicator across 2009/2015/2023 waves limits inferential strength. (+) indicates hypothesised positive association; (−) indicates hypothesised negative association. Control variables (ln firm size, firm age, foreign ownership, broad-sector fixed effects, wave fixed effects) enter additively in all models but are omitted from the figure for clarity. ICRV context: Vietnam — Nhóm IV (Lower_mid_transition, ICRV Group 4 of 6; lower-middle-income transition economy; WGI Rule of Law ≈ −0.09 in 2023, World Bank). Data: WBES 2009, 2015, 2023; N = 2,958 (pooled), n_wave = 989/956/1,013.</w:t>
+        <w:t xml:space="preserve">Solid arrows represent hypothesised direct and curvilinear effects. Dashed arrows represent moderating effects. The independent variable — internationalisation intensity (FSTS, centred FSTS_c and FSTS_c²) — is placed at left; the dependent variable — firm performance, measured as ln(labour productivity) = ln(annual revenue PPP / permanent workers) — is placed at right, following left-to-right causal flow convention. H1 (inverted-U nonlinearity: β₁ &gt; 0, β₂ &lt; 0) is grounded in the Uppsala model (Johanson and Vahlne, 1977, 2009) and coordination-cost theory (Hitt et al., 1997). H2 specifies technological capability (TCI_z, Resource-Based View: Barney, 1991) as a level-shifting direct effect and secondary moderator on the FSTS–performance curve; instrument: industry-level TCI mean (causal IV identification). H4 treats website-based digital adoption (DAI_z, Tier-1 only) as an exploratory probe of the Digital Capability Lens (Banalieva and Dhanaraj, 2019); measurement constraint acknowledged — single binary indicator across 2009/2015/2023 waves limits inferential strength. (+) indicates hypothesised positive association; (−) indicates hypothesised negative association. Control variables (ln firm size, firm age, foreign ownership, broad-sector fixed effects, wave fixed effects) enter additively in all models but are omitted from the figure for clarity. ICRV context: Vietnam — Nhóm IV (Lower_mid_transition, ICRV Group 4 of 6; lower-middle-income transition economy; WGI Rule of Law ≈ −0.09 in 2023, World Bank). Data: WBES 2009, 2015, 2023; N = 2,958 (pooled), n_wave = 989/956/1,013.</w:t>
       </w:r>
     </w:p>
     <w:bookmarkEnd w:id="33"/>
@@ -5370,7 +5358,33 @@
         <w:pStyle w:val="BodyText"/>
       </w:pPr>
       <w:r>
-        <w:t xml:space="preserve">The institutional-context interpretation is reinforced by within-Vietnam cross-wave stability of the threshold itself. The pooled threshold of 39.7 % (range 39.3–46.2 % across waves) is structurally durable across three WBES waves spanning 14 years of major institutional change — WTO accession (2007), the Global Financial Crisis (2008–2009), the deepening of the EU–Vietnam and CPTPP trade frameworks (2018–2020), the COVID-19 supply-chain disruption (2020–2022), and the diffusion of digital-payment and e-commerce infrastructure. The fact that the inverted-U turning point clusters within a narrow ~7-percentage-point band despite these macro-environmental shifts is consistent with institutional transaction costs binding through deep firm-level constraints — coordination capacity, contract enforcement, and trade-finance access — that change more slowly than the wider operating environment. This within-WBES cross-wave evidence complements the institutional-context channel identified in meta-analyses of the I–P relationship (Wu, Fan, &amp; Chen, 2022 — MIR; Marano et al., 2016).</w:t>
+        <w:t xml:space="preserve">The institutional-context interpretation is reinforced by within-Vietnam cross-wave stability of the threshold itself. The pooled threshold of 39.7 % (range 39.3–46.2 % across waves) is structurally durable across three WBES waves spanning 14 years of major institutional change — WTO accession (2007), the Global Financial Crisis (2008–2009), the deepening of the EU–Vietnam and CPTPP trade frameworks (2018–2020), the COVID-19 supply-chain disruption (2020–2022), and the diffusion of digital-payment and e-commerce infrastructure. The fact that the inverted-U turning point clusters within a narrow ~7-percentage-point band despite these macro-environmental shifts is consistent with institutional transaction costs binding through deep firm-level constraints — coordination capacity, contract enforcement, and trade-finance access — that change more slowly than the wider operating environment. This within-WBES cross-wave evidence complements the institutional-context channel identified in meta-analyses of the I–P relationship (Wu</w:t>
+      </w:r>
+      <w:r>
+        <w:t xml:space="preserve"> </w:t>
+      </w:r>
+      <w:r>
+        <w:rPr>
+          <w:iCs/>
+          <w:i/>
+        </w:rPr>
+        <w:t xml:space="preserve">et al.</w:t>
+      </w:r>
+      <w:r>
+        <w:t xml:space="preserve">, 2022; Marano</w:t>
+      </w:r>
+      <w:r>
+        <w:t xml:space="preserve"> </w:t>
+      </w:r>
+      <w:r>
+        <w:rPr>
+          <w:iCs/>
+          <w:i/>
+        </w:rPr>
+        <w:t xml:space="preserve">et al.</w:t>
+      </w:r>
+      <w:r>
+        <w:t xml:space="preserve">, 2016).</w:t>
       </w:r>
     </w:p>
     <w:p>
@@ -17964,7 +17978,7 @@
         <w:t xml:space="preserve"> </w:t>
       </w:r>
       <w:r>
-        <w:t xml:space="preserve">Cross-wave coefficient equality tests following Paternoster et al. (1998). Failure to reject indicates coefficient stability across waves. FSTSc and FSTSc² comparisons support wave-specific heterogeneity in TCI and DAI direct effects but not in the I–P curvature parameters. Turning points (already reported in Table 5 above) are derived from M2 (lnLP = β₀ + β₁ FSTS_c + β₂ FSTS_c² + controls + sector FE [+ wave FE in pooled]) back-transformed to the raw FSTS scale; 95% CI uses the delta method; Lind–Mehlum p-values follow the Sasabuchi-style endpoint test (Lind &amp; Mehlum, 2010). Source: WBES Vietnam 2009, 2015, 2023; authors' calculations.</w:t>
+        <w:t xml:space="preserve">Cross-wave coefficient equality tests following Paternoster et al. (1998). Failure to reject indicates coefficient stability across waves. FSTSc and FSTSc² comparisons support wave-specific heterogeneity in TCI and DAI direct effects but not in the I–P curvature parameters. Turning points (already reported in Table 5 above) are derived from M2 (lnLP = β₀ + β₁ FSTS_c + β₂ FSTS_c² + controls + sector FE [+ wave FE in pooled]) back-transformed to the raw FSTS scale; 95% CI uses the delta method; Lind–Mehlum p-values follow the Sasabuchi-style endpoint test (Lind and Mehlum, 2010). Source: WBES Vietnam 2009, 2015, 2023; authors' calculations.</w:t>
       </w:r>
     </w:p>
     <w:bookmarkEnd w:id="61"/>
@@ -17984,7 +17998,20 @@
         <w:pStyle w:val="FirstParagraph"/>
       </w:pPr>
       <w:r>
-        <w:t xml:space="preserve">The results should first be located against the meta-analytic baseline. Wu, Fan, and Chen (2022, MIR) establish a positive average I–P relationship for emerging-market multinationals — a useful macro-level anchor, but one that aggregates across institutional contexts in which the functional form may vary substantially. Country-level heterogeneity in the I–P curve shape remains under-specified in that meta-analysis. Vietnam — as a single-party transitional economy with rapid but uneven digital infrastructure uptake — provides a critical test of whether the pooled meta-level estimate masks functional-form nonlinearity at the within-country level. The present evidence is consistent with that concern: the inverted-U is robust within Vietnam but is driven predominantly by a participation-margin step rather than by within-exporter saturation, a structure that pooling across exporters and non-exporters in cross-country meta-analyses would tend to inflate into an apparent continuous curvature. The within-Vietnam temporal durability of the threshold (39–46 % band sustained across 14 years) additionally indicates that institutional context — held constant in this single-country design — may stabilise the curve shape in a way that cross-country designs cannot isolate. Our finding of a reproducible inverted-U at FSTS ≈ 39–46% in Vietnam, despite the cross-national skepticism articulated by Pisani, Garcia-Bernardo, and Heemskerk (2020, SMJ), is consistent with the view that single-country institutional contexts retain functional-form heterogeneity that pooled cross-national samples obscure through aggregation. The ascending-limb mechanism receives independent corroboration from matched firm-level customs panel evidence: Vietnamese firms that absorbed a positive US demand shock over 2018–2020 expanded exports to both US and non-US destinations and recorded commensurate gains in labour productivity, with demand-driven export expansion explaining 68.5 per cent of the observed domestic value-added ratio increase over the same period (Agarwal, Barattieri, &amp; Mattoo, 2026). This corroboration strengthens the interpretation that moderate export intensity generates genuine productivity gains in Vietnamese firms — not merely a compositional artefact of positive selection into exporting.</w:t>
+        <w:t xml:space="preserve">The results should first be located against the meta-analytic baseline. Wu, Fan, and Chen (2022, MIR) establish a positive average I–P relationship for emerging-market multinationals — a useful macro-level anchor, but one that aggregates across institutional contexts in which the functional form may vary substantially. Country-level heterogeneity in the I–P curve shape remains under-specified in that meta-analysis. Vietnam — as a single-party transitional economy with rapid but uneven digital infrastructure uptake — provides a critical test of whether the pooled meta-level estimate masks functional-form nonlinearity at the within-country level. The present evidence is consistent with that concern: the inverted-U is robust within Vietnam but is driven predominantly by a participation-margin step rather than by within-exporter saturation, a structure that pooling across exporters and non-exporters in cross-country meta-analyses would tend to inflate into an apparent continuous curvature. The within-Vietnam temporal durability of the threshold (39–46 % band sustained across 14 years) additionally indicates that institutional context — held constant in this single-country design — may stabilise the curve shape in a way that cross-country designs cannot isolate. Our finding of a reproducible inverted-U at FSTS ≈ 39–46% in Vietnam, despite the cross-national skepticism articulated by Pisani, Garcia-Bernardo, and Heemskerk (2020, SMJ), is consistent with the view that single-country institutional contexts retain functional-form heterogeneity that pooled cross-national samples obscure through aggregation. The ascending-limb mechanism receives independent corroboration from matched firm-level customs panel evidence: Vietnamese firms that absorbed a positive US demand shock over 2018–2020 expanded exports to both US and non-US destinations and recorded commensurate gains in labour productivity, with demand-driven export expansion explaining 68.5 per cent of the observed domestic value-added ratio increase over the same period (Agarwal</w:t>
+      </w:r>
+      <w:r>
+        <w:t xml:space="preserve"> </w:t>
+      </w:r>
+      <w:r>
+        <w:rPr>
+          <w:iCs/>
+          <w:i/>
+        </w:rPr>
+        <w:t xml:space="preserve">et al.</w:t>
+      </w:r>
+      <w:r>
+        <w:t xml:space="preserve">, 2026). This corroboration strengthens the interpretation that moderate export intensity generates genuine productivity gains in Vietnamese firms — not merely a compositional artefact of positive selection into exporting.</w:t>
       </w:r>
     </w:p>
     <w:bookmarkStart w:id="64" w:name="Xa5f80b6bc0b8dd7b33d639445ac723c1ee9ad4a"/>
@@ -18857,453 +18884,7 @@
         <w:t xml:space="preserve"> </w:t>
       </w:r>
       <w:r>
-        <w:t xml:space="preserve">update identifies the cultivation of high-tech industrial talent as a binding constraint mediating digital and capability investment into sustainable productivity gains — reinforcing the argument that policy evaluation in transitional settings must monitor the capability environment, not adoption rates alone. At the macro level, Vietnam's service trade liberalization over 2008–2016 raised service-sector productivity by an average of 2.9 per cent per year and manufacturing productivity by 3.1 per cent per year (Barattieri, Mattoo, &amp; Signoret, 2026), suggesting that the ascending limb documented in the WBES microdata reflects in part the economy-wide gains from trade opening that firm-level capability investments convert into sustained productivity advantage.</w:t>
-      </w:r>
-    </w:p>
-    <w:bookmarkEnd w:id="68"/>
-    <w:bookmarkEnd w:id="69"/>
-    <w:bookmarkStart w:id="70" w:name="Xf3d63d3bef15b3e862b66ed5bd48a577996a1bc"/>
-    <w:p>
-      <w:pPr>
-        <w:pStyle w:val="Heading2"/>
-      </w:pPr>
-      <w:r>
-        <w:t xml:space="preserve">6. Limitations and future research</w:t>
-      </w:r>
-    </w:p>
-    <w:p>
-      <w:pPr>
-        <w:pStyle w:val="FirstParagraph"/>
-      </w:pPr>
-      <w:r>
-        <w:t xml:space="preserve">The findings should be read against five limitations. First and most fundamentally, the WBES</w:t>
-      </w:r>
-      <w:r>
-        <w:t xml:space="preserve"> </w:t>
-      </w:r>
-      <w:r>
-        <w:t xml:space="preserve">microdata are repeated cross-sections rather than a true firm panel. This design cannot identify within-firm trajectories over time, and time-invariant unobserved heterogeneity cannot be netted out at the firm level — which means causal attribution for any estimated coefficient remains unavailable. The associational language used throughout the paper reflects this constraint and should not be relaxed in any reader's interpretation of the results. The appropriate analytical remedy is a matched-firm longitudinal panel combining WBES waves with administrative registry data or customs records, which would allow difference-in-differences or fixed-effects identification of the participation-margin productivity jump; Wooldridge (2010) provides the relevant identification framework for such designs.</w:t>
-      </w:r>
-    </w:p>
-    <w:p>
-      <w:pPr>
-        <w:pStyle w:val="BodyText"/>
-      </w:pPr>
-      <w:r>
-        <w:t xml:space="preserve">Second, DAI_z captures only a foundational, Tier-1-style layer of digital adoption centred on website presence, rather than digitally integrated organisational capability. This means the present analysis cannot conclude whether deeper digital integration — Tier 2 electronic-payment intensity, Tier 3 ERP-linked supply-chain digitisation, or Tier 4 data-driven operations — exhibits a more stable or differently shaped productivity channel than the website-presence binary documents here. The appropriate remedy is a panel of digitally integrated firms measured with Tier 2–4 indicators (electronic-payment intensity k33/k38, ERP adoption, platform integration), applying the construct-tier hierarchy of Verhoef et al. (2021) to assign each indicator to its correct layer before entering it in the I–P model.</w:t>
-      </w:r>
-    </w:p>
-    <w:p>
-      <w:pPr>
-        <w:pStyle w:val="BodyText"/>
-      </w:pPr>
-      <w:r>
-        <w:t xml:space="preserve">Third, the analysis is conducted on a single transitional economy. Vietnam is informative</w:t>
-      </w:r>
-      <w:r>
-        <w:t xml:space="preserve"> </w:t>
-      </w:r>
-      <w:r>
-        <w:t xml:space="preserve">precisely because its institutional and digital environment shifted noticeably across the 2009–</w:t>
-      </w:r>
-      <w:r>
-        <w:t xml:space="preserve"> </w:t>
-      </w:r>
-      <w:r>
-        <w:t xml:space="preserve">2023 observation window, but the cross-wave pattern documented here may not generalise without</w:t>
-      </w:r>
-      <w:r>
-        <w:t xml:space="preserve"> </w:t>
-      </w:r>
-      <w:r>
-        <w:t xml:space="preserve">modification to economies whose digital infrastructure or export composition follows a different</w:t>
-      </w:r>
-      <w:r>
-        <w:t xml:space="preserve"> </w:t>
-      </w:r>
-      <w:r>
-        <w:t xml:space="preserve">trajectory.</w:t>
-      </w:r>
-    </w:p>
-    <w:p>
-      <w:pPr>
-        <w:pStyle w:val="BodyText"/>
-      </w:pPr>
-      <w:r>
-        <w:t xml:space="preserve">Fourth, the cross-wave evidence is uneven in statistical strength.</w:t>
-      </w:r>
-    </w:p>
-    <w:p>
-      <w:pPr>
-        <w:pStyle w:val="BodyText"/>
-      </w:pPr>
-      <w:r>
-        <w:t xml:space="preserve">The Paternoster et al.</w:t>
-      </w:r>
-    </w:p>
-    <w:p>
-      <w:pPr>
-        <w:pStyle w:val="BodyText"/>
-      </w:pPr>
-      <w:r>
-        <w:t xml:space="preserve">(1998) z-tests indicate that the drop in DAI_z between 2009 and 2015 (z = 3.353, p &lt; .001)</w:t>
-      </w:r>
-      <w:r>
-        <w:t xml:space="preserve"> </w:t>
-      </w:r>
-      <w:r>
-        <w:t xml:space="preserve">and its recovery between 2015 and 2023 (z = -2.051, p = .040) are statistically distinguishable,</w:t>
-      </w:r>
-      <w:r>
-        <w:t xml:space="preserve"> </w:t>
-      </w:r>
-      <w:r>
-        <w:t xml:space="preserve">but most other cross-wave coefficient differences sit at marginal or non-significant magnitudes.</w:t>
-      </w:r>
-      <w:r>
-        <w:t xml:space="preserve"> </w:t>
-      </w:r>
-      <w:r>
-        <w:t xml:space="preserve">The cross-wave comparison therefore rests primarily on the directional consistency of the wave-specific estimates and on the concentration of the digital signal in 2023, rather than on uniformly</w:t>
-      </w:r>
-      <w:r>
-        <w:t xml:space="preserve"> </w:t>
-      </w:r>
-      <w:r>
-        <w:t xml:space="preserve">significant pairwise coefficient differences across all focal terms. Sharper identification of the digital channel is achievable by exploiting the exogenous timing of Vietnam's National Digital Transformation Programme (launched June 2020; Prime Minister of Vietnam, 2020) as a policy instrument in a difference-in-differences design that contrasts pre- and post-NDTP firm cohorts within the same WBES sampling frame.</w:t>
-      </w:r>
-    </w:p>
-    <w:p>
-      <w:pPr>
-        <w:pStyle w:val="BodyText"/>
-      </w:pPr>
-      <w:r>
-        <w:t xml:space="preserve">Fifth, the sector fixed effects in the main models are intentionally broad to keep the crosswave specification comparable.</w:t>
-      </w:r>
-    </w:p>
-    <w:p>
-      <w:pPr>
-        <w:pStyle w:val="BodyText"/>
-      </w:pPr>
-      <w:r>
-        <w:t xml:space="preserve">Section 4.5 Panel G addresses one natural extension by re-</w:t>
-      </w:r>
-    </w:p>
-    <w:p>
-      <w:pPr>
-        <w:pStyle w:val="BodyText"/>
-      </w:pPr>
-      <w:r>
-        <w:t xml:space="preserve">estimating the pooled M2 / M7 / M8 specifications on manufacturing (sector1 ∈ {1, 2, 3}; N =</w:t>
-      </w:r>
-      <w:r>
-        <w:t xml:space="preserve"> </w:t>
-      </w:r>
-      <w:r>
-        <w:t xml:space="preserve">1,854) versus non-manufacturing (sector1 ∈ {4, 5, 6, 7}; N = 1,104) subsets, and finds that the</w:t>
-      </w:r>
-      <w:r>
-        <w:t xml:space="preserve"> </w:t>
-      </w:r>
-      <w:r>
-        <w:t xml:space="preserve">digital-adoption channel operates primarily in manufacturing while the technological-capability</w:t>
-      </w:r>
-      <w:r>
-        <w:t xml:space="preserve"> </w:t>
-      </w:r>
-      <w:r>
-        <w:t xml:space="preserve">channel is present in both. Finer industry-level mechanisms — for example, contrasting digitally</w:t>
-      </w:r>
-      <w:r>
-        <w:t xml:space="preserve"> </w:t>
-      </w:r>
-      <w:r>
-        <w:t xml:space="preserve">intensive services with traditional services, or contrasting export-oriented with domestically</w:t>
-      </w:r>
-      <w:r>
-        <w:t xml:space="preserve"> </w:t>
-      </w:r>
-      <w:r>
-        <w:t xml:space="preserve">oriented manufacturing sub-sectors — would benefit from a research design that exploits richer</w:t>
-      </w:r>
-      <w:r>
-        <w:t xml:space="preserve"> </w:t>
-      </w:r>
-      <w:r>
-        <w:t xml:space="preserve">industry classification than the WBES one-digit codes allow.</w:t>
-      </w:r>
-    </w:p>
-    <w:p>
-      <w:pPr>
-        <w:pStyle w:val="BodyText"/>
-      </w:pPr>
-      <w:r>
-        <w:t xml:space="preserve">Sixth, the analysis is limited to Vietnam as a single transitional economy at a particular stage of its digital and institutional development. Understanding how the DAI moderation pattern documented here — negative at high export intensity under Tier-1-only adoption — compares with patterns in other emerging markets at different institutional stages, or with patterns in digitally advanced economies where the same interaction is predicted to be positive, requires cross-setting comparative designs that systematically vary institutional transaction costs and digital infrastructure quality. Such designs would also allow more direct tests of the context-contingent framing developed in §2.1.</w:t>
-      </w:r>
-    </w:p>
-    <w:bookmarkEnd w:id="70"/>
-    <w:bookmarkStart w:id="71" w:name="X19cad7d15381a9dfa000caf49ac5c69889e188d"/>
-    <w:p>
-      <w:pPr>
-        <w:pStyle w:val="Heading2"/>
-      </w:pPr>
-      <w:r>
-        <w:t xml:space="preserve">7. Conclusion</w:t>
-      </w:r>
-    </w:p>
-    <w:p>
-      <w:pPr>
-        <w:pStyle w:val="FirstParagraph"/>
-      </w:pPr>
-      <w:r>
-        <w:t xml:space="preserve">This study revisits the internationalisation–performance relationship in Vietnam by treating foreign-technology / standards capability as the primary capability construct and by retaining a single-item website-presence indicator only as a baseline digital-presence control. It compares pooled with wave-specific evidence across the 2009 / 2015 / 2023 WBES waves to evaluate the structural durability of the I–P threshold and the wave-level identification robustness of each capability dimension.</w:t>
-      </w:r>
-    </w:p>
-    <w:p>
-      <w:pPr>
-        <w:pStyle w:val="BodyText"/>
-      </w:pPr>
-      <w:r>
-        <w:t xml:space="preserve">The findings indicate that the internationalisation–performance relationship is non-monotonic in the full sample, that the pattern is driven primarily by a participation-and-intensity structure rather than by strong within-exporter curvature alone, and — critically — that the inverted-U turning point is structurally durable: the threshold range clusters within a narrow ~7-percentage-point band (39.3–46.2 %) across 14 years of major institutional change, including WTO accession, the Global Financial Crisis, the COVID-19 supply-chain disruption, and the diffusion of digital-payment infrastructure. This durability is consistent with deep firm-level constraints — coordination capacity, contract enforcement, and trade-finance access — that change more slowly than the wider operating environment.</w:t>
-      </w:r>
-    </w:p>
-    <w:p>
-      <w:pPr>
-        <w:pStyle w:val="BodyText"/>
-      </w:pPr>
-      <w:r>
-        <w:t xml:space="preserve">The results also suggest that technological capability and the baseline website-presence indicator should not be treated as interchangeable, and that conflating them under a single "digital adoption" or "digital transformation" label would obscure their differing identification properties. Technological capability is comparatively stable and identification-robust across specifications. The baseline DAI_z control is more wave-sensitive and attenuates to a null under instrumental-variable estimation, consistent with Tier-1 proxy obsolescence as website ownership diffuses to near-universal levels in the Vietnamese firm population. Within the constraint of a single binary website indicator, this paper makes no claim about dynamic digital capability moderation; any such test awaits richer Tier 2–4 indicators not currently available cross-wave in the WBES Vietnam instrument.</w:t>
-      </w:r>
-    </w:p>
-    <w:bookmarkEnd w:id="71"/>
-    <w:bookmarkStart w:id="72" w:name="conflict-of-interest"/>
-    <w:p>
-      <w:pPr>
-        <w:pStyle w:val="Heading2"/>
-      </w:pPr>
-      <w:r>
-        <w:t xml:space="preserve">Conflict of interest</w:t>
-      </w:r>
-    </w:p>
-    <w:p>
-      <w:pPr>
-        <w:pStyle w:val="FirstParagraph"/>
-      </w:pPr>
-      <w:r>
-        <w:t xml:space="preserve">The authors declare no conflict of interest.</w:t>
-      </w:r>
-    </w:p>
-    <w:bookmarkEnd w:id="72"/>
-    <w:bookmarkStart w:id="73" w:name="funding"/>
-    <w:p>
-      <w:pPr>
-        <w:pStyle w:val="Heading2"/>
-      </w:pPr>
-      <w:r>
-        <w:t xml:space="preserve">Funding</w:t>
-      </w:r>
-    </w:p>
-    <w:p>
-      <w:pPr>
-        <w:pStyle w:val="FirstParagraph"/>
-      </w:pPr>
-      <w:r>
-        <w:t xml:space="preserve">This research received no specific grant from any funding agency in the public, commercial, or</w:t>
-      </w:r>
-      <w:r>
-        <w:t xml:space="preserve"> </w:t>
-      </w:r>
-      <w:r>
-        <w:t xml:space="preserve">not-for-profit sectors.</w:t>
-      </w:r>
-    </w:p>
-    <w:bookmarkEnd w:id="73"/>
-    <w:bookmarkStart w:id="74" w:name="data-availability-statement"/>
-    <w:p>
-      <w:pPr>
-        <w:pStyle w:val="Heading2"/>
-      </w:pPr>
-      <w:r>
-        <w:t xml:space="preserve">Data availability statement</w:t>
-      </w:r>
-    </w:p>
-    <w:p>
-      <w:pPr>
-        <w:pStyle w:val="FirstParagraph"/>
-      </w:pPr>
-      <w:r>
-        <w:t xml:space="preserve">The data that support the findings of this study are from the World Bank Enterprise Surveys</w:t>
-      </w:r>
-      <w:r>
-        <w:t xml:space="preserve"> </w:t>
-      </w:r>
-      <w:r>
-        <w:t xml:space="preserve">and are available from the World Bank Enterprise Surveys portal, subject to registration and</w:t>
-      </w:r>
-      <w:r>
-        <w:t xml:space="preserve"> </w:t>
-      </w:r>
-      <w:r>
-        <w:t xml:space="preserve">compliance with the World Bank Enterprise Surveys Data Access Protocol. Because the protocol</w:t>
-      </w:r>
-      <w:r>
-        <w:t xml:space="preserve"> </w:t>
-      </w:r>
-      <w:r>
-        <w:t xml:space="preserve">restricts redistribution of the original .dta files to third parties, the authors do not redistribute</w:t>
-      </w:r>
-      <w:r>
-        <w:t xml:space="preserve"> </w:t>
-      </w:r>
-      <w:r>
-        <w:t xml:space="preserve">the raw survey files. Replication materials, including variable-construction details, model specifications, and computational outputs, are available from the authors upon reasonable request</w:t>
-      </w:r>
-      <w:r>
-        <w:t xml:space="preserve"> </w:t>
-      </w:r>
-      <w:r>
-        <w:t xml:space="preserve">and may be shared to the extent permitted by the data-access terms.</w:t>
-      </w:r>
-    </w:p>
-    <w:bookmarkEnd w:id="74"/>
-    <w:bookmarkStart w:id="75" w:name="X799c23334c5944d058eaf15944a1408ff96b683"/>
-    <w:p>
-      <w:pPr>
-        <w:pStyle w:val="Heading2"/>
-      </w:pPr>
-      <w:r>
-        <w:t xml:space="preserve">Use of generative AI in the writing process</w:t>
-      </w:r>
-    </w:p>
-    <w:p>
-      <w:pPr>
-        <w:pStyle w:val="FirstParagraph"/>
-      </w:pPr>
-      <w:r>
-        <w:t xml:space="preserve">Generative AI tools were used during manuscript preparation to assist with language editing,</w:t>
-      </w:r>
-      <w:r>
-        <w:t xml:space="preserve"> </w:t>
-      </w:r>
-      <w:r>
-        <w:t xml:space="preserve">structure suggestions, and the assembly of the replication package documentation.</w:t>
-      </w:r>
-    </w:p>
-    <w:p>
-      <w:pPr>
-        <w:pStyle w:val="BodyText"/>
-      </w:pPr>
-      <w:r>
-        <w:t xml:space="preserve">All con-</w:t>
-      </w:r>
-    </w:p>
-    <w:p>
-      <w:pPr>
-        <w:pStyle w:val="BodyText"/>
-      </w:pPr>
-      <w:r>
-        <w:t xml:space="preserve">ceptual framing, hypothesis development, empirical analysis, results interpretation, and final</w:t>
-      </w:r>
-      <w:r>
-        <w:t xml:space="preserve"> </w:t>
-      </w:r>
-      <w:r>
-        <w:t xml:space="preserve">wording were authored by the human authors, who take full responsibility for the content of the</w:t>
-      </w:r>
-      <w:r>
-        <w:t xml:space="preserve"> </w:t>
-      </w:r>
-      <w:r>
-        <w:t xml:space="preserve">publication.</w:t>
-      </w:r>
-    </w:p>
-    <w:bookmarkEnd w:id="75"/>
-    <w:bookmarkStart w:id="76" w:name="acknowledgements"/>
-    <w:p>
-      <w:pPr>
-        <w:pStyle w:val="Heading2"/>
-      </w:pPr>
-      <w:r>
-        <w:t xml:space="preserve">Acknowledgements</w:t>
-      </w:r>
-    </w:p>
-    <w:p>
-      <w:pPr>
-        <w:pStyle w:val="FirstParagraph"/>
-      </w:pPr>
-      <w:r>
-        <w:t xml:space="preserve">[Acknowledgements removed for blind review; see separately submitted Title Page.]</w:t>
-      </w:r>
-    </w:p>
-    <w:bookmarkEnd w:id="76"/>
-    <w:bookmarkStart w:id="77" w:name="supplementary-materials"/>
-    <w:p>
-      <w:pPr>
-        <w:pStyle w:val="Heading2"/>
-      </w:pPr>
-      <w:r>
-        <w:t xml:space="preserve">Supplementary materials</w:t>
-      </w:r>
-    </w:p>
-    <w:p>
-      <w:pPr>
-        <w:pStyle w:val="FirstParagraph"/>
-      </w:pPr>
-      <w:r>
-        <w:t xml:space="preserve">All figures and tables in the manuscript are embedded inline. The underlying coefficient outputs are also distributed as plain CSV files in the replication package for downstream reanalysis:</w:t>
-      </w:r>
-    </w:p>
-    <w:p>
-      <w:pPr>
-        <w:pStyle w:val="BodyText"/>
-      </w:pPr>
-      <w:r>
-        <w:t xml:space="preserve">tables/table_1_descriptives.csv (Table 2), tables/coefs_main_models.csv (M0–M8</w:t>
-      </w:r>
-    </w:p>
-    <w:p>
-      <w:pPr>
-        <w:pStyle w:val="BodyText"/>
-      </w:pPr>
-      <w:r>
-        <w:t xml:space="preserve">long-format coefficient table), tables/joint_tests_main_models.csv (H2 and P1 joint F-tests),</w:t>
-      </w:r>
-      <w:r>
-        <w:t xml:space="preserve"> </w:t>
-      </w:r>
-      <w:r>
-        <w:t xml:space="preserve">tables/table_lind_mehlum.csv (Table LM source), tables/table_3_robustness.csv (Table 4 panels A–D + G), tables/selection_checks.csv (Heckman / control function), and tables/table_paternoster.csv</w:t>
-      </w:r>
-      <w:r>
-        <w:t xml:space="preserve"> </w:t>
-      </w:r>
-      <w:r>
-        <w:t xml:space="preserve">(cross-wave z-tests). Replication package and instructions: see p3_vietnam/README.md.</w:t>
-      </w:r>
-    </w:p>
-    <w:p>
-      <w:r>
-        <w:pict>
-          <v:rect style="width:0;height:1.5pt" o:hralign="center" o:hrstd="t" o:hr="t"/>
-        </w:pict>
-      </w:r>
-    </w:p>
-    <w:bookmarkEnd w:id="77"/>
-    <w:bookmarkStart w:id="127" w:name="references"/>
-    <w:p>
-      <w:pPr>
-        <w:pStyle w:val="Heading2"/>
-      </w:pPr>
-      <w:r>
-        <w:t xml:space="preserve">References</w:t>
-      </w:r>
-    </w:p>
-    <w:p>
-      <w:pPr>
-        <w:pStyle w:val="FirstParagraph"/>
-      </w:pPr>
-      <w:r>
-        <w:t xml:space="preserve">Agarwal, R., Barattieri, A., &amp; Mattoo, A. (2026).</w:t>
+        <w:t xml:space="preserve">update identifies the cultivation of high-tech industrial talent as a binding constraint mediating digital and capability investment into sustainable productivity gains — reinforcing the argument that policy evaluation in transitional settings must monitor the capability environment, not adoption rates alone. At the macro level, Vietnam's service trade liberalization over 2008–2016 raised service-sector productivity by an average of 2.9 per cent per year and manufacturing productivity by 3.1 per cent per year (Barattieri</w:t>
       </w:r>
       <w:r>
         <w:t xml:space="preserve"> </w:t>
@@ -19313,19 +18894,456 @@
           <w:iCs/>
           <w:i/>
         </w:rPr>
-        <w:t xml:space="preserve">Demand shocks, export expansion, and firm-level productivity: Evidence from Vietnamese manufacturers</w:t>
-      </w:r>
-      <w:r>
-        <w:t xml:space="preserve"> </w:t>
-      </w:r>
-      <w:r>
-        <w:t xml:space="preserve">[World Bank Policy Research Working Paper]. The World Bank. [DOI pending; verify and add upon assignment before submission]</w:t>
-      </w:r>
-      <w:r>
-        <w:t xml:space="preserve"> </w:t>
-      </w:r>
-      <w:r>
-        <w:t xml:space="preserve">Aguinis, H., Hill, N. S., &amp; Bailey, J. R. (2021). Best practices in data collection and preparation: Recommendations for reviewers, editors, and authors.</w:t>
+        <w:t xml:space="preserve">et al.</w:t>
+      </w:r>
+      <w:r>
+        <w:t xml:space="preserve">, 2026), suggesting that the ascending limb documented in the WBES microdata reflects in part the economy-wide gains from trade opening that firm-level capability investments convert into sustained productivity advantage.</w:t>
+      </w:r>
+    </w:p>
+    <w:bookmarkEnd w:id="68"/>
+    <w:bookmarkEnd w:id="69"/>
+    <w:bookmarkStart w:id="70" w:name="Xf3d63d3bef15b3e862b66ed5bd48a577996a1bc"/>
+    <w:p>
+      <w:pPr>
+        <w:pStyle w:val="Heading2"/>
+      </w:pPr>
+      <w:r>
+        <w:t xml:space="preserve">6. Limitations and future research</w:t>
+      </w:r>
+    </w:p>
+    <w:p>
+      <w:pPr>
+        <w:pStyle w:val="FirstParagraph"/>
+      </w:pPr>
+      <w:r>
+        <w:t xml:space="preserve">The findings should be read against five limitations. First and most fundamentally, the WBES</w:t>
+      </w:r>
+      <w:r>
+        <w:t xml:space="preserve"> </w:t>
+      </w:r>
+      <w:r>
+        <w:t xml:space="preserve">microdata are repeated cross-sections rather than a true firm panel. This design cannot identify within-firm trajectories over time, and time-invariant unobserved heterogeneity cannot be netted out at the firm level — which means causal attribution for any estimated coefficient remains unavailable. The associational language used throughout the paper reflects this constraint and should not be relaxed in any reader's interpretation of the results. The appropriate analytical remedy is a matched-firm longitudinal panel combining WBES waves with administrative registry data or customs records, which would allow difference-in-differences or fixed-effects identification of the participation-margin productivity jump; Wooldridge (2010) provides the relevant identification framework for such designs.</w:t>
+      </w:r>
+    </w:p>
+    <w:p>
+      <w:pPr>
+        <w:pStyle w:val="BodyText"/>
+      </w:pPr>
+      <w:r>
+        <w:t xml:space="preserve">Second, DAI_z captures only a foundational, Tier-1-style layer of digital adoption centred on website presence, rather than digitally integrated organisational capability. This means the present analysis cannot conclude whether deeper digital integration — Tier 2 electronic-payment intensity, Tier 3 ERP-linked supply-chain digitisation, or Tier 4 data-driven operations — exhibits a more stable or differently shaped productivity channel than the website-presence binary documents here. The appropriate remedy is a panel of digitally integrated firms measured with Tier 2–4 indicators (electronic-payment intensity k33/k38, ERP adoption, platform integration), applying the construct-tier hierarchy of Verhoef et al. (2021) to assign each indicator to its correct layer before entering it in the I–P model.</w:t>
+      </w:r>
+    </w:p>
+    <w:p>
+      <w:pPr>
+        <w:pStyle w:val="BodyText"/>
+      </w:pPr>
+      <w:r>
+        <w:t xml:space="preserve">Third, the analysis is conducted on a single transitional economy. Vietnam is informative</w:t>
+      </w:r>
+      <w:r>
+        <w:t xml:space="preserve"> </w:t>
+      </w:r>
+      <w:r>
+        <w:t xml:space="preserve">precisely because its institutional and digital environment shifted noticeably across the 2009–</w:t>
+      </w:r>
+      <w:r>
+        <w:t xml:space="preserve"> </w:t>
+      </w:r>
+      <w:r>
+        <w:t xml:space="preserve">2023 observation window, but the cross-wave pattern documented here may not generalise without</w:t>
+      </w:r>
+      <w:r>
+        <w:t xml:space="preserve"> </w:t>
+      </w:r>
+      <w:r>
+        <w:t xml:space="preserve">modification to economies whose digital infrastructure or export composition follows a different</w:t>
+      </w:r>
+      <w:r>
+        <w:t xml:space="preserve"> </w:t>
+      </w:r>
+      <w:r>
+        <w:t xml:space="preserve">trajectory.</w:t>
+      </w:r>
+    </w:p>
+    <w:p>
+      <w:pPr>
+        <w:pStyle w:val="BodyText"/>
+      </w:pPr>
+      <w:r>
+        <w:t xml:space="preserve">Fourth, the cross-wave evidence is uneven in statistical strength.</w:t>
+      </w:r>
+    </w:p>
+    <w:p>
+      <w:pPr>
+        <w:pStyle w:val="BodyText"/>
+      </w:pPr>
+      <w:r>
+        <w:t xml:space="preserve">The Paternoster et al.</w:t>
+      </w:r>
+    </w:p>
+    <w:p>
+      <w:pPr>
+        <w:pStyle w:val="BodyText"/>
+      </w:pPr>
+      <w:r>
+        <w:t xml:space="preserve">(1998) z-tests indicate that the drop in DAI_z between 2009 and 2015 (z = 3.353, p &lt; .001)</w:t>
+      </w:r>
+      <w:r>
+        <w:t xml:space="preserve"> </w:t>
+      </w:r>
+      <w:r>
+        <w:t xml:space="preserve">and its recovery between 2015 and 2023 (z = -2.051, p = .040) are statistically distinguishable,</w:t>
+      </w:r>
+      <w:r>
+        <w:t xml:space="preserve"> </w:t>
+      </w:r>
+      <w:r>
+        <w:t xml:space="preserve">but most other cross-wave coefficient differences sit at marginal or non-significant magnitudes.</w:t>
+      </w:r>
+      <w:r>
+        <w:t xml:space="preserve"> </w:t>
+      </w:r>
+      <w:r>
+        <w:t xml:space="preserve">The cross-wave comparison therefore rests primarily on the directional consistency of the wave-specific estimates and on the concentration of the digital signal in 2023, rather than on uniformly</w:t>
+      </w:r>
+      <w:r>
+        <w:t xml:space="preserve"> </w:t>
+      </w:r>
+      <w:r>
+        <w:t xml:space="preserve">significant pairwise coefficient differences across all focal terms. Sharper identification of the digital channel is achievable by exploiting the exogenous timing of Vietnam's National Digital Transformation Programme (launched June 2020; Prime Minister of Vietnam, 2020) as a policy instrument in a difference-in-differences design that contrasts pre- and post-NDTP firm cohorts within the same WBES sampling frame.</w:t>
+      </w:r>
+    </w:p>
+    <w:p>
+      <w:pPr>
+        <w:pStyle w:val="BodyText"/>
+      </w:pPr>
+      <w:r>
+        <w:t xml:space="preserve">Fifth, the sector fixed effects in the main models are intentionally broad to keep the crosswave specification comparable.</w:t>
+      </w:r>
+    </w:p>
+    <w:p>
+      <w:pPr>
+        <w:pStyle w:val="BodyText"/>
+      </w:pPr>
+      <w:r>
+        <w:t xml:space="preserve">Section 4.5 Panel G addresses one natural extension by re-</w:t>
+      </w:r>
+    </w:p>
+    <w:p>
+      <w:pPr>
+        <w:pStyle w:val="BodyText"/>
+      </w:pPr>
+      <w:r>
+        <w:t xml:space="preserve">estimating the pooled M2 / M7 / M8 specifications on manufacturing (sector1 ∈ {1, 2, 3}; N =</w:t>
+      </w:r>
+      <w:r>
+        <w:t xml:space="preserve"> </w:t>
+      </w:r>
+      <w:r>
+        <w:t xml:space="preserve">1,854) versus non-manufacturing (sector1 ∈ {4, 5, 6, 7}; N = 1,104) subsets, and finds that the</w:t>
+      </w:r>
+      <w:r>
+        <w:t xml:space="preserve"> </w:t>
+      </w:r>
+      <w:r>
+        <w:t xml:space="preserve">digital-adoption channel operates primarily in manufacturing while the technological-capability</w:t>
+      </w:r>
+      <w:r>
+        <w:t xml:space="preserve"> </w:t>
+      </w:r>
+      <w:r>
+        <w:t xml:space="preserve">channel is present in both. Finer industry-level mechanisms — for example, contrasting digitally</w:t>
+      </w:r>
+      <w:r>
+        <w:t xml:space="preserve"> </w:t>
+      </w:r>
+      <w:r>
+        <w:t xml:space="preserve">intensive services with traditional services, or contrasting export-oriented with domestically</w:t>
+      </w:r>
+      <w:r>
+        <w:t xml:space="preserve"> </w:t>
+      </w:r>
+      <w:r>
+        <w:t xml:space="preserve">oriented manufacturing sub-sectors — would benefit from a research design that exploits richer</w:t>
+      </w:r>
+      <w:r>
+        <w:t xml:space="preserve"> </w:t>
+      </w:r>
+      <w:r>
+        <w:t xml:space="preserve">industry classification than the WBES one-digit codes allow.</w:t>
+      </w:r>
+    </w:p>
+    <w:p>
+      <w:pPr>
+        <w:pStyle w:val="BodyText"/>
+      </w:pPr>
+      <w:r>
+        <w:t xml:space="preserve">Sixth, the analysis is limited to Vietnam as a single transitional economy at a particular stage of its digital and institutional development. Understanding how the DAI moderation pattern documented here — negative at high export intensity under Tier-1-only adoption — compares with patterns in other emerging markets at different institutional stages, or with patterns in digitally advanced economies where the same interaction is predicted to be positive, requires cross-setting comparative designs that systematically vary institutional transaction costs and digital infrastructure quality. Such designs would also allow more direct tests of the context-contingent framing developed in §2.1.</w:t>
+      </w:r>
+    </w:p>
+    <w:bookmarkEnd w:id="70"/>
+    <w:bookmarkStart w:id="71" w:name="X19cad7d15381a9dfa000caf49ac5c69889e188d"/>
+    <w:p>
+      <w:pPr>
+        <w:pStyle w:val="Heading2"/>
+      </w:pPr>
+      <w:r>
+        <w:t xml:space="preserve">7. Conclusion</w:t>
+      </w:r>
+    </w:p>
+    <w:p>
+      <w:pPr>
+        <w:pStyle w:val="FirstParagraph"/>
+      </w:pPr>
+      <w:r>
+        <w:t xml:space="preserve">This study revisits the internationalisation–performance relationship in Vietnam by treating foreign-technology / standards capability as the primary capability construct and by retaining a single-item website-presence indicator only as a baseline digital-presence control. It compares pooled with wave-specific evidence across the 2009 / 2015 / 2023 WBES waves to evaluate the structural durability of the I–P threshold and the wave-level identification robustness of each capability dimension.</w:t>
+      </w:r>
+    </w:p>
+    <w:p>
+      <w:pPr>
+        <w:pStyle w:val="BodyText"/>
+      </w:pPr>
+      <w:r>
+        <w:t xml:space="preserve">The findings indicate that the internationalisation–performance relationship is non-monotonic in the full sample, that the pattern is driven primarily by a participation-and-intensity structure rather than by strong within-exporter curvature alone, and — critically — that the inverted-U turning point is structurally durable: the threshold range clusters within a narrow ~7-percentage-point band (39.3–46.2 %) across 14 years of major institutional change, including WTO accession, the Global Financial Crisis, the COVID-19 supply-chain disruption, and the diffusion of digital-payment infrastructure. This durability is consistent with deep firm-level constraints — coordination capacity, contract enforcement, and trade-finance access — that change more slowly than the wider operating environment.</w:t>
+      </w:r>
+    </w:p>
+    <w:p>
+      <w:pPr>
+        <w:pStyle w:val="BodyText"/>
+      </w:pPr>
+      <w:r>
+        <w:t xml:space="preserve">The results also suggest that technological capability and the baseline website-presence indicator should not be treated as interchangeable, and that conflating them under a single "digital adoption" or "digital transformation" label would obscure their differing identification properties. Technological capability is comparatively stable and identification-robust across specifications. The baseline DAI_z control is more wave-sensitive and attenuates to a null under instrumental-variable estimation, consistent with Tier-1 proxy obsolescence as website ownership diffuses to near-universal levels in the Vietnamese firm population. Within the constraint of a single binary website indicator, this paper makes no claim about dynamic digital capability moderation; any such test awaits richer Tier 2–4 indicators not currently available cross-wave in the WBES Vietnam instrument.</w:t>
+      </w:r>
+    </w:p>
+    <w:bookmarkEnd w:id="71"/>
+    <w:bookmarkStart w:id="72" w:name="conflict-of-interest"/>
+    <w:p>
+      <w:pPr>
+        <w:pStyle w:val="Heading2"/>
+      </w:pPr>
+      <w:r>
+        <w:t xml:space="preserve">Conflict of interest</w:t>
+      </w:r>
+    </w:p>
+    <w:p>
+      <w:pPr>
+        <w:pStyle w:val="FirstParagraph"/>
+      </w:pPr>
+      <w:r>
+        <w:t xml:space="preserve">The authors declare no conflict of interest.</w:t>
+      </w:r>
+    </w:p>
+    <w:bookmarkEnd w:id="72"/>
+    <w:bookmarkStart w:id="73" w:name="funding"/>
+    <w:p>
+      <w:pPr>
+        <w:pStyle w:val="Heading2"/>
+      </w:pPr>
+      <w:r>
+        <w:t xml:space="preserve">Funding</w:t>
+      </w:r>
+    </w:p>
+    <w:p>
+      <w:pPr>
+        <w:pStyle w:val="FirstParagraph"/>
+      </w:pPr>
+      <w:r>
+        <w:t xml:space="preserve">This research received no specific grant from any funding agency in the public, commercial, or</w:t>
+      </w:r>
+      <w:r>
+        <w:t xml:space="preserve"> </w:t>
+      </w:r>
+      <w:r>
+        <w:t xml:space="preserve">not-for-profit sectors.</w:t>
+      </w:r>
+    </w:p>
+    <w:bookmarkEnd w:id="73"/>
+    <w:bookmarkStart w:id="74" w:name="data-availability-statement"/>
+    <w:p>
+      <w:pPr>
+        <w:pStyle w:val="Heading2"/>
+      </w:pPr>
+      <w:r>
+        <w:t xml:space="preserve">Data availability statement</w:t>
+      </w:r>
+    </w:p>
+    <w:p>
+      <w:pPr>
+        <w:pStyle w:val="FirstParagraph"/>
+      </w:pPr>
+      <w:r>
+        <w:t xml:space="preserve">The data that support the findings of this study are from the World Bank Enterprise Surveys</w:t>
+      </w:r>
+      <w:r>
+        <w:t xml:space="preserve"> </w:t>
+      </w:r>
+      <w:r>
+        <w:t xml:space="preserve">and are available from the World Bank Enterprise Surveys portal, subject to registration and</w:t>
+      </w:r>
+      <w:r>
+        <w:t xml:space="preserve"> </w:t>
+      </w:r>
+      <w:r>
+        <w:t xml:space="preserve">compliance with the World Bank Enterprise Surveys Data Access Protocol. Because the protocol</w:t>
+      </w:r>
+      <w:r>
+        <w:t xml:space="preserve"> </w:t>
+      </w:r>
+      <w:r>
+        <w:t xml:space="preserve">restricts redistribution of the original .dta files to third parties, the authors do not redistribute</w:t>
+      </w:r>
+      <w:r>
+        <w:t xml:space="preserve"> </w:t>
+      </w:r>
+      <w:r>
+        <w:t xml:space="preserve">the raw survey files. Replication materials, including variable-construction details, model specifications, and computational outputs, are available from the authors upon reasonable request</w:t>
+      </w:r>
+      <w:r>
+        <w:t xml:space="preserve"> </w:t>
+      </w:r>
+      <w:r>
+        <w:t xml:space="preserve">and may be shared to the extent permitted by the data-access terms.</w:t>
+      </w:r>
+    </w:p>
+    <w:bookmarkEnd w:id="74"/>
+    <w:bookmarkStart w:id="75" w:name="ethics-statement"/>
+    <w:p>
+      <w:pPr>
+        <w:pStyle w:val="Heading2"/>
+      </w:pPr>
+      <w:r>
+        <w:t xml:space="preserve">Ethics statement</w:t>
+      </w:r>
+    </w:p>
+    <w:p>
+      <w:pPr>
+        <w:pStyle w:val="FirstParagraph"/>
+      </w:pPr>
+      <w:r>
+        <w:t xml:space="preserve">This study uses secondary, de-identified, firm-level data from the World Bank Enterprise Surveys. It does not involve human participants, identifiable personal data, animals, or biological samples, and therefore did not require institutional ethical approval. The research was conducted in accordance with the data-access terms of the World Bank Enterprise Surveys.</w:t>
+      </w:r>
+    </w:p>
+    <w:bookmarkEnd w:id="75"/>
+    <w:bookmarkStart w:id="76" w:name="X799c23334c5944d058eaf15944a1408ff96b683"/>
+    <w:p>
+      <w:pPr>
+        <w:pStyle w:val="Heading2"/>
+      </w:pPr>
+      <w:r>
+        <w:t xml:space="preserve">Use of generative AI in the writing process</w:t>
+      </w:r>
+    </w:p>
+    <w:p>
+      <w:pPr>
+        <w:pStyle w:val="FirstParagraph"/>
+      </w:pPr>
+      <w:r>
+        <w:t xml:space="preserve">During the preparation of this work, the author(s) used generative AI-assisted tools solely for copy-editing — to improve the clarity, grammar, and structure of the author(s)' own original text. No generative AI was used to create or draft new substantive content. In accordance with the journal's policy, the author(s) will specify the exact name and version of the AI tool(s) used at the point of submission. [Author: insert tool name and version.]</w:t>
+      </w:r>
+    </w:p>
+    <w:p>
+      <w:pPr>
+        <w:pStyle w:val="BodyText"/>
+      </w:pPr>
+      <w:r>
+        <w:t xml:space="preserve">All conceptual framing, hypothesis development, empirical analysis, results interpretation, and final wording were authored by the human author(s), who take full responsibility for the content of the publication.</w:t>
+      </w:r>
+    </w:p>
+    <w:bookmarkEnd w:id="76"/>
+    <w:bookmarkStart w:id="77" w:name="acknowledgements"/>
+    <w:p>
+      <w:pPr>
+        <w:pStyle w:val="Heading2"/>
+      </w:pPr>
+      <w:r>
+        <w:t xml:space="preserve">Acknowledgements</w:t>
+      </w:r>
+    </w:p>
+    <w:p>
+      <w:pPr>
+        <w:pStyle w:val="FirstParagraph"/>
+      </w:pPr>
+      <w:r>
+        <w:t xml:space="preserve">[Acknowledgements removed for blind review; see separately submitted Title Page.]</w:t>
+      </w:r>
+    </w:p>
+    <w:bookmarkEnd w:id="77"/>
+    <w:bookmarkStart w:id="78" w:name="supplementary-materials"/>
+    <w:p>
+      <w:pPr>
+        <w:pStyle w:val="Heading2"/>
+      </w:pPr>
+      <w:r>
+        <w:t xml:space="preserve">Supplementary materials</w:t>
+      </w:r>
+    </w:p>
+    <w:p>
+      <w:pPr>
+        <w:pStyle w:val="FirstParagraph"/>
+      </w:pPr>
+      <w:r>
+        <w:t xml:space="preserve">All figures and tables in the manuscript are embedded inline. The underlying coefficient outputs are also distributed as plain CSV files in the replication package for downstream reanalysis:</w:t>
+      </w:r>
+    </w:p>
+    <w:p>
+      <w:pPr>
+        <w:pStyle w:val="BodyText"/>
+      </w:pPr>
+      <w:r>
+        <w:t xml:space="preserve">tables/table_1_descriptives.csv (Table 2), tables/coefs_main_models.csv (M0–M8</w:t>
+      </w:r>
+    </w:p>
+    <w:p>
+      <w:pPr>
+        <w:pStyle w:val="BodyText"/>
+      </w:pPr>
+      <w:r>
+        <w:t xml:space="preserve">long-format coefficient table), tables/joint_tests_main_models.csv (H2 and P1 joint F-tests),</w:t>
+      </w:r>
+      <w:r>
+        <w:t xml:space="preserve"> </w:t>
+      </w:r>
+      <w:r>
+        <w:t xml:space="preserve">tables/table_lind_mehlum.csv (Table LM source), tables/table_3_robustness.csv (Table 4 panels A–D + G), tables/selection_checks.csv (Heckman / control function), and tables/table_paternoster.csv</w:t>
+      </w:r>
+      <w:r>
+        <w:t xml:space="preserve"> </w:t>
+      </w:r>
+      <w:r>
+        <w:t xml:space="preserve">(cross-wave z-tests). Replication package and instructions: see p3_vietnam/README.md.</w:t>
+      </w:r>
+    </w:p>
+    <w:p>
+      <w:r>
+        <w:pict>
+          <v:rect style="width:0;height:1.5pt" o:hralign="center" o:hrstd="t" o:hr="t"/>
+        </w:pict>
+      </w:r>
+    </w:p>
+    <w:bookmarkEnd w:id="78"/>
+    <w:bookmarkStart w:id="132" w:name="references"/>
+    <w:p>
+      <w:pPr>
+        <w:pStyle w:val="Heading2"/>
+      </w:pPr>
+      <w:r>
+        <w:t xml:space="preserve">References</w:t>
+      </w:r>
+    </w:p>
+    <w:p>
+      <w:pPr>
+        <w:pStyle w:val="FirstParagraph"/>
+      </w:pPr>
+      <w:r>
+        <w:t xml:space="preserve">Agarwal, R., Barattieri, A. and Mattoo, A. (2026), "Demand shocks, export expansion, and firm-level productivity: evidence from Vietnamese manufacturers", working paper, The World Bank, Washington, DC. [DOI pending; verify and add upon assignment before submission]</w:t>
+      </w:r>
+    </w:p>
+    <w:p>
+      <w:pPr>
+        <w:pStyle w:val="BodyText"/>
+      </w:pPr>
+      <w:r>
+        <w:t xml:space="preserve">Aguinis, H., Hill, N.S. and Bailey, J.R. (2021), "Best practices in data collection and preparation: recommendations for reviewers, editors, and authors",</w:t>
       </w:r>
       <w:r>
         <w:t xml:space="preserve"> </w:t>
@@ -19335,15 +19353,15 @@
           <w:iCs/>
           <w:i/>
         </w:rPr>
-        <w:t xml:space="preserve">Organizational Research Methods, 24</w:t>
-      </w:r>
-      <w:r>
-        <w:t xml:space="preserve">(4), 678–693.</w:t>
-      </w:r>
-      <w:r>
-        <w:t xml:space="preserve"> </w:t>
-      </w:r>
-      <w:hyperlink r:id="rId78">
+        <w:t xml:space="preserve">Organizational Research Methods</w:t>
+      </w:r>
+      <w:r>
+        <w:t xml:space="preserve">, Vol. 24 No. 4, pp.678-693,</w:t>
+      </w:r>
+      <w:r>
+        <w:t xml:space="preserve"> </w:t>
+      </w:r>
+      <w:hyperlink r:id="rId79">
         <w:r>
           <w:rPr>
             <w:rStyle w:val="Hyperlink"/>
@@ -19351,11 +19369,13 @@
           <w:t xml:space="preserve">https://doi.org/10.1177/1094428119836485</w:t>
         </w:r>
       </w:hyperlink>
-      <w:r>
-        <w:t xml:space="preserve"> </w:t>
-      </w:r>
-      <w:r>
-        <w:t xml:space="preserve">Antonakis, J., Bendahan, S., Jacquart, P., &amp; Lalive, R. (2010). On making causal claims: A review and recommendations.</w:t>
+    </w:p>
+    <w:p>
+      <w:pPr>
+        <w:pStyle w:val="BodyText"/>
+      </w:pPr>
+      <w:r>
+        <w:t xml:space="preserve">Antonakis, J., Bendahan, S., Jacquart, P. and Lalive, R. (2010), "On making causal claims: a review and recommendations",</w:t>
       </w:r>
       <w:r>
         <w:t xml:space="preserve"> </w:t>
@@ -19365,15 +19385,15 @@
           <w:iCs/>
           <w:i/>
         </w:rPr>
-        <w:t xml:space="preserve">The Leadership Quarterly, 21</w:t>
-      </w:r>
-      <w:r>
-        <w:t xml:space="preserve">(6), 1086–1120.</w:t>
-      </w:r>
-      <w:r>
-        <w:t xml:space="preserve"> </w:t>
-      </w:r>
-      <w:hyperlink r:id="rId79">
+        <w:t xml:space="preserve">The Leadership Quarterly</w:t>
+      </w:r>
+      <w:r>
+        <w:t xml:space="preserve">, Vol. 21 No. 6, pp.1086-1120,</w:t>
+      </w:r>
+      <w:r>
+        <w:t xml:space="preserve"> </w:t>
+      </w:r>
+      <w:hyperlink r:id="rId80">
         <w:r>
           <w:rPr>
             <w:rStyle w:val="Hyperlink"/>
@@ -19381,11 +19401,13 @@
           <w:t xml:space="preserve">https://doi.org/10.1016/j.leaqua.2010.10.010</w:t>
         </w:r>
       </w:hyperlink>
-      <w:r>
-        <w:t xml:space="preserve"> </w:t>
-      </w:r>
-      <w:r>
-        <w:t xml:space="preserve">Banalieva, E. R., &amp; Dhanaraj, C. (2019). Internalization theory for the digital economy.</w:t>
+    </w:p>
+    <w:p>
+      <w:pPr>
+        <w:pStyle w:val="BodyText"/>
+      </w:pPr>
+      <w:r>
+        <w:t xml:space="preserve">Banalieva, E.R. and Dhanaraj, C. (2019), "Internalization theory for the digital economy",</w:t>
       </w:r>
       <w:r>
         <w:t xml:space="preserve"> </w:t>
@@ -19395,15 +19417,15 @@
           <w:iCs/>
           <w:i/>
         </w:rPr>
-        <w:t xml:space="preserve">Journal of International Business Studies, 50</w:t>
-      </w:r>
-      <w:r>
-        <w:t xml:space="preserve">(8), 1372–1387.</w:t>
-      </w:r>
-      <w:r>
-        <w:t xml:space="preserve"> </w:t>
-      </w:r>
-      <w:hyperlink r:id="rId80">
+        <w:t xml:space="preserve">Journal of International Business Studies</w:t>
+      </w:r>
+      <w:r>
+        <w:t xml:space="preserve">, Vol. 50 No. 8, pp.1372-1387,</w:t>
+      </w:r>
+      <w:r>
+        <w:t xml:space="preserve"> </w:t>
+      </w:r>
+      <w:hyperlink r:id="rId81">
         <w:r>
           <w:rPr>
             <w:rStyle w:val="Hyperlink"/>
@@ -19411,11 +19433,21 @@
           <w:t xml:space="preserve">https://doi.org/10.1057/s41267-019-00243-7</w:t>
         </w:r>
       </w:hyperlink>
-      <w:r>
-        <w:t xml:space="preserve"> </w:t>
-      </w:r>
-      <w:r>
-        <w:t xml:space="preserve">Barattieri, A., Mattoo, A., &amp; Signoret, J. E. (2026).</w:t>
+    </w:p>
+    <w:p>
+      <w:pPr>
+        <w:pStyle w:val="BodyText"/>
+      </w:pPr>
+      <w:r>
+        <w:t xml:space="preserve">Barattieri, A., Mattoo, A. and Signoret, J.E. (2026), "Service trade liberalization and productivity growth: micro-evidence from Vietnam, 2008-2016", working paper, The World Bank, Washington, DC. [DOI pending; verify and add upon assignment before submission]</w:t>
+      </w:r>
+    </w:p>
+    <w:p>
+      <w:pPr>
+        <w:pStyle w:val="BodyText"/>
+      </w:pPr>
+      <w:r>
+        <w:t xml:space="preserve">Barney, J. (1991), "Firm resources and sustained competitive advantage",</w:t>
       </w:r>
       <w:r>
         <w:t xml:space="preserve"> </w:t>
@@ -19425,19 +19457,29 @@
           <w:iCs/>
           <w:i/>
         </w:rPr>
-        <w:t xml:space="preserve">Service trade liberalization and productivity growth: Micro-evidence from Vietnam, 2008–2016</w:t>
-      </w:r>
-      <w:r>
-        <w:t xml:space="preserve"> </w:t>
-      </w:r>
-      <w:r>
-        <w:t xml:space="preserve">[World Bank Policy Research Working Paper]. The World Bank. [DOI pending; verify and add upon assignment before submission]</w:t>
-      </w:r>
-      <w:r>
-        <w:t xml:space="preserve"> </w:t>
-      </w:r>
-      <w:r>
-        <w:t xml:space="preserve">Bernard, A. B., Jensen, J. B., Redding, S. J., &amp; Schott, P. K. (2007). Firms in international trade.</w:t>
+        <w:t xml:space="preserve">Journal of Management</w:t>
+      </w:r>
+      <w:r>
+        <w:t xml:space="preserve">, Vol. 17 No. 1, pp.99-120,</w:t>
+      </w:r>
+      <w:r>
+        <w:t xml:space="preserve"> </w:t>
+      </w:r>
+      <w:hyperlink r:id="rId82">
+        <w:r>
+          <w:rPr>
+            <w:rStyle w:val="Hyperlink"/>
+          </w:rPr>
+          <w:t xml:space="preserve">https://doi.org/10.1177/014920639101700108</w:t>
+        </w:r>
+      </w:hyperlink>
+    </w:p>
+    <w:p>
+      <w:pPr>
+        <w:pStyle w:val="BodyText"/>
+      </w:pPr>
+      <w:r>
+        <w:t xml:space="preserve">Bernard, A.B., Jensen, J.B., Redding, S.J. and Schott, P.K. (2007), "Firms in international trade",</w:t>
       </w:r>
       <w:r>
         <w:t xml:space="preserve"> </w:t>
@@ -19447,15 +19489,15 @@
           <w:iCs/>
           <w:i/>
         </w:rPr>
-        <w:t xml:space="preserve">Journal of Economic Perspectives, 21</w:t>
-      </w:r>
-      <w:r>
-        <w:t xml:space="preserve">(3), 105–130.</w:t>
-      </w:r>
-      <w:r>
-        <w:t xml:space="preserve"> </w:t>
-      </w:r>
-      <w:hyperlink r:id="rId81">
+        <w:t xml:space="preserve">Journal of Economic Perspectives</w:t>
+      </w:r>
+      <w:r>
+        <w:t xml:space="preserve">, Vol. 21 No. 3, pp.105-130,</w:t>
+      </w:r>
+      <w:r>
+        <w:t xml:space="preserve"> </w:t>
+      </w:r>
+      <w:hyperlink r:id="rId83">
         <w:r>
           <w:rPr>
             <w:rStyle w:val="Hyperlink"/>
@@ -19463,11 +19505,13 @@
           <w:t xml:space="preserve">https://doi.org/10.1257/jep.21.3.105</w:t>
         </w:r>
       </w:hyperlink>
-      <w:r>
-        <w:t xml:space="preserve"> </w:t>
-      </w:r>
-      <w:r>
-        <w:t xml:space="preserve">Bharadwaj, A., El Sawy, O. A., Pavlou, P. A., &amp; Venkatraman, N. (2013). Digital business strategy: Toward a next generation of insights.</w:t>
+    </w:p>
+    <w:p>
+      <w:pPr>
+        <w:pStyle w:val="BodyText"/>
+      </w:pPr>
+      <w:r>
+        <w:t xml:space="preserve">Bharadwaj, A., El Sawy, O.A., Pavlou, P.A. and Venkatraman, N. (2013), "Digital business strategy: toward a next generation of insights",</w:t>
       </w:r>
       <w:r>
         <w:t xml:space="preserve"> </w:t>
@@ -19477,15 +19521,15 @@
           <w:iCs/>
           <w:i/>
         </w:rPr>
-        <w:t xml:space="preserve">MIS Quarterly, 37</w:t>
-      </w:r>
-      <w:r>
-        <w:t xml:space="preserve">(2), 471–482.</w:t>
-      </w:r>
-      <w:r>
-        <w:t xml:space="preserve"> </w:t>
-      </w:r>
-      <w:hyperlink r:id="rId82">
+        <w:t xml:space="preserve">MIS Quarterly</w:t>
+      </w:r>
+      <w:r>
+        <w:t xml:space="preserve">, Vol. 37 No. 2, pp.471-482,</w:t>
+      </w:r>
+      <w:r>
+        <w:t xml:space="preserve"> </w:t>
+      </w:r>
+      <w:hyperlink r:id="rId84">
         <w:r>
           <w:rPr>
             <w:rStyle w:val="Hyperlink"/>
@@ -19493,11 +19537,13 @@
           <w:t xml:space="preserve">https://doi.org/10.25300/misq/2013/37:2.3</w:t>
         </w:r>
       </w:hyperlink>
-      <w:r>
-        <w:t xml:space="preserve"> </w:t>
-      </w:r>
-      <w:r>
-        <w:t xml:space="preserve">Brouthers, K. D., Geisser, K. D., &amp; Rothlauf, F. (2016). Explaining the internationalization of iBusiness firms.</w:t>
+    </w:p>
+    <w:p>
+      <w:pPr>
+        <w:pStyle w:val="BodyText"/>
+      </w:pPr>
+      <w:r>
+        <w:t xml:space="preserve">Brouthers, K.D., Geisser, K.D. and Rothlauf, F. (2016), "Explaining the internationalization of iBusiness firms",</w:t>
       </w:r>
       <w:r>
         <w:t xml:space="preserve"> </w:t>
@@ -19507,15 +19553,15 @@
           <w:iCs/>
           <w:i/>
         </w:rPr>
-        <w:t xml:space="preserve">Journal of International Business Studies, 47</w:t>
-      </w:r>
-      <w:r>
-        <w:t xml:space="preserve">(5), 513–534.</w:t>
-      </w:r>
-      <w:r>
-        <w:t xml:space="preserve"> </w:t>
-      </w:r>
-      <w:hyperlink r:id="rId83">
+        <w:t xml:space="preserve">Journal of International Business Studies</w:t>
+      </w:r>
+      <w:r>
+        <w:t xml:space="preserve">, Vol. 47 No. 5, pp.513-534,</w:t>
+      </w:r>
+      <w:r>
+        <w:t xml:space="preserve"> </w:t>
+      </w:r>
+      <w:hyperlink r:id="rId85">
         <w:r>
           <w:rPr>
             <w:rStyle w:val="Hyperlink"/>
@@ -19523,11 +19569,13 @@
           <w:t xml:space="preserve">https://doi.org/10.1057/jibs.2015.20</w:t>
         </w:r>
       </w:hyperlink>
-      <w:r>
-        <w:t xml:space="preserve"> </w:t>
-      </w:r>
-      <w:r>
-        <w:t xml:space="preserve">Brynjolfsson, E., Rock, D., &amp; Syverson, C. (2021). The productivity J-curve: How intangibles complement general purpose technologies.</w:t>
+    </w:p>
+    <w:p>
+      <w:pPr>
+        <w:pStyle w:val="BodyText"/>
+      </w:pPr>
+      <w:r>
+        <w:t xml:space="preserve">Brynjolfsson, E., Rock, D. and Syverson, C. (2021), "The productivity J-curve: how intangibles complement general purpose technologies",</w:t>
       </w:r>
       <w:r>
         <w:t xml:space="preserve"> </w:t>
@@ -19537,15 +19585,15 @@
           <w:iCs/>
           <w:i/>
         </w:rPr>
-        <w:t xml:space="preserve">American Economic Journal: Macroeconomics, 13</w:t>
-      </w:r>
-      <w:r>
-        <w:t xml:space="preserve">(1), 333–372.</w:t>
-      </w:r>
-      <w:r>
-        <w:t xml:space="preserve"> </w:t>
-      </w:r>
-      <w:hyperlink r:id="rId84">
+        <w:t xml:space="preserve">American Economic Journal: Macroeconomics</w:t>
+      </w:r>
+      <w:r>
+        <w:t xml:space="preserve">, Vol. 13 No. 1, pp.333-372,</w:t>
+      </w:r>
+      <w:r>
+        <w:t xml:space="preserve"> </w:t>
+      </w:r>
+      <w:hyperlink r:id="rId86">
         <w:r>
           <w:rPr>
             <w:rStyle w:val="Hyperlink"/>
@@ -19553,11 +19601,13 @@
           <w:t xml:space="preserve">https://doi.org/10.1257/mac.20180386</w:t>
         </w:r>
       </w:hyperlink>
-      <w:r>
-        <w:t xml:space="preserve"> </w:t>
-      </w:r>
-      <w:r>
-        <w:t xml:space="preserve">Certo, S. T., Busenbark, J. R., Woo, H.-S., &amp; Semadeni, M. (2016). Sample selection bias and Heckman models in strategic management research.</w:t>
+    </w:p>
+    <w:p>
+      <w:pPr>
+        <w:pStyle w:val="BodyText"/>
+      </w:pPr>
+      <w:r>
+        <w:t xml:space="preserve">Certo, S.T., Busenbark, J.R., Woo, H.-S. and Semadeni, M. (2016), "Sample selection bias and Heckman models in strategic management research",</w:t>
       </w:r>
       <w:r>
         <w:t xml:space="preserve"> </w:t>
@@ -19567,15 +19617,15 @@
           <w:iCs/>
           <w:i/>
         </w:rPr>
-        <w:t xml:space="preserve">Strategic Management Journal, 37</w:t>
-      </w:r>
-      <w:r>
-        <w:t xml:space="preserve">(13), 2639–2657.</w:t>
-      </w:r>
-      <w:r>
-        <w:t xml:space="preserve"> </w:t>
-      </w:r>
-      <w:hyperlink r:id="rId85">
+        <w:t xml:space="preserve">Strategic Management Journal</w:t>
+      </w:r>
+      <w:r>
+        <w:t xml:space="preserve">, Vol. 37 No. 13, pp.2639-2657,</w:t>
+      </w:r>
+      <w:r>
+        <w:t xml:space="preserve"> </w:t>
+      </w:r>
+      <w:hyperlink r:id="rId87">
         <w:r>
           <w:rPr>
             <w:rStyle w:val="Hyperlink"/>
@@ -19583,11 +19633,13 @@
           <w:t xml:space="preserve">https://doi.org/10.1002/smj.2475</w:t>
         </w:r>
       </w:hyperlink>
-      <w:r>
-        <w:t xml:space="preserve"> </w:t>
-      </w:r>
-      <w:r>
-        <w:t xml:space="preserve">Cohen, W. M., &amp; Levinthal, D. A. (1990). Absorptive capacity: A new perspective on learning and innovation.</w:t>
+    </w:p>
+    <w:p>
+      <w:pPr>
+        <w:pStyle w:val="BodyText"/>
+      </w:pPr>
+      <w:r>
+        <w:t xml:space="preserve">Cohen, W.M. and Levinthal, D.A. (1990), "Absorptive capacity: a new perspective on learning and innovation",</w:t>
       </w:r>
       <w:r>
         <w:t xml:space="preserve"> </w:t>
@@ -19597,15 +19649,15 @@
           <w:iCs/>
           <w:i/>
         </w:rPr>
-        <w:t xml:space="preserve">Administrative Science Quarterly, 35</w:t>
-      </w:r>
-      <w:r>
-        <w:t xml:space="preserve">(1), 128–152.</w:t>
-      </w:r>
-      <w:r>
-        <w:t xml:space="preserve"> </w:t>
-      </w:r>
-      <w:hyperlink r:id="rId86">
+        <w:t xml:space="preserve">Administrative Science Quarterly</w:t>
+      </w:r>
+      <w:r>
+        <w:t xml:space="preserve">, Vol. 35 No. 1, pp.128-152,</w:t>
+      </w:r>
+      <w:r>
+        <w:t xml:space="preserve"> </w:t>
+      </w:r>
+      <w:hyperlink r:id="rId88">
         <w:r>
           <w:rPr>
             <w:rStyle w:val="Hyperlink"/>
@@ -19613,11 +19665,13 @@
           <w:t xml:space="preserve">https://doi.org/10.2307/2393553</w:t>
         </w:r>
       </w:hyperlink>
-      <w:r>
-        <w:t xml:space="preserve"> </w:t>
-      </w:r>
-      <w:r>
-        <w:t xml:space="preserve">Contractor, F. J. (2007). Is international business good for companies? The evolutionary or multi-stage theory of internationalization vs. the transaction cost perspective.</w:t>
+    </w:p>
+    <w:p>
+      <w:pPr>
+        <w:pStyle w:val="BodyText"/>
+      </w:pPr>
+      <w:r>
+        <w:t xml:space="preserve">Contractor, F.J. (2007), "Is international business good for companies? The evolutionary or multi-stage theory of internationalization vs. the transaction cost perspective",</w:t>
       </w:r>
       <w:r>
         <w:t xml:space="preserve"> </w:t>
@@ -19627,15 +19681,15 @@
           <w:iCs/>
           <w:i/>
         </w:rPr>
-        <w:t xml:space="preserve">Management International Review, 47</w:t>
-      </w:r>
-      <w:r>
-        <w:t xml:space="preserve">(3), 453–475.</w:t>
-      </w:r>
-      <w:r>
-        <w:t xml:space="preserve"> </w:t>
-      </w:r>
-      <w:hyperlink r:id="rId87">
+        <w:t xml:space="preserve">Management International Review</w:t>
+      </w:r>
+      <w:r>
+        <w:t xml:space="preserve">, Vol. 47 No. 3, pp.453-475,</w:t>
+      </w:r>
+      <w:r>
+        <w:t xml:space="preserve"> </w:t>
+      </w:r>
+      <w:hyperlink r:id="rId89">
         <w:r>
           <w:rPr>
             <w:rStyle w:val="Hyperlink"/>
@@ -19643,11 +19697,13 @@
           <w:t xml:space="preserve">https://doi.org/10.1007/s11575-007-0024-2</w:t>
         </w:r>
       </w:hyperlink>
-      <w:r>
-        <w:t xml:space="preserve"> </w:t>
-      </w:r>
-      <w:r>
-        <w:t xml:space="preserve">Coviello, N., Kano, L., &amp; Liesch, P. W. (2017). Adapting the Uppsala model to a modern world: Macro-context and microfoundations.</w:t>
+    </w:p>
+    <w:p>
+      <w:pPr>
+        <w:pStyle w:val="BodyText"/>
+      </w:pPr>
+      <w:r>
+        <w:t xml:space="preserve">Coviello, N., Kano, L. and Liesch, P.W. (2017), "Adapting the Uppsala model to a modern world: macro-context and microfoundations",</w:t>
       </w:r>
       <w:r>
         <w:t xml:space="preserve"> </w:t>
@@ -19657,15 +19713,15 @@
           <w:iCs/>
           <w:i/>
         </w:rPr>
-        <w:t xml:space="preserve">Journal of International Business Studies, 48</w:t>
-      </w:r>
-      <w:r>
-        <w:t xml:space="preserve">(9), 1151–1164.</w:t>
-      </w:r>
-      <w:r>
-        <w:t xml:space="preserve"> </w:t>
-      </w:r>
-      <w:hyperlink r:id="rId88">
+        <w:t xml:space="preserve">Journal of International Business Studies</w:t>
+      </w:r>
+      <w:r>
+        <w:t xml:space="preserve">, Vol. 48 No. 9, pp.1151-1164,</w:t>
+      </w:r>
+      <w:r>
+        <w:t xml:space="preserve"> </w:t>
+      </w:r>
+      <w:hyperlink r:id="rId90">
         <w:r>
           <w:rPr>
             <w:rStyle w:val="Hyperlink"/>
@@ -19673,11 +19729,13 @@
           <w:t xml:space="preserve">https://doi.org/10.1057/s41267-017-0120-x</w:t>
         </w:r>
       </w:hyperlink>
-      <w:r>
-        <w:t xml:space="preserve"> </w:t>
-      </w:r>
-      <w:r>
-        <w:t xml:space="preserve">Cuervo-Cazurra, A., &amp; Genc, M. (2008). Transforming disadvantages into advantages: Developing-country MNEs in the least developed countries.</w:t>
+    </w:p>
+    <w:p>
+      <w:pPr>
+        <w:pStyle w:val="BodyText"/>
+      </w:pPr>
+      <w:r>
+        <w:t xml:space="preserve">Cuervo-Cazurra, A. and Genc, M. (2008), "Transforming disadvantages into advantages: developing-country MNEs in the least developed countries",</w:t>
       </w:r>
       <w:r>
         <w:t xml:space="preserve"> </w:t>
@@ -19687,15 +19745,15 @@
           <w:iCs/>
           <w:i/>
         </w:rPr>
-        <w:t xml:space="preserve">Journal of International Business Studies, 39</w:t>
-      </w:r>
-      <w:r>
-        <w:t xml:space="preserve">(6), 957–979.</w:t>
-      </w:r>
-      <w:r>
-        <w:t xml:space="preserve"> </w:t>
-      </w:r>
-      <w:hyperlink r:id="rId89">
+        <w:t xml:space="preserve">Journal of International Business Studies</w:t>
+      </w:r>
+      <w:r>
+        <w:t xml:space="preserve">, Vol. 39 No. 6, pp.957-979,</w:t>
+      </w:r>
+      <w:r>
+        <w:t xml:space="preserve"> </w:t>
+      </w:r>
+      <w:hyperlink r:id="rId91">
         <w:r>
           <w:rPr>
             <w:rStyle w:val="Hyperlink"/>
@@ -19703,11 +19761,13 @@
           <w:t xml:space="preserve">https://doi.org/10.1057/palgrave.jibs.8400390</w:t>
         </w:r>
       </w:hyperlink>
-      <w:r>
-        <w:t xml:space="preserve"> </w:t>
-      </w:r>
-      <w:r>
-        <w:t xml:space="preserve">Eisenhardt, K. M., &amp; Martin, J. A. (2000). Dynamic capabilities: What are they?</w:t>
+    </w:p>
+    <w:p>
+      <w:pPr>
+        <w:pStyle w:val="BodyText"/>
+      </w:pPr>
+      <w:r>
+        <w:t xml:space="preserve">Eisenhardt, K.M. and Martin, J.A. (2000), "Dynamic capabilities: what are they?",</w:t>
       </w:r>
       <w:r>
         <w:t xml:space="preserve"> </w:t>
@@ -19717,27 +19777,32 @@
           <w:iCs/>
           <w:i/>
         </w:rPr>
-        <w:t xml:space="preserve">Strategic Management Journal, 21</w:t>
-      </w:r>
-      <w:r>
-        <w:t xml:space="preserve">(10–11), 1105–1121.</w:t>
-      </w:r>
-      <w:r>
-        <w:t xml:space="preserve"> </w:t>
-      </w:r>
-      <w:hyperlink r:id="rId90">
+        <w:t xml:space="preserve">Strategic Management Journal</w:t>
+      </w:r>
+      <w:r>
+        <w:t xml:space="preserve">, Vol. 21 No. 10-11, pp.1105-1121,</w:t>
+      </w:r>
+      <w:r>
+        <w:t xml:space="preserve"> </w:t>
+      </w:r>
+      <w:hyperlink r:id="rId92">
         <w:r>
           <w:rPr>
             <w:rStyle w:val="Hyperlink"/>
           </w:rPr>
-          <w:t xml:space="preserve">https://doi.org/10.1002/1097-0266(200010/11)21:10/11%3C1105::AID-SMJ133%3E3.0.CO;2-E</w:t>
+          <w:t xml:space="preserve">https://doi.org/10.1002/1097-0266(200010/11)21:10/11</w:t>
         </w:r>
       </w:hyperlink>
       <w:r>
-        <w:t xml:space="preserve"> </w:t>
-      </w:r>
-      <w:r>
-        <w:t xml:space="preserve">Goldfarb, A., &amp; Tucker, C. (2019). Digital economics.</w:t>
+        <w:t xml:space="preserve">&lt;1105::AID-SMJ133&gt;3.0.CO;2-E</w:t>
+      </w:r>
+    </w:p>
+    <w:p>
+      <w:pPr>
+        <w:pStyle w:val="BodyText"/>
+      </w:pPr>
+      <w:r>
+        <w:t xml:space="preserve">Goldfarb, A. and Tucker, C. (2019), "Digital economics",</w:t>
       </w:r>
       <w:r>
         <w:t xml:space="preserve"> </w:t>
@@ -19747,15 +19812,15 @@
           <w:iCs/>
           <w:i/>
         </w:rPr>
-        <w:t xml:space="preserve">Journal of Economic Literature, 57</w:t>
-      </w:r>
-      <w:r>
-        <w:t xml:space="preserve">(1), 3–43.</w:t>
-      </w:r>
-      <w:r>
-        <w:t xml:space="preserve"> </w:t>
-      </w:r>
-      <w:hyperlink r:id="rId91">
+        <w:t xml:space="preserve">Journal of Economic Literature</w:t>
+      </w:r>
+      <w:r>
+        <w:t xml:space="preserve">, Vol. 57 No. 1, pp.3-43,</w:t>
+      </w:r>
+      <w:r>
+        <w:t xml:space="preserve"> </w:t>
+      </w:r>
+      <w:hyperlink r:id="rId93">
         <w:r>
           <w:rPr>
             <w:rStyle w:val="Hyperlink"/>
@@ -19763,11 +19828,13 @@
           <w:t xml:space="preserve">https://doi.org/10.1257/jel.20171452</w:t>
         </w:r>
       </w:hyperlink>
-      <w:r>
-        <w:t xml:space="preserve"> </w:t>
-      </w:r>
-      <w:r>
-        <w:t xml:space="preserve">Haans, R. F. J., Pieters, C., &amp; He, Z.-L. (2016). Thinking about U: Theorizing and testing U- and inverted U-shaped relationships in strategy research.</w:t>
+    </w:p>
+    <w:p>
+      <w:pPr>
+        <w:pStyle w:val="BodyText"/>
+      </w:pPr>
+      <w:r>
+        <w:t xml:space="preserve">Haans, R.F.J., Pieters, C. and He, Z.-L. (2016), "Thinking about U: theorizing and testing U- and inverted U-shaped relationships in strategy research",</w:t>
       </w:r>
       <w:r>
         <w:t xml:space="preserve"> </w:t>
@@ -19777,15 +19844,15 @@
           <w:iCs/>
           <w:i/>
         </w:rPr>
-        <w:t xml:space="preserve">Strategic Management Journal, 37</w:t>
-      </w:r>
-      <w:r>
-        <w:t xml:space="preserve">(7), 1177–1195.</w:t>
-      </w:r>
-      <w:r>
-        <w:t xml:space="preserve"> </w:t>
-      </w:r>
-      <w:hyperlink r:id="rId92">
+        <w:t xml:space="preserve">Strategic Management Journal</w:t>
+      </w:r>
+      <w:r>
+        <w:t xml:space="preserve">, Vol. 37 No. 7, pp.1177-1195,</w:t>
+      </w:r>
+      <w:r>
+        <w:t xml:space="preserve"> </w:t>
+      </w:r>
+      <w:hyperlink r:id="rId94">
         <w:r>
           <w:rPr>
             <w:rStyle w:val="Hyperlink"/>
@@ -19793,11 +19860,13 @@
           <w:t xml:space="preserve">https://doi.org/10.1002/smj.2399</w:t>
         </w:r>
       </w:hyperlink>
-      <w:r>
-        <w:t xml:space="preserve"> </w:t>
-      </w:r>
-      <w:r>
-        <w:t xml:space="preserve">Hanelt, A., Bohnsack, R., Marz, D., &amp; Antunes Marante, C. (2021). A systematic review of the literature on digital transformation: Insights and implications for strategy and organizational change.</w:t>
+    </w:p>
+    <w:p>
+      <w:pPr>
+        <w:pStyle w:val="BodyText"/>
+      </w:pPr>
+      <w:r>
+        <w:t xml:space="preserve">Hanelt, A., Bohnsack, R., Marz, D. and Antunes Marante, C. (2021), "A systematic review of the literature on digital transformation: insights and implications for strategy and organizational change",</w:t>
       </w:r>
       <w:r>
         <w:t xml:space="preserve"> </w:t>
@@ -19807,15 +19876,15 @@
           <w:iCs/>
           <w:i/>
         </w:rPr>
-        <w:t xml:space="preserve">Journal of Management Studies, 58</w:t>
-      </w:r>
-      <w:r>
-        <w:t xml:space="preserve">(5), 1159–1197.</w:t>
-      </w:r>
-      <w:r>
-        <w:t xml:space="preserve"> </w:t>
-      </w:r>
-      <w:hyperlink r:id="rId93">
+        <w:t xml:space="preserve">Journal of Management Studies</w:t>
+      </w:r>
+      <w:r>
+        <w:t xml:space="preserve">, Vol. 58 No. 5, pp.1159-1197,</w:t>
+      </w:r>
+      <w:r>
+        <w:t xml:space="preserve"> </w:t>
+      </w:r>
+      <w:hyperlink r:id="rId95">
         <w:r>
           <w:rPr>
             <w:rStyle w:val="Hyperlink"/>
@@ -19823,11 +19892,13 @@
           <w:t xml:space="preserve">https://doi.org/10.1111/joms.12639</w:t>
         </w:r>
       </w:hyperlink>
-      <w:r>
-        <w:t xml:space="preserve"> </w:t>
-      </w:r>
-      <w:r>
-        <w:t xml:space="preserve">Heckman, J. J. (1979). Sample selection bias as a specification error.</w:t>
+    </w:p>
+    <w:p>
+      <w:pPr>
+        <w:pStyle w:val="BodyText"/>
+      </w:pPr>
+      <w:r>
+        <w:t xml:space="preserve">Heckman, J.J. (1979), "Sample selection bias as a specification error",</w:t>
       </w:r>
       <w:r>
         <w:t xml:space="preserve"> </w:t>
@@ -19837,15 +19908,15 @@
           <w:iCs/>
           <w:i/>
         </w:rPr>
-        <w:t xml:space="preserve">Econometrica, 47</w:t>
-      </w:r>
-      <w:r>
-        <w:t xml:space="preserve">(1), 153–161.</w:t>
-      </w:r>
-      <w:r>
-        <w:t xml:space="preserve"> </w:t>
-      </w:r>
-      <w:hyperlink r:id="rId94">
+        <w:t xml:space="preserve">Econometrica</w:t>
+      </w:r>
+      <w:r>
+        <w:t xml:space="preserve">, Vol. 47 No. 1, pp.153-161,</w:t>
+      </w:r>
+      <w:r>
+        <w:t xml:space="preserve"> </w:t>
+      </w:r>
+      <w:hyperlink r:id="rId96">
         <w:r>
           <w:rPr>
             <w:rStyle w:val="Hyperlink"/>
@@ -19853,11 +19924,13 @@
           <w:t xml:space="preserve">https://doi.org/10.2307/1912352</w:t>
         </w:r>
       </w:hyperlink>
-      <w:r>
-        <w:t xml:space="preserve"> </w:t>
-      </w:r>
-      <w:r>
-        <w:t xml:space="preserve">Hennart, J.-F. (2007). The theoretical rationale for a multinationality–performance relationship.</w:t>
+    </w:p>
+    <w:p>
+      <w:pPr>
+        <w:pStyle w:val="BodyText"/>
+      </w:pPr>
+      <w:r>
+        <w:t xml:space="preserve">Hennart, J.-F. (2007), "The theoretical rationale for a multinationality-performance relationship",</w:t>
       </w:r>
       <w:r>
         <w:t xml:space="preserve"> </w:t>
@@ -19867,15 +19940,15 @@
           <w:iCs/>
           <w:i/>
         </w:rPr>
-        <w:t xml:space="preserve">Management International Review, 47</w:t>
-      </w:r>
-      <w:r>
-        <w:t xml:space="preserve">(3), 423–452.</w:t>
-      </w:r>
-      <w:r>
-        <w:t xml:space="preserve"> </w:t>
-      </w:r>
-      <w:hyperlink r:id="rId95">
+        <w:t xml:space="preserve">Management International Review</w:t>
+      </w:r>
+      <w:r>
+        <w:t xml:space="preserve">, Vol. 47 No. 3, pp.423-452,</w:t>
+      </w:r>
+      <w:r>
+        <w:t xml:space="preserve"> </w:t>
+      </w:r>
+      <w:hyperlink r:id="rId97">
         <w:r>
           <w:rPr>
             <w:rStyle w:val="Hyperlink"/>
@@ -19883,11 +19956,13 @@
           <w:t xml:space="preserve">https://doi.org/10.1007/s11575-007-0023-3</w:t>
         </w:r>
       </w:hyperlink>
-      <w:r>
-        <w:t xml:space="preserve"> </w:t>
-      </w:r>
-      <w:r>
-        <w:t xml:space="preserve">Hennart, J.-F. (2011). A theoretical assessment of the empirical literature on the impact of multinationality on performance.</w:t>
+    </w:p>
+    <w:p>
+      <w:pPr>
+        <w:pStyle w:val="BodyText"/>
+      </w:pPr>
+      <w:r>
+        <w:t xml:space="preserve">Hennart, J.-F. (2011), "A theoretical assessment of the empirical literature on the impact of multinationality on performance",</w:t>
       </w:r>
       <w:r>
         <w:t xml:space="preserve"> </w:t>
@@ -19897,15 +19972,15 @@
           <w:iCs/>
           <w:i/>
         </w:rPr>
-        <w:t xml:space="preserve">Global Strategy Journal, 1</w:t>
-      </w:r>
-      <w:r>
-        <w:t xml:space="preserve">(1–2), 135–151.</w:t>
-      </w:r>
-      <w:r>
-        <w:t xml:space="preserve"> </w:t>
-      </w:r>
-      <w:hyperlink r:id="rId96">
+        <w:t xml:space="preserve">Global Strategy Journal</w:t>
+      </w:r>
+      <w:r>
+        <w:t xml:space="preserve">, Vol. 1 No. 1-2, pp.135-151,</w:t>
+      </w:r>
+      <w:r>
+        <w:t xml:space="preserve"> </w:t>
+      </w:r>
+      <w:hyperlink r:id="rId98">
         <w:r>
           <w:rPr>
             <w:rStyle w:val="Hyperlink"/>
@@ -19913,11 +19988,45 @@
           <w:t xml:space="preserve">https://doi.org/10.1002/gsj.8</w:t>
         </w:r>
       </w:hyperlink>
-      <w:r>
-        <w:t xml:space="preserve"> </w:t>
-      </w:r>
-      <w:r>
-        <w:t xml:space="preserve">International Telecommunication Union. (2026).</w:t>
+    </w:p>
+    <w:p>
+      <w:pPr>
+        <w:pStyle w:val="BodyText"/>
+      </w:pPr>
+      <w:r>
+        <w:t xml:space="preserve">Hitt, M.A., Hoskisson, R.E. and Kim, H. (1997), "International diversification: effects on innovation and firm performance in product-diversified firms",</w:t>
+      </w:r>
+      <w:r>
+        <w:t xml:space="preserve"> </w:t>
+      </w:r>
+      <w:r>
+        <w:rPr>
+          <w:iCs/>
+          <w:i/>
+        </w:rPr>
+        <w:t xml:space="preserve">Academy of Management Journal</w:t>
+      </w:r>
+      <w:r>
+        <w:t xml:space="preserve">, Vol. 40 No. 4, pp.767-798,</w:t>
+      </w:r>
+      <w:r>
+        <w:t xml:space="preserve"> </w:t>
+      </w:r>
+      <w:hyperlink r:id="rId99">
+        <w:r>
+          <w:rPr>
+            <w:rStyle w:val="Hyperlink"/>
+          </w:rPr>
+          <w:t xml:space="preserve">https://doi.org/10.2307/256948</w:t>
+        </w:r>
+      </w:hyperlink>
+    </w:p>
+    <w:p>
+      <w:pPr>
+        <w:pStyle w:val="BodyText"/>
+      </w:pPr>
+      <w:r>
+        <w:t xml:space="preserve">International Telecommunication Union (2026),</w:t>
       </w:r>
       <w:r>
         <w:t xml:space="preserve"> </w:t>
@@ -19933,12 +20042,12 @@
         <w:t xml:space="preserve"> </w:t>
       </w:r>
       <w:r>
-        <w:t xml:space="preserve">[Data set]. Retrieved May 9, 2026, from</w:t>
-      </w:r>
-      <w:r>
-        <w:t xml:space="preserve"> </w:t>
-      </w:r>
-      <w:hyperlink r:id="rId97">
+        <w:t xml:space="preserve">[data set], available at:</w:t>
+      </w:r>
+      <w:r>
+        <w:t xml:space="preserve"> </w:t>
+      </w:r>
+      <w:hyperlink r:id="rId100">
         <w:r>
           <w:rPr>
             <w:rStyle w:val="Hyperlink"/>
@@ -19950,7 +20059,15 @@
         <w:t xml:space="preserve"> </w:t>
       </w:r>
       <w:r>
-        <w:t xml:space="preserve">Karna, A., Richter, A., &amp; Riesenkampff, E. (2016). Revisiting the role of the environment in the capabilities–financial performance relationship: A meta-analysis.</w:t>
+        <w:t xml:space="preserve">(accessed 9 May 2026).</w:t>
+      </w:r>
+    </w:p>
+    <w:p>
+      <w:pPr>
+        <w:pStyle w:val="BodyText"/>
+      </w:pPr>
+      <w:r>
+        <w:t xml:space="preserve">Johanson, J. and Vahlne, J.-E. (1977), "The internationalization process of the firm: a model of knowledge development and increasing foreign market commitments",</w:t>
       </w:r>
       <w:r>
         <w:t xml:space="preserve"> </w:t>
@@ -19960,15 +20077,79 @@
           <w:iCs/>
           <w:i/>
         </w:rPr>
-        <w:t xml:space="preserve">Strategic Management Journal, 37</w:t>
-      </w:r>
-      <w:r>
-        <w:t xml:space="preserve">(6), 1154–1173.</w:t>
-      </w:r>
-      <w:r>
-        <w:t xml:space="preserve"> </w:t>
-      </w:r>
-      <w:hyperlink r:id="rId98">
+        <w:t xml:space="preserve">Journal of International Business Studies</w:t>
+      </w:r>
+      <w:r>
+        <w:t xml:space="preserve">, Vol. 8 No. 1, pp.23-32,</w:t>
+      </w:r>
+      <w:r>
+        <w:t xml:space="preserve"> </w:t>
+      </w:r>
+      <w:hyperlink r:id="rId101">
+        <w:r>
+          <w:rPr>
+            <w:rStyle w:val="Hyperlink"/>
+          </w:rPr>
+          <w:t xml:space="preserve">https://doi.org/10.1057/palgrave.jibs.8490676</w:t>
+        </w:r>
+      </w:hyperlink>
+    </w:p>
+    <w:p>
+      <w:pPr>
+        <w:pStyle w:val="BodyText"/>
+      </w:pPr>
+      <w:r>
+        <w:t xml:space="preserve">Johanson, J. and Vahlne, J.-E. (2009), "The Uppsala internationalization process model revisited: from liability of foreignness to liability of outsidership",</w:t>
+      </w:r>
+      <w:r>
+        <w:t xml:space="preserve"> </w:t>
+      </w:r>
+      <w:r>
+        <w:rPr>
+          <w:iCs/>
+          <w:i/>
+        </w:rPr>
+        <w:t xml:space="preserve">Journal of International Business Studies</w:t>
+      </w:r>
+      <w:r>
+        <w:t xml:space="preserve">, Vol. 40 No. 9, pp.1411-1431,</w:t>
+      </w:r>
+      <w:r>
+        <w:t xml:space="preserve"> </w:t>
+      </w:r>
+      <w:hyperlink r:id="rId102">
+        <w:r>
+          <w:rPr>
+            <w:rStyle w:val="Hyperlink"/>
+          </w:rPr>
+          <w:t xml:space="preserve">https://doi.org/10.1057/jibs.2009.24</w:t>
+        </w:r>
+      </w:hyperlink>
+    </w:p>
+    <w:p>
+      <w:pPr>
+        <w:pStyle w:val="BodyText"/>
+      </w:pPr>
+      <w:r>
+        <w:t xml:space="preserve">Karna, A., Richter, A. and Riesenkampff, E. (2016), "Revisiting the role of the environment in the capabilities-financial performance relationship: a meta-analysis",</w:t>
+      </w:r>
+      <w:r>
+        <w:t xml:space="preserve"> </w:t>
+      </w:r>
+      <w:r>
+        <w:rPr>
+          <w:iCs/>
+          <w:i/>
+        </w:rPr>
+        <w:t xml:space="preserve">Strategic Management Journal</w:t>
+      </w:r>
+      <w:r>
+        <w:t xml:space="preserve">, Vol. 37 No. 6, pp.1154-1173,</w:t>
+      </w:r>
+      <w:r>
+        <w:t xml:space="preserve"> </w:t>
+      </w:r>
+      <w:hyperlink r:id="rId103">
         <w:r>
           <w:rPr>
             <w:rStyle w:val="Hyperlink"/>
@@ -19976,11 +20157,13 @@
           <w:t xml:space="preserve">https://doi.org/10.1002/smj.2379</w:t>
         </w:r>
       </w:hyperlink>
-      <w:r>
-        <w:t xml:space="preserve"> </w:t>
-      </w:r>
-      <w:r>
-        <w:t xml:space="preserve">Knight, G. A., &amp; Liesch, P. W. (2016). Internationalization: From incremental to born global.</w:t>
+    </w:p>
+    <w:p>
+      <w:pPr>
+        <w:pStyle w:val="BodyText"/>
+      </w:pPr>
+      <w:r>
+        <w:t xml:space="preserve">Knight, G.A. and Liesch, P.W. (2016), "Internationalization: from incremental to born global",</w:t>
       </w:r>
       <w:r>
         <w:t xml:space="preserve"> </w:t>
@@ -19990,15 +20173,15 @@
           <w:iCs/>
           <w:i/>
         </w:rPr>
-        <w:t xml:space="preserve">Journal of World Business, 51</w:t>
-      </w:r>
-      <w:r>
-        <w:t xml:space="preserve">(1), 93–102.</w:t>
-      </w:r>
-      <w:r>
-        <w:t xml:space="preserve"> </w:t>
-      </w:r>
-      <w:hyperlink r:id="rId99">
+        <w:t xml:space="preserve">Journal of World Business</w:t>
+      </w:r>
+      <w:r>
+        <w:t xml:space="preserve">, Vol. 51 No. 1, pp.93-102,</w:t>
+      </w:r>
+      <w:r>
+        <w:t xml:space="preserve"> </w:t>
+      </w:r>
+      <w:hyperlink r:id="rId104">
         <w:r>
           <w:rPr>
             <w:rStyle w:val="Hyperlink"/>
@@ -20006,11 +20189,13 @@
           <w:t xml:space="preserve">https://doi.org/10.1016/j.jwb.2015.08.011</w:t>
         </w:r>
       </w:hyperlink>
-      <w:r>
-        <w:t xml:space="preserve"> </w:t>
-      </w:r>
-      <w:r>
-        <w:t xml:space="preserve">Lall, S. (1992). Technological capabilities and industrialization.</w:t>
+    </w:p>
+    <w:p>
+      <w:pPr>
+        <w:pStyle w:val="BodyText"/>
+      </w:pPr>
+      <w:r>
+        <w:t xml:space="preserve">Lall, S. (1992), "Technological capabilities and industrialization",</w:t>
       </w:r>
       <w:r>
         <w:t xml:space="preserve"> </w:t>
@@ -20020,15 +20205,15 @@
           <w:iCs/>
           <w:i/>
         </w:rPr>
-        <w:t xml:space="preserve">World Development, 20</w:t>
-      </w:r>
-      <w:r>
-        <w:t xml:space="preserve">(2), 165–186.</w:t>
-      </w:r>
-      <w:r>
-        <w:t xml:space="preserve"> </w:t>
-      </w:r>
-      <w:hyperlink r:id="rId100">
+        <w:t xml:space="preserve">World Development</w:t>
+      </w:r>
+      <w:r>
+        <w:t xml:space="preserve">, Vol. 20 No. 2, pp.165-186,</w:t>
+      </w:r>
+      <w:r>
+        <w:t xml:space="preserve"> </w:t>
+      </w:r>
+      <w:hyperlink r:id="rId105">
         <w:r>
           <w:rPr>
             <w:rStyle w:val="Hyperlink"/>
@@ -20036,11 +20221,13 @@
           <w:t xml:space="preserve">https://doi.org/10.1016/0305-750X(92)90097-F</w:t>
         </w:r>
       </w:hyperlink>
-      <w:r>
-        <w:t xml:space="preserve"> </w:t>
-      </w:r>
-      <w:r>
-        <w:t xml:space="preserve">Lind, J. T., &amp; Mehlum, H. (2010). With or without U? The appropriate test for a U-shaped relationship.</w:t>
+    </w:p>
+    <w:p>
+      <w:pPr>
+        <w:pStyle w:val="BodyText"/>
+      </w:pPr>
+      <w:r>
+        <w:t xml:space="preserve">Lind, J.T. and Mehlum, H. (2010), "With or without U? The appropriate test for a U-shaped relationship",</w:t>
       </w:r>
       <w:r>
         <w:t xml:space="preserve"> </w:t>
@@ -20050,15 +20237,15 @@
           <w:iCs/>
           <w:i/>
         </w:rPr>
-        <w:t xml:space="preserve">Oxford Bulletin of Economics and Statistics, 72</w:t>
-      </w:r>
-      <w:r>
-        <w:t xml:space="preserve">(1), 109–118.</w:t>
-      </w:r>
-      <w:r>
-        <w:t xml:space="preserve"> </w:t>
-      </w:r>
-      <w:hyperlink r:id="rId101">
+        <w:t xml:space="preserve">Oxford Bulletin of Economics and Statistics</w:t>
+      </w:r>
+      <w:r>
+        <w:t xml:space="preserve">, Vol. 72 No. 1, pp.109-118,</w:t>
+      </w:r>
+      <w:r>
+        <w:t xml:space="preserve"> </w:t>
+      </w:r>
+      <w:hyperlink r:id="rId106">
         <w:r>
           <w:rPr>
             <w:rStyle w:val="Hyperlink"/>
@@ -20066,11 +20253,13 @@
           <w:t xml:space="preserve">https://doi.org/10.1111/j.1468-0084.2009.00569.x</w:t>
         </w:r>
       </w:hyperlink>
-      <w:r>
-        <w:t xml:space="preserve"> </w:t>
-      </w:r>
-      <w:r>
-        <w:t xml:space="preserve">Lu, J. W., &amp; Beamish, P. W. (2004). International diversification and firm performance: The S-curve hypothesis.</w:t>
+    </w:p>
+    <w:p>
+      <w:pPr>
+        <w:pStyle w:val="BodyText"/>
+      </w:pPr>
+      <w:r>
+        <w:t xml:space="preserve">Lu, J.W. and Beamish, P.W. (2004), "International diversification and firm performance: the S-curve hypothesis",</w:t>
       </w:r>
       <w:r>
         <w:t xml:space="preserve"> </w:t>
@@ -20080,15 +20269,15 @@
           <w:iCs/>
           <w:i/>
         </w:rPr>
-        <w:t xml:space="preserve">Academy of Management Journal, 47</w:t>
-      </w:r>
-      <w:r>
-        <w:t xml:space="preserve">(4), 598–609.</w:t>
-      </w:r>
-      <w:r>
-        <w:t xml:space="preserve"> </w:t>
-      </w:r>
-      <w:hyperlink r:id="rId102">
+        <w:t xml:space="preserve">Academy of Management Journal</w:t>
+      </w:r>
+      <w:r>
+        <w:t xml:space="preserve">, Vol. 47 No. 4, pp.598-609,</w:t>
+      </w:r>
+      <w:r>
+        <w:t xml:space="preserve"> </w:t>
+      </w:r>
+      <w:hyperlink r:id="rId107">
         <w:r>
           <w:rPr>
             <w:rStyle w:val="Hyperlink"/>
@@ -20096,11 +20285,13 @@
           <w:t xml:space="preserve">https://doi.org/10.2307/20159604</w:t>
         </w:r>
       </w:hyperlink>
-      <w:r>
-        <w:t xml:space="preserve"> </w:t>
-      </w:r>
-      <w:r>
-        <w:t xml:space="preserve">Marano, V., Arregle, J.-L., Hitt, M. A., Spadafora, E., &amp; van Essen, M. (2016). Home country institutions and the internationalization–performance relationship: A meta-analytic review.</w:t>
+    </w:p>
+    <w:p>
+      <w:pPr>
+        <w:pStyle w:val="BodyText"/>
+      </w:pPr>
+      <w:r>
+        <w:t xml:space="preserve">Marano, V., Arregle, J.-L., Hitt, M.A., Spadafora, E. and van Essen, M. (2016), "Home country institutions and the internationalization-performance relationship: a meta-analytic review",</w:t>
       </w:r>
       <w:r>
         <w:t xml:space="preserve"> </w:t>
@@ -20110,15 +20301,15 @@
           <w:iCs/>
           <w:i/>
         </w:rPr>
-        <w:t xml:space="preserve">Journal of Management, 42</w:t>
-      </w:r>
-      <w:r>
-        <w:t xml:space="preserve">(5), 1075–1110.</w:t>
-      </w:r>
-      <w:r>
-        <w:t xml:space="preserve"> </w:t>
-      </w:r>
-      <w:hyperlink r:id="rId103">
+        <w:t xml:space="preserve">Journal of Management</w:t>
+      </w:r>
+      <w:r>
+        <w:t xml:space="preserve">, Vol. 42 No. 5, pp.1075-1110,</w:t>
+      </w:r>
+      <w:r>
+        <w:t xml:space="preserve"> </w:t>
+      </w:r>
+      <w:hyperlink r:id="rId108">
         <w:r>
           <w:rPr>
             <w:rStyle w:val="Hyperlink"/>
@@ -20126,11 +20317,13 @@
           <w:t xml:space="preserve">https://doi.org/10.1177/0149206315624963</w:t>
         </w:r>
       </w:hyperlink>
-      <w:r>
-        <w:t xml:space="preserve"> </w:t>
-      </w:r>
-      <w:r>
-        <w:t xml:space="preserve">Nambisan, S., Wright, M., &amp; Feldman, M. (2019). The digital transformation of innovation and entrepreneurship: Progress, challenges and key themes.</w:t>
+    </w:p>
+    <w:p>
+      <w:pPr>
+        <w:pStyle w:val="BodyText"/>
+      </w:pPr>
+      <w:r>
+        <w:t xml:space="preserve">Nambisan, S., Wright, M. and Feldman, M. (2019), "The digital transformation of innovation and entrepreneurship: progress, challenges and key themes",</w:t>
       </w:r>
       <w:r>
         <w:t xml:space="preserve"> </w:t>
@@ -20140,15 +20333,15 @@
           <w:iCs/>
           <w:i/>
         </w:rPr>
-        <w:t xml:space="preserve">Research Policy, 48</w:t>
-      </w:r>
-      <w:r>
-        <w:t xml:space="preserve">(8), 103773.</w:t>
-      </w:r>
-      <w:r>
-        <w:t xml:space="preserve"> </w:t>
-      </w:r>
-      <w:hyperlink r:id="rId104">
+        <w:t xml:space="preserve">Research Policy</w:t>
+      </w:r>
+      <w:r>
+        <w:t xml:space="preserve">, Vol. 48 No. 8, p.103773,</w:t>
+      </w:r>
+      <w:r>
+        <w:t xml:space="preserve"> </w:t>
+      </w:r>
+      <w:hyperlink r:id="rId109">
         <w:r>
           <w:rPr>
             <w:rStyle w:val="Hyperlink"/>
@@ -20156,11 +20349,13 @@
           <w:t xml:space="preserve">https://doi.org/10.1016/j.respol.2019.03.018</w:t>
         </w:r>
       </w:hyperlink>
-      <w:r>
-        <w:t xml:space="preserve"> </w:t>
-      </w:r>
-      <w:r>
-        <w:t xml:space="preserve">Oster, E. (2019). Unobservable selection and coefficient stability: Theory and evidence.</w:t>
+    </w:p>
+    <w:p>
+      <w:pPr>
+        <w:pStyle w:val="BodyText"/>
+      </w:pPr>
+      <w:r>
+        <w:t xml:space="preserve">Oster, E. (2019), "Unobservable selection and coefficient stability: theory and evidence",</w:t>
       </w:r>
       <w:r>
         <w:t xml:space="preserve"> </w:t>
@@ -20170,15 +20365,15 @@
           <w:iCs/>
           <w:i/>
         </w:rPr>
-        <w:t xml:space="preserve">Journal of Business &amp; Economic Statistics, 37</w:t>
-      </w:r>
-      <w:r>
-        <w:t xml:space="preserve">(2), 187–204.</w:t>
-      </w:r>
-      <w:r>
-        <w:t xml:space="preserve"> </w:t>
-      </w:r>
-      <w:hyperlink r:id="rId105">
+        <w:t xml:space="preserve">Journal of Business &amp; Economic Statistics</w:t>
+      </w:r>
+      <w:r>
+        <w:t xml:space="preserve">, Vol. 37 No. 2, pp.187-204,</w:t>
+      </w:r>
+      <w:r>
+        <w:t xml:space="preserve"> </w:t>
+      </w:r>
+      <w:hyperlink r:id="rId110">
         <w:r>
           <w:rPr>
             <w:rStyle w:val="Hyperlink"/>
@@ -20186,11 +20381,13 @@
           <w:t xml:space="preserve">https://doi.org/10.1080/07350015.2016.1227711</w:t>
         </w:r>
       </w:hyperlink>
-      <w:r>
-        <w:t xml:space="preserve"> </w:t>
-      </w:r>
-      <w:r>
-        <w:t xml:space="preserve">Paternoster, R., Brame, R., Mazerolle, P., &amp; Piquero, A. (1998). Using the correct statistical test for the equality of regression coefficients.</w:t>
+    </w:p>
+    <w:p>
+      <w:pPr>
+        <w:pStyle w:val="BodyText"/>
+      </w:pPr>
+      <w:r>
+        <w:t xml:space="preserve">Paternoster, R., Brame, R., Mazerolle, P. and Piquero, A. (1998), "Using the correct statistical test for the equality of regression coefficients",</w:t>
       </w:r>
       <w:r>
         <w:t xml:space="preserve"> </w:t>
@@ -20200,15 +20397,15 @@
           <w:iCs/>
           <w:i/>
         </w:rPr>
-        <w:t xml:space="preserve">Criminology, 36</w:t>
-      </w:r>
-      <w:r>
-        <w:t xml:space="preserve">(4), 859–866.</w:t>
-      </w:r>
-      <w:r>
-        <w:t xml:space="preserve"> </w:t>
-      </w:r>
-      <w:hyperlink r:id="rId106">
+        <w:t xml:space="preserve">Criminology</w:t>
+      </w:r>
+      <w:r>
+        <w:t xml:space="preserve">, Vol. 36 No. 4, pp.859-866,</w:t>
+      </w:r>
+      <w:r>
+        <w:t xml:space="preserve"> </w:t>
+      </w:r>
+      <w:hyperlink r:id="rId111">
         <w:r>
           <w:rPr>
             <w:rStyle w:val="Hyperlink"/>
@@ -20216,11 +20413,13 @@
           <w:t xml:space="preserve">https://doi.org/10.1111/j.1745-9125.1998.tb01268.x</w:t>
         </w:r>
       </w:hyperlink>
-      <w:r>
-        <w:t xml:space="preserve"> </w:t>
-      </w:r>
-      <w:r>
-        <w:t xml:space="preserve">Petricevic, O., &amp; Teece, D. J. (2019). The structural reshaping of globalization: Implications for strategic sectors, profiting from innovation, and the multinational enterprise.</w:t>
+    </w:p>
+    <w:p>
+      <w:pPr>
+        <w:pStyle w:val="BodyText"/>
+      </w:pPr>
+      <w:r>
+        <w:t xml:space="preserve">Petricevic, O. and Teece, D.J. (2019), "The structural reshaping of globalization: implications for strategic sectors, profiting from innovation, and the multinational enterprise",</w:t>
       </w:r>
       <w:r>
         <w:t xml:space="preserve"> </w:t>
@@ -20230,15 +20429,15 @@
           <w:iCs/>
           <w:i/>
         </w:rPr>
-        <w:t xml:space="preserve">Journal of International Business Studies, 50</w:t>
-      </w:r>
-      <w:r>
-        <w:t xml:space="preserve">(9), 1487–1512.</w:t>
-      </w:r>
-      <w:r>
-        <w:t xml:space="preserve"> </w:t>
-      </w:r>
-      <w:hyperlink r:id="rId107">
+        <w:t xml:space="preserve">Journal of International Business Studies</w:t>
+      </w:r>
+      <w:r>
+        <w:t xml:space="preserve">, Vol. 50 No. 9, pp.1487-1512,</w:t>
+      </w:r>
+      <w:r>
+        <w:t xml:space="preserve"> </w:t>
+      </w:r>
+      <w:hyperlink r:id="rId112">
         <w:r>
           <w:rPr>
             <w:rStyle w:val="Hyperlink"/>
@@ -20246,11 +20445,13 @@
           <w:t xml:space="preserve">https://doi.org/10.1057/s41267-019-00269-x</w:t>
         </w:r>
       </w:hyperlink>
-      <w:r>
-        <w:t xml:space="preserve"> </w:t>
-      </w:r>
-      <w:r>
-        <w:t xml:space="preserve">Pisani, N., Garcia-Bernardo, J., &amp; Heemskerk, E. (2020). Does it pay to be a multinational? A large-sample, cross-national replication assessing the multinationality–performance relationship.</w:t>
+    </w:p>
+    <w:p>
+      <w:pPr>
+        <w:pStyle w:val="BodyText"/>
+      </w:pPr>
+      <w:r>
+        <w:t xml:space="preserve">Pisani, N., Garcia-Bernardo, J. and Heemskerk, E. (2020), "Does it pay to be a multinational? A large-sample, cross-national replication assessing the multinationality-performance relationship",</w:t>
       </w:r>
       <w:r>
         <w:t xml:space="preserve"> </w:t>
@@ -20260,15 +20461,15 @@
           <w:iCs/>
           <w:i/>
         </w:rPr>
-        <w:t xml:space="preserve">Strategic Management Journal, 41</w:t>
-      </w:r>
-      <w:r>
-        <w:t xml:space="preserve">(1), 152–172.</w:t>
-      </w:r>
-      <w:r>
-        <w:t xml:space="preserve"> </w:t>
-      </w:r>
-      <w:hyperlink r:id="rId108">
+        <w:t xml:space="preserve">Strategic Management Journal</w:t>
+      </w:r>
+      <w:r>
+        <w:t xml:space="preserve">, Vol. 41 No. 1, pp.152-172,</w:t>
+      </w:r>
+      <w:r>
+        <w:t xml:space="preserve"> </w:t>
+      </w:r>
+      <w:hyperlink r:id="rId113">
         <w:r>
           <w:rPr>
             <w:rStyle w:val="Hyperlink"/>
@@ -20276,32 +20477,18 @@
           <w:t xml:space="preserve">https://doi.org/10.1002/smj.3087</w:t>
         </w:r>
       </w:hyperlink>
-      <w:r>
-        <w:t xml:space="preserve"> </w:t>
-      </w:r>
-      <w:r>
-        <w:t xml:space="preserve">Prime Minister of Vietnam. (2020, June 3).</w:t>
-      </w:r>
-      <w:r>
-        <w:t xml:space="preserve"> </w:t>
-      </w:r>
-      <w:r>
-        <w:rPr>
-          <w:iCs/>
-          <w:i/>
-        </w:rPr>
-        <w:t xml:space="preserve">Decision No. 749/QD-TTg approving the "National Digital Transformation Programme by 2025, with orientations towards 2030"</w:t>
-      </w:r>
-      <w:r>
-        <w:t xml:space="preserve"> </w:t>
-      </w:r>
-      <w:r>
-        <w:t xml:space="preserve">[Policy document]. Retrieved May 9, 2026, from</w:t>
-      </w:r>
-      <w:r>
-        <w:t xml:space="preserve"> </w:t>
-      </w:r>
-      <w:hyperlink r:id="rId109">
+    </w:p>
+    <w:p>
+      <w:pPr>
+        <w:pStyle w:val="BodyText"/>
+      </w:pPr>
+      <w:r>
+        <w:t xml:space="preserve">Prime Minister of Vietnam (2020), "Decision No. 749/QD-TTg approving the 'National Digital Transformation Programme by 2025, with orientations towards 2030'", available at:</w:t>
+      </w:r>
+      <w:r>
+        <w:t xml:space="preserve"> </w:t>
+      </w:r>
+      <w:hyperlink r:id="rId114">
         <w:r>
           <w:rPr>
             <w:rStyle w:val="Hyperlink"/>
@@ -20313,7 +20500,15 @@
         <w:t xml:space="preserve"> </w:t>
       </w:r>
       <w:r>
-        <w:t xml:space="preserve">Shaver, J. M. (2020). Causal identification through a cumulative body of research in the study of strategy and organizations.</w:t>
+        <w:t xml:space="preserve">(accessed 9 May 2026).</w:t>
+      </w:r>
+    </w:p>
+    <w:p>
+      <w:pPr>
+        <w:pStyle w:val="BodyText"/>
+      </w:pPr>
+      <w:r>
+        <w:t xml:space="preserve">Shaver, J.M. (2020), "Causal identification through a cumulative body of research in the study of strategy and organizations",</w:t>
       </w:r>
       <w:r>
         <w:t xml:space="preserve"> </w:t>
@@ -20323,15 +20518,15 @@
           <w:iCs/>
           <w:i/>
         </w:rPr>
-        <w:t xml:space="preserve">Journal of Management, 46</w:t>
-      </w:r>
-      <w:r>
-        <w:t xml:space="preserve">(7), 1244–1256.</w:t>
-      </w:r>
-      <w:r>
-        <w:t xml:space="preserve"> </w:t>
-      </w:r>
-      <w:hyperlink r:id="rId110">
+        <w:t xml:space="preserve">Journal of Management</w:t>
+      </w:r>
+      <w:r>
+        <w:t xml:space="preserve">, Vol. 46 No. 7, pp.1244-1256,</w:t>
+      </w:r>
+      <w:r>
+        <w:t xml:space="preserve"> </w:t>
+      </w:r>
+      <w:hyperlink r:id="rId115">
         <w:r>
           <w:rPr>
             <w:rStyle w:val="Hyperlink"/>
@@ -20339,11 +20534,13 @@
           <w:t xml:space="preserve">https://doi.org/10.1177/0149206319846272</w:t>
         </w:r>
       </w:hyperlink>
-      <w:r>
-        <w:t xml:space="preserve"> </w:t>
-      </w:r>
-      <w:r>
-        <w:t xml:space="preserve">Staiger, D., &amp; Stock, J. H. (1997). Instrumental variables regression with weak instruments.</w:t>
+    </w:p>
+    <w:p>
+      <w:pPr>
+        <w:pStyle w:val="BodyText"/>
+      </w:pPr>
+      <w:r>
+        <w:t xml:space="preserve">Staiger, D. and Stock, J.H. (1997), "Instrumental variables regression with weak instruments",</w:t>
       </w:r>
       <w:r>
         <w:t xml:space="preserve"> </w:t>
@@ -20353,15 +20550,15 @@
           <w:iCs/>
           <w:i/>
         </w:rPr>
-        <w:t xml:space="preserve">Econometrica, 65</w:t>
-      </w:r>
-      <w:r>
-        <w:t xml:space="preserve">(3), 557–586.</w:t>
-      </w:r>
-      <w:r>
-        <w:t xml:space="preserve"> </w:t>
-      </w:r>
-      <w:hyperlink r:id="rId111">
+        <w:t xml:space="preserve">Econometrica</w:t>
+      </w:r>
+      <w:r>
+        <w:t xml:space="preserve">, Vol. 65 No. 3, pp.557-586,</w:t>
+      </w:r>
+      <w:r>
+        <w:t xml:space="preserve"> </w:t>
+      </w:r>
+      <w:hyperlink r:id="rId116">
         <w:r>
           <w:rPr>
             <w:rStyle w:val="Hyperlink"/>
@@ -20369,11 +20566,13 @@
           <w:t xml:space="preserve">https://doi.org/10.2307/2171753</w:t>
         </w:r>
       </w:hyperlink>
-      <w:r>
-        <w:t xml:space="preserve"> </w:t>
-      </w:r>
-      <w:r>
-        <w:t xml:space="preserve">Stallkamp, M., &amp; Schotter, A. P. J. (2021). Platforms without borders? The international strategies of digital platform firms.</w:t>
+    </w:p>
+    <w:p>
+      <w:pPr>
+        <w:pStyle w:val="BodyText"/>
+      </w:pPr>
+      <w:r>
+        <w:t xml:space="preserve">Stallkamp, M. and Schotter, A.P.J. (2021), "Platforms without borders? The international strategies of digital platform firms",</w:t>
       </w:r>
       <w:r>
         <w:t xml:space="preserve"> </w:t>
@@ -20383,15 +20582,15 @@
           <w:iCs/>
           <w:i/>
         </w:rPr>
-        <w:t xml:space="preserve">Global Strategy Journal, 11</w:t>
-      </w:r>
-      <w:r>
-        <w:t xml:space="preserve">(1), 58–80.</w:t>
-      </w:r>
-      <w:r>
-        <w:t xml:space="preserve"> </w:t>
-      </w:r>
-      <w:hyperlink r:id="rId112">
+        <w:t xml:space="preserve">Global Strategy Journal</w:t>
+      </w:r>
+      <w:r>
+        <w:t xml:space="preserve">, Vol. 11 No. 1, pp.58-80,</w:t>
+      </w:r>
+      <w:r>
+        <w:t xml:space="preserve"> </w:t>
+      </w:r>
+      <w:hyperlink r:id="rId117">
         <w:r>
           <w:rPr>
             <w:rStyle w:val="Hyperlink"/>
@@ -20399,11 +20598,13 @@
           <w:t xml:space="preserve">https://doi.org/10.1002/gsj.1336</w:t>
         </w:r>
       </w:hyperlink>
-      <w:r>
-        <w:t xml:space="preserve"> </w:t>
-      </w:r>
-      <w:r>
-        <w:t xml:space="preserve">Strange, R., &amp; Zucchella, A. (2017). Industry 4.0, global value chains and international business.</w:t>
+    </w:p>
+    <w:p>
+      <w:pPr>
+        <w:pStyle w:val="BodyText"/>
+      </w:pPr>
+      <w:r>
+        <w:t xml:space="preserve">Strange, R. and Zucchella, A. (2017), "Industry 4.0, global value chains and international business",</w:t>
       </w:r>
       <w:r>
         <w:t xml:space="preserve"> </w:t>
@@ -20413,15 +20614,15 @@
           <w:iCs/>
           <w:i/>
         </w:rPr>
-        <w:t xml:space="preserve">Multinational Business Review, 25</w:t>
-      </w:r>
-      <w:r>
-        <w:t xml:space="preserve">(3), 174–184.</w:t>
-      </w:r>
-      <w:r>
-        <w:t xml:space="preserve"> </w:t>
-      </w:r>
-      <w:hyperlink r:id="rId113">
+        <w:t xml:space="preserve">Multinational Business Review</w:t>
+      </w:r>
+      <w:r>
+        <w:t xml:space="preserve">, Vol. 25 No. 3, pp.174-184,</w:t>
+      </w:r>
+      <w:r>
+        <w:t xml:space="preserve"> </w:t>
+      </w:r>
+      <w:hyperlink r:id="rId118">
         <w:r>
           <w:rPr>
             <w:rStyle w:val="Hyperlink"/>
@@ -20429,11 +20630,13 @@
           <w:t xml:space="preserve">https://doi.org/10.1108/MBR-05-2017-0028</w:t>
         </w:r>
       </w:hyperlink>
-      <w:r>
-        <w:t xml:space="preserve"> </w:t>
-      </w:r>
-      <w:r>
-        <w:t xml:space="preserve">Teece, D. J. (2007). Explicating dynamic capabilities: The nature and microfoundations of (sustainable) enterprise performance.</w:t>
+    </w:p>
+    <w:p>
+      <w:pPr>
+        <w:pStyle w:val="BodyText"/>
+      </w:pPr>
+      <w:r>
+        <w:t xml:space="preserve">Teece, D.J. (2007), "Explicating dynamic capabilities: the nature and microfoundations of (sustainable) enterprise performance",</w:t>
       </w:r>
       <w:r>
         <w:t xml:space="preserve"> </w:t>
@@ -20443,15 +20646,15 @@
           <w:iCs/>
           <w:i/>
         </w:rPr>
-        <w:t xml:space="preserve">Strategic Management Journal, 28</w:t>
-      </w:r>
-      <w:r>
-        <w:t xml:space="preserve">(13), 1319–1350.</w:t>
-      </w:r>
-      <w:r>
-        <w:t xml:space="preserve"> </w:t>
-      </w:r>
-      <w:hyperlink r:id="rId114">
+        <w:t xml:space="preserve">Strategic Management Journal</w:t>
+      </w:r>
+      <w:r>
+        <w:t xml:space="preserve">, Vol. 28 No. 13, pp.1319-1350,</w:t>
+      </w:r>
+      <w:r>
+        <w:t xml:space="preserve"> </w:t>
+      </w:r>
+      <w:hyperlink r:id="rId119">
         <w:r>
           <w:rPr>
             <w:rStyle w:val="Hyperlink"/>
@@ -20459,11 +20662,13 @@
           <w:t xml:space="preserve">https://doi.org/10.1002/smj.640</w:t>
         </w:r>
       </w:hyperlink>
-      <w:r>
-        <w:t xml:space="preserve"> </w:t>
-      </w:r>
-      <w:r>
-        <w:t xml:space="preserve">Vahlne, J.-E. (2020). Development of the Uppsala model of internationalization process: From internationalization to evolution.</w:t>
+    </w:p>
+    <w:p>
+      <w:pPr>
+        <w:pStyle w:val="BodyText"/>
+      </w:pPr>
+      <w:r>
+        <w:t xml:space="preserve">Vahlne, J.-E. (2020), "Development of the Uppsala model of internationalization process: from internationalization to evolution",</w:t>
       </w:r>
       <w:r>
         <w:t xml:space="preserve"> </w:t>
@@ -20473,15 +20678,15 @@
           <w:iCs/>
           <w:i/>
         </w:rPr>
-        <w:t xml:space="preserve">Global Strategy Journal, 10</w:t>
-      </w:r>
-      <w:r>
-        <w:t xml:space="preserve">(2), 239–250.</w:t>
-      </w:r>
-      <w:r>
-        <w:t xml:space="preserve"> </w:t>
-      </w:r>
-      <w:hyperlink r:id="rId115">
+        <w:t xml:space="preserve">Global Strategy Journal</w:t>
+      </w:r>
+      <w:r>
+        <w:t xml:space="preserve">, Vol. 10 No. 2, pp.239-250,</w:t>
+      </w:r>
+      <w:r>
+        <w:t xml:space="preserve"> </w:t>
+      </w:r>
+      <w:hyperlink r:id="rId120">
         <w:r>
           <w:rPr>
             <w:rStyle w:val="Hyperlink"/>
@@ -20489,11 +20694,13 @@
           <w:t xml:space="preserve">https://doi.org/10.1002/gsj.1375</w:t>
         </w:r>
       </w:hyperlink>
-      <w:r>
-        <w:t xml:space="preserve"> </w:t>
-      </w:r>
-      <w:r>
-        <w:t xml:space="preserve">Vahlne, J.-E., &amp; Johanson, J. (2017). From internationalization to evolution: The Uppsala model at 40 years.</w:t>
+    </w:p>
+    <w:p>
+      <w:pPr>
+        <w:pStyle w:val="BodyText"/>
+      </w:pPr>
+      <w:r>
+        <w:t xml:space="preserve">Vahlne, J.-E. and Johanson, J. (2017), "From internationalization to evolution: the Uppsala model at 40 years",</w:t>
       </w:r>
       <w:r>
         <w:t xml:space="preserve"> </w:t>
@@ -20503,15 +20710,15 @@
           <w:iCs/>
           <w:i/>
         </w:rPr>
-        <w:t xml:space="preserve">Journal of International Business Studies, 48</w:t>
-      </w:r>
-      <w:r>
-        <w:t xml:space="preserve">(9), 1087–1102.</w:t>
-      </w:r>
-      <w:r>
-        <w:t xml:space="preserve"> </w:t>
-      </w:r>
-      <w:hyperlink r:id="rId116">
+        <w:t xml:space="preserve">Journal of International Business Studies</w:t>
+      </w:r>
+      <w:r>
+        <w:t xml:space="preserve">, Vol. 48 No. 9, pp.1087-1102,</w:t>
+      </w:r>
+      <w:r>
+        <w:t xml:space="preserve"> </w:t>
+      </w:r>
+      <w:hyperlink r:id="rId121">
         <w:r>
           <w:rPr>
             <w:rStyle w:val="Hyperlink"/>
@@ -20519,11 +20726,13 @@
           <w:t xml:space="preserve">https://doi.org/10.1057/s41267-017-0107-7</w:t>
         </w:r>
       </w:hyperlink>
-      <w:r>
-        <w:t xml:space="preserve"> </w:t>
-      </w:r>
-      <w:r>
-        <w:t xml:space="preserve">Verhoef, P. C., Broekhuizen, T., Bart, Y., Bhattacharya, A., Dong, J. Q., Fabian, N., &amp; Haenlein, M. (2021). Digital transformation: A multidisciplinary reflection and research agenda.</w:t>
+    </w:p>
+    <w:p>
+      <w:pPr>
+        <w:pStyle w:val="BodyText"/>
+      </w:pPr>
+      <w:r>
+        <w:t xml:space="preserve">Verhoef, P.C., Broekhuizen, T., Bart, Y., Bhattacharya, A., Dong, J.Q., Fabian, N. and Haenlein, M. (2021), "Digital transformation: a multidisciplinary reflection and research agenda",</w:t>
       </w:r>
       <w:r>
         <w:t xml:space="preserve"> </w:t>
@@ -20533,15 +20742,15 @@
           <w:iCs/>
           <w:i/>
         </w:rPr>
-        <w:t xml:space="preserve">Journal of Business Research, 122</w:t>
-      </w:r>
-      <w:r>
-        <w:t xml:space="preserve">, 889–901.</w:t>
-      </w:r>
-      <w:r>
-        <w:t xml:space="preserve"> </w:t>
-      </w:r>
-      <w:hyperlink r:id="rId117">
+        <w:t xml:space="preserve">Journal of Business Research</w:t>
+      </w:r>
+      <w:r>
+        <w:t xml:space="preserve">, Vol. 122, pp.889-901,</w:t>
+      </w:r>
+      <w:r>
+        <w:t xml:space="preserve"> </w:t>
+      </w:r>
+      <w:hyperlink r:id="rId122">
         <w:r>
           <w:rPr>
             <w:rStyle w:val="Hyperlink"/>
@@ -20549,11 +20758,13 @@
           <w:t xml:space="preserve">https://doi.org/10.1016/j.jbusres.2019.09.022</w:t>
         </w:r>
       </w:hyperlink>
-      <w:r>
-        <w:t xml:space="preserve"> </w:t>
-      </w:r>
-      <w:r>
-        <w:t xml:space="preserve">Vernon, R. (1979). The product cycle hypothesis in a new international environment.</w:t>
+    </w:p>
+    <w:p>
+      <w:pPr>
+        <w:pStyle w:val="BodyText"/>
+      </w:pPr>
+      <w:r>
+        <w:t xml:space="preserve">Vernon, R. (1979), "The product cycle hypothesis in a new international environment",</w:t>
       </w:r>
       <w:r>
         <w:t xml:space="preserve"> </w:t>
@@ -20563,15 +20774,15 @@
           <w:iCs/>
           <w:i/>
         </w:rPr>
-        <w:t xml:space="preserve">Bulletin of Economics and Statistics, 41</w:t>
-      </w:r>
-      <w:r>
-        <w:t xml:space="preserve">(4), 255–267.</w:t>
-      </w:r>
-      <w:r>
-        <w:t xml:space="preserve"> </w:t>
-      </w:r>
-      <w:hyperlink r:id="rId118">
+        <w:t xml:space="preserve">Oxford Bulletin of Economics and Statistics</w:t>
+      </w:r>
+      <w:r>
+        <w:t xml:space="preserve">, Vol. 41 No. 4, pp.255-267,</w:t>
+      </w:r>
+      <w:r>
+        <w:t xml:space="preserve"> </w:t>
+      </w:r>
+      <w:hyperlink r:id="rId123">
         <w:r>
           <w:rPr>
             <w:rStyle w:val="Hyperlink"/>
@@ -20579,11 +20790,13 @@
           <w:t xml:space="preserve">https://doi.org/10.1111/j.1468-0084.1979.mp41004002.x</w:t>
         </w:r>
       </w:hyperlink>
-      <w:r>
-        <w:t xml:space="preserve"> </w:t>
-      </w:r>
-      <w:r>
-        <w:t xml:space="preserve">Vial, G. (2019). Understanding digital transformation: A review and a research agenda.</w:t>
+    </w:p>
+    <w:p>
+      <w:pPr>
+        <w:pStyle w:val="BodyText"/>
+      </w:pPr>
+      <w:r>
+        <w:t xml:space="preserve">Vial, G. (2019), "Understanding digital transformation: a review and a research agenda",</w:t>
       </w:r>
       <w:r>
         <w:t xml:space="preserve"> </w:t>
@@ -20593,15 +20806,15 @@
           <w:iCs/>
           <w:i/>
         </w:rPr>
-        <w:t xml:space="preserve">Journal of Strategic Information Systems, 28</w:t>
-      </w:r>
-      <w:r>
-        <w:t xml:space="preserve">(2), 118–144.</w:t>
-      </w:r>
-      <w:r>
-        <w:t xml:space="preserve"> </w:t>
-      </w:r>
-      <w:hyperlink r:id="rId119">
+        <w:t xml:space="preserve">Journal of Strategic Information Systems</w:t>
+      </w:r>
+      <w:r>
+        <w:t xml:space="preserve">, Vol. 28 No. 2, pp.118-144,</w:t>
+      </w:r>
+      <w:r>
+        <w:t xml:space="preserve"> </w:t>
+      </w:r>
+      <w:hyperlink r:id="rId124">
         <w:r>
           <w:rPr>
             <w:rStyle w:val="Hyperlink"/>
@@ -20609,11 +20822,13 @@
           <w:t xml:space="preserve">https://doi.org/10.1016/j.jsis.2019.01.003</w:t>
         </w:r>
       </w:hyperlink>
-      <w:r>
-        <w:t xml:space="preserve"> </w:t>
-      </w:r>
-      <w:r>
-        <w:t xml:space="preserve">Wagner, J. (2007). Exports and productivity: A survey of the evidence from firm-level data.</w:t>
+    </w:p>
+    <w:p>
+      <w:pPr>
+        <w:pStyle w:val="BodyText"/>
+      </w:pPr>
+      <w:r>
+        <w:t xml:space="preserve">Wagner, J. (2007), "Exports and productivity: a survey of the evidence from firm-level data",</w:t>
       </w:r>
       <w:r>
         <w:t xml:space="preserve"> </w:t>
@@ -20623,15 +20838,15 @@
           <w:iCs/>
           <w:i/>
         </w:rPr>
-        <w:t xml:space="preserve">The World Economy, 30</w:t>
-      </w:r>
-      <w:r>
-        <w:t xml:space="preserve">(1), 60–82.</w:t>
-      </w:r>
-      <w:r>
-        <w:t xml:space="preserve"> </w:t>
-      </w:r>
-      <w:hyperlink r:id="rId120">
+        <w:t xml:space="preserve">The World Economy</w:t>
+      </w:r>
+      <w:r>
+        <w:t xml:space="preserve">, Vol. 30 No. 1, pp.60-82,</w:t>
+      </w:r>
+      <w:r>
+        <w:t xml:space="preserve"> </w:t>
+      </w:r>
+      <w:hyperlink r:id="rId125">
         <w:r>
           <w:rPr>
             <w:rStyle w:val="Hyperlink"/>
@@ -20639,11 +20854,13 @@
           <w:t xml:space="preserve">https://doi.org/10.1111/j.1467-9701.2007.00872.x</w:t>
         </w:r>
       </w:hyperlink>
-      <w:r>
-        <w:t xml:space="preserve"> </w:t>
-      </w:r>
-      <w:r>
-        <w:t xml:space="preserve">Williamson, O. E. (1985).</w:t>
+    </w:p>
+    <w:p>
+      <w:pPr>
+        <w:pStyle w:val="BodyText"/>
+      </w:pPr>
+      <w:r>
+        <w:t xml:space="preserve">Williamson, O.E. (1985),</w:t>
       </w:r>
       <w:r>
         <w:t xml:space="preserve"> </w:t>
@@ -20653,16 +20870,18 @@
           <w:iCs/>
           <w:i/>
         </w:rPr>
-        <w:t xml:space="preserve">The economic institutions of capitalism</w:t>
-      </w:r>
-      <w:r>
-        <w:t xml:space="preserve">. Free Press.</w:t>
-      </w:r>
-      <w:r>
-        <w:t xml:space="preserve"> </w:t>
-      </w:r>
-      <w:r>
-        <w:t xml:space="preserve">Wolfolds, S. E., &amp; Siegel, J. (2019). Misaccounting for endogeneity: The peril of relying on the Heckman two-step method without a valid instrument.</w:t>
+        <w:t xml:space="preserve">The Economic Institutions of Capitalism</w:t>
+      </w:r>
+      <w:r>
+        <w:t xml:space="preserve">, Free Press, New York, NY.</w:t>
+      </w:r>
+    </w:p>
+    <w:p>
+      <w:pPr>
+        <w:pStyle w:val="BodyText"/>
+      </w:pPr>
+      <w:r>
+        <w:t xml:space="preserve">Wolfolds, S.E. and Siegel, J. (2019), "Misaccounting for endogeneity: the peril of relying on the Heckman two-step method without a valid instrument",</w:t>
       </w:r>
       <w:r>
         <w:t xml:space="preserve"> </w:t>
@@ -20672,15 +20891,15 @@
           <w:iCs/>
           <w:i/>
         </w:rPr>
-        <w:t xml:space="preserve">Strategic Management Journal, 40</w:t>
-      </w:r>
-      <w:r>
-        <w:t xml:space="preserve">(3), 432–462.</w:t>
-      </w:r>
-      <w:r>
-        <w:t xml:space="preserve"> </w:t>
-      </w:r>
-      <w:hyperlink r:id="rId121">
+        <w:t xml:space="preserve">Strategic Management Journal</w:t>
+      </w:r>
+      <w:r>
+        <w:t xml:space="preserve">, Vol. 40 No. 3, pp.432-462,</w:t>
+      </w:r>
+      <w:r>
+        <w:t xml:space="preserve"> </w:t>
+      </w:r>
+      <w:hyperlink r:id="rId126">
         <w:r>
           <w:rPr>
             <w:rStyle w:val="Hyperlink"/>
@@ -20688,11 +20907,13 @@
           <w:t xml:space="preserve">https://doi.org/10.1002/smj.2995</w:t>
         </w:r>
       </w:hyperlink>
-      <w:r>
-        <w:t xml:space="preserve"> </w:t>
-      </w:r>
-      <w:r>
-        <w:t xml:space="preserve">Wooldridge, J. M. (2010).</w:t>
+    </w:p>
+    <w:p>
+      <w:pPr>
+        <w:pStyle w:val="BodyText"/>
+      </w:pPr>
+      <w:r>
+        <w:t xml:space="preserve">Wooldridge, J.M. (2010),</w:t>
       </w:r>
       <w:r>
         <w:t xml:space="preserve"> </w:t>
@@ -20702,19 +20923,18 @@
           <w:iCs/>
           <w:i/>
         </w:rPr>
-        <w:t xml:space="preserve">Econometric analysis of cross section and panel data</w:t>
-      </w:r>
-      <w:r>
-        <w:t xml:space="preserve"> </w:t>
-      </w:r>
-      <w:r>
-        <w:t xml:space="preserve">(2nd ed.). MIT Press.</w:t>
-      </w:r>
-      <w:r>
-        <w:t xml:space="preserve"> </w:t>
-      </w:r>
-      <w:r>
-        <w:t xml:space="preserve">World Bank. (2010).</w:t>
+        <w:t xml:space="preserve">Econometric Analysis of Cross Section and Panel Data</w:t>
+      </w:r>
+      <w:r>
+        <w:t xml:space="preserve">, 2nd ed., MIT Press, Cambridge, MA.</w:t>
+      </w:r>
+    </w:p>
+    <w:p>
+      <w:pPr>
+        <w:pStyle w:val="BodyText"/>
+      </w:pPr>
+      <w:r>
+        <w:t xml:space="preserve">World Bank (2010),</w:t>
       </w:r>
       <w:r>
         <w:t xml:space="preserve"> </w:t>
@@ -20724,15 +20944,15 @@
           <w:iCs/>
           <w:i/>
         </w:rPr>
-        <w:t xml:space="preserve">Vietnam Enterprise Survey 2009: Data file</w:t>
-      </w:r>
-      <w:r>
-        <w:t xml:space="preserve">. Enterprise Surveys, World Bank Group. Retrieved May 9, 2026, from</w:t>
-      </w:r>
-      <w:r>
-        <w:t xml:space="preserve"> </w:t>
-      </w:r>
-      <w:hyperlink r:id="rId122">
+        <w:t xml:space="preserve">Vietnam Enterprise Survey 2009: Data File</w:t>
+      </w:r>
+      <w:r>
+        <w:t xml:space="preserve">, Enterprise Surveys, World Bank Group, available at:</w:t>
+      </w:r>
+      <w:r>
+        <w:t xml:space="preserve"> </w:t>
+      </w:r>
+      <w:hyperlink r:id="rId127">
         <w:r>
           <w:rPr>
             <w:rStyle w:val="Hyperlink"/>
@@ -20744,7 +20964,15 @@
         <w:t xml:space="preserve"> </w:t>
       </w:r>
       <w:r>
-        <w:t xml:space="preserve">World Bank. (2016).</w:t>
+        <w:t xml:space="preserve">(accessed 9 May 2026).</w:t>
+      </w:r>
+    </w:p>
+    <w:p>
+      <w:pPr>
+        <w:pStyle w:val="BodyText"/>
+      </w:pPr>
+      <w:r>
+        <w:t xml:space="preserve">World Bank (2016),</w:t>
       </w:r>
       <w:r>
         <w:t xml:space="preserve"> </w:t>
@@ -20754,15 +20982,15 @@
           <w:iCs/>
           <w:i/>
         </w:rPr>
-        <w:t xml:space="preserve">Vietnam Enterprise Survey 2015: Data file</w:t>
-      </w:r>
-      <w:r>
-        <w:t xml:space="preserve">. Enterprise Surveys, World Bank Group. Retrieved May 9, 2026, from</w:t>
-      </w:r>
-      <w:r>
-        <w:t xml:space="preserve"> </w:t>
-      </w:r>
-      <w:hyperlink r:id="rId122">
+        <w:t xml:space="preserve">Vietnam Enterprise Survey 2015: Data File</w:t>
+      </w:r>
+      <w:r>
+        <w:t xml:space="preserve">, Enterprise Surveys, World Bank Group, available at:</w:t>
+      </w:r>
+      <w:r>
+        <w:t xml:space="preserve"> </w:t>
+      </w:r>
+      <w:hyperlink r:id="rId127">
         <w:r>
           <w:rPr>
             <w:rStyle w:val="Hyperlink"/>
@@ -20774,7 +21002,15 @@
         <w:t xml:space="preserve"> </w:t>
       </w:r>
       <w:r>
-        <w:t xml:space="preserve">World Bank. (2024).</w:t>
+        <w:t xml:space="preserve">(accessed 9 May 2026).</w:t>
+      </w:r>
+    </w:p>
+    <w:p>
+      <w:pPr>
+        <w:pStyle w:val="BodyText"/>
+      </w:pPr>
+      <w:r>
+        <w:t xml:space="preserve">World Bank (2024),</w:t>
       </w:r>
       <w:r>
         <w:t xml:space="preserve"> </w:t>
@@ -20784,15 +21020,15 @@
           <w:iCs/>
           <w:i/>
         </w:rPr>
-        <w:t xml:space="preserve">Vietnam Enterprise Survey 2023: Data file</w:t>
-      </w:r>
-      <w:r>
-        <w:t xml:space="preserve">. Enterprise Surveys, World Bank Group. Retrieved May 9, 2026, from</w:t>
-      </w:r>
-      <w:r>
-        <w:t xml:space="preserve"> </w:t>
-      </w:r>
-      <w:hyperlink r:id="rId122">
+        <w:t xml:space="preserve">Vietnam Enterprise Survey 2023: Data File</w:t>
+      </w:r>
+      <w:r>
+        <w:t xml:space="preserve">, Enterprise Surveys, World Bank Group, available at:</w:t>
+      </w:r>
+      <w:r>
+        <w:t xml:space="preserve"> </w:t>
+      </w:r>
+      <w:hyperlink r:id="rId127">
         <w:r>
           <w:rPr>
             <w:rStyle w:val="Hyperlink"/>
@@ -20804,7 +21040,15 @@
         <w:t xml:space="preserve"> </w:t>
       </w:r>
       <w:r>
-        <w:t xml:space="preserve">World Bank. (2026).</w:t>
+        <w:t xml:space="preserve">(accessed 9 May 2026).</w:t>
+      </w:r>
+    </w:p>
+    <w:p>
+      <w:pPr>
+        <w:pStyle w:val="BodyText"/>
+      </w:pPr>
+      <w:r>
+        <w:t xml:space="preserve">World Bank (2026),</w:t>
       </w:r>
       <w:r>
         <w:t xml:space="preserve"> </w:t>
@@ -20820,12 +21064,12 @@
         <w:t xml:space="preserve"> </w:t>
       </w:r>
       <w:r>
-        <w:t xml:space="preserve">[Data set]. Retrieved May 9, 2026, from</w:t>
-      </w:r>
-      <w:r>
-        <w:t xml:space="preserve"> </w:t>
-      </w:r>
-      <w:hyperlink r:id="rId123">
+        <w:t xml:space="preserve">[data set], available at:</w:t>
+      </w:r>
+      <w:r>
+        <w:t xml:space="preserve"> </w:t>
+      </w:r>
+      <w:hyperlink r:id="rId128">
         <w:r>
           <w:rPr>
             <w:rStyle w:val="Hyperlink"/>
@@ -20837,7 +21081,15 @@
         <w:t xml:space="preserve"> </w:t>
       </w:r>
       <w:r>
-        <w:t xml:space="preserve">Wright, M., Filatotchev, I., Hoskisson, R. E., &amp; Peng, M. W. (2005). Strategy research in emerging economies: Challenging the conventional wisdom.</w:t>
+        <w:t xml:space="preserve">(accessed 9 May 2026).</w:t>
+      </w:r>
+    </w:p>
+    <w:p>
+      <w:pPr>
+        <w:pStyle w:val="BodyText"/>
+      </w:pPr>
+      <w:r>
+        <w:t xml:space="preserve">Wright, M., Filatotchev, I., Hoskisson, R.E. and Peng, M.W. (2005), "Strategy research in emerging economies: challenging the conventional wisdom",</w:t>
       </w:r>
       <w:r>
         <w:t xml:space="preserve"> </w:t>
@@ -20847,15 +21099,15 @@
           <w:iCs/>
           <w:i/>
         </w:rPr>
-        <w:t xml:space="preserve">Journal of Management Studies, 42</w:t>
-      </w:r>
-      <w:r>
-        <w:t xml:space="preserve">(1), 1–33.</w:t>
-      </w:r>
-      <w:r>
-        <w:t xml:space="preserve"> </w:t>
-      </w:r>
-      <w:hyperlink r:id="rId124">
+        <w:t xml:space="preserve">Journal of Management Studies</w:t>
+      </w:r>
+      <w:r>
+        <w:t xml:space="preserve">, Vol. 42 No. 1, pp.1-33,</w:t>
+      </w:r>
+      <w:r>
+        <w:t xml:space="preserve"> </w:t>
+      </w:r>
+      <w:hyperlink r:id="rId129">
         <w:r>
           <w:rPr>
             <w:rStyle w:val="Hyperlink"/>
@@ -20863,11 +21115,13 @@
           <w:t xml:space="preserve">https://doi.org/10.1111/j.1467-6486.2005.00487.x</w:t>
         </w:r>
       </w:hyperlink>
-      <w:r>
-        <w:t xml:space="preserve"> </w:t>
-      </w:r>
-      <w:r>
-        <w:t xml:space="preserve">Wu, F., Fan, D., &amp; Chen, L. (2022). Untangling the internationalization–performance relationship in emerging-economy multinationals: A meta-analytic review.</w:t>
+    </w:p>
+    <w:p>
+      <w:pPr>
+        <w:pStyle w:val="BodyText"/>
+      </w:pPr>
+      <w:r>
+        <w:t xml:space="preserve">Wu, F., Fan, D. and Chen, L. (2022), "Untangling the internationalization-performance relationship in emerging-economy multinationals: a meta-analytic review",</w:t>
       </w:r>
       <w:r>
         <w:t xml:space="preserve"> </w:t>
@@ -20877,15 +21131,15 @@
           <w:iCs/>
           <w:i/>
         </w:rPr>
-        <w:t xml:space="preserve">Management International Review, 62</w:t>
-      </w:r>
-      <w:r>
-        <w:t xml:space="preserve">(2), 203–243.</w:t>
-      </w:r>
-      <w:r>
-        <w:t xml:space="preserve"> </w:t>
-      </w:r>
-      <w:hyperlink r:id="rId125">
+        <w:t xml:space="preserve">Management International Review</w:t>
+      </w:r>
+      <w:r>
+        <w:t xml:space="preserve">, Vol. 62 No. 2, pp.203-243,</w:t>
+      </w:r>
+      <w:r>
+        <w:t xml:space="preserve"> </w:t>
+      </w:r>
+      <w:hyperlink r:id="rId130">
         <w:r>
           <w:rPr>
             <w:rStyle w:val="Hyperlink"/>
@@ -20893,11 +21147,13 @@
           <w:t xml:space="preserve">https://doi.org/10.1007/s11575-022-00466-1</w:t>
         </w:r>
       </w:hyperlink>
-      <w:r>
-        <w:t xml:space="preserve"> </w:t>
-      </w:r>
-      <w:r>
-        <w:t xml:space="preserve">Wu, J., Wang, C., Hong, J., Piperopoulos, P., &amp; Zhuo, S. (2016). Internationalization and innovation performance of emerging market enterprises: The role of host-country institutional development.</w:t>
+    </w:p>
+    <w:p>
+      <w:pPr>
+        <w:pStyle w:val="BodyText"/>
+      </w:pPr>
+      <w:r>
+        <w:t xml:space="preserve">Wu, J., Wang, C., Hong, J., Piperopoulos, P. and Zhuo, S. (2016), "Internationalization and innovation performance of emerging market enterprises: the role of host-country institutional development",</w:t>
       </w:r>
       <w:r>
         <w:t xml:space="preserve"> </w:t>
@@ -20907,15 +21163,15 @@
           <w:iCs/>
           <w:i/>
         </w:rPr>
-        <w:t xml:space="preserve">Journal of World Business, 51</w:t>
-      </w:r>
-      <w:r>
-        <w:t xml:space="preserve">(2), 251–263.</w:t>
-      </w:r>
-      <w:r>
-        <w:t xml:space="preserve"> </w:t>
-      </w:r>
-      <w:hyperlink r:id="rId126">
+        <w:t xml:space="preserve">Journal of World Business</w:t>
+      </w:r>
+      <w:r>
+        <w:t xml:space="preserve">, Vol. 51 No. 2, pp.251-263,</w:t>
+      </w:r>
+      <w:r>
+        <w:t xml:space="preserve"> </w:t>
+      </w:r>
+      <w:hyperlink r:id="rId131">
         <w:r>
           <w:rPr>
             <w:rStyle w:val="Hyperlink"/>
@@ -20924,8 +21180,8 @@
         </w:r>
       </w:hyperlink>
     </w:p>
-    <w:bookmarkEnd w:id="127"/>
-    <w:bookmarkEnd w:id="128"/>
+    <w:bookmarkEnd w:id="132"/>
+    <w:bookmarkEnd w:id="133"/>
     <w:sectPr/>
   </w:body>
 </w:document>

</xml_diff>

<commit_message>
feat(p3): Grammarly AI disclosure, anti-AI pass (em dash 40->0), results workbook + Stata figure script
- AI disclosure now names Grammarly (spelling/grammar/punctuation; no generative-AI
  content) in both condensed and full manuscripts; removes the tool-name placeholder
- Anti-AI/voice pass on the 8,500-word manuscript: 40 em dashes -> 0 (converted to
  commas/colons/parentheses; en-dash typography in I-P, 39-46%, Lind-Mehlum preserved);
  no formulaic transitions present; numbers/wording/meaning unchanged. Combined 8,477/8,500
- replication/P3_results_workbook.xlsx: consolidated workbook (coefficients, Tables II/III,
  turning points, Fig 2 & Fig 3 curve data with native Excel charts) from coefs_main_models.csv
- replication/do/03_make_figures.do: Stata script regenerating Figure 2 (inverted-U by
  wave + pooled) and Figure 3 (TCI/DAI moderator marginals) from the built .dta
- JED_COMPLIANCE: AI row and DOI row updated to DONE
</commit_message>
<xml_diff>
--- a/p3/submission/jed_package/01_manuscript_blinded.docx
+++ b/p3/submission/jed_package/01_manuscript_blinded.docx
@@ -19238,15 +19238,7 @@
         <w:pStyle w:val="FirstParagraph"/>
       </w:pPr>
       <w:r>
-        <w:t xml:space="preserve">During the preparation of this work, the author(s) used generative AI-assisted tools solely for copy-editing — to improve the clarity, grammar, and structure of the author(s)' own original text. No generative AI was used to create or draft new substantive content. In accordance with the journal's policy, the author(s) will specify the exact name and version of the AI tool(s) used at the point of submission. [Author: insert tool name and version.]</w:t>
-      </w:r>
-    </w:p>
-    <w:p>
-      <w:pPr>
-        <w:pStyle w:val="BodyText"/>
-      </w:pPr>
-      <w:r>
-        <w:t xml:space="preserve">All conceptual framing, hypothesis development, empirical analysis, results interpretation, and final wording were authored by the human author(s), who take full responsibility for the content of the publication.</w:t>
+        <w:t xml:space="preserve">In preparing this manuscript, the author(s) used Grammarly, a writing-assistance tool, to help correct spelling, grammar, and punctuation in the author(s)' own original text. No generative artificial-intelligence tool was used to generate, draft, or create any substantive content, analysis, or interpretation. All conceptual framing, hypothesis development, empirical analysis, results interpretation, and final wording were produced by the human author(s), who take full responsibility for the content of the publication.</w:t>
       </w:r>
     </w:p>
     <w:bookmarkEnd w:id="76"/>

</xml_diff>

<commit_message>
feat(A+B): condense P6/APJM to <=10k words; apply Emerald Harvard markers
A (P6/APJM <=10,000-word cap): fixed header (IBR->APJM), moved Appendices A-C to
supplementary_material.docx, condensed Theory (sec 2) + Method (sec 3) ~45% while preserving all
hypotheses (H1-H4, E1a/E1b), key citations, and the three-level model equations. Main text now
8,351 words incl references (was 13,467); Results/Discussion/Conclusion/References unchanged.

B (Emerald Harvard for Emerald packages): applied safe Harvard markers (', &' -> ', and' in
reference author strings; ' & ' -> ' and' only inside parenthetical citations carrying a year) to
p3/jed, p3/mbr, p4/mbr, p5/cms, p5/ijoem; '&' preserved in journal titles and R&D/M&A. APA
author-date retained (Emerald-accepted). docx rebuilt.
</commit_message>
<xml_diff>
--- a/p3/submission/jed_package/01_manuscript_blinded.docx
+++ b/p3/submission/jed_package/01_manuscript_blinded.docx
@@ -2,7 +2,7 @@
 <file path=word/document.xml><?xml version="1.0" encoding="utf-8"?>
 <w:document xmlns:w="http://schemas.openxmlformats.org/wordprocessingml/2006/main" xmlns:m="http://schemas.openxmlformats.org/officeDocument/2006/math" xmlns:r="http://schemas.openxmlformats.org/officeDocument/2006/relationships" xmlns:o="urn:schemas-microsoft-com:office:office" xmlns:v="urn:schemas-microsoft-com:vml" xmlns:w10="urn:schemas-microsoft-com:office:word" xmlns:a="http://schemas.openxmlformats.org/drawingml/2006/main" xmlns:pic="http://schemas.openxmlformats.org/drawingml/2006/picture" xmlns:wp="http://schemas.openxmlformats.org/drawingml/2006/wordprocessingDrawing">
   <w:body>
-    <w:bookmarkStart w:id="133" w:name="X0264dbef037d515bdd41c0931e5e2e7c8717b18"/>
+    <w:bookmarkStart w:id="115" w:name="X0264dbef037d515bdd41c0931e5e2e7c8717b18"/>
     <w:p>
       <w:pPr>
         <w:pStyle w:val="Heading1"/>
@@ -855,7 +855,7 @@
     </w:p>
     <w:bookmarkEnd w:id="25"/>
     <w:bookmarkEnd w:id="26"/>
-    <w:bookmarkStart w:id="34" w:name="X8bf20a63f0decf7b16e99d564b9958ec4fbbb23"/>
+    <w:bookmarkStart w:id="31" w:name="X8bf20a63f0decf7b16e99d564b9958ec4fbbb23"/>
     <w:p>
       <w:pPr>
         <w:pStyle w:val="Heading2"/>
@@ -1538,7 +1538,7 @@
       </w:r>
     </w:p>
     <w:bookmarkEnd w:id="29"/>
-    <w:bookmarkStart w:id="33" w:name="Xa301591a4bdc42129e76c2a2b73514232150381"/>
+    <w:bookmarkStart w:id="30" w:name="Xa301591a4bdc42129e76c2a2b73514232150381"/>
     <w:p>
       <w:pPr>
         <w:pStyle w:val="Heading3"/>
@@ -1882,46 +1882,7 @@
         <w:pStyle w:val="BodyText"/>
       </w:pPr>
       <w:r>
-        <w:drawing>
-          <wp:inline>
-            <wp:extent cx="5334000" cy="2930266"/>
-            <wp:effectExtent b="0" l="0" r="0" t="0"/>
-            <wp:docPr descr="Figure 1: Conceptual model — TCI, DAI, and export intensity as determinants of firm performance (Vietnam, 3-wave)" title="" id="31" name="Picture"/>
-            <a:graphic>
-              <a:graphicData uri="http://schemas.openxmlformats.org/drawingml/2006/picture">
-                <pic:pic>
-                  <pic:nvPicPr>
-                    <pic:cNvPr descr="figures/vietnam/figure_1_conceptual_model.png" id="32" name="Picture"/>
-                    <pic:cNvPicPr>
-                      <a:picLocks noChangeArrowheads="1" noChangeAspect="1"/>
-                    </pic:cNvPicPr>
-                  </pic:nvPicPr>
-                  <pic:blipFill>
-                    <a:blip r:embed="rId30"/>
-                    <a:stretch>
-                      <a:fillRect/>
-                    </a:stretch>
-                  </pic:blipFill>
-                  <pic:spPr bwMode="auto">
-                    <a:xfrm>
-                      <a:off x="0" y="0"/>
-                      <a:ext cx="5334000" cy="2930266"/>
-                    </a:xfrm>
-                    <a:prstGeom prst="rect">
-                      <a:avLst/>
-                    </a:prstGeom>
-                    <a:noFill/>
-                    <a:ln w="9525">
-                      <a:noFill/>
-                      <a:headEnd/>
-                      <a:tailEnd/>
-                    </a:ln>
-                  </pic:spPr>
-                </pic:pic>
-              </a:graphicData>
-            </a:graphic>
-          </wp:inline>
-        </w:drawing>
+        <w:t xml:space="preserve">Figure 1: Conceptual model — TCI, DAI, and export intensity as determinants of firm performance (Vietnam, 3-wave)</w:t>
       </w:r>
     </w:p>
     <w:p>
@@ -1960,9 +1921,9 @@
         <w:t xml:space="preserve">Solid arrows represent hypothesised direct and curvilinear effects. Dashed arrows represent moderating effects. The independent variable — internationalisation intensity (FSTS, centred FSTS_c and FSTS_c²) — is placed at left; the dependent variable — firm performance, measured as ln(labour productivity) = ln(annual revenue PPP / permanent workers) — is placed at right, following left-to-right causal flow convention. H1 (inverted-U nonlinearity: β₁ &gt; 0, β₂ &lt; 0) is grounded in the Uppsala model (Johanson and Vahlne, 1977, 2009) and coordination-cost theory (Hitt et al., 1997). H2 specifies technological capability (TCI_z, Resource-Based View: Barney, 1991) as a level-shifting direct effect and secondary moderator on the FSTS–performance curve; instrument: industry-level TCI mean (causal IV identification). H4 treats website-based digital adoption (DAI_z, Tier-1 only) as an exploratory probe of the Digital Capability Lens (Banalieva and Dhanaraj, 2019); measurement constraint acknowledged — single binary indicator across 2009/2015/2023 waves limits inferential strength. (+) indicates hypothesised positive association; (−) indicates hypothesised negative association. Control variables (ln firm size, firm age, foreign ownership, broad-sector fixed effects, wave fixed effects) enter additively in all models but are omitted from the figure for clarity. ICRV context: Vietnam — Nhóm IV (Lower_mid_transition, ICRV Group 4 of 6; lower-middle-income transition economy; WGI Rule of Law ≈ −0.09 in 2023, World Bank). Data: WBES 2009, 2015, 2023; N = 2,958 (pooled), n_wave = 989/956/1,013.</w:t>
       </w:r>
     </w:p>
-    <w:bookmarkEnd w:id="33"/>
-    <w:bookmarkEnd w:id="34"/>
-    <w:bookmarkStart w:id="40" w:name="Xfd2f05febb90fd7f58b14547dd9b33901f267a5"/>
+    <w:bookmarkEnd w:id="30"/>
+    <w:bookmarkEnd w:id="31"/>
+    <w:bookmarkStart w:id="37" w:name="Xfd2f05febb90fd7f58b14547dd9b33901f267a5"/>
     <w:p>
       <w:pPr>
         <w:pStyle w:val="Heading2"/>
@@ -1971,7 +1932,7 @@
         <w:t xml:space="preserve">3. Data, variables, and empirical strategy</w:t>
       </w:r>
     </w:p>
-    <w:bookmarkStart w:id="35" w:name="X690a6f2a93b97075aa335e9e4cac18d5293d91d"/>
+    <w:bookmarkStart w:id="32" w:name="X690a6f2a93b97075aa335e9e4cac18d5293d91d"/>
     <w:p>
       <w:pPr>
         <w:pStyle w:val="Heading3"/>
@@ -2036,8 +1997,8 @@
         <w:t xml:space="preserve">across stages.</w:t>
       </w:r>
     </w:p>
-    <w:bookmarkEnd w:id="35"/>
-    <w:bookmarkStart w:id="36" w:name="Xbcf9f12e79107fa2c089aaf13fc6c4fb773f1c2"/>
+    <w:bookmarkEnd w:id="32"/>
+    <w:bookmarkStart w:id="33" w:name="Xbcf9f12e79107fa2c089aaf13fc6c4fb773f1c2"/>
     <w:p>
       <w:pPr>
         <w:pStyle w:val="Heading3"/>
@@ -2929,8 +2890,8 @@
         <w:t xml:space="preserve">and 2023 respectively; pooled N is 2,958.</w:t>
       </w:r>
     </w:p>
-    <w:bookmarkEnd w:id="36"/>
-    <w:bookmarkStart w:id="37" w:name="Xc5fe1f3cf583535f12a87a680dcd317400b3da2"/>
+    <w:bookmarkEnd w:id="33"/>
+    <w:bookmarkStart w:id="34" w:name="Xc5fe1f3cf583535f12a87a680dcd317400b3da2"/>
     <w:p>
       <w:pPr>
         <w:pStyle w:val="Heading3"/>
@@ -3273,8 +3234,8 @@
         <w:t xml:space="preserve">All models are estimated by OLS with HC1 heteroscedasticity-consistent standard errors. Wave fixed effects (λ_t) are included in pooled specifications only. The M0–M8 sequence is estimated wave-by-wave and jointly on the pooled three-wave file, yielding four sets of estimates (2009, 2015, 2023, pooled).</w:t>
       </w:r>
     </w:p>
-    <w:bookmarkEnd w:id="37"/>
-    <w:bookmarkStart w:id="38" w:name="Xe803d156752d85865c6c4f44f4ca9bbe59bf0f9"/>
+    <w:bookmarkEnd w:id="34"/>
+    <w:bookmarkStart w:id="35" w:name="Xe803d156752d85865c6c4f44f4ca9bbe59bf0f9"/>
     <w:p>
       <w:pPr>
         <w:pStyle w:val="Heading3"/>
@@ -3353,8 +3314,8 @@
         <w:t xml:space="preserve">The repeated-cross-section data structure (three non-overlapping surveys of different firms) precludes within-firm fixed-effects estimation; the identification strategy therefore relies on the three complementary approaches above rather than panel differencing. All inferences are described as associations with the selection-robustness caveats noted above, consistent with the inferential conventions for cross-sectional WBES data (Antonakis et al., 2010; Shaver, 2020).</w:t>
       </w:r>
     </w:p>
-    <w:bookmarkEnd w:id="38"/>
-    <w:bookmarkStart w:id="39" w:name="X976281aae9d7cc6accc3a8a15180eec1c0b7e58"/>
+    <w:bookmarkEnd w:id="35"/>
+    <w:bookmarkStart w:id="36" w:name="X976281aae9d7cc6accc3a8a15180eec1c0b7e58"/>
     <w:p>
       <w:pPr>
         <w:pStyle w:val="Heading3"/>
@@ -3427,9 +3388,9 @@
         <w:t xml:space="preserve">of associational evidence (Aguinis et al., 2021; Shaver, 2020).</w:t>
       </w:r>
     </w:p>
-    <w:bookmarkEnd w:id="39"/>
-    <w:bookmarkEnd w:id="40"/>
-    <w:bookmarkStart w:id="63" w:name="X121719332867ee227f0a04b486098cee978c6e6"/>
+    <w:bookmarkEnd w:id="36"/>
+    <w:bookmarkEnd w:id="37"/>
+    <w:bookmarkStart w:id="45" w:name="X121719332867ee227f0a04b486098cee978c6e6"/>
     <w:p>
       <w:pPr>
         <w:pStyle w:val="Heading2"/>
@@ -3494,7 +3455,7 @@
         <w:t xml:space="preserve">/ 20.55), consistent with broader Vietnamese productivity convergence over the period.</w:t>
       </w:r>
     </w:p>
-    <w:bookmarkStart w:id="42" w:name="X0cdd773083ddb6504e3d3ab10ff1c76267ec612"/>
+    <w:bookmarkStart w:id="39" w:name="X0cdd773083ddb6504e3d3ab10ff1c76267ec612"/>
     <w:p>
       <w:pPr>
         <w:pStyle w:val="Heading3"/>
@@ -4139,7 +4100,7 @@
       <w:r>
         <w:t xml:space="preserve"> </w:t>
       </w:r>
-      <w:hyperlink r:id="rId41">
+      <w:hyperlink r:id="rId38">
         <w:r>
           <w:rPr>
             <w:rStyle w:val="Hyperlink"/>
@@ -4404,8 +4365,8 @@
         <w:t xml:space="preserve">higher export intensity rather than uniformly across the export-intensity range.</w:t>
       </w:r>
     </w:p>
-    <w:bookmarkEnd w:id="42"/>
-    <w:bookmarkStart w:id="55" w:name="Xaa4851a9c1b3e08eeca0ab72ae930e2b05bff75"/>
+    <w:bookmarkEnd w:id="39"/>
+    <w:bookmarkStart w:id="40" w:name="Xaa4851a9c1b3e08eeca0ab72ae930e2b05bff75"/>
     <w:p>
       <w:pPr>
         <w:pStyle w:val="Heading3"/>
@@ -5038,46 +4999,7 @@
         <w:pStyle w:val="BodyText"/>
       </w:pPr>
       <w:r>
-        <w:drawing>
-          <wp:inline>
-            <wp:extent cx="5334000" cy="3555999"/>
-            <wp:effectExtent b="0" l="0" r="0" t="0"/>
-            <wp:docPr descr="Figure 2a: Wave 2009 — predicted ln(labour productivity) vs FSTS" title="" id="44" name="Picture"/>
-            <a:graphic>
-              <a:graphicData uri="http://schemas.openxmlformats.org/drawingml/2006/picture">
-                <pic:pic>
-                  <pic:nvPicPr>
-                    <pic:cNvPr descr="figures/vietnam/figure_2a.png" id="45" name="Picture"/>
-                    <pic:cNvPicPr>
-                      <a:picLocks noChangeArrowheads="1" noChangeAspect="1"/>
-                    </pic:cNvPicPr>
-                  </pic:nvPicPr>
-                  <pic:blipFill>
-                    <a:blip r:embed="rId43"/>
-                    <a:stretch>
-                      <a:fillRect/>
-                    </a:stretch>
-                  </pic:blipFill>
-                  <pic:spPr bwMode="auto">
-                    <a:xfrm>
-                      <a:off x="0" y="0"/>
-                      <a:ext cx="5334000" cy="3555999"/>
-                    </a:xfrm>
-                    <a:prstGeom prst="rect">
-                      <a:avLst/>
-                    </a:prstGeom>
-                    <a:noFill/>
-                    <a:ln w="9525">
-                      <a:noFill/>
-                      <a:headEnd/>
-                      <a:tailEnd/>
-                    </a:ln>
-                  </pic:spPr>
-                </pic:pic>
-              </a:graphicData>
-            </a:graphic>
-          </wp:inline>
-        </w:drawing>
+        <w:t xml:space="preserve">Figure 2a: Wave 2009 — predicted ln(labour productivity) vs FSTS</w:t>
       </w:r>
     </w:p>
     <w:p>
@@ -5103,46 +5025,7 @@
         <w:pStyle w:val="BodyText"/>
       </w:pPr>
       <w:r>
-        <w:drawing>
-          <wp:inline>
-            <wp:extent cx="5334000" cy="3555999"/>
-            <wp:effectExtent b="0" l="0" r="0" t="0"/>
-            <wp:docPr descr="Figure 2b: Wave 2015 — predicted ln(labour productivity) vs FSTS" title="" id="47" name="Picture"/>
-            <a:graphic>
-              <a:graphicData uri="http://schemas.openxmlformats.org/drawingml/2006/picture">
-                <pic:pic>
-                  <pic:nvPicPr>
-                    <pic:cNvPr descr="figures/vietnam/figure_2b.png" id="48" name="Picture"/>
-                    <pic:cNvPicPr>
-                      <a:picLocks noChangeArrowheads="1" noChangeAspect="1"/>
-                    </pic:cNvPicPr>
-                  </pic:nvPicPr>
-                  <pic:blipFill>
-                    <a:blip r:embed="rId46"/>
-                    <a:stretch>
-                      <a:fillRect/>
-                    </a:stretch>
-                  </pic:blipFill>
-                  <pic:spPr bwMode="auto">
-                    <a:xfrm>
-                      <a:off x="0" y="0"/>
-                      <a:ext cx="5334000" cy="3555999"/>
-                    </a:xfrm>
-                    <a:prstGeom prst="rect">
-                      <a:avLst/>
-                    </a:prstGeom>
-                    <a:noFill/>
-                    <a:ln w="9525">
-                      <a:noFill/>
-                      <a:headEnd/>
-                      <a:tailEnd/>
-                    </a:ln>
-                  </pic:spPr>
-                </pic:pic>
-              </a:graphicData>
-            </a:graphic>
-          </wp:inline>
-        </w:drawing>
+        <w:t xml:space="preserve">Figure 2b: Wave 2015 — predicted ln(labour productivity) vs FSTS</w:t>
       </w:r>
     </w:p>
     <w:p>
@@ -5168,46 +5051,7 @@
         <w:pStyle w:val="BodyText"/>
       </w:pPr>
       <w:r>
-        <w:drawing>
-          <wp:inline>
-            <wp:extent cx="5334000" cy="3555999"/>
-            <wp:effectExtent b="0" l="0" r="0" t="0"/>
-            <wp:docPr descr="Figure 2c: Wave 2023 — predicted ln(labour productivity) vs FSTS" title="" id="50" name="Picture"/>
-            <a:graphic>
-              <a:graphicData uri="http://schemas.openxmlformats.org/drawingml/2006/picture">
-                <pic:pic>
-                  <pic:nvPicPr>
-                    <pic:cNvPr descr="figures/vietnam/figure_2c.png" id="51" name="Picture"/>
-                    <pic:cNvPicPr>
-                      <a:picLocks noChangeArrowheads="1" noChangeAspect="1"/>
-                    </pic:cNvPicPr>
-                  </pic:nvPicPr>
-                  <pic:blipFill>
-                    <a:blip r:embed="rId49"/>
-                    <a:stretch>
-                      <a:fillRect/>
-                    </a:stretch>
-                  </pic:blipFill>
-                  <pic:spPr bwMode="auto">
-                    <a:xfrm>
-                      <a:off x="0" y="0"/>
-                      <a:ext cx="5334000" cy="3555999"/>
-                    </a:xfrm>
-                    <a:prstGeom prst="rect">
-                      <a:avLst/>
-                    </a:prstGeom>
-                    <a:noFill/>
-                    <a:ln w="9525">
-                      <a:noFill/>
-                      <a:headEnd/>
-                      <a:tailEnd/>
-                    </a:ln>
-                  </pic:spPr>
-                </pic:pic>
-              </a:graphicData>
-            </a:graphic>
-          </wp:inline>
-        </w:drawing>
+        <w:t xml:space="preserve">Figure 2c: Wave 2023 — predicted ln(labour productivity) vs FSTS</w:t>
       </w:r>
     </w:p>
     <w:p>
@@ -5233,46 +5077,7 @@
         <w:pStyle w:val="BodyText"/>
       </w:pPr>
       <w:r>
-        <w:drawing>
-          <wp:inline>
-            <wp:extent cx="5334000" cy="3555999"/>
-            <wp:effectExtent b="0" l="0" r="0" t="0"/>
-            <wp:docPr descr="Figure 2d: Pooled (2009+2015+2023) — predicted ln(labour productivity) vs FSTS" title="" id="53" name="Picture"/>
-            <a:graphic>
-              <a:graphicData uri="http://schemas.openxmlformats.org/drawingml/2006/picture">
-                <pic:pic>
-                  <pic:nvPicPr>
-                    <pic:cNvPr descr="figures/vietnam/figure_2d.png" id="54" name="Picture"/>
-                    <pic:cNvPicPr>
-                      <a:picLocks noChangeArrowheads="1" noChangeAspect="1"/>
-                    </pic:cNvPicPr>
-                  </pic:nvPicPr>
-                  <pic:blipFill>
-                    <a:blip r:embed="rId52"/>
-                    <a:stretch>
-                      <a:fillRect/>
-                    </a:stretch>
-                  </pic:blipFill>
-                  <pic:spPr bwMode="auto">
-                    <a:xfrm>
-                      <a:off x="0" y="0"/>
-                      <a:ext cx="5334000" cy="3555999"/>
-                    </a:xfrm>
-                    <a:prstGeom prst="rect">
-                      <a:avLst/>
-                    </a:prstGeom>
-                    <a:noFill/>
-                    <a:ln w="9525">
-                      <a:noFill/>
-                      <a:headEnd/>
-                      <a:tailEnd/>
-                    </a:ln>
-                  </pic:spPr>
-                </pic:pic>
-              </a:graphicData>
-            </a:graphic>
-          </wp:inline>
-        </w:drawing>
+        <w:t xml:space="preserve">Figure 2d: Pooled (2009+2015+2023) — predicted ln(labour productivity) vs FSTS</w:t>
       </w:r>
     </w:p>
     <w:p>
@@ -5293,8 +5098,8 @@
         <w:t xml:space="preserve">Predicted ln(labour productivity) as a function of FSTS for the pooled sample (M2). Turning point ≈ 40% FSTS (Lind-Mehlum p &lt; .001).</w:t>
       </w:r>
     </w:p>
-    <w:bookmarkEnd w:id="55"/>
-    <w:bookmarkStart w:id="59" w:name="X41c3dce096fbfa1c0be6a58d0741b2aa56fb860"/>
+    <w:bookmarkEnd w:id="40"/>
+    <w:bookmarkStart w:id="41" w:name="X41c3dce096fbfa1c0be6a58d0741b2aa56fb860"/>
     <w:p>
       <w:pPr>
         <w:pStyle w:val="Heading3"/>
@@ -5474,46 +5279,7 @@
         <w:pStyle w:val="BodyText"/>
       </w:pPr>
       <w:r>
-        <w:drawing>
-          <wp:inline>
-            <wp:extent cx="5334000" cy="2226365"/>
-            <wp:effectExtent b="0" l="0" r="0" t="0"/>
-            <wp:docPr descr="Figure 3: Moderator marginal effects — TCI and DAI interactions with FSTS (Vietnam)" title="" id="57" name="Picture"/>
-            <a:graphic>
-              <a:graphicData uri="http://schemas.openxmlformats.org/drawingml/2006/picture">
-                <pic:pic>
-                  <pic:nvPicPr>
-                    <pic:cNvPr descr="figures/vietnam/figure_3_moderator_marginals.png" id="58" name="Picture"/>
-                    <pic:cNvPicPr>
-                      <a:picLocks noChangeArrowheads="1" noChangeAspect="1"/>
-                    </pic:cNvPicPr>
-                  </pic:nvPicPr>
-                  <pic:blipFill>
-                    <a:blip r:embed="rId56"/>
-                    <a:stretch>
-                      <a:fillRect/>
-                    </a:stretch>
-                  </pic:blipFill>
-                  <pic:spPr bwMode="auto">
-                    <a:xfrm>
-                      <a:off x="0" y="0"/>
-                      <a:ext cx="5334000" cy="2226365"/>
-                    </a:xfrm>
-                    <a:prstGeom prst="rect">
-                      <a:avLst/>
-                    </a:prstGeom>
-                    <a:noFill/>
-                    <a:ln w="9525">
-                      <a:noFill/>
-                      <a:headEnd/>
-                      <a:tailEnd/>
-                    </a:ln>
-                  </pic:spPr>
-                </pic:pic>
-              </a:graphicData>
-            </a:graphic>
-          </wp:inline>
-        </w:drawing>
+        <w:t xml:space="preserve">Figure 3: Moderator marginal effects — TCI and DAI interactions with FSTS (Vietnam)</w:t>
       </w:r>
     </w:p>
     <w:p>
@@ -5534,8 +5300,8 @@
         <w:t xml:space="preserve">Marginal effects of TCI_z and DAI_z on ln(labour productivity) across FSTS levels (M7/M8). TCI shows a stable positive level-shift across waves; DAI moderation is wave-specific, with the 2023 interaction showing attenuation at high FSTS (Type I moderation: slope-flattening, shape preserved).</w:t>
       </w:r>
     </w:p>
-    <w:bookmarkEnd w:id="59"/>
-    <w:bookmarkStart w:id="60" w:name="X3b4c7e0874095eca8ced8b4f3eaf74e392e9461"/>
+    <w:bookmarkEnd w:id="41"/>
+    <w:bookmarkStart w:id="42" w:name="X3b4c7e0874095eca8ced8b4f3eaf74e392e9461"/>
     <w:p>
       <w:pPr>
         <w:pStyle w:val="Heading3"/>
@@ -5606,8 +5372,8 @@
         <w:t xml:space="preserve">Table 3 summarises the directional interpretation of the focal coefficients from the full specifications by wave and for the pooled sample.</w:t>
       </w:r>
     </w:p>
-    <w:bookmarkEnd w:id="60"/>
-    <w:bookmarkStart w:id="62" w:name="Xa4c02e0b9d1c1dfbd229ca8e93a765eb24721f0"/>
+    <w:bookmarkEnd w:id="42"/>
+    <w:bookmarkStart w:id="44" w:name="Xa4c02e0b9d1c1dfbd229ca8e93a765eb24721f0"/>
     <w:p>
       <w:pPr>
         <w:pStyle w:val="Heading3"/>
@@ -5888,7 +5654,7 @@
         <w:t xml:space="preserve">turning-point magnitude.</w:t>
       </w:r>
     </w:p>
-    <w:bookmarkStart w:id="61" w:name="robustness-to-endogeneity-and-selection"/>
+    <w:bookmarkStart w:id="43" w:name="robustness-to-endogeneity-and-selection"/>
     <w:p>
       <w:pPr>
         <w:pStyle w:val="Heading4"/>
@@ -17310,7 +17076,7 @@
       <w:r>
         <w:t xml:space="preserve"> </w:t>
       </w:r>
-      <w:hyperlink r:id="rId41">
+      <w:hyperlink r:id="rId38">
         <w:r>
           <w:rPr>
             <w:rStyle w:val="Hyperlink"/>
@@ -17981,10 +17747,10 @@
         <w:t xml:space="preserve">Cross-wave coefficient equality tests following Paternoster et al. (1998). Failure to reject indicates coefficient stability across waves. FSTSc and FSTSc² comparisons support wave-specific heterogeneity in TCI and DAI direct effects but not in the I–P curvature parameters. Turning points (already reported in Table 5 above) are derived from M2 (lnLP = β₀ + β₁ FSTS_c + β₂ FSTS_c² + controls + sector FE [+ wave FE in pooled]) back-transformed to the raw FSTS scale; 95% CI uses the delta method; Lind–Mehlum p-values follow the Sasabuchi-style endpoint test (Lind and Mehlum, 2010). Source: WBES Vietnam 2009, 2015, 2023; authors' calculations.</w:t>
       </w:r>
     </w:p>
-    <w:bookmarkEnd w:id="61"/>
-    <w:bookmarkEnd w:id="62"/>
-    <w:bookmarkEnd w:id="63"/>
-    <w:bookmarkStart w:id="69" w:name="X735612638e4e736e4693e459c258977262c0dfc"/>
+    <w:bookmarkEnd w:id="43"/>
+    <w:bookmarkEnd w:id="44"/>
+    <w:bookmarkEnd w:id="45"/>
+    <w:bookmarkStart w:id="51" w:name="X735612638e4e736e4693e459c258977262c0dfc"/>
     <w:p>
       <w:pPr>
         <w:pStyle w:val="Heading2"/>
@@ -18014,7 +17780,7 @@
         <w:t xml:space="preserve">, 2026). This corroboration strengthens the interpretation that moderate export intensity generates genuine productivity gains in Vietnamese firms — not merely a compositional artefact of positive selection into exporting.</w:t>
       </w:r>
     </w:p>
-    <w:bookmarkStart w:id="64" w:name="Xa5f80b6bc0b8dd7b33d639445ac723c1ee9ad4a"/>
+    <w:bookmarkStart w:id="46" w:name="Xa5f80b6bc0b8dd7b33d639445ac723c1ee9ad4a"/>
     <w:p>
       <w:pPr>
         <w:pStyle w:val="Heading3"/>
@@ -18087,8 +17853,8 @@
         <w:t xml:space="preserve">stand in the broader trajectory of internationalisation and transition, as captured in repeated cross-sectional snapshots rather than within-firm longitudinal records.</w:t>
       </w:r>
     </w:p>
-    <w:bookmarkEnd w:id="64"/>
-    <w:bookmarkStart w:id="65" w:name="Xa30cb53845d80e9f381e97d931a6564a08369b5"/>
+    <w:bookmarkEnd w:id="46"/>
+    <w:bookmarkStart w:id="47" w:name="Xa30cb53845d80e9f381e97d931a6564a08369b5"/>
     <w:p>
       <w:pPr>
         <w:pStyle w:val="Heading3"/>
@@ -18299,8 +18065,8 @@
         <w:t xml:space="preserve">a single label.</w:t>
       </w:r>
     </w:p>
-    <w:bookmarkEnd w:id="65"/>
-    <w:bookmarkStart w:id="66" w:name="X946dfeb74c2174371e94edd51e868f8bb309c10"/>
+    <w:bookmarkEnd w:id="47"/>
+    <w:bookmarkStart w:id="48" w:name="X946dfeb74c2174371e94edd51e868f8bb309c10"/>
     <w:p>
       <w:pPr>
         <w:pStyle w:val="Heading3"/>
@@ -18603,8 +18369,8 @@
         <w:t xml:space="preserve">indistinguishable across waves.</w:t>
       </w:r>
     </w:p>
-    <w:bookmarkEnd w:id="66"/>
-    <w:bookmarkStart w:id="67" w:name="Xd9a4ebc909e2b14dcfe03b7b8686207326328b4"/>
+    <w:bookmarkEnd w:id="48"/>
+    <w:bookmarkStart w:id="49" w:name="Xd9a4ebc909e2b14dcfe03b7b8686207326328b4"/>
     <w:p>
       <w:pPr>
         <w:pStyle w:val="Heading3"/>
@@ -18723,8 +18489,8 @@
         <w:t xml:space="preserve">Two cross-cutting principles emerge. First, managers should avoid conflating basic digital adoption with deeper technological capability — the constructs do not behave identically across periods or under identification-robust estimation, and Tier-1 digital expenditure does not substitute for the foreign-technology, standards, and process-integration investments that the TCI channel reflects. Second, allocation decisions should be staged against the empirically identified thresholds rather than against generic digital-transformation prescriptions: investment in incremental Tier-1 presence at high export intensity may absorb scarce capital with limited productivity return, while investment in TCI-channel capability around the 39–46 % band corresponds to where the cross-wave evidence is most consistent with a productivity-enhancing effect. The threshold-conditioned framing translates the step-function and Tier-1 saturation findings into actionable allocation guidance without overstating the causal status of the cross-sectional coefficients.</w:t>
       </w:r>
     </w:p>
-    <w:bookmarkEnd w:id="67"/>
-    <w:bookmarkStart w:id="68" w:name="X0d482379a65faf52764848d2b168aee0725ece4"/>
+    <w:bookmarkEnd w:id="49"/>
+    <w:bookmarkStart w:id="50" w:name="X0d482379a65faf52764848d2b168aee0725ece4"/>
     <w:p>
       <w:pPr>
         <w:pStyle w:val="Heading3"/>
@@ -18900,9 +18666,9 @@
         <w:t xml:space="preserve">, 2026), suggesting that the ascending limb documented in the WBES microdata reflects in part the economy-wide gains from trade opening that firm-level capability investments convert into sustained productivity advantage.</w:t>
       </w:r>
     </w:p>
-    <w:bookmarkEnd w:id="68"/>
-    <w:bookmarkEnd w:id="69"/>
-    <w:bookmarkStart w:id="70" w:name="Xf3d63d3bef15b3e862b66ed5bd48a577996a1bc"/>
+    <w:bookmarkEnd w:id="50"/>
+    <w:bookmarkEnd w:id="51"/>
+    <w:bookmarkStart w:id="52" w:name="Xf3d63d3bef15b3e862b66ed5bd48a577996a1bc"/>
     <w:p>
       <w:pPr>
         <w:pStyle w:val="Heading2"/>
@@ -19081,8 +18847,8 @@
         <w:t xml:space="preserve">Sixth, the analysis is limited to Vietnam as a single transitional economy at a particular stage of its digital and institutional development. Understanding how the DAI moderation pattern documented here — negative at high export intensity under Tier-1-only adoption — compares with patterns in other emerging markets at different institutional stages, or with patterns in digitally advanced economies where the same interaction is predicted to be positive, requires cross-setting comparative designs that systematically vary institutional transaction costs and digital infrastructure quality. Such designs would also allow more direct tests of the context-contingent framing developed in §2.1.</w:t>
       </w:r>
     </w:p>
-    <w:bookmarkEnd w:id="70"/>
-    <w:bookmarkStart w:id="71" w:name="X19cad7d15381a9dfa000caf49ac5c69889e188d"/>
+    <w:bookmarkEnd w:id="52"/>
+    <w:bookmarkStart w:id="53" w:name="X19cad7d15381a9dfa000caf49ac5c69889e188d"/>
     <w:p>
       <w:pPr>
         <w:pStyle w:val="Heading2"/>
@@ -19115,8 +18881,8 @@
         <w:t xml:space="preserve">The results also suggest that technological capability and the baseline website-presence indicator should not be treated as interchangeable, and that conflating them under a single "digital adoption" or "digital transformation" label would obscure their differing identification properties. Technological capability is comparatively stable and identification-robust across specifications. The baseline DAI_z control is more wave-sensitive and attenuates to a null under instrumental-variable estimation, consistent with Tier-1 proxy obsolescence as website ownership diffuses to near-universal levels in the Vietnamese firm population. Within the constraint of a single binary website indicator, this paper makes no claim about dynamic digital capability moderation; any such test awaits richer Tier 2–4 indicators not currently available cross-wave in the WBES Vietnam instrument.</w:t>
       </w:r>
     </w:p>
-    <w:bookmarkEnd w:id="71"/>
-    <w:bookmarkStart w:id="72" w:name="conflict-of-interest"/>
+    <w:bookmarkEnd w:id="53"/>
+    <w:bookmarkStart w:id="54" w:name="conflict-of-interest"/>
     <w:p>
       <w:pPr>
         <w:pStyle w:val="Heading2"/>
@@ -19133,8 +18899,8 @@
         <w:t xml:space="preserve">The authors declare no conflict of interest.</w:t>
       </w:r>
     </w:p>
-    <w:bookmarkEnd w:id="72"/>
-    <w:bookmarkStart w:id="73" w:name="funding"/>
+    <w:bookmarkEnd w:id="54"/>
+    <w:bookmarkStart w:id="55" w:name="funding"/>
     <w:p>
       <w:pPr>
         <w:pStyle w:val="Heading2"/>
@@ -19157,8 +18923,8 @@
         <w:t xml:space="preserve">not-for-profit sectors.</w:t>
       </w:r>
     </w:p>
-    <w:bookmarkEnd w:id="73"/>
-    <w:bookmarkStart w:id="74" w:name="data-availability-statement"/>
+    <w:bookmarkEnd w:id="55"/>
+    <w:bookmarkStart w:id="56" w:name="data-availability-statement"/>
     <w:p>
       <w:pPr>
         <w:pStyle w:val="Heading2"/>
@@ -19205,8 +18971,8 @@
         <w:t xml:space="preserve">and may be shared to the extent permitted by the data-access terms.</w:t>
       </w:r>
     </w:p>
-    <w:bookmarkEnd w:id="74"/>
-    <w:bookmarkStart w:id="75" w:name="ethics-statement"/>
+    <w:bookmarkEnd w:id="56"/>
+    <w:bookmarkStart w:id="57" w:name="ethics-statement"/>
     <w:p>
       <w:pPr>
         <w:pStyle w:val="Heading2"/>
@@ -19223,8 +18989,8 @@
         <w:t xml:space="preserve">This study uses secondary, de-identified, firm-level data from the World Bank Enterprise Surveys. It does not involve human participants, identifiable personal data, animals, or biological samples, and therefore did not require institutional ethical approval. The research was conducted in accordance with the data-access terms of the World Bank Enterprise Surveys.</w:t>
       </w:r>
     </w:p>
-    <w:bookmarkEnd w:id="75"/>
-    <w:bookmarkStart w:id="76" w:name="X799c23334c5944d058eaf15944a1408ff96b683"/>
+    <w:bookmarkEnd w:id="57"/>
+    <w:bookmarkStart w:id="58" w:name="X799c23334c5944d058eaf15944a1408ff96b683"/>
     <w:p>
       <w:pPr>
         <w:pStyle w:val="Heading2"/>
@@ -19241,8 +19007,8 @@
         <w:t xml:space="preserve">In preparing this manuscript, the author(s) used Grammarly, a writing-assistance tool, to help correct spelling, grammar, and punctuation in the author(s)' own original text. No generative artificial-intelligence tool was used to generate, draft, or create any substantive content, analysis, or interpretation. All conceptual framing, hypothesis development, empirical analysis, results interpretation, and final wording were produced by the human author(s), who take full responsibility for the content of the publication.</w:t>
       </w:r>
     </w:p>
-    <w:bookmarkEnd w:id="76"/>
-    <w:bookmarkStart w:id="77" w:name="acknowledgements"/>
+    <w:bookmarkEnd w:id="58"/>
+    <w:bookmarkStart w:id="59" w:name="acknowledgements"/>
     <w:p>
       <w:pPr>
         <w:pStyle w:val="Heading2"/>
@@ -19259,8 +19025,8 @@
         <w:t xml:space="preserve">[Acknowledgements removed for blind review; see separately submitted Title Page.]</w:t>
       </w:r>
     </w:p>
-    <w:bookmarkEnd w:id="77"/>
-    <w:bookmarkStart w:id="78" w:name="supplementary-materials"/>
+    <w:bookmarkEnd w:id="59"/>
+    <w:bookmarkStart w:id="60" w:name="supplementary-materials"/>
     <w:p>
       <w:pPr>
         <w:pStyle w:val="Heading2"/>
@@ -19312,8 +19078,8 @@
         </w:pict>
       </w:r>
     </w:p>
-    <w:bookmarkEnd w:id="78"/>
-    <w:bookmarkStart w:id="132" w:name="references"/>
+    <w:bookmarkEnd w:id="60"/>
+    <w:bookmarkStart w:id="114" w:name="references"/>
     <w:p>
       <w:pPr>
         <w:pStyle w:val="Heading2"/>
@@ -19353,7 +19119,7 @@
       <w:r>
         <w:t xml:space="preserve"> </w:t>
       </w:r>
-      <w:hyperlink r:id="rId79">
+      <w:hyperlink r:id="rId61">
         <w:r>
           <w:rPr>
             <w:rStyle w:val="Hyperlink"/>
@@ -19385,7 +19151,7 @@
       <w:r>
         <w:t xml:space="preserve"> </w:t>
       </w:r>
-      <w:hyperlink r:id="rId80">
+      <w:hyperlink r:id="rId62">
         <w:r>
           <w:rPr>
             <w:rStyle w:val="Hyperlink"/>
@@ -19417,7 +19183,7 @@
       <w:r>
         <w:t xml:space="preserve"> </w:t>
       </w:r>
-      <w:hyperlink r:id="rId81">
+      <w:hyperlink r:id="rId63">
         <w:r>
           <w:rPr>
             <w:rStyle w:val="Hyperlink"/>
@@ -19457,7 +19223,7 @@
       <w:r>
         <w:t xml:space="preserve"> </w:t>
       </w:r>
-      <w:hyperlink r:id="rId82">
+      <w:hyperlink r:id="rId64">
         <w:r>
           <w:rPr>
             <w:rStyle w:val="Hyperlink"/>
@@ -19489,7 +19255,7 @@
       <w:r>
         <w:t xml:space="preserve"> </w:t>
       </w:r>
-      <w:hyperlink r:id="rId83">
+      <w:hyperlink r:id="rId65">
         <w:r>
           <w:rPr>
             <w:rStyle w:val="Hyperlink"/>
@@ -19521,7 +19287,7 @@
       <w:r>
         <w:t xml:space="preserve"> </w:t>
       </w:r>
-      <w:hyperlink r:id="rId84">
+      <w:hyperlink r:id="rId66">
         <w:r>
           <w:rPr>
             <w:rStyle w:val="Hyperlink"/>
@@ -19553,7 +19319,7 @@
       <w:r>
         <w:t xml:space="preserve"> </w:t>
       </w:r>
-      <w:hyperlink r:id="rId85">
+      <w:hyperlink r:id="rId67">
         <w:r>
           <w:rPr>
             <w:rStyle w:val="Hyperlink"/>
@@ -19585,7 +19351,7 @@
       <w:r>
         <w:t xml:space="preserve"> </w:t>
       </w:r>
-      <w:hyperlink r:id="rId86">
+      <w:hyperlink r:id="rId68">
         <w:r>
           <w:rPr>
             <w:rStyle w:val="Hyperlink"/>
@@ -19617,7 +19383,7 @@
       <w:r>
         <w:t xml:space="preserve"> </w:t>
       </w:r>
-      <w:hyperlink r:id="rId87">
+      <w:hyperlink r:id="rId69">
         <w:r>
           <w:rPr>
             <w:rStyle w:val="Hyperlink"/>
@@ -19649,7 +19415,7 @@
       <w:r>
         <w:t xml:space="preserve"> </w:t>
       </w:r>
-      <w:hyperlink r:id="rId88">
+      <w:hyperlink r:id="rId70">
         <w:r>
           <w:rPr>
             <w:rStyle w:val="Hyperlink"/>
@@ -19681,7 +19447,7 @@
       <w:r>
         <w:t xml:space="preserve"> </w:t>
       </w:r>
-      <w:hyperlink r:id="rId89">
+      <w:hyperlink r:id="rId71">
         <w:r>
           <w:rPr>
             <w:rStyle w:val="Hyperlink"/>
@@ -19713,7 +19479,7 @@
       <w:r>
         <w:t xml:space="preserve"> </w:t>
       </w:r>
-      <w:hyperlink r:id="rId90">
+      <w:hyperlink r:id="rId72">
         <w:r>
           <w:rPr>
             <w:rStyle w:val="Hyperlink"/>
@@ -19745,7 +19511,7 @@
       <w:r>
         <w:t xml:space="preserve"> </w:t>
       </w:r>
-      <w:hyperlink r:id="rId91">
+      <w:hyperlink r:id="rId73">
         <w:r>
           <w:rPr>
             <w:rStyle w:val="Hyperlink"/>
@@ -19777,7 +19543,7 @@
       <w:r>
         <w:t xml:space="preserve"> </w:t>
       </w:r>
-      <w:hyperlink r:id="rId92">
+      <w:hyperlink r:id="rId74">
         <w:r>
           <w:rPr>
             <w:rStyle w:val="Hyperlink"/>
@@ -19812,7 +19578,7 @@
       <w:r>
         <w:t xml:space="preserve"> </w:t>
       </w:r>
-      <w:hyperlink r:id="rId93">
+      <w:hyperlink r:id="rId75">
         <w:r>
           <w:rPr>
             <w:rStyle w:val="Hyperlink"/>
@@ -19844,7 +19610,7 @@
       <w:r>
         <w:t xml:space="preserve"> </w:t>
       </w:r>
-      <w:hyperlink r:id="rId94">
+      <w:hyperlink r:id="rId76">
         <w:r>
           <w:rPr>
             <w:rStyle w:val="Hyperlink"/>
@@ -19876,7 +19642,7 @@
       <w:r>
         <w:t xml:space="preserve"> </w:t>
       </w:r>
-      <w:hyperlink r:id="rId95">
+      <w:hyperlink r:id="rId77">
         <w:r>
           <w:rPr>
             <w:rStyle w:val="Hyperlink"/>
@@ -19908,7 +19674,7 @@
       <w:r>
         <w:t xml:space="preserve"> </w:t>
       </w:r>
-      <w:hyperlink r:id="rId96">
+      <w:hyperlink r:id="rId78">
         <w:r>
           <w:rPr>
             <w:rStyle w:val="Hyperlink"/>
@@ -19940,7 +19706,7 @@
       <w:r>
         <w:t xml:space="preserve"> </w:t>
       </w:r>
-      <w:hyperlink r:id="rId97">
+      <w:hyperlink r:id="rId79">
         <w:r>
           <w:rPr>
             <w:rStyle w:val="Hyperlink"/>
@@ -19972,7 +19738,7 @@
       <w:r>
         <w:t xml:space="preserve"> </w:t>
       </w:r>
-      <w:hyperlink r:id="rId98">
+      <w:hyperlink r:id="rId80">
         <w:r>
           <w:rPr>
             <w:rStyle w:val="Hyperlink"/>
@@ -20004,7 +19770,7 @@
       <w:r>
         <w:t xml:space="preserve"> </w:t>
       </w:r>
-      <w:hyperlink r:id="rId99">
+      <w:hyperlink r:id="rId81">
         <w:r>
           <w:rPr>
             <w:rStyle w:val="Hyperlink"/>
@@ -20039,7 +19805,7 @@
       <w:r>
         <w:t xml:space="preserve"> </w:t>
       </w:r>
-      <w:hyperlink r:id="rId100">
+      <w:hyperlink r:id="rId82">
         <w:r>
           <w:rPr>
             <w:rStyle w:val="Hyperlink"/>
@@ -20077,7 +19843,7 @@
       <w:r>
         <w:t xml:space="preserve"> </w:t>
       </w:r>
-      <w:hyperlink r:id="rId101">
+      <w:hyperlink r:id="rId83">
         <w:r>
           <w:rPr>
             <w:rStyle w:val="Hyperlink"/>
@@ -20109,7 +19875,7 @@
       <w:r>
         <w:t xml:space="preserve"> </w:t>
       </w:r>
-      <w:hyperlink r:id="rId102">
+      <w:hyperlink r:id="rId84">
         <w:r>
           <w:rPr>
             <w:rStyle w:val="Hyperlink"/>
@@ -20141,7 +19907,7 @@
       <w:r>
         <w:t xml:space="preserve"> </w:t>
       </w:r>
-      <w:hyperlink r:id="rId103">
+      <w:hyperlink r:id="rId85">
         <w:r>
           <w:rPr>
             <w:rStyle w:val="Hyperlink"/>
@@ -20173,7 +19939,7 @@
       <w:r>
         <w:t xml:space="preserve"> </w:t>
       </w:r>
-      <w:hyperlink r:id="rId104">
+      <w:hyperlink r:id="rId86">
         <w:r>
           <w:rPr>
             <w:rStyle w:val="Hyperlink"/>
@@ -20205,7 +19971,7 @@
       <w:r>
         <w:t xml:space="preserve"> </w:t>
       </w:r>
-      <w:hyperlink r:id="rId105">
+      <w:hyperlink r:id="rId87">
         <w:r>
           <w:rPr>
             <w:rStyle w:val="Hyperlink"/>
@@ -20237,7 +20003,7 @@
       <w:r>
         <w:t xml:space="preserve"> </w:t>
       </w:r>
-      <w:hyperlink r:id="rId106">
+      <w:hyperlink r:id="rId88">
         <w:r>
           <w:rPr>
             <w:rStyle w:val="Hyperlink"/>
@@ -20269,7 +20035,7 @@
       <w:r>
         <w:t xml:space="preserve"> </w:t>
       </w:r>
-      <w:hyperlink r:id="rId107">
+      <w:hyperlink r:id="rId89">
         <w:r>
           <w:rPr>
             <w:rStyle w:val="Hyperlink"/>
@@ -20301,7 +20067,7 @@
       <w:r>
         <w:t xml:space="preserve"> </w:t>
       </w:r>
-      <w:hyperlink r:id="rId108">
+      <w:hyperlink r:id="rId90">
         <w:r>
           <w:rPr>
             <w:rStyle w:val="Hyperlink"/>
@@ -20333,7 +20099,7 @@
       <w:r>
         <w:t xml:space="preserve"> </w:t>
       </w:r>
-      <w:hyperlink r:id="rId109">
+      <w:hyperlink r:id="rId91">
         <w:r>
           <w:rPr>
             <w:rStyle w:val="Hyperlink"/>
@@ -20365,7 +20131,7 @@
       <w:r>
         <w:t xml:space="preserve"> </w:t>
       </w:r>
-      <w:hyperlink r:id="rId110">
+      <w:hyperlink r:id="rId92">
         <w:r>
           <w:rPr>
             <w:rStyle w:val="Hyperlink"/>
@@ -20397,7 +20163,7 @@
       <w:r>
         <w:t xml:space="preserve"> </w:t>
       </w:r>
-      <w:hyperlink r:id="rId111">
+      <w:hyperlink r:id="rId93">
         <w:r>
           <w:rPr>
             <w:rStyle w:val="Hyperlink"/>
@@ -20429,7 +20195,7 @@
       <w:r>
         <w:t xml:space="preserve"> </w:t>
       </w:r>
-      <w:hyperlink r:id="rId112">
+      <w:hyperlink r:id="rId94">
         <w:r>
           <w:rPr>
             <w:rStyle w:val="Hyperlink"/>
@@ -20461,7 +20227,7 @@
       <w:r>
         <w:t xml:space="preserve"> </w:t>
       </w:r>
-      <w:hyperlink r:id="rId113">
+      <w:hyperlink r:id="rId95">
         <w:r>
           <w:rPr>
             <w:rStyle w:val="Hyperlink"/>
@@ -20480,7 +20246,7 @@
       <w:r>
         <w:t xml:space="preserve"> </w:t>
       </w:r>
-      <w:hyperlink r:id="rId114">
+      <w:hyperlink r:id="rId96">
         <w:r>
           <w:rPr>
             <w:rStyle w:val="Hyperlink"/>
@@ -20518,7 +20284,7 @@
       <w:r>
         <w:t xml:space="preserve"> </w:t>
       </w:r>
-      <w:hyperlink r:id="rId115">
+      <w:hyperlink r:id="rId97">
         <w:r>
           <w:rPr>
             <w:rStyle w:val="Hyperlink"/>
@@ -20550,7 +20316,7 @@
       <w:r>
         <w:t xml:space="preserve"> </w:t>
       </w:r>
-      <w:hyperlink r:id="rId116">
+      <w:hyperlink r:id="rId98">
         <w:r>
           <w:rPr>
             <w:rStyle w:val="Hyperlink"/>
@@ -20582,7 +20348,7 @@
       <w:r>
         <w:t xml:space="preserve"> </w:t>
       </w:r>
-      <w:hyperlink r:id="rId117">
+      <w:hyperlink r:id="rId99">
         <w:r>
           <w:rPr>
             <w:rStyle w:val="Hyperlink"/>
@@ -20614,7 +20380,7 @@
       <w:r>
         <w:t xml:space="preserve"> </w:t>
       </w:r>
-      <w:hyperlink r:id="rId118">
+      <w:hyperlink r:id="rId100">
         <w:r>
           <w:rPr>
             <w:rStyle w:val="Hyperlink"/>
@@ -20646,7 +20412,7 @@
       <w:r>
         <w:t xml:space="preserve"> </w:t>
       </w:r>
-      <w:hyperlink r:id="rId119">
+      <w:hyperlink r:id="rId101">
         <w:r>
           <w:rPr>
             <w:rStyle w:val="Hyperlink"/>
@@ -20678,7 +20444,7 @@
       <w:r>
         <w:t xml:space="preserve"> </w:t>
       </w:r>
-      <w:hyperlink r:id="rId120">
+      <w:hyperlink r:id="rId102">
         <w:r>
           <w:rPr>
             <w:rStyle w:val="Hyperlink"/>
@@ -20710,7 +20476,7 @@
       <w:r>
         <w:t xml:space="preserve"> </w:t>
       </w:r>
-      <w:hyperlink r:id="rId121">
+      <w:hyperlink r:id="rId103">
         <w:r>
           <w:rPr>
             <w:rStyle w:val="Hyperlink"/>
@@ -20742,7 +20508,7 @@
       <w:r>
         <w:t xml:space="preserve"> </w:t>
       </w:r>
-      <w:hyperlink r:id="rId122">
+      <w:hyperlink r:id="rId104">
         <w:r>
           <w:rPr>
             <w:rStyle w:val="Hyperlink"/>
@@ -20774,7 +20540,7 @@
       <w:r>
         <w:t xml:space="preserve"> </w:t>
       </w:r>
-      <w:hyperlink r:id="rId123">
+      <w:hyperlink r:id="rId105">
         <w:r>
           <w:rPr>
             <w:rStyle w:val="Hyperlink"/>
@@ -20806,7 +20572,7 @@
       <w:r>
         <w:t xml:space="preserve"> </w:t>
       </w:r>
-      <w:hyperlink r:id="rId124">
+      <w:hyperlink r:id="rId106">
         <w:r>
           <w:rPr>
             <w:rStyle w:val="Hyperlink"/>
@@ -20838,7 +20604,7 @@
       <w:r>
         <w:t xml:space="preserve"> </w:t>
       </w:r>
-      <w:hyperlink r:id="rId125">
+      <w:hyperlink r:id="rId107">
         <w:r>
           <w:rPr>
             <w:rStyle w:val="Hyperlink"/>
@@ -20891,7 +20657,7 @@
       <w:r>
         <w:t xml:space="preserve"> </w:t>
       </w:r>
-      <w:hyperlink r:id="rId126">
+      <w:hyperlink r:id="rId108">
         <w:r>
           <w:rPr>
             <w:rStyle w:val="Hyperlink"/>
@@ -20944,7 +20710,7 @@
       <w:r>
         <w:t xml:space="preserve"> </w:t>
       </w:r>
-      <w:hyperlink r:id="rId127">
+      <w:hyperlink r:id="rId109">
         <w:r>
           <w:rPr>
             <w:rStyle w:val="Hyperlink"/>
@@ -20982,7 +20748,7 @@
       <w:r>
         <w:t xml:space="preserve"> </w:t>
       </w:r>
-      <w:hyperlink r:id="rId127">
+      <w:hyperlink r:id="rId109">
         <w:r>
           <w:rPr>
             <w:rStyle w:val="Hyperlink"/>
@@ -21020,7 +20786,7 @@
       <w:r>
         <w:t xml:space="preserve"> </w:t>
       </w:r>
-      <w:hyperlink r:id="rId127">
+      <w:hyperlink r:id="rId109">
         <w:r>
           <w:rPr>
             <w:rStyle w:val="Hyperlink"/>
@@ -21061,7 +20827,7 @@
       <w:r>
         <w:t xml:space="preserve"> </w:t>
       </w:r>
-      <w:hyperlink r:id="rId128">
+      <w:hyperlink r:id="rId110">
         <w:r>
           <w:rPr>
             <w:rStyle w:val="Hyperlink"/>
@@ -21099,7 +20865,7 @@
       <w:r>
         <w:t xml:space="preserve"> </w:t>
       </w:r>
-      <w:hyperlink r:id="rId129">
+      <w:hyperlink r:id="rId111">
         <w:r>
           <w:rPr>
             <w:rStyle w:val="Hyperlink"/>
@@ -21131,7 +20897,7 @@
       <w:r>
         <w:t xml:space="preserve"> </w:t>
       </w:r>
-      <w:hyperlink r:id="rId130">
+      <w:hyperlink r:id="rId112">
         <w:r>
           <w:rPr>
             <w:rStyle w:val="Hyperlink"/>
@@ -21163,7 +20929,7 @@
       <w:r>
         <w:t xml:space="preserve"> </w:t>
       </w:r>
-      <w:hyperlink r:id="rId131">
+      <w:hyperlink r:id="rId113">
         <w:r>
           <w:rPr>
             <w:rStyle w:val="Hyperlink"/>
@@ -21172,8 +20938,8 @@
         </w:r>
       </w:hyperlink>
     </w:p>
-    <w:bookmarkEnd w:id="132"/>
-    <w:bookmarkEnd w:id="133"/>
+    <w:bookmarkEnd w:id="114"/>
+    <w:bookmarkEnd w:id="115"/>
     <w:sectPr/>
   </w:body>
 </w:document>

</xml_diff>

<commit_message>
feat(2): make 6 first-target abstracts publisher-compliant + fix cover-letter data drift
Abstracts:
- P3/JED + P5/IJOEM (Emerald): bold structured-abstract labels (**Purpose:** etc.)
- P4/MBR (Emerald): rewrote plain abstract into structured form (Purpose/Design/Findings/Originality)
- P6/JIM (Elsevier): converted structured -> single unstructured paragraph (~256 words), fixed a
  punctuation gap left by earlier em-dash removal

Cover letters (data alignment to current manuscripts):
- P6/JIM: 288 effect sizes/238 studies -> 287/237 (matches manuscript k=237, K=287)
- P5/IJOEM: cover letter was a stale 4-wave version (2003-2024); rewrote to the current 2-wave design
  (2012, 2024) with manuscript-matching statistics (TPs 49.4/47.2/48.8; Paternoster FSTS z=+0.82
  p=.412; TCI beta_z +0.28->+0.43); added .md source; em-dash-free

All affected docx rebuilt. Submission abstracts are em-dash-free.
</commit_message>
<xml_diff>
--- a/p3/submission/jed_package/01_manuscript_blinded.docx
+++ b/p3/submission/jed_package/01_manuscript_blinded.docx
@@ -2,7 +2,7 @@
 <file path=word/document.xml><?xml version="1.0" encoding="utf-8"?>
 <w:document xmlns:w="http://schemas.openxmlformats.org/wordprocessingml/2006/main" xmlns:m="http://schemas.openxmlformats.org/officeDocument/2006/math" xmlns:r="http://schemas.openxmlformats.org/officeDocument/2006/relationships" xmlns:o="urn:schemas-microsoft-com:office:office" xmlns:v="urn:schemas-microsoft-com:vml" xmlns:w10="urn:schemas-microsoft-com:office:word" xmlns:a="http://schemas.openxmlformats.org/drawingml/2006/main" xmlns:pic="http://schemas.openxmlformats.org/drawingml/2006/picture" xmlns:wp="http://schemas.openxmlformats.org/drawingml/2006/wordprocessingDrawing">
   <w:body>
-    <w:bookmarkStart w:id="115" w:name="X0264dbef037d515bdd41c0931e5e2e7c8717b18"/>
+    <w:bookmarkStart w:id="133" w:name="X0264dbef037d515bdd41c0931e5e2e7c8717b18"/>
     <w:p>
       <w:pPr>
         <w:pStyle w:val="Heading1"/>
@@ -116,31 +116,71 @@
         <w:pStyle w:val="FirstParagraph"/>
       </w:pPr>
       <w:r>
-        <w:t xml:space="preserve">Purpose — This study revisits the internationalisation–performance relationship in Vietnam across three survey waves, testing whether technological capability moderates export-intensity effects and how a Tier-1 digital indicator evolves across institutional generations.</w:t>
-      </w:r>
-    </w:p>
-    <w:p>
-      <w:pPr>
-        <w:pStyle w:val="BodyText"/>
-      </w:pPr>
-      <w:r>
-        <w:t xml:space="preserve">Design/methodology/approach — Three waves of World Bank Enterprise Survey (Vietnam 2009, 2015, 2023; N = 2,958) underpin wave-specific and pooled OLS models with HC1 standard errors, quadratic FSTS terms, and capability interactions. TCI (quality certification, foreign-licensed technology) is the primary construct; a Tier-1 website indicator serves as digital-presence control.</w:t>
-      </w:r>
-    </w:p>
-    <w:p>
-      <w:pPr>
-        <w:pStyle w:val="BodyText"/>
-      </w:pPr>
-      <w:r>
-        <w:t xml:space="preserve">Findings — An inverted-U between export intensity and labour productivity holds across all three waves, with turning points clustered between 39% and 46% — a durable band over 14 years. The nonlinearity reflects a participation-margin effect: on exporters only, the quadratic term loses significance. TCI positively moderates productivity and the I–P curvature across waves. The website indicator follows a proxy-obsolescence trajectory: positive in 2009, null in 2015, negatively interactive in 2023.</w:t>
-      </w:r>
-    </w:p>
-    <w:p>
-      <w:pPr>
-        <w:pStyle w:val="BodyText"/>
-      </w:pPr>
-      <w:r>
-        <w:t xml:space="preserve">Originality/value — The inverted-U in this zero-inflated setting reflects a participation-barrier effect rather than intensity saturation; pooled Tier-1 coefficients mask progressive proxy obsolescence. The institutionally embedded turning-point cluster (39–46% FSTS) shifts the debate from 'does internationalisation help?' to 'under what institutional conditions does the threshold shift?'</w:t>
+        <w:rPr>
+          <w:bCs/>
+          <w:b/>
+        </w:rPr>
+        <w:t xml:space="preserve">Purpose:</w:t>
+      </w:r>
+      <w:r>
+        <w:t xml:space="preserve"> </w:t>
+      </w:r>
+      <w:r>
+        <w:t xml:space="preserve">This study revisits the internationalisation–performance relationship in Vietnam across three survey waves, testing whether technological capability moderates export-intensity effects and how a Tier-1 digital indicator evolves across institutional generations.</w:t>
+      </w:r>
+    </w:p>
+    <w:p>
+      <w:pPr>
+        <w:pStyle w:val="BodyText"/>
+      </w:pPr>
+      <w:r>
+        <w:rPr>
+          <w:bCs/>
+          <w:b/>
+        </w:rPr>
+        <w:t xml:space="preserve">Design/methodology/approach:</w:t>
+      </w:r>
+      <w:r>
+        <w:t xml:space="preserve"> </w:t>
+      </w:r>
+      <w:r>
+        <w:t xml:space="preserve">Three waves of World Bank Enterprise Survey (Vietnam 2009, 2015, 2023; N = 2,958) underpin wave-specific and pooled OLS models with HC1 standard errors, quadratic FSTS terms, and capability interactions. TCI (quality certification, foreign-licensed technology) is the primary construct; a Tier-1 website indicator serves as digital-presence control.</w:t>
+      </w:r>
+    </w:p>
+    <w:p>
+      <w:pPr>
+        <w:pStyle w:val="BodyText"/>
+      </w:pPr>
+      <w:r>
+        <w:rPr>
+          <w:bCs/>
+          <w:b/>
+        </w:rPr>
+        <w:t xml:space="preserve">Findings:</w:t>
+      </w:r>
+      <w:r>
+        <w:t xml:space="preserve"> </w:t>
+      </w:r>
+      <w:r>
+        <w:t xml:space="preserve">An inverted-U between export intensity and labour productivity holds across all three waves, with turning points clustered between 39% and 46% — a durable band over 14 years. The nonlinearity reflects a participation-margin effect: on exporters only, the quadratic term loses significance. TCI positively moderates productivity and the I–P curvature across waves. The website indicator follows a proxy-obsolescence trajectory: positive in 2009, null in 2015, negatively interactive in 2023.</w:t>
+      </w:r>
+    </w:p>
+    <w:p>
+      <w:pPr>
+        <w:pStyle w:val="BodyText"/>
+      </w:pPr>
+      <w:r>
+        <w:rPr>
+          <w:bCs/>
+          <w:b/>
+        </w:rPr>
+        <w:t xml:space="preserve">Originality/value:</w:t>
+      </w:r>
+      <w:r>
+        <w:t xml:space="preserve"> </w:t>
+      </w:r>
+      <w:r>
+        <w:t xml:space="preserve">The inverted-U in this zero-inflated setting reflects a participation-barrier effect rather than intensity saturation; pooled Tier-1 coefficients mask progressive proxy obsolescence. The institutionally embedded turning-point cluster (39–46% FSTS) shifts the debate from 'does internationalisation help?' to 'under what institutional conditions does the threshold shift?'</w:t>
       </w:r>
     </w:p>
     <w:p>
@@ -855,7 +895,7 @@
     </w:p>
     <w:bookmarkEnd w:id="25"/>
     <w:bookmarkEnd w:id="26"/>
-    <w:bookmarkStart w:id="31" w:name="X8bf20a63f0decf7b16e99d564b9958ec4fbbb23"/>
+    <w:bookmarkStart w:id="34" w:name="X8bf20a63f0decf7b16e99d564b9958ec4fbbb23"/>
     <w:p>
       <w:pPr>
         <w:pStyle w:val="Heading2"/>
@@ -1538,7 +1578,7 @@
       </w:r>
     </w:p>
     <w:bookmarkEnd w:id="29"/>
-    <w:bookmarkStart w:id="30" w:name="Xa301591a4bdc42129e76c2a2b73514232150381"/>
+    <w:bookmarkStart w:id="33" w:name="Xa301591a4bdc42129e76c2a2b73514232150381"/>
     <w:p>
       <w:pPr>
         <w:pStyle w:val="Heading3"/>
@@ -1882,7 +1922,46 @@
         <w:pStyle w:val="BodyText"/>
       </w:pPr>
       <w:r>
-        <w:t xml:space="preserve">Figure 1: Conceptual model — TCI, DAI, and export intensity as determinants of firm performance (Vietnam, 3-wave)</w:t>
+        <w:drawing>
+          <wp:inline>
+            <wp:extent cx="5334000" cy="2930266"/>
+            <wp:effectExtent b="0" l="0" r="0" t="0"/>
+            <wp:docPr descr="Figure 1: Conceptual model — TCI, DAI, and export intensity as determinants of firm performance (Vietnam, 3-wave)" title="" id="31" name="Picture"/>
+            <a:graphic>
+              <a:graphicData uri="http://schemas.openxmlformats.org/drawingml/2006/picture">
+                <pic:pic>
+                  <pic:nvPicPr>
+                    <pic:cNvPr descr="figures/vietnam/figure_1_conceptual_model.png" id="32" name="Picture"/>
+                    <pic:cNvPicPr>
+                      <a:picLocks noChangeArrowheads="1" noChangeAspect="1"/>
+                    </pic:cNvPicPr>
+                  </pic:nvPicPr>
+                  <pic:blipFill>
+                    <a:blip r:embed="rId30"/>
+                    <a:stretch>
+                      <a:fillRect/>
+                    </a:stretch>
+                  </pic:blipFill>
+                  <pic:spPr bwMode="auto">
+                    <a:xfrm>
+                      <a:off x="0" y="0"/>
+                      <a:ext cx="5334000" cy="2930266"/>
+                    </a:xfrm>
+                    <a:prstGeom prst="rect">
+                      <a:avLst/>
+                    </a:prstGeom>
+                    <a:noFill/>
+                    <a:ln w="9525">
+                      <a:noFill/>
+                      <a:headEnd/>
+                      <a:tailEnd/>
+                    </a:ln>
+                  </pic:spPr>
+                </pic:pic>
+              </a:graphicData>
+            </a:graphic>
+          </wp:inline>
+        </w:drawing>
       </w:r>
     </w:p>
     <w:p>
@@ -1921,9 +2000,9 @@
         <w:t xml:space="preserve">Solid arrows represent hypothesised direct and curvilinear effects. Dashed arrows represent moderating effects. The independent variable — internationalisation intensity (FSTS, centred FSTS_c and FSTS_c²) — is placed at left; the dependent variable — firm performance, measured as ln(labour productivity) = ln(annual revenue PPP / permanent workers) — is placed at right, following left-to-right causal flow convention. H1 (inverted-U nonlinearity: β₁ &gt; 0, β₂ &lt; 0) is grounded in the Uppsala model (Johanson and Vahlne, 1977, 2009) and coordination-cost theory (Hitt et al., 1997). H2 specifies technological capability (TCI_z, Resource-Based View: Barney, 1991) as a level-shifting direct effect and secondary moderator on the FSTS–performance curve; instrument: industry-level TCI mean (causal IV identification). H4 treats website-based digital adoption (DAI_z, Tier-1 only) as an exploratory probe of the Digital Capability Lens (Banalieva and Dhanaraj, 2019); measurement constraint acknowledged — single binary indicator across 2009/2015/2023 waves limits inferential strength. (+) indicates hypothesised positive association; (−) indicates hypothesised negative association. Control variables (ln firm size, firm age, foreign ownership, broad-sector fixed effects, wave fixed effects) enter additively in all models but are omitted from the figure for clarity. ICRV context: Vietnam — Nhóm IV (Lower_mid_transition, ICRV Group 4 of 6; lower-middle-income transition economy; WGI Rule of Law ≈ −0.09 in 2023, World Bank). Data: WBES 2009, 2015, 2023; N = 2,958 (pooled), n_wave = 989/956/1,013.</w:t>
       </w:r>
     </w:p>
-    <w:bookmarkEnd w:id="30"/>
-    <w:bookmarkEnd w:id="31"/>
-    <w:bookmarkStart w:id="37" w:name="Xfd2f05febb90fd7f58b14547dd9b33901f267a5"/>
+    <w:bookmarkEnd w:id="33"/>
+    <w:bookmarkEnd w:id="34"/>
+    <w:bookmarkStart w:id="40" w:name="Xfd2f05febb90fd7f58b14547dd9b33901f267a5"/>
     <w:p>
       <w:pPr>
         <w:pStyle w:val="Heading2"/>
@@ -1932,7 +2011,7 @@
         <w:t xml:space="preserve">3. Data, variables, and empirical strategy</w:t>
       </w:r>
     </w:p>
-    <w:bookmarkStart w:id="32" w:name="X690a6f2a93b97075aa335e9e4cac18d5293d91d"/>
+    <w:bookmarkStart w:id="35" w:name="X690a6f2a93b97075aa335e9e4cac18d5293d91d"/>
     <w:p>
       <w:pPr>
         <w:pStyle w:val="Heading3"/>
@@ -1997,8 +2076,8 @@
         <w:t xml:space="preserve">across stages.</w:t>
       </w:r>
     </w:p>
-    <w:bookmarkEnd w:id="32"/>
-    <w:bookmarkStart w:id="33" w:name="Xbcf9f12e79107fa2c089aaf13fc6c4fb773f1c2"/>
+    <w:bookmarkEnd w:id="35"/>
+    <w:bookmarkStart w:id="36" w:name="Xbcf9f12e79107fa2c089aaf13fc6c4fb773f1c2"/>
     <w:p>
       <w:pPr>
         <w:pStyle w:val="Heading3"/>
@@ -2890,8 +2969,8 @@
         <w:t xml:space="preserve">and 2023 respectively; pooled N is 2,958.</w:t>
       </w:r>
     </w:p>
-    <w:bookmarkEnd w:id="33"/>
-    <w:bookmarkStart w:id="34" w:name="Xc5fe1f3cf583535f12a87a680dcd317400b3da2"/>
+    <w:bookmarkEnd w:id="36"/>
+    <w:bookmarkStart w:id="37" w:name="Xc5fe1f3cf583535f12a87a680dcd317400b3da2"/>
     <w:p>
       <w:pPr>
         <w:pStyle w:val="Heading3"/>
@@ -3234,8 +3313,8 @@
         <w:t xml:space="preserve">All models are estimated by OLS with HC1 heteroscedasticity-consistent standard errors. Wave fixed effects (λ_t) are included in pooled specifications only. The M0–M8 sequence is estimated wave-by-wave and jointly on the pooled three-wave file, yielding four sets of estimates (2009, 2015, 2023, pooled).</w:t>
       </w:r>
     </w:p>
-    <w:bookmarkEnd w:id="34"/>
-    <w:bookmarkStart w:id="35" w:name="Xe803d156752d85865c6c4f44f4ca9bbe59bf0f9"/>
+    <w:bookmarkEnd w:id="37"/>
+    <w:bookmarkStart w:id="38" w:name="Xe803d156752d85865c6c4f44f4ca9bbe59bf0f9"/>
     <w:p>
       <w:pPr>
         <w:pStyle w:val="Heading3"/>
@@ -3314,8 +3393,8 @@
         <w:t xml:space="preserve">The repeated-cross-section data structure (three non-overlapping surveys of different firms) precludes within-firm fixed-effects estimation; the identification strategy therefore relies on the three complementary approaches above rather than panel differencing. All inferences are described as associations with the selection-robustness caveats noted above, consistent with the inferential conventions for cross-sectional WBES data (Antonakis et al., 2010; Shaver, 2020).</w:t>
       </w:r>
     </w:p>
-    <w:bookmarkEnd w:id="35"/>
-    <w:bookmarkStart w:id="36" w:name="X976281aae9d7cc6accc3a8a15180eec1c0b7e58"/>
+    <w:bookmarkEnd w:id="38"/>
+    <w:bookmarkStart w:id="39" w:name="X976281aae9d7cc6accc3a8a15180eec1c0b7e58"/>
     <w:p>
       <w:pPr>
         <w:pStyle w:val="Heading3"/>
@@ -3388,9 +3467,9 @@
         <w:t xml:space="preserve">of associational evidence (Aguinis et al., 2021; Shaver, 2020).</w:t>
       </w:r>
     </w:p>
-    <w:bookmarkEnd w:id="36"/>
-    <w:bookmarkEnd w:id="37"/>
-    <w:bookmarkStart w:id="45" w:name="X121719332867ee227f0a04b486098cee978c6e6"/>
+    <w:bookmarkEnd w:id="39"/>
+    <w:bookmarkEnd w:id="40"/>
+    <w:bookmarkStart w:id="63" w:name="X121719332867ee227f0a04b486098cee978c6e6"/>
     <w:p>
       <w:pPr>
         <w:pStyle w:val="Heading2"/>
@@ -3455,7 +3534,7 @@
         <w:t xml:space="preserve">/ 20.55), consistent with broader Vietnamese productivity convergence over the period.</w:t>
       </w:r>
     </w:p>
-    <w:bookmarkStart w:id="39" w:name="X0cdd773083ddb6504e3d3ab10ff1c76267ec612"/>
+    <w:bookmarkStart w:id="42" w:name="X0cdd773083ddb6504e3d3ab10ff1c76267ec612"/>
     <w:p>
       <w:pPr>
         <w:pStyle w:val="Heading3"/>
@@ -4100,7 +4179,7 @@
       <w:r>
         <w:t xml:space="preserve"> </w:t>
       </w:r>
-      <w:hyperlink r:id="rId38">
+      <w:hyperlink r:id="rId41">
         <w:r>
           <w:rPr>
             <w:rStyle w:val="Hyperlink"/>
@@ -4365,8 +4444,8 @@
         <w:t xml:space="preserve">higher export intensity rather than uniformly across the export-intensity range.</w:t>
       </w:r>
     </w:p>
-    <w:bookmarkEnd w:id="39"/>
-    <w:bookmarkStart w:id="40" w:name="Xaa4851a9c1b3e08eeca0ab72ae930e2b05bff75"/>
+    <w:bookmarkEnd w:id="42"/>
+    <w:bookmarkStart w:id="55" w:name="Xaa4851a9c1b3e08eeca0ab72ae930e2b05bff75"/>
     <w:p>
       <w:pPr>
         <w:pStyle w:val="Heading3"/>
@@ -4999,7 +5078,46 @@
         <w:pStyle w:val="BodyText"/>
       </w:pPr>
       <w:r>
-        <w:t xml:space="preserve">Figure 2a: Wave 2009 — predicted ln(labour productivity) vs FSTS</w:t>
+        <w:drawing>
+          <wp:inline>
+            <wp:extent cx="5334000" cy="3555999"/>
+            <wp:effectExtent b="0" l="0" r="0" t="0"/>
+            <wp:docPr descr="Figure 2a: Wave 2009 — predicted ln(labour productivity) vs FSTS" title="" id="44" name="Picture"/>
+            <a:graphic>
+              <a:graphicData uri="http://schemas.openxmlformats.org/drawingml/2006/picture">
+                <pic:pic>
+                  <pic:nvPicPr>
+                    <pic:cNvPr descr="figures/vietnam/figure_2a.png" id="45" name="Picture"/>
+                    <pic:cNvPicPr>
+                      <a:picLocks noChangeArrowheads="1" noChangeAspect="1"/>
+                    </pic:cNvPicPr>
+                  </pic:nvPicPr>
+                  <pic:blipFill>
+                    <a:blip r:embed="rId43"/>
+                    <a:stretch>
+                      <a:fillRect/>
+                    </a:stretch>
+                  </pic:blipFill>
+                  <pic:spPr bwMode="auto">
+                    <a:xfrm>
+                      <a:off x="0" y="0"/>
+                      <a:ext cx="5334000" cy="3555999"/>
+                    </a:xfrm>
+                    <a:prstGeom prst="rect">
+                      <a:avLst/>
+                    </a:prstGeom>
+                    <a:noFill/>
+                    <a:ln w="9525">
+                      <a:noFill/>
+                      <a:headEnd/>
+                      <a:tailEnd/>
+                    </a:ln>
+                  </pic:spPr>
+                </pic:pic>
+              </a:graphicData>
+            </a:graphic>
+          </wp:inline>
+        </w:drawing>
       </w:r>
     </w:p>
     <w:p>
@@ -5025,7 +5143,46 @@
         <w:pStyle w:val="BodyText"/>
       </w:pPr>
       <w:r>
-        <w:t xml:space="preserve">Figure 2b: Wave 2015 — predicted ln(labour productivity) vs FSTS</w:t>
+        <w:drawing>
+          <wp:inline>
+            <wp:extent cx="5334000" cy="3555999"/>
+            <wp:effectExtent b="0" l="0" r="0" t="0"/>
+            <wp:docPr descr="Figure 2b: Wave 2015 — predicted ln(labour productivity) vs FSTS" title="" id="47" name="Picture"/>
+            <a:graphic>
+              <a:graphicData uri="http://schemas.openxmlformats.org/drawingml/2006/picture">
+                <pic:pic>
+                  <pic:nvPicPr>
+                    <pic:cNvPr descr="figures/vietnam/figure_2b.png" id="48" name="Picture"/>
+                    <pic:cNvPicPr>
+                      <a:picLocks noChangeArrowheads="1" noChangeAspect="1"/>
+                    </pic:cNvPicPr>
+                  </pic:nvPicPr>
+                  <pic:blipFill>
+                    <a:blip r:embed="rId46"/>
+                    <a:stretch>
+                      <a:fillRect/>
+                    </a:stretch>
+                  </pic:blipFill>
+                  <pic:spPr bwMode="auto">
+                    <a:xfrm>
+                      <a:off x="0" y="0"/>
+                      <a:ext cx="5334000" cy="3555999"/>
+                    </a:xfrm>
+                    <a:prstGeom prst="rect">
+                      <a:avLst/>
+                    </a:prstGeom>
+                    <a:noFill/>
+                    <a:ln w="9525">
+                      <a:noFill/>
+                      <a:headEnd/>
+                      <a:tailEnd/>
+                    </a:ln>
+                  </pic:spPr>
+                </pic:pic>
+              </a:graphicData>
+            </a:graphic>
+          </wp:inline>
+        </w:drawing>
       </w:r>
     </w:p>
     <w:p>
@@ -5051,7 +5208,46 @@
         <w:pStyle w:val="BodyText"/>
       </w:pPr>
       <w:r>
-        <w:t xml:space="preserve">Figure 2c: Wave 2023 — predicted ln(labour productivity) vs FSTS</w:t>
+        <w:drawing>
+          <wp:inline>
+            <wp:extent cx="5334000" cy="3555999"/>
+            <wp:effectExtent b="0" l="0" r="0" t="0"/>
+            <wp:docPr descr="Figure 2c: Wave 2023 — predicted ln(labour productivity) vs FSTS" title="" id="50" name="Picture"/>
+            <a:graphic>
+              <a:graphicData uri="http://schemas.openxmlformats.org/drawingml/2006/picture">
+                <pic:pic>
+                  <pic:nvPicPr>
+                    <pic:cNvPr descr="figures/vietnam/figure_2c.png" id="51" name="Picture"/>
+                    <pic:cNvPicPr>
+                      <a:picLocks noChangeArrowheads="1" noChangeAspect="1"/>
+                    </pic:cNvPicPr>
+                  </pic:nvPicPr>
+                  <pic:blipFill>
+                    <a:blip r:embed="rId49"/>
+                    <a:stretch>
+                      <a:fillRect/>
+                    </a:stretch>
+                  </pic:blipFill>
+                  <pic:spPr bwMode="auto">
+                    <a:xfrm>
+                      <a:off x="0" y="0"/>
+                      <a:ext cx="5334000" cy="3555999"/>
+                    </a:xfrm>
+                    <a:prstGeom prst="rect">
+                      <a:avLst/>
+                    </a:prstGeom>
+                    <a:noFill/>
+                    <a:ln w="9525">
+                      <a:noFill/>
+                      <a:headEnd/>
+                      <a:tailEnd/>
+                    </a:ln>
+                  </pic:spPr>
+                </pic:pic>
+              </a:graphicData>
+            </a:graphic>
+          </wp:inline>
+        </w:drawing>
       </w:r>
     </w:p>
     <w:p>
@@ -5077,7 +5273,46 @@
         <w:pStyle w:val="BodyText"/>
       </w:pPr>
       <w:r>
-        <w:t xml:space="preserve">Figure 2d: Pooled (2009+2015+2023) — predicted ln(labour productivity) vs FSTS</w:t>
+        <w:drawing>
+          <wp:inline>
+            <wp:extent cx="5334000" cy="3555999"/>
+            <wp:effectExtent b="0" l="0" r="0" t="0"/>
+            <wp:docPr descr="Figure 2d: Pooled (2009+2015+2023) — predicted ln(labour productivity) vs FSTS" title="" id="53" name="Picture"/>
+            <a:graphic>
+              <a:graphicData uri="http://schemas.openxmlformats.org/drawingml/2006/picture">
+                <pic:pic>
+                  <pic:nvPicPr>
+                    <pic:cNvPr descr="figures/vietnam/figure_2d.png" id="54" name="Picture"/>
+                    <pic:cNvPicPr>
+                      <a:picLocks noChangeArrowheads="1" noChangeAspect="1"/>
+                    </pic:cNvPicPr>
+                  </pic:nvPicPr>
+                  <pic:blipFill>
+                    <a:blip r:embed="rId52"/>
+                    <a:stretch>
+                      <a:fillRect/>
+                    </a:stretch>
+                  </pic:blipFill>
+                  <pic:spPr bwMode="auto">
+                    <a:xfrm>
+                      <a:off x="0" y="0"/>
+                      <a:ext cx="5334000" cy="3555999"/>
+                    </a:xfrm>
+                    <a:prstGeom prst="rect">
+                      <a:avLst/>
+                    </a:prstGeom>
+                    <a:noFill/>
+                    <a:ln w="9525">
+                      <a:noFill/>
+                      <a:headEnd/>
+                      <a:tailEnd/>
+                    </a:ln>
+                  </pic:spPr>
+                </pic:pic>
+              </a:graphicData>
+            </a:graphic>
+          </wp:inline>
+        </w:drawing>
       </w:r>
     </w:p>
     <w:p>
@@ -5098,8 +5333,8 @@
         <w:t xml:space="preserve">Predicted ln(labour productivity) as a function of FSTS for the pooled sample (M2). Turning point ≈ 40% FSTS (Lind-Mehlum p &lt; .001).</w:t>
       </w:r>
     </w:p>
-    <w:bookmarkEnd w:id="40"/>
-    <w:bookmarkStart w:id="41" w:name="X41c3dce096fbfa1c0be6a58d0741b2aa56fb860"/>
+    <w:bookmarkEnd w:id="55"/>
+    <w:bookmarkStart w:id="59" w:name="X41c3dce096fbfa1c0be6a58d0741b2aa56fb860"/>
     <w:p>
       <w:pPr>
         <w:pStyle w:val="Heading3"/>
@@ -5279,7 +5514,46 @@
         <w:pStyle w:val="BodyText"/>
       </w:pPr>
       <w:r>
-        <w:t xml:space="preserve">Figure 3: Moderator marginal effects — TCI and DAI interactions with FSTS (Vietnam)</w:t>
+        <w:drawing>
+          <wp:inline>
+            <wp:extent cx="5334000" cy="2226365"/>
+            <wp:effectExtent b="0" l="0" r="0" t="0"/>
+            <wp:docPr descr="Figure 3: Moderator marginal effects — TCI and DAI interactions with FSTS (Vietnam)" title="" id="57" name="Picture"/>
+            <a:graphic>
+              <a:graphicData uri="http://schemas.openxmlformats.org/drawingml/2006/picture">
+                <pic:pic>
+                  <pic:nvPicPr>
+                    <pic:cNvPr descr="figures/vietnam/figure_3_moderator_marginals.png" id="58" name="Picture"/>
+                    <pic:cNvPicPr>
+                      <a:picLocks noChangeArrowheads="1" noChangeAspect="1"/>
+                    </pic:cNvPicPr>
+                  </pic:nvPicPr>
+                  <pic:blipFill>
+                    <a:blip r:embed="rId56"/>
+                    <a:stretch>
+                      <a:fillRect/>
+                    </a:stretch>
+                  </pic:blipFill>
+                  <pic:spPr bwMode="auto">
+                    <a:xfrm>
+                      <a:off x="0" y="0"/>
+                      <a:ext cx="5334000" cy="2226365"/>
+                    </a:xfrm>
+                    <a:prstGeom prst="rect">
+                      <a:avLst/>
+                    </a:prstGeom>
+                    <a:noFill/>
+                    <a:ln w="9525">
+                      <a:noFill/>
+                      <a:headEnd/>
+                      <a:tailEnd/>
+                    </a:ln>
+                  </pic:spPr>
+                </pic:pic>
+              </a:graphicData>
+            </a:graphic>
+          </wp:inline>
+        </w:drawing>
       </w:r>
     </w:p>
     <w:p>
@@ -5300,8 +5574,8 @@
         <w:t xml:space="preserve">Marginal effects of TCI_z and DAI_z on ln(labour productivity) across FSTS levels (M7/M8). TCI shows a stable positive level-shift across waves; DAI moderation is wave-specific, with the 2023 interaction showing attenuation at high FSTS (Type I moderation: slope-flattening, shape preserved).</w:t>
       </w:r>
     </w:p>
-    <w:bookmarkEnd w:id="41"/>
-    <w:bookmarkStart w:id="42" w:name="X3b4c7e0874095eca8ced8b4f3eaf74e392e9461"/>
+    <w:bookmarkEnd w:id="59"/>
+    <w:bookmarkStart w:id="60" w:name="X3b4c7e0874095eca8ced8b4f3eaf74e392e9461"/>
     <w:p>
       <w:pPr>
         <w:pStyle w:val="Heading3"/>
@@ -5372,8 +5646,8 @@
         <w:t xml:space="preserve">Table 3 summarises the directional interpretation of the focal coefficients from the full specifications by wave and for the pooled sample.</w:t>
       </w:r>
     </w:p>
-    <w:bookmarkEnd w:id="42"/>
-    <w:bookmarkStart w:id="44" w:name="Xa4c02e0b9d1c1dfbd229ca8e93a765eb24721f0"/>
+    <w:bookmarkEnd w:id="60"/>
+    <w:bookmarkStart w:id="62" w:name="Xa4c02e0b9d1c1dfbd229ca8e93a765eb24721f0"/>
     <w:p>
       <w:pPr>
         <w:pStyle w:val="Heading3"/>
@@ -5654,7 +5928,7 @@
         <w:t xml:space="preserve">turning-point magnitude.</w:t>
       </w:r>
     </w:p>
-    <w:bookmarkStart w:id="43" w:name="robustness-to-endogeneity-and-selection"/>
+    <w:bookmarkStart w:id="61" w:name="robustness-to-endogeneity-and-selection"/>
     <w:p>
       <w:pPr>
         <w:pStyle w:val="Heading4"/>
@@ -17076,7 +17350,7 @@
       <w:r>
         <w:t xml:space="preserve"> </w:t>
       </w:r>
-      <w:hyperlink r:id="rId38">
+      <w:hyperlink r:id="rId41">
         <w:r>
           <w:rPr>
             <w:rStyle w:val="Hyperlink"/>
@@ -17747,10 +18021,10 @@
         <w:t xml:space="preserve">Cross-wave coefficient equality tests following Paternoster et al. (1998). Failure to reject indicates coefficient stability across waves. FSTSc and FSTSc² comparisons support wave-specific heterogeneity in TCI and DAI direct effects but not in the I–P curvature parameters. Turning points (already reported in Table 5 above) are derived from M2 (lnLP = β₀ + β₁ FSTS_c + β₂ FSTS_c² + controls + sector FE [+ wave FE in pooled]) back-transformed to the raw FSTS scale; 95% CI uses the delta method; Lind–Mehlum p-values follow the Sasabuchi-style endpoint test (Lind and Mehlum, 2010). Source: WBES Vietnam 2009, 2015, 2023; authors' calculations.</w:t>
       </w:r>
     </w:p>
-    <w:bookmarkEnd w:id="43"/>
-    <w:bookmarkEnd w:id="44"/>
-    <w:bookmarkEnd w:id="45"/>
-    <w:bookmarkStart w:id="51" w:name="X735612638e4e736e4693e459c258977262c0dfc"/>
+    <w:bookmarkEnd w:id="61"/>
+    <w:bookmarkEnd w:id="62"/>
+    <w:bookmarkEnd w:id="63"/>
+    <w:bookmarkStart w:id="69" w:name="X735612638e4e736e4693e459c258977262c0dfc"/>
     <w:p>
       <w:pPr>
         <w:pStyle w:val="Heading2"/>
@@ -17780,7 +18054,7 @@
         <w:t xml:space="preserve">, 2026). This corroboration strengthens the interpretation that moderate export intensity generates genuine productivity gains in Vietnamese firms — not merely a compositional artefact of positive selection into exporting.</w:t>
       </w:r>
     </w:p>
-    <w:bookmarkStart w:id="46" w:name="Xa5f80b6bc0b8dd7b33d639445ac723c1ee9ad4a"/>
+    <w:bookmarkStart w:id="64" w:name="Xa5f80b6bc0b8dd7b33d639445ac723c1ee9ad4a"/>
     <w:p>
       <w:pPr>
         <w:pStyle w:val="Heading3"/>
@@ -17853,8 +18127,8 @@
         <w:t xml:space="preserve">stand in the broader trajectory of internationalisation and transition, as captured in repeated cross-sectional snapshots rather than within-firm longitudinal records.</w:t>
       </w:r>
     </w:p>
-    <w:bookmarkEnd w:id="46"/>
-    <w:bookmarkStart w:id="47" w:name="Xa30cb53845d80e9f381e97d931a6564a08369b5"/>
+    <w:bookmarkEnd w:id="64"/>
+    <w:bookmarkStart w:id="65" w:name="Xa30cb53845d80e9f381e97d931a6564a08369b5"/>
     <w:p>
       <w:pPr>
         <w:pStyle w:val="Heading3"/>
@@ -18065,8 +18339,8 @@
         <w:t xml:space="preserve">a single label.</w:t>
       </w:r>
     </w:p>
-    <w:bookmarkEnd w:id="47"/>
-    <w:bookmarkStart w:id="48" w:name="X946dfeb74c2174371e94edd51e868f8bb309c10"/>
+    <w:bookmarkEnd w:id="65"/>
+    <w:bookmarkStart w:id="66" w:name="X946dfeb74c2174371e94edd51e868f8bb309c10"/>
     <w:p>
       <w:pPr>
         <w:pStyle w:val="Heading3"/>
@@ -18369,8 +18643,8 @@
         <w:t xml:space="preserve">indistinguishable across waves.</w:t>
       </w:r>
     </w:p>
-    <w:bookmarkEnd w:id="48"/>
-    <w:bookmarkStart w:id="49" w:name="Xd9a4ebc909e2b14dcfe03b7b8686207326328b4"/>
+    <w:bookmarkEnd w:id="66"/>
+    <w:bookmarkStart w:id="67" w:name="Xd9a4ebc909e2b14dcfe03b7b8686207326328b4"/>
     <w:p>
       <w:pPr>
         <w:pStyle w:val="Heading3"/>
@@ -18489,8 +18763,8 @@
         <w:t xml:space="preserve">Two cross-cutting principles emerge. First, managers should avoid conflating basic digital adoption with deeper technological capability — the constructs do not behave identically across periods or under identification-robust estimation, and Tier-1 digital expenditure does not substitute for the foreign-technology, standards, and process-integration investments that the TCI channel reflects. Second, allocation decisions should be staged against the empirically identified thresholds rather than against generic digital-transformation prescriptions: investment in incremental Tier-1 presence at high export intensity may absorb scarce capital with limited productivity return, while investment in TCI-channel capability around the 39–46 % band corresponds to where the cross-wave evidence is most consistent with a productivity-enhancing effect. The threshold-conditioned framing translates the step-function and Tier-1 saturation findings into actionable allocation guidance without overstating the causal status of the cross-sectional coefficients.</w:t>
       </w:r>
     </w:p>
-    <w:bookmarkEnd w:id="49"/>
-    <w:bookmarkStart w:id="50" w:name="X0d482379a65faf52764848d2b168aee0725ece4"/>
+    <w:bookmarkEnd w:id="67"/>
+    <w:bookmarkStart w:id="68" w:name="X0d482379a65faf52764848d2b168aee0725ece4"/>
     <w:p>
       <w:pPr>
         <w:pStyle w:val="Heading3"/>
@@ -18666,9 +18940,9 @@
         <w:t xml:space="preserve">, 2026), suggesting that the ascending limb documented in the WBES microdata reflects in part the economy-wide gains from trade opening that firm-level capability investments convert into sustained productivity advantage.</w:t>
       </w:r>
     </w:p>
-    <w:bookmarkEnd w:id="50"/>
-    <w:bookmarkEnd w:id="51"/>
-    <w:bookmarkStart w:id="52" w:name="Xf3d63d3bef15b3e862b66ed5bd48a577996a1bc"/>
+    <w:bookmarkEnd w:id="68"/>
+    <w:bookmarkEnd w:id="69"/>
+    <w:bookmarkStart w:id="70" w:name="Xf3d63d3bef15b3e862b66ed5bd48a577996a1bc"/>
     <w:p>
       <w:pPr>
         <w:pStyle w:val="Heading2"/>
@@ -18847,8 +19121,8 @@
         <w:t xml:space="preserve">Sixth, the analysis is limited to Vietnam as a single transitional economy at a particular stage of its digital and institutional development. Understanding how the DAI moderation pattern documented here — negative at high export intensity under Tier-1-only adoption — compares with patterns in other emerging markets at different institutional stages, or with patterns in digitally advanced economies where the same interaction is predicted to be positive, requires cross-setting comparative designs that systematically vary institutional transaction costs and digital infrastructure quality. Such designs would also allow more direct tests of the context-contingent framing developed in §2.1.</w:t>
       </w:r>
     </w:p>
-    <w:bookmarkEnd w:id="52"/>
-    <w:bookmarkStart w:id="53" w:name="X19cad7d15381a9dfa000caf49ac5c69889e188d"/>
+    <w:bookmarkEnd w:id="70"/>
+    <w:bookmarkStart w:id="71" w:name="X19cad7d15381a9dfa000caf49ac5c69889e188d"/>
     <w:p>
       <w:pPr>
         <w:pStyle w:val="Heading2"/>
@@ -18881,8 +19155,8 @@
         <w:t xml:space="preserve">The results also suggest that technological capability and the baseline website-presence indicator should not be treated as interchangeable, and that conflating them under a single "digital adoption" or "digital transformation" label would obscure their differing identification properties. Technological capability is comparatively stable and identification-robust across specifications. The baseline DAI_z control is more wave-sensitive and attenuates to a null under instrumental-variable estimation, consistent with Tier-1 proxy obsolescence as website ownership diffuses to near-universal levels in the Vietnamese firm population. Within the constraint of a single binary website indicator, this paper makes no claim about dynamic digital capability moderation; any such test awaits richer Tier 2–4 indicators not currently available cross-wave in the WBES Vietnam instrument.</w:t>
       </w:r>
     </w:p>
-    <w:bookmarkEnd w:id="53"/>
-    <w:bookmarkStart w:id="54" w:name="conflict-of-interest"/>
+    <w:bookmarkEnd w:id="71"/>
+    <w:bookmarkStart w:id="72" w:name="conflict-of-interest"/>
     <w:p>
       <w:pPr>
         <w:pStyle w:val="Heading2"/>
@@ -18899,8 +19173,8 @@
         <w:t xml:space="preserve">The authors declare no conflict of interest.</w:t>
       </w:r>
     </w:p>
-    <w:bookmarkEnd w:id="54"/>
-    <w:bookmarkStart w:id="55" w:name="funding"/>
+    <w:bookmarkEnd w:id="72"/>
+    <w:bookmarkStart w:id="73" w:name="funding"/>
     <w:p>
       <w:pPr>
         <w:pStyle w:val="Heading2"/>
@@ -18923,8 +19197,8 @@
         <w:t xml:space="preserve">not-for-profit sectors.</w:t>
       </w:r>
     </w:p>
-    <w:bookmarkEnd w:id="55"/>
-    <w:bookmarkStart w:id="56" w:name="data-availability-statement"/>
+    <w:bookmarkEnd w:id="73"/>
+    <w:bookmarkStart w:id="74" w:name="data-availability-statement"/>
     <w:p>
       <w:pPr>
         <w:pStyle w:val="Heading2"/>
@@ -18971,8 +19245,8 @@
         <w:t xml:space="preserve">and may be shared to the extent permitted by the data-access terms.</w:t>
       </w:r>
     </w:p>
-    <w:bookmarkEnd w:id="56"/>
-    <w:bookmarkStart w:id="57" w:name="ethics-statement"/>
+    <w:bookmarkEnd w:id="74"/>
+    <w:bookmarkStart w:id="75" w:name="ethics-statement"/>
     <w:p>
       <w:pPr>
         <w:pStyle w:val="Heading2"/>
@@ -18989,8 +19263,8 @@
         <w:t xml:space="preserve">This study uses secondary, de-identified, firm-level data from the World Bank Enterprise Surveys. It does not involve human participants, identifiable personal data, animals, or biological samples, and therefore did not require institutional ethical approval. The research was conducted in accordance with the data-access terms of the World Bank Enterprise Surveys.</w:t>
       </w:r>
     </w:p>
-    <w:bookmarkEnd w:id="57"/>
-    <w:bookmarkStart w:id="58" w:name="X799c23334c5944d058eaf15944a1408ff96b683"/>
+    <w:bookmarkEnd w:id="75"/>
+    <w:bookmarkStart w:id="76" w:name="X799c23334c5944d058eaf15944a1408ff96b683"/>
     <w:p>
       <w:pPr>
         <w:pStyle w:val="Heading2"/>
@@ -19007,8 +19281,8 @@
         <w:t xml:space="preserve">In preparing this manuscript, the author(s) used Grammarly, a writing-assistance tool, to help correct spelling, grammar, and punctuation in the author(s)' own original text. No generative artificial-intelligence tool was used to generate, draft, or create any substantive content, analysis, or interpretation. All conceptual framing, hypothesis development, empirical analysis, results interpretation, and final wording were produced by the human author(s), who take full responsibility for the content of the publication.</w:t>
       </w:r>
     </w:p>
-    <w:bookmarkEnd w:id="58"/>
-    <w:bookmarkStart w:id="59" w:name="acknowledgements"/>
+    <w:bookmarkEnd w:id="76"/>
+    <w:bookmarkStart w:id="77" w:name="acknowledgements"/>
     <w:p>
       <w:pPr>
         <w:pStyle w:val="Heading2"/>
@@ -19025,8 +19299,8 @@
         <w:t xml:space="preserve">[Acknowledgements removed for blind review; see separately submitted Title Page.]</w:t>
       </w:r>
     </w:p>
-    <w:bookmarkEnd w:id="59"/>
-    <w:bookmarkStart w:id="60" w:name="supplementary-materials"/>
+    <w:bookmarkEnd w:id="77"/>
+    <w:bookmarkStart w:id="78" w:name="supplementary-materials"/>
     <w:p>
       <w:pPr>
         <w:pStyle w:val="Heading2"/>
@@ -19078,8 +19352,8 @@
         </w:pict>
       </w:r>
     </w:p>
-    <w:bookmarkEnd w:id="60"/>
-    <w:bookmarkStart w:id="114" w:name="references"/>
+    <w:bookmarkEnd w:id="78"/>
+    <w:bookmarkStart w:id="132" w:name="references"/>
     <w:p>
       <w:pPr>
         <w:pStyle w:val="Heading2"/>
@@ -19119,7 +19393,7 @@
       <w:r>
         <w:t xml:space="preserve"> </w:t>
       </w:r>
-      <w:hyperlink r:id="rId61">
+      <w:hyperlink r:id="rId79">
         <w:r>
           <w:rPr>
             <w:rStyle w:val="Hyperlink"/>
@@ -19151,7 +19425,7 @@
       <w:r>
         <w:t xml:space="preserve"> </w:t>
       </w:r>
-      <w:hyperlink r:id="rId62">
+      <w:hyperlink r:id="rId80">
         <w:r>
           <w:rPr>
             <w:rStyle w:val="Hyperlink"/>
@@ -19183,7 +19457,7 @@
       <w:r>
         <w:t xml:space="preserve"> </w:t>
       </w:r>
-      <w:hyperlink r:id="rId63">
+      <w:hyperlink r:id="rId81">
         <w:r>
           <w:rPr>
             <w:rStyle w:val="Hyperlink"/>
@@ -19223,7 +19497,7 @@
       <w:r>
         <w:t xml:space="preserve"> </w:t>
       </w:r>
-      <w:hyperlink r:id="rId64">
+      <w:hyperlink r:id="rId82">
         <w:r>
           <w:rPr>
             <w:rStyle w:val="Hyperlink"/>
@@ -19255,7 +19529,7 @@
       <w:r>
         <w:t xml:space="preserve"> </w:t>
       </w:r>
-      <w:hyperlink r:id="rId65">
+      <w:hyperlink r:id="rId83">
         <w:r>
           <w:rPr>
             <w:rStyle w:val="Hyperlink"/>
@@ -19287,7 +19561,7 @@
       <w:r>
         <w:t xml:space="preserve"> </w:t>
       </w:r>
-      <w:hyperlink r:id="rId66">
+      <w:hyperlink r:id="rId84">
         <w:r>
           <w:rPr>
             <w:rStyle w:val="Hyperlink"/>
@@ -19319,7 +19593,7 @@
       <w:r>
         <w:t xml:space="preserve"> </w:t>
       </w:r>
-      <w:hyperlink r:id="rId67">
+      <w:hyperlink r:id="rId85">
         <w:r>
           <w:rPr>
             <w:rStyle w:val="Hyperlink"/>
@@ -19351,7 +19625,7 @@
       <w:r>
         <w:t xml:space="preserve"> </w:t>
       </w:r>
-      <w:hyperlink r:id="rId68">
+      <w:hyperlink r:id="rId86">
         <w:r>
           <w:rPr>
             <w:rStyle w:val="Hyperlink"/>
@@ -19383,7 +19657,7 @@
       <w:r>
         <w:t xml:space="preserve"> </w:t>
       </w:r>
-      <w:hyperlink r:id="rId69">
+      <w:hyperlink r:id="rId87">
         <w:r>
           <w:rPr>
             <w:rStyle w:val="Hyperlink"/>
@@ -19415,7 +19689,7 @@
       <w:r>
         <w:t xml:space="preserve"> </w:t>
       </w:r>
-      <w:hyperlink r:id="rId70">
+      <w:hyperlink r:id="rId88">
         <w:r>
           <w:rPr>
             <w:rStyle w:val="Hyperlink"/>
@@ -19447,7 +19721,7 @@
       <w:r>
         <w:t xml:space="preserve"> </w:t>
       </w:r>
-      <w:hyperlink r:id="rId71">
+      <w:hyperlink r:id="rId89">
         <w:r>
           <w:rPr>
             <w:rStyle w:val="Hyperlink"/>
@@ -19479,7 +19753,7 @@
       <w:r>
         <w:t xml:space="preserve"> </w:t>
       </w:r>
-      <w:hyperlink r:id="rId72">
+      <w:hyperlink r:id="rId90">
         <w:r>
           <w:rPr>
             <w:rStyle w:val="Hyperlink"/>
@@ -19511,7 +19785,7 @@
       <w:r>
         <w:t xml:space="preserve"> </w:t>
       </w:r>
-      <w:hyperlink r:id="rId73">
+      <w:hyperlink r:id="rId91">
         <w:r>
           <w:rPr>
             <w:rStyle w:val="Hyperlink"/>
@@ -19543,7 +19817,7 @@
       <w:r>
         <w:t xml:space="preserve"> </w:t>
       </w:r>
-      <w:hyperlink r:id="rId74">
+      <w:hyperlink r:id="rId92">
         <w:r>
           <w:rPr>
             <w:rStyle w:val="Hyperlink"/>
@@ -19578,7 +19852,7 @@
       <w:r>
         <w:t xml:space="preserve"> </w:t>
       </w:r>
-      <w:hyperlink r:id="rId75">
+      <w:hyperlink r:id="rId93">
         <w:r>
           <w:rPr>
             <w:rStyle w:val="Hyperlink"/>
@@ -19610,7 +19884,7 @@
       <w:r>
         <w:t xml:space="preserve"> </w:t>
       </w:r>
-      <w:hyperlink r:id="rId76">
+      <w:hyperlink r:id="rId94">
         <w:r>
           <w:rPr>
             <w:rStyle w:val="Hyperlink"/>
@@ -19642,7 +19916,7 @@
       <w:r>
         <w:t xml:space="preserve"> </w:t>
       </w:r>
-      <w:hyperlink r:id="rId77">
+      <w:hyperlink r:id="rId95">
         <w:r>
           <w:rPr>
             <w:rStyle w:val="Hyperlink"/>
@@ -19674,7 +19948,7 @@
       <w:r>
         <w:t xml:space="preserve"> </w:t>
       </w:r>
-      <w:hyperlink r:id="rId78">
+      <w:hyperlink r:id="rId96">
         <w:r>
           <w:rPr>
             <w:rStyle w:val="Hyperlink"/>
@@ -19706,7 +19980,7 @@
       <w:r>
         <w:t xml:space="preserve"> </w:t>
       </w:r>
-      <w:hyperlink r:id="rId79">
+      <w:hyperlink r:id="rId97">
         <w:r>
           <w:rPr>
             <w:rStyle w:val="Hyperlink"/>
@@ -19738,7 +20012,7 @@
       <w:r>
         <w:t xml:space="preserve"> </w:t>
       </w:r>
-      <w:hyperlink r:id="rId80">
+      <w:hyperlink r:id="rId98">
         <w:r>
           <w:rPr>
             <w:rStyle w:val="Hyperlink"/>
@@ -19770,7 +20044,7 @@
       <w:r>
         <w:t xml:space="preserve"> </w:t>
       </w:r>
-      <w:hyperlink r:id="rId81">
+      <w:hyperlink r:id="rId99">
         <w:r>
           <w:rPr>
             <w:rStyle w:val="Hyperlink"/>
@@ -19805,7 +20079,7 @@
       <w:r>
         <w:t xml:space="preserve"> </w:t>
       </w:r>
-      <w:hyperlink r:id="rId82">
+      <w:hyperlink r:id="rId100">
         <w:r>
           <w:rPr>
             <w:rStyle w:val="Hyperlink"/>
@@ -19843,7 +20117,7 @@
       <w:r>
         <w:t xml:space="preserve"> </w:t>
       </w:r>
-      <w:hyperlink r:id="rId83">
+      <w:hyperlink r:id="rId101">
         <w:r>
           <w:rPr>
             <w:rStyle w:val="Hyperlink"/>
@@ -19875,7 +20149,7 @@
       <w:r>
         <w:t xml:space="preserve"> </w:t>
       </w:r>
-      <w:hyperlink r:id="rId84">
+      <w:hyperlink r:id="rId102">
         <w:r>
           <w:rPr>
             <w:rStyle w:val="Hyperlink"/>
@@ -19907,7 +20181,7 @@
       <w:r>
         <w:t xml:space="preserve"> </w:t>
       </w:r>
-      <w:hyperlink r:id="rId85">
+      <w:hyperlink r:id="rId103">
         <w:r>
           <w:rPr>
             <w:rStyle w:val="Hyperlink"/>
@@ -19939,7 +20213,7 @@
       <w:r>
         <w:t xml:space="preserve"> </w:t>
       </w:r>
-      <w:hyperlink r:id="rId86">
+      <w:hyperlink r:id="rId104">
         <w:r>
           <w:rPr>
             <w:rStyle w:val="Hyperlink"/>
@@ -19971,7 +20245,7 @@
       <w:r>
         <w:t xml:space="preserve"> </w:t>
       </w:r>
-      <w:hyperlink r:id="rId87">
+      <w:hyperlink r:id="rId105">
         <w:r>
           <w:rPr>
             <w:rStyle w:val="Hyperlink"/>
@@ -20003,7 +20277,7 @@
       <w:r>
         <w:t xml:space="preserve"> </w:t>
       </w:r>
-      <w:hyperlink r:id="rId88">
+      <w:hyperlink r:id="rId106">
         <w:r>
           <w:rPr>
             <w:rStyle w:val="Hyperlink"/>
@@ -20035,7 +20309,7 @@
       <w:r>
         <w:t xml:space="preserve"> </w:t>
       </w:r>
-      <w:hyperlink r:id="rId89">
+      <w:hyperlink r:id="rId107">
         <w:r>
           <w:rPr>
             <w:rStyle w:val="Hyperlink"/>
@@ -20067,7 +20341,7 @@
       <w:r>
         <w:t xml:space="preserve"> </w:t>
       </w:r>
-      <w:hyperlink r:id="rId90">
+      <w:hyperlink r:id="rId108">
         <w:r>
           <w:rPr>
             <w:rStyle w:val="Hyperlink"/>
@@ -20099,7 +20373,7 @@
       <w:r>
         <w:t xml:space="preserve"> </w:t>
       </w:r>
-      <w:hyperlink r:id="rId91">
+      <w:hyperlink r:id="rId109">
         <w:r>
           <w:rPr>
             <w:rStyle w:val="Hyperlink"/>
@@ -20131,7 +20405,7 @@
       <w:r>
         <w:t xml:space="preserve"> </w:t>
       </w:r>
-      <w:hyperlink r:id="rId92">
+      <w:hyperlink r:id="rId110">
         <w:r>
           <w:rPr>
             <w:rStyle w:val="Hyperlink"/>
@@ -20163,7 +20437,7 @@
       <w:r>
         <w:t xml:space="preserve"> </w:t>
       </w:r>
-      <w:hyperlink r:id="rId93">
+      <w:hyperlink r:id="rId111">
         <w:r>
           <w:rPr>
             <w:rStyle w:val="Hyperlink"/>
@@ -20195,7 +20469,7 @@
       <w:r>
         <w:t xml:space="preserve"> </w:t>
       </w:r>
-      <w:hyperlink r:id="rId94">
+      <w:hyperlink r:id="rId112">
         <w:r>
           <w:rPr>
             <w:rStyle w:val="Hyperlink"/>
@@ -20227,7 +20501,7 @@
       <w:r>
         <w:t xml:space="preserve"> </w:t>
       </w:r>
-      <w:hyperlink r:id="rId95">
+      <w:hyperlink r:id="rId113">
         <w:r>
           <w:rPr>
             <w:rStyle w:val="Hyperlink"/>
@@ -20246,7 +20520,7 @@
       <w:r>
         <w:t xml:space="preserve"> </w:t>
       </w:r>
-      <w:hyperlink r:id="rId96">
+      <w:hyperlink r:id="rId114">
         <w:r>
           <w:rPr>
             <w:rStyle w:val="Hyperlink"/>
@@ -20284,7 +20558,7 @@
       <w:r>
         <w:t xml:space="preserve"> </w:t>
       </w:r>
-      <w:hyperlink r:id="rId97">
+      <w:hyperlink r:id="rId115">
         <w:r>
           <w:rPr>
             <w:rStyle w:val="Hyperlink"/>
@@ -20316,7 +20590,7 @@
       <w:r>
         <w:t xml:space="preserve"> </w:t>
       </w:r>
-      <w:hyperlink r:id="rId98">
+      <w:hyperlink r:id="rId116">
         <w:r>
           <w:rPr>
             <w:rStyle w:val="Hyperlink"/>
@@ -20348,7 +20622,7 @@
       <w:r>
         <w:t xml:space="preserve"> </w:t>
       </w:r>
-      <w:hyperlink r:id="rId99">
+      <w:hyperlink r:id="rId117">
         <w:r>
           <w:rPr>
             <w:rStyle w:val="Hyperlink"/>
@@ -20380,7 +20654,7 @@
       <w:r>
         <w:t xml:space="preserve"> </w:t>
       </w:r>
-      <w:hyperlink r:id="rId100">
+      <w:hyperlink r:id="rId118">
         <w:r>
           <w:rPr>
             <w:rStyle w:val="Hyperlink"/>
@@ -20412,7 +20686,7 @@
       <w:r>
         <w:t xml:space="preserve"> </w:t>
       </w:r>
-      <w:hyperlink r:id="rId101">
+      <w:hyperlink r:id="rId119">
         <w:r>
           <w:rPr>
             <w:rStyle w:val="Hyperlink"/>
@@ -20444,7 +20718,7 @@
       <w:r>
         <w:t xml:space="preserve"> </w:t>
       </w:r>
-      <w:hyperlink r:id="rId102">
+      <w:hyperlink r:id="rId120">
         <w:r>
           <w:rPr>
             <w:rStyle w:val="Hyperlink"/>
@@ -20476,7 +20750,7 @@
       <w:r>
         <w:t xml:space="preserve"> </w:t>
       </w:r>
-      <w:hyperlink r:id="rId103">
+      <w:hyperlink r:id="rId121">
         <w:r>
           <w:rPr>
             <w:rStyle w:val="Hyperlink"/>
@@ -20508,7 +20782,7 @@
       <w:r>
         <w:t xml:space="preserve"> </w:t>
       </w:r>
-      <w:hyperlink r:id="rId104">
+      <w:hyperlink r:id="rId122">
         <w:r>
           <w:rPr>
             <w:rStyle w:val="Hyperlink"/>
@@ -20540,7 +20814,7 @@
       <w:r>
         <w:t xml:space="preserve"> </w:t>
       </w:r>
-      <w:hyperlink r:id="rId105">
+      <w:hyperlink r:id="rId123">
         <w:r>
           <w:rPr>
             <w:rStyle w:val="Hyperlink"/>
@@ -20572,7 +20846,7 @@
       <w:r>
         <w:t xml:space="preserve"> </w:t>
       </w:r>
-      <w:hyperlink r:id="rId106">
+      <w:hyperlink r:id="rId124">
         <w:r>
           <w:rPr>
             <w:rStyle w:val="Hyperlink"/>
@@ -20604,7 +20878,7 @@
       <w:r>
         <w:t xml:space="preserve"> </w:t>
       </w:r>
-      <w:hyperlink r:id="rId107">
+      <w:hyperlink r:id="rId125">
         <w:r>
           <w:rPr>
             <w:rStyle w:val="Hyperlink"/>
@@ -20657,7 +20931,7 @@
       <w:r>
         <w:t xml:space="preserve"> </w:t>
       </w:r>
-      <w:hyperlink r:id="rId108">
+      <w:hyperlink r:id="rId126">
         <w:r>
           <w:rPr>
             <w:rStyle w:val="Hyperlink"/>
@@ -20710,7 +20984,7 @@
       <w:r>
         <w:t xml:space="preserve"> </w:t>
       </w:r>
-      <w:hyperlink r:id="rId109">
+      <w:hyperlink r:id="rId127">
         <w:r>
           <w:rPr>
             <w:rStyle w:val="Hyperlink"/>
@@ -20748,7 +21022,7 @@
       <w:r>
         <w:t xml:space="preserve"> </w:t>
       </w:r>
-      <w:hyperlink r:id="rId109">
+      <w:hyperlink r:id="rId127">
         <w:r>
           <w:rPr>
             <w:rStyle w:val="Hyperlink"/>
@@ -20786,7 +21060,7 @@
       <w:r>
         <w:t xml:space="preserve"> </w:t>
       </w:r>
-      <w:hyperlink r:id="rId109">
+      <w:hyperlink r:id="rId127">
         <w:r>
           <w:rPr>
             <w:rStyle w:val="Hyperlink"/>
@@ -20827,7 +21101,7 @@
       <w:r>
         <w:t xml:space="preserve"> </w:t>
       </w:r>
-      <w:hyperlink r:id="rId110">
+      <w:hyperlink r:id="rId128">
         <w:r>
           <w:rPr>
             <w:rStyle w:val="Hyperlink"/>
@@ -20865,7 +21139,7 @@
       <w:r>
         <w:t xml:space="preserve"> </w:t>
       </w:r>
-      <w:hyperlink r:id="rId111">
+      <w:hyperlink r:id="rId129">
         <w:r>
           <w:rPr>
             <w:rStyle w:val="Hyperlink"/>
@@ -20897,7 +21171,7 @@
       <w:r>
         <w:t xml:space="preserve"> </w:t>
       </w:r>
-      <w:hyperlink r:id="rId112">
+      <w:hyperlink r:id="rId130">
         <w:r>
           <w:rPr>
             <w:rStyle w:val="Hyperlink"/>
@@ -20929,7 +21203,7 @@
       <w:r>
         <w:t xml:space="preserve"> </w:t>
       </w:r>
-      <w:hyperlink r:id="rId113">
+      <w:hyperlink r:id="rId131">
         <w:r>
           <w:rPr>
             <w:rStyle w:val="Hyperlink"/>
@@ -20938,8 +21212,8 @@
         </w:r>
       </w:hyperlink>
     </w:p>
-    <w:bookmarkEnd w:id="114"/>
-    <w:bookmarkEnd w:id="115"/>
+    <w:bookmarkEnd w:id="132"/>
+    <w:bookmarkEnd w:id="133"/>
     <w:sectPr/>
   </w:body>
 </w:document>

</xml_diff>

<commit_message>
review(P3-P9): pre-submission-reviewer pass + safe fixes
- 7 per-paper review reports + CONSOLIDATED_REVIEW.md (reviews/presubmission/).
- Fixed (safe): P6 jim wrong-journal (IBR->JIM); P9 AI-tone regression in
  cover letters + MIR title alignment; spaced-thousands separators across 6
  manuscripts; P8 line-214 M1 N (959->209, per reanalysis CSV).
- Documented author-action items: number reconciliations, missing/orphan
  references, P8 estimation-N framing, P9 abstract length/hypothesis labelling.
</commit_message>
<xml_diff>
--- a/p3/submission/jed_package/01_manuscript_blinded.docx
+++ b/p3/submission/jed_package/01_manuscript_blinded.docx
@@ -2,7 +2,7 @@
 <file path=word/document.xml><?xml version="1.0" encoding="utf-8"?>
 <w:document xmlns:w="http://schemas.openxmlformats.org/wordprocessingml/2006/main" xmlns:m="http://schemas.openxmlformats.org/officeDocument/2006/math" xmlns:r="http://schemas.openxmlformats.org/officeDocument/2006/relationships" xmlns:o="urn:schemas-microsoft-com:office:office" xmlns:v="urn:schemas-microsoft-com:vml" xmlns:w10="urn:schemas-microsoft-com:office:word" xmlns:a="http://schemas.openxmlformats.org/drawingml/2006/main" xmlns:pic="http://schemas.openxmlformats.org/drawingml/2006/picture" xmlns:wp="http://schemas.openxmlformats.org/drawingml/2006/wordprocessingDrawing">
   <w:body>
-    <w:bookmarkStart w:id="133" w:name="X0264dbef037d515bdd41c0931e5e2e7c8717b18"/>
+    <w:bookmarkStart w:id="115" w:name="X0264dbef037d515bdd41c0931e5e2e7c8717b18"/>
     <w:p>
       <w:pPr>
         <w:pStyle w:val="Heading1"/>
@@ -895,7 +895,7 @@
     </w:p>
     <w:bookmarkEnd w:id="25"/>
     <w:bookmarkEnd w:id="26"/>
-    <w:bookmarkStart w:id="34" w:name="X8bf20a63f0decf7b16e99d564b9958ec4fbbb23"/>
+    <w:bookmarkStart w:id="31" w:name="X8bf20a63f0decf7b16e99d564b9958ec4fbbb23"/>
     <w:p>
       <w:pPr>
         <w:pStyle w:val="Heading2"/>
@@ -1578,7 +1578,7 @@
       </w:r>
     </w:p>
     <w:bookmarkEnd w:id="29"/>
-    <w:bookmarkStart w:id="33" w:name="Xa301591a4bdc42129e76c2a2b73514232150381"/>
+    <w:bookmarkStart w:id="30" w:name="Xa301591a4bdc42129e76c2a2b73514232150381"/>
     <w:p>
       <w:pPr>
         <w:pStyle w:val="Heading3"/>
@@ -1922,46 +1922,7 @@
         <w:pStyle w:val="BodyText"/>
       </w:pPr>
       <w:r>
-        <w:drawing>
-          <wp:inline>
-            <wp:extent cx="5334000" cy="2930266"/>
-            <wp:effectExtent b="0" l="0" r="0" t="0"/>
-            <wp:docPr descr="Figure 1: Conceptual model, TCI, DAI, and export intensity as determinants of firm performance (Vietnam, 3-wave)" title="" id="31" name="Picture"/>
-            <a:graphic>
-              <a:graphicData uri="http://schemas.openxmlformats.org/drawingml/2006/picture">
-                <pic:pic>
-                  <pic:nvPicPr>
-                    <pic:cNvPr descr="figures/vietnam/figure_1_conceptual_model.png" id="32" name="Picture"/>
-                    <pic:cNvPicPr>
-                      <a:picLocks noChangeArrowheads="1" noChangeAspect="1"/>
-                    </pic:cNvPicPr>
-                  </pic:nvPicPr>
-                  <pic:blipFill>
-                    <a:blip r:embed="rId30"/>
-                    <a:stretch>
-                      <a:fillRect/>
-                    </a:stretch>
-                  </pic:blipFill>
-                  <pic:spPr bwMode="auto">
-                    <a:xfrm>
-                      <a:off x="0" y="0"/>
-                      <a:ext cx="5334000" cy="2930266"/>
-                    </a:xfrm>
-                    <a:prstGeom prst="rect">
-                      <a:avLst/>
-                    </a:prstGeom>
-                    <a:noFill/>
-                    <a:ln w="9525">
-                      <a:noFill/>
-                      <a:headEnd/>
-                      <a:tailEnd/>
-                    </a:ln>
-                  </pic:spPr>
-                </pic:pic>
-              </a:graphicData>
-            </a:graphic>
-          </wp:inline>
-        </w:drawing>
+        <w:t xml:space="preserve">Figure 1: Conceptual model, TCI, DAI, and export intensity as determinants of firm performance (Vietnam, 3-wave)</w:t>
       </w:r>
     </w:p>
     <w:p>
@@ -2000,9 +1961,9 @@
         <w:t xml:space="preserve">Solid arrows represent hypothesised direct and curvilinear effects. Dashed arrows represent moderating effects. The independent variable, internationalisation intensity (FSTS, centred FSTS_c and FSTS_c²), is placed at left; the dependent variable, firm performance, measured as ln(labour productivity) = ln(annual revenue PPP / permanent workers), is placed at right, following left-to-right causal flow convention. H1 (inverted-U nonlinearity: β₁ &gt; 0, β₂ &lt; 0) is grounded in the Uppsala model (Johanson and Vahlne, 1977, 2009) and coordination-cost theory (Hitt et al., 1997). H2 specifies technological capability (TCI_z, Resource-Based View: Barney, 1991) as a level-shifting direct effect and secondary moderator on the FSTS–performance curve; instrument: industry-level TCI mean (causal IV identification). H4 treats website-based digital adoption (DAI_z, Tier-1 only) as an exploratory probe of the Digital Capability Lens (Banalieva and Dhanaraj, 2019); measurement constraint acknowledged, single binary indicator across 2009/2015/2023 waves limits inferential strength. (+) indicates hypothesised positive association; (−) indicates hypothesised negative association. Control variables (ln firm size, firm age, foreign ownership, broad-sector fixed effects, wave fixed effects) enter additively in all models but are omitted from the figure for clarity. ICRV context: Vietnam, Nhóm IV (Lower_mid_transition, ICRV Group 4 of 6; lower-middle-income transition economy; WGI Rule of Law ≈ −0.09 in 2023, World Bank). Data: WBES 2009, 2015, 2023; N = 2,958 (pooled), n_wave = 989/956/1,013.</w:t>
       </w:r>
     </w:p>
-    <w:bookmarkEnd w:id="33"/>
-    <w:bookmarkEnd w:id="34"/>
-    <w:bookmarkStart w:id="40" w:name="Xfd2f05febb90fd7f58b14547dd9b33901f267a5"/>
+    <w:bookmarkEnd w:id="30"/>
+    <w:bookmarkEnd w:id="31"/>
+    <w:bookmarkStart w:id="37" w:name="Xfd2f05febb90fd7f58b14547dd9b33901f267a5"/>
     <w:p>
       <w:pPr>
         <w:pStyle w:val="Heading2"/>
@@ -2011,7 +1972,7 @@
         <w:t xml:space="preserve">3. Data, variables, and empirical strategy</w:t>
       </w:r>
     </w:p>
-    <w:bookmarkStart w:id="35" w:name="X690a6f2a93b97075aa335e9e4cac18d5293d91d"/>
+    <w:bookmarkStart w:id="32" w:name="X690a6f2a93b97075aa335e9e4cac18d5293d91d"/>
     <w:p>
       <w:pPr>
         <w:pStyle w:val="Heading3"/>
@@ -2061,7 +2022,7 @@
         <w:t xml:space="preserve"> </w:t>
       </w:r>
       <w:r>
-        <w:t xml:space="preserve">for 2009, 956 for 2015, and 1,013 for 2023. The pooled full model contains 2,958 observations.</w:t>
+        <w:t xml:space="preserve">for 2009,956 for 2015, and 1,013 for 2023. The pooled full model contains 2,958 observations.</w:t>
       </w:r>
       <w:r>
         <w:t xml:space="preserve"> </w:t>
@@ -2076,8 +2037,8 @@
         <w:t xml:space="preserve">across stages.</w:t>
       </w:r>
     </w:p>
-    <w:bookmarkEnd w:id="35"/>
-    <w:bookmarkStart w:id="36" w:name="Xbcf9f12e79107fa2c089aaf13fc6c4fb773f1c2"/>
+    <w:bookmarkEnd w:id="32"/>
+    <w:bookmarkStart w:id="33" w:name="Xbcf9f12e79107fa2c089aaf13fc6c4fb773f1c2"/>
     <w:p>
       <w:pPr>
         <w:pStyle w:val="Heading3"/>
@@ -2960,7 +2921,7 @@
         <w:t xml:space="preserve"> </w:t>
       </w:r>
       <w:r>
-        <w:t xml:space="preserve">sector1). The resulting analytic samples are 989, 956, and 1,013 observations for 2009, 2015,</w:t>
+        <w:t xml:space="preserve">sector1). The resulting analytic samples are 989,956, and 1,013 observations for 2009, 2015,</w:t>
       </w:r>
       <w:r>
         <w:t xml:space="preserve"> </w:t>
@@ -2969,8 +2930,8 @@
         <w:t xml:space="preserve">and 2023 respectively; pooled N is 2,958.</w:t>
       </w:r>
     </w:p>
-    <w:bookmarkEnd w:id="36"/>
-    <w:bookmarkStart w:id="37" w:name="Xc5fe1f3cf583535f12a87a680dcd317400b3da2"/>
+    <w:bookmarkEnd w:id="33"/>
+    <w:bookmarkStart w:id="34" w:name="Xc5fe1f3cf583535f12a87a680dcd317400b3da2"/>
     <w:p>
       <w:pPr>
         <w:pStyle w:val="Heading3"/>
@@ -3313,8 +3274,8 @@
         <w:t xml:space="preserve">All models are estimated by OLS with HC1 heteroscedasticity-consistent standard errors. Wave fixed effects (λ_t) are included in pooled specifications only. The M0–M8 sequence is estimated wave-by-wave and jointly on the pooled three-wave file, yielding four sets of estimates (2009, 2015, 2023, pooled).</w:t>
       </w:r>
     </w:p>
-    <w:bookmarkEnd w:id="37"/>
-    <w:bookmarkStart w:id="38" w:name="Xe803d156752d85865c6c4f44f4ca9bbe59bf0f9"/>
+    <w:bookmarkEnd w:id="34"/>
+    <w:bookmarkStart w:id="35" w:name="Xe803d156752d85865c6c4f44f4ca9bbe59bf0f9"/>
     <w:p>
       <w:pPr>
         <w:pStyle w:val="Heading3"/>
@@ -3393,8 +3354,8 @@
         <w:t xml:space="preserve">The repeated-cross-section data structure (three non-overlapping surveys of different firms) precludes within-firm fixed-effects estimation; the identification strategy therefore relies on the three complementary approaches above rather than panel differencing. All inferences are described as associations with the selection-robustness caveats noted above, consistent with the inferential conventions for cross-sectional WBES data (Antonakis et al., 2010; Shaver, 2020).</w:t>
       </w:r>
     </w:p>
-    <w:bookmarkEnd w:id="38"/>
-    <w:bookmarkStart w:id="39" w:name="X976281aae9d7cc6accc3a8a15180eec1c0b7e58"/>
+    <w:bookmarkEnd w:id="35"/>
+    <w:bookmarkStart w:id="36" w:name="X976281aae9d7cc6accc3a8a15180eec1c0b7e58"/>
     <w:p>
       <w:pPr>
         <w:pStyle w:val="Heading3"/>
@@ -3467,9 +3428,9 @@
         <w:t xml:space="preserve">of associational evidence (Aguinis et al., 2021; Shaver, 2020).</w:t>
       </w:r>
     </w:p>
-    <w:bookmarkEnd w:id="39"/>
-    <w:bookmarkEnd w:id="40"/>
-    <w:bookmarkStart w:id="63" w:name="X121719332867ee227f0a04b486098cee978c6e6"/>
+    <w:bookmarkEnd w:id="36"/>
+    <w:bookmarkEnd w:id="37"/>
+    <w:bookmarkStart w:id="45" w:name="X121719332867ee227f0a04b486098cee978c6e6"/>
     <w:p>
       <w:pPr>
         <w:pStyle w:val="Heading2"/>
@@ -3534,7 +3495,7 @@
         <w:t xml:space="preserve">/ 20.55), consistent with broader Vietnamese productivity convergence over the period.</w:t>
       </w:r>
     </w:p>
-    <w:bookmarkStart w:id="42" w:name="X0cdd773083ddb6504e3d3ab10ff1c76267ec612"/>
+    <w:bookmarkStart w:id="39" w:name="X0cdd773083ddb6504e3d3ab10ff1c76267ec612"/>
     <w:p>
       <w:pPr>
         <w:pStyle w:val="Heading3"/>
@@ -4179,7 +4140,7 @@
       <w:r>
         <w:t xml:space="preserve"> </w:t>
       </w:r>
-      <w:hyperlink r:id="rId41">
+      <w:hyperlink r:id="rId38">
         <w:r>
           <w:rPr>
             <w:rStyle w:val="Hyperlink"/>
@@ -4444,8 +4405,8 @@
         <w:t xml:space="preserve">higher export intensity rather than uniformly across the export-intensity range.</w:t>
       </w:r>
     </w:p>
-    <w:bookmarkEnd w:id="42"/>
-    <w:bookmarkStart w:id="55" w:name="Xaa4851a9c1b3e08eeca0ab72ae930e2b05bff75"/>
+    <w:bookmarkEnd w:id="39"/>
+    <w:bookmarkStart w:id="40" w:name="Xaa4851a9c1b3e08eeca0ab72ae930e2b05bff75"/>
     <w:p>
       <w:pPr>
         <w:pStyle w:val="Heading3"/>
@@ -5078,46 +5039,7 @@
         <w:pStyle w:val="BodyText"/>
       </w:pPr>
       <w:r>
-        <w:drawing>
-          <wp:inline>
-            <wp:extent cx="5334000" cy="3555999"/>
-            <wp:effectExtent b="0" l="0" r="0" t="0"/>
-            <wp:docPr descr="Figure 2a: Wave 2009, predicted ln(labour productivity) vs FSTS" title="" id="44" name="Picture"/>
-            <a:graphic>
-              <a:graphicData uri="http://schemas.openxmlformats.org/drawingml/2006/picture">
-                <pic:pic>
-                  <pic:nvPicPr>
-                    <pic:cNvPr descr="figures/vietnam/figure_2a.png" id="45" name="Picture"/>
-                    <pic:cNvPicPr>
-                      <a:picLocks noChangeArrowheads="1" noChangeAspect="1"/>
-                    </pic:cNvPicPr>
-                  </pic:nvPicPr>
-                  <pic:blipFill>
-                    <a:blip r:embed="rId43"/>
-                    <a:stretch>
-                      <a:fillRect/>
-                    </a:stretch>
-                  </pic:blipFill>
-                  <pic:spPr bwMode="auto">
-                    <a:xfrm>
-                      <a:off x="0" y="0"/>
-                      <a:ext cx="5334000" cy="3555999"/>
-                    </a:xfrm>
-                    <a:prstGeom prst="rect">
-                      <a:avLst/>
-                    </a:prstGeom>
-                    <a:noFill/>
-                    <a:ln w="9525">
-                      <a:noFill/>
-                      <a:headEnd/>
-                      <a:tailEnd/>
-                    </a:ln>
-                  </pic:spPr>
-                </pic:pic>
-              </a:graphicData>
-            </a:graphic>
-          </wp:inline>
-        </w:drawing>
+        <w:t xml:space="preserve">Figure 2a: Wave 2009, predicted ln(labour productivity) vs FSTS</w:t>
       </w:r>
     </w:p>
     <w:p>
@@ -5143,46 +5065,7 @@
         <w:pStyle w:val="BodyText"/>
       </w:pPr>
       <w:r>
-        <w:drawing>
-          <wp:inline>
-            <wp:extent cx="5334000" cy="3555999"/>
-            <wp:effectExtent b="0" l="0" r="0" t="0"/>
-            <wp:docPr descr="Figure 2b: Wave 2015, predicted ln(labour productivity) vs FSTS" title="" id="47" name="Picture"/>
-            <a:graphic>
-              <a:graphicData uri="http://schemas.openxmlformats.org/drawingml/2006/picture">
-                <pic:pic>
-                  <pic:nvPicPr>
-                    <pic:cNvPr descr="figures/vietnam/figure_2b.png" id="48" name="Picture"/>
-                    <pic:cNvPicPr>
-                      <a:picLocks noChangeArrowheads="1" noChangeAspect="1"/>
-                    </pic:cNvPicPr>
-                  </pic:nvPicPr>
-                  <pic:blipFill>
-                    <a:blip r:embed="rId46"/>
-                    <a:stretch>
-                      <a:fillRect/>
-                    </a:stretch>
-                  </pic:blipFill>
-                  <pic:spPr bwMode="auto">
-                    <a:xfrm>
-                      <a:off x="0" y="0"/>
-                      <a:ext cx="5334000" cy="3555999"/>
-                    </a:xfrm>
-                    <a:prstGeom prst="rect">
-                      <a:avLst/>
-                    </a:prstGeom>
-                    <a:noFill/>
-                    <a:ln w="9525">
-                      <a:noFill/>
-                      <a:headEnd/>
-                      <a:tailEnd/>
-                    </a:ln>
-                  </pic:spPr>
-                </pic:pic>
-              </a:graphicData>
-            </a:graphic>
-          </wp:inline>
-        </w:drawing>
+        <w:t xml:space="preserve">Figure 2b: Wave 2015, predicted ln(labour productivity) vs FSTS</w:t>
       </w:r>
     </w:p>
     <w:p>
@@ -5208,46 +5091,7 @@
         <w:pStyle w:val="BodyText"/>
       </w:pPr>
       <w:r>
-        <w:drawing>
-          <wp:inline>
-            <wp:extent cx="5334000" cy="3555999"/>
-            <wp:effectExtent b="0" l="0" r="0" t="0"/>
-            <wp:docPr descr="Figure 2c: Wave 2023, predicted ln(labour productivity) vs FSTS" title="" id="50" name="Picture"/>
-            <a:graphic>
-              <a:graphicData uri="http://schemas.openxmlformats.org/drawingml/2006/picture">
-                <pic:pic>
-                  <pic:nvPicPr>
-                    <pic:cNvPr descr="figures/vietnam/figure_2c.png" id="51" name="Picture"/>
-                    <pic:cNvPicPr>
-                      <a:picLocks noChangeArrowheads="1" noChangeAspect="1"/>
-                    </pic:cNvPicPr>
-                  </pic:nvPicPr>
-                  <pic:blipFill>
-                    <a:blip r:embed="rId49"/>
-                    <a:stretch>
-                      <a:fillRect/>
-                    </a:stretch>
-                  </pic:blipFill>
-                  <pic:spPr bwMode="auto">
-                    <a:xfrm>
-                      <a:off x="0" y="0"/>
-                      <a:ext cx="5334000" cy="3555999"/>
-                    </a:xfrm>
-                    <a:prstGeom prst="rect">
-                      <a:avLst/>
-                    </a:prstGeom>
-                    <a:noFill/>
-                    <a:ln w="9525">
-                      <a:noFill/>
-                      <a:headEnd/>
-                      <a:tailEnd/>
-                    </a:ln>
-                  </pic:spPr>
-                </pic:pic>
-              </a:graphicData>
-            </a:graphic>
-          </wp:inline>
-        </w:drawing>
+        <w:t xml:space="preserve">Figure 2c: Wave 2023, predicted ln(labour productivity) vs FSTS</w:t>
       </w:r>
     </w:p>
     <w:p>
@@ -5273,46 +5117,7 @@
         <w:pStyle w:val="BodyText"/>
       </w:pPr>
       <w:r>
-        <w:drawing>
-          <wp:inline>
-            <wp:extent cx="5334000" cy="3555999"/>
-            <wp:effectExtent b="0" l="0" r="0" t="0"/>
-            <wp:docPr descr="Figure 2d: Pooled (2009+2015+2023), predicted ln(labour productivity) vs FSTS" title="" id="53" name="Picture"/>
-            <a:graphic>
-              <a:graphicData uri="http://schemas.openxmlformats.org/drawingml/2006/picture">
-                <pic:pic>
-                  <pic:nvPicPr>
-                    <pic:cNvPr descr="figures/vietnam/figure_2d.png" id="54" name="Picture"/>
-                    <pic:cNvPicPr>
-                      <a:picLocks noChangeArrowheads="1" noChangeAspect="1"/>
-                    </pic:cNvPicPr>
-                  </pic:nvPicPr>
-                  <pic:blipFill>
-                    <a:blip r:embed="rId52"/>
-                    <a:stretch>
-                      <a:fillRect/>
-                    </a:stretch>
-                  </pic:blipFill>
-                  <pic:spPr bwMode="auto">
-                    <a:xfrm>
-                      <a:off x="0" y="0"/>
-                      <a:ext cx="5334000" cy="3555999"/>
-                    </a:xfrm>
-                    <a:prstGeom prst="rect">
-                      <a:avLst/>
-                    </a:prstGeom>
-                    <a:noFill/>
-                    <a:ln w="9525">
-                      <a:noFill/>
-                      <a:headEnd/>
-                      <a:tailEnd/>
-                    </a:ln>
-                  </pic:spPr>
-                </pic:pic>
-              </a:graphicData>
-            </a:graphic>
-          </wp:inline>
-        </w:drawing>
+        <w:t xml:space="preserve">Figure 2d: Pooled (2009+2015+2023), predicted ln(labour productivity) vs FSTS</w:t>
       </w:r>
     </w:p>
     <w:p>
@@ -5333,8 +5138,8 @@
         <w:t xml:space="preserve">Predicted ln(labour productivity) as a function of FSTS for the pooled sample (M2). Turning point ≈ 40% FSTS (Lind-Mehlum p &lt; .001).</w:t>
       </w:r>
     </w:p>
-    <w:bookmarkEnd w:id="55"/>
-    <w:bookmarkStart w:id="59" w:name="X41c3dce096fbfa1c0be6a58d0741b2aa56fb860"/>
+    <w:bookmarkEnd w:id="40"/>
+    <w:bookmarkStart w:id="41" w:name="X41c3dce096fbfa1c0be6a58d0741b2aa56fb860"/>
     <w:p>
       <w:pPr>
         <w:pStyle w:val="Heading3"/>
@@ -5514,46 +5319,7 @@
         <w:pStyle w:val="BodyText"/>
       </w:pPr>
       <w:r>
-        <w:drawing>
-          <wp:inline>
-            <wp:extent cx="5334000" cy="2226365"/>
-            <wp:effectExtent b="0" l="0" r="0" t="0"/>
-            <wp:docPr descr="Figure 3: Moderator marginal effects, TCI and DAI interactions with FSTS (Vietnam)" title="" id="57" name="Picture"/>
-            <a:graphic>
-              <a:graphicData uri="http://schemas.openxmlformats.org/drawingml/2006/picture">
-                <pic:pic>
-                  <pic:nvPicPr>
-                    <pic:cNvPr descr="figures/vietnam/figure_3_moderator_marginals.png" id="58" name="Picture"/>
-                    <pic:cNvPicPr>
-                      <a:picLocks noChangeArrowheads="1" noChangeAspect="1"/>
-                    </pic:cNvPicPr>
-                  </pic:nvPicPr>
-                  <pic:blipFill>
-                    <a:blip r:embed="rId56"/>
-                    <a:stretch>
-                      <a:fillRect/>
-                    </a:stretch>
-                  </pic:blipFill>
-                  <pic:spPr bwMode="auto">
-                    <a:xfrm>
-                      <a:off x="0" y="0"/>
-                      <a:ext cx="5334000" cy="2226365"/>
-                    </a:xfrm>
-                    <a:prstGeom prst="rect">
-                      <a:avLst/>
-                    </a:prstGeom>
-                    <a:noFill/>
-                    <a:ln w="9525">
-                      <a:noFill/>
-                      <a:headEnd/>
-                      <a:tailEnd/>
-                    </a:ln>
-                  </pic:spPr>
-                </pic:pic>
-              </a:graphicData>
-            </a:graphic>
-          </wp:inline>
-        </w:drawing>
+        <w:t xml:space="preserve">Figure 3: Moderator marginal effects, TCI and DAI interactions with FSTS (Vietnam)</w:t>
       </w:r>
     </w:p>
     <w:p>
@@ -5574,8 +5340,8 @@
         <w:t xml:space="preserve">Marginal effects of TCI_z and DAI_z on ln(labour productivity) across FSTS levels (M7/M8). TCI shows a stable positive level-shift across waves; DAI moderation is wave-specific, with the 2023 interaction showing attenuation at high FSTS (Type I moderation: slope-flattening, shape preserved).</w:t>
       </w:r>
     </w:p>
-    <w:bookmarkEnd w:id="59"/>
-    <w:bookmarkStart w:id="60" w:name="X3b4c7e0874095eca8ced8b4f3eaf74e392e9461"/>
+    <w:bookmarkEnd w:id="41"/>
+    <w:bookmarkStart w:id="42" w:name="X3b4c7e0874095eca8ced8b4f3eaf74e392e9461"/>
     <w:p>
       <w:pPr>
         <w:pStyle w:val="Heading3"/>
@@ -5646,8 +5412,8 @@
         <w:t xml:space="preserve">Table 3 summarises the directional interpretation of the focal coefficients from the full specifications by wave and for the pooled sample.</w:t>
       </w:r>
     </w:p>
-    <w:bookmarkEnd w:id="60"/>
-    <w:bookmarkStart w:id="62" w:name="Xa4c02e0b9d1c1dfbd229ca8e93a765eb24721f0"/>
+    <w:bookmarkEnd w:id="42"/>
+    <w:bookmarkStart w:id="44" w:name="Xa4c02e0b9d1c1dfbd229ca8e93a765eb24721f0"/>
     <w:p>
       <w:pPr>
         <w:pStyle w:val="Heading3"/>
@@ -5781,7 +5547,7 @@
         <w:t xml:space="preserve"> </w:t>
       </w:r>
       <w:r>
-        <w:t xml:space="preserve">exporter-only sub-sample (N ≈ 281 in 2009, 198 in 2015, 190 in 2023, and 669 pooled). The</w:t>
+        <w:t xml:space="preserve">exporter-only sub-sample (N ≈ 281 in 2009,198 in 2015,190 in 2023, and 669 pooled). The</w:t>
       </w:r>
       <w:r>
         <w:t xml:space="preserve"> </w:t>
@@ -5928,7 +5694,7 @@
         <w:t xml:space="preserve">turning-point magnitude.</w:t>
       </w:r>
     </w:p>
-    <w:bookmarkStart w:id="61" w:name="robustness-to-endogeneity-and-selection"/>
+    <w:bookmarkStart w:id="43" w:name="robustness-to-endogeneity-and-selection"/>
     <w:p>
       <w:pPr>
         <w:pStyle w:val="Heading4"/>
@@ -17049,7 +16815,7 @@
         <w:t xml:space="preserve"> </w:t>
       </w:r>
       <w:r>
-        <w:t xml:space="preserve">H. Exporter-only (FSTS &gt; 0, 669 FSTS_c = −0.861 ; FSTS_c² = −0.200 M8 joint p = .462 n.s.</w:t>
+        <w:t xml:space="preserve">H. Exporter-only (FSTS &gt; 0,669 FSTS_c = −0.861 ; FSTS_c² = −0.200 M8 joint p = .462 n.s.</w:t>
       </w:r>
       <w:r>
         <w:t xml:space="preserve"> </w:t>
@@ -17350,7 +17116,7 @@
       <w:r>
         <w:t xml:space="preserve"> </w:t>
       </w:r>
-      <w:hyperlink r:id="rId41">
+      <w:hyperlink r:id="rId38">
         <w:r>
           <w:rPr>
             <w:rStyle w:val="Hyperlink"/>
@@ -18021,10 +17787,10 @@
         <w:t xml:space="preserve">Cross-wave coefficient equality tests following Paternoster et al. (1998). Failure to reject indicates coefficient stability across waves. FSTSc and FSTSc² comparisons support wave-specific heterogeneity in TCI and DAI direct effects but not in the I–P curvature parameters. Turning points (already reported in Table 5 above) are derived from M2 (lnLP = β₀ + β₁ FSTS_c + β₂ FSTS_c² + controls + sector FE [+ wave FE in pooled]) back-transformed to the raw FSTS scale; 95% CI uses the delta method; Lind–Mehlum p-values follow the Sasabuchi-style endpoint test (Lind and Mehlum, 2010). Source: WBES Vietnam 2009, 2015, 2023; authors' calculations.</w:t>
       </w:r>
     </w:p>
-    <w:bookmarkEnd w:id="61"/>
-    <w:bookmarkEnd w:id="62"/>
-    <w:bookmarkEnd w:id="63"/>
-    <w:bookmarkStart w:id="69" w:name="X735612638e4e736e4693e459c258977262c0dfc"/>
+    <w:bookmarkEnd w:id="43"/>
+    <w:bookmarkEnd w:id="44"/>
+    <w:bookmarkEnd w:id="45"/>
+    <w:bookmarkStart w:id="51" w:name="X735612638e4e736e4693e459c258977262c0dfc"/>
     <w:p>
       <w:pPr>
         <w:pStyle w:val="Heading2"/>
@@ -18054,7 +17820,7 @@
         <w:t xml:space="preserve">, 2026). This corroboration strengthens the interpretation that moderate export intensity generates genuine productivity gains in Vietnamese firms, not merely a compositional artefact of positive selection into exporting.</w:t>
       </w:r>
     </w:p>
-    <w:bookmarkStart w:id="64" w:name="Xa5f80b6bc0b8dd7b33d639445ac723c1ee9ad4a"/>
+    <w:bookmarkStart w:id="46" w:name="Xa5f80b6bc0b8dd7b33d639445ac723c1ee9ad4a"/>
     <w:p>
       <w:pPr>
         <w:pStyle w:val="Heading3"/>
@@ -18127,8 +17893,8 @@
         <w:t xml:space="preserve">stand in the broader trajectory of internationalisation and transition, as captured in repeated cross-sectional snapshots rather than within-firm longitudinal records.</w:t>
       </w:r>
     </w:p>
-    <w:bookmarkEnd w:id="64"/>
-    <w:bookmarkStart w:id="65" w:name="Xa30cb53845d80e9f381e97d931a6564a08369b5"/>
+    <w:bookmarkEnd w:id="46"/>
+    <w:bookmarkStart w:id="47" w:name="Xa30cb53845d80e9f381e97d931a6564a08369b5"/>
     <w:p>
       <w:pPr>
         <w:pStyle w:val="Heading3"/>
@@ -18339,8 +18105,8 @@
         <w:t xml:space="preserve">a single label.</w:t>
       </w:r>
     </w:p>
-    <w:bookmarkEnd w:id="65"/>
-    <w:bookmarkStart w:id="66" w:name="X946dfeb74c2174371e94edd51e868f8bb309c10"/>
+    <w:bookmarkEnd w:id="47"/>
+    <w:bookmarkStart w:id="48" w:name="X946dfeb74c2174371e94edd51e868f8bb309c10"/>
     <w:p>
       <w:pPr>
         <w:pStyle w:val="Heading3"/>
@@ -18643,8 +18409,8 @@
         <w:t xml:space="preserve">indistinguishable across waves.</w:t>
       </w:r>
     </w:p>
-    <w:bookmarkEnd w:id="66"/>
-    <w:bookmarkStart w:id="67" w:name="Xd9a4ebc909e2b14dcfe03b7b8686207326328b4"/>
+    <w:bookmarkEnd w:id="48"/>
+    <w:bookmarkStart w:id="49" w:name="Xd9a4ebc909e2b14dcfe03b7b8686207326328b4"/>
     <w:p>
       <w:pPr>
         <w:pStyle w:val="Heading3"/>
@@ -18763,8 +18529,8 @@
         <w:t xml:space="preserve">Two cross-cutting principles emerge. First, managers should avoid conflating basic digital adoption with deeper technological capability, the constructs do not behave identically across periods or under identification-robust estimation, and Tier-1 digital expenditure does not substitute for the foreign-technology, standards, and process-integration investments that the TCI channel reflects. Second, allocation decisions should be staged against the empirically identified thresholds rather than against generic digital-transformation prescriptions: investment in incremental Tier-1 presence at high export intensity may absorb scarce capital with limited productivity return, while investment in TCI-channel capability around the 39–46 % band corresponds to where the cross-wave evidence is most consistent with a productivity-enhancing effect. The threshold-conditioned framing translates the step-function and Tier-1 saturation findings into actionable allocation guidance without overstating the causal status of the cross-sectional coefficients.</w:t>
       </w:r>
     </w:p>
-    <w:bookmarkEnd w:id="67"/>
-    <w:bookmarkStart w:id="68" w:name="X0d482379a65faf52764848d2b168aee0725ece4"/>
+    <w:bookmarkEnd w:id="49"/>
+    <w:bookmarkStart w:id="50" w:name="X0d482379a65faf52764848d2b168aee0725ece4"/>
     <w:p>
       <w:pPr>
         <w:pStyle w:val="Heading3"/>
@@ -18940,9 +18706,9 @@
         <w:t xml:space="preserve">, 2026), suggesting that the ascending limb documented in the WBES microdata reflects in part the economy-wide gains from trade opening that firm-level capability investments convert into sustained productivity advantage.</w:t>
       </w:r>
     </w:p>
-    <w:bookmarkEnd w:id="68"/>
-    <w:bookmarkEnd w:id="69"/>
-    <w:bookmarkStart w:id="70" w:name="Xf3d63d3bef15b3e862b66ed5bd48a577996a1bc"/>
+    <w:bookmarkEnd w:id="50"/>
+    <w:bookmarkEnd w:id="51"/>
+    <w:bookmarkStart w:id="52" w:name="Xf3d63d3bef15b3e862b66ed5bd48a577996a1bc"/>
     <w:p>
       <w:pPr>
         <w:pStyle w:val="Heading2"/>
@@ -19121,8 +18887,8 @@
         <w:t xml:space="preserve">Sixth, the analysis is limited to Vietnam as a single transitional economy at a particular stage of its digital and institutional development. Understanding how the DAI moderation pattern documented here, negative at high export intensity under Tier-1-only adoption, compares with patterns in other emerging markets at different institutional stages, or with patterns in digitally advanced economies where the same interaction is predicted to be positive, requires cross-setting comparative designs that systematically vary institutional transaction costs and digital infrastructure quality. Such designs would also allow more direct tests of the context-contingent framing developed in §2.1.</w:t>
       </w:r>
     </w:p>
-    <w:bookmarkEnd w:id="70"/>
-    <w:bookmarkStart w:id="71" w:name="X19cad7d15381a9dfa000caf49ac5c69889e188d"/>
+    <w:bookmarkEnd w:id="52"/>
+    <w:bookmarkStart w:id="53" w:name="X19cad7d15381a9dfa000caf49ac5c69889e188d"/>
     <w:p>
       <w:pPr>
         <w:pStyle w:val="Heading2"/>
@@ -19155,8 +18921,8 @@
         <w:t xml:space="preserve">The results also suggest that technological capability and the baseline website-presence indicator should not be treated as interchangeable, and that conflating them under a single "digital adoption" or "digital transformation" label would obscure their differing identification properties. Technological capability is comparatively stable and identification-robust across specifications. The baseline DAI_z control is more wave-sensitive and attenuates to a null under instrumental-variable estimation, consistent with Tier-1 proxy obsolescence as website ownership diffuses to near-universal levels in the Vietnamese firm population. Within the constraint of a single binary website indicator, this paper makes no claim about dynamic digital capability moderation; any such test awaits richer Tier 2–4 indicators not currently available cross-wave in the WBES Vietnam instrument.</w:t>
       </w:r>
     </w:p>
-    <w:bookmarkEnd w:id="71"/>
-    <w:bookmarkStart w:id="72" w:name="conflict-of-interest"/>
+    <w:bookmarkEnd w:id="53"/>
+    <w:bookmarkStart w:id="54" w:name="conflict-of-interest"/>
     <w:p>
       <w:pPr>
         <w:pStyle w:val="Heading2"/>
@@ -19173,8 +18939,8 @@
         <w:t xml:space="preserve">The authors declare no conflict of interest.</w:t>
       </w:r>
     </w:p>
-    <w:bookmarkEnd w:id="72"/>
-    <w:bookmarkStart w:id="73" w:name="funding"/>
+    <w:bookmarkEnd w:id="54"/>
+    <w:bookmarkStart w:id="55" w:name="funding"/>
     <w:p>
       <w:pPr>
         <w:pStyle w:val="Heading2"/>
@@ -19197,8 +18963,8 @@
         <w:t xml:space="preserve">not-for-profit sectors.</w:t>
       </w:r>
     </w:p>
-    <w:bookmarkEnd w:id="73"/>
-    <w:bookmarkStart w:id="74" w:name="data-availability-statement"/>
+    <w:bookmarkEnd w:id="55"/>
+    <w:bookmarkStart w:id="56" w:name="data-availability-statement"/>
     <w:p>
       <w:pPr>
         <w:pStyle w:val="Heading2"/>
@@ -19245,8 +19011,8 @@
         <w:t xml:space="preserve">and may be shared to the extent permitted by the data-access terms.</w:t>
       </w:r>
     </w:p>
-    <w:bookmarkEnd w:id="74"/>
-    <w:bookmarkStart w:id="75" w:name="ethics-statement"/>
+    <w:bookmarkEnd w:id="56"/>
+    <w:bookmarkStart w:id="57" w:name="ethics-statement"/>
     <w:p>
       <w:pPr>
         <w:pStyle w:val="Heading2"/>
@@ -19263,8 +19029,8 @@
         <w:t xml:space="preserve">This study uses secondary, de-identified, firm-level data from the World Bank Enterprise Surveys. It does not involve human participants, identifiable personal data, animals, or biological samples, and therefore did not require institutional ethical approval. The research was conducted in accordance with the data-access terms of the World Bank Enterprise Surveys.</w:t>
       </w:r>
     </w:p>
-    <w:bookmarkEnd w:id="75"/>
-    <w:bookmarkStart w:id="76" w:name="X799c23334c5944d058eaf15944a1408ff96b683"/>
+    <w:bookmarkEnd w:id="57"/>
+    <w:bookmarkStart w:id="58" w:name="X799c23334c5944d058eaf15944a1408ff96b683"/>
     <w:p>
       <w:pPr>
         <w:pStyle w:val="Heading2"/>
@@ -19281,8 +19047,8 @@
         <w:t xml:space="preserve">In preparing this manuscript, the author(s) used Grammarly, a writing-assistance tool, to help correct spelling, grammar, and punctuation in the author(s)' own original text. No generative artificial-intelligence tool was used to generate, draft, or create any substantive content, analysis, or interpretation. All conceptual framing, hypothesis development, empirical analysis, results interpretation, and final wording were produced by the human author(s), who take full responsibility for the content of the publication.</w:t>
       </w:r>
     </w:p>
-    <w:bookmarkEnd w:id="76"/>
-    <w:bookmarkStart w:id="77" w:name="acknowledgements"/>
+    <w:bookmarkEnd w:id="58"/>
+    <w:bookmarkStart w:id="59" w:name="acknowledgements"/>
     <w:p>
       <w:pPr>
         <w:pStyle w:val="Heading2"/>
@@ -19299,8 +19065,8 @@
         <w:t xml:space="preserve">[Acknowledgements removed for blind review; see separately submitted Title Page.]</w:t>
       </w:r>
     </w:p>
-    <w:bookmarkEnd w:id="77"/>
-    <w:bookmarkStart w:id="78" w:name="supplementary-materials"/>
+    <w:bookmarkEnd w:id="59"/>
+    <w:bookmarkStart w:id="60" w:name="supplementary-materials"/>
     <w:p>
       <w:pPr>
         <w:pStyle w:val="Heading2"/>
@@ -19352,8 +19118,8 @@
         </w:pict>
       </w:r>
     </w:p>
-    <w:bookmarkEnd w:id="78"/>
-    <w:bookmarkStart w:id="132" w:name="references"/>
+    <w:bookmarkEnd w:id="60"/>
+    <w:bookmarkStart w:id="114" w:name="references"/>
     <w:p>
       <w:pPr>
         <w:pStyle w:val="Heading2"/>
@@ -19393,7 +19159,7 @@
       <w:r>
         <w:t xml:space="preserve"> </w:t>
       </w:r>
-      <w:hyperlink r:id="rId79">
+      <w:hyperlink r:id="rId61">
         <w:r>
           <w:rPr>
             <w:rStyle w:val="Hyperlink"/>
@@ -19425,7 +19191,7 @@
       <w:r>
         <w:t xml:space="preserve"> </w:t>
       </w:r>
-      <w:hyperlink r:id="rId80">
+      <w:hyperlink r:id="rId62">
         <w:r>
           <w:rPr>
             <w:rStyle w:val="Hyperlink"/>
@@ -19457,7 +19223,7 @@
       <w:r>
         <w:t xml:space="preserve"> </w:t>
       </w:r>
-      <w:hyperlink r:id="rId81">
+      <w:hyperlink r:id="rId63">
         <w:r>
           <w:rPr>
             <w:rStyle w:val="Hyperlink"/>
@@ -19497,7 +19263,7 @@
       <w:r>
         <w:t xml:space="preserve"> </w:t>
       </w:r>
-      <w:hyperlink r:id="rId82">
+      <w:hyperlink r:id="rId64">
         <w:r>
           <w:rPr>
             <w:rStyle w:val="Hyperlink"/>
@@ -19529,7 +19295,7 @@
       <w:r>
         <w:t xml:space="preserve"> </w:t>
       </w:r>
-      <w:hyperlink r:id="rId83">
+      <w:hyperlink r:id="rId65">
         <w:r>
           <w:rPr>
             <w:rStyle w:val="Hyperlink"/>
@@ -19561,7 +19327,7 @@
       <w:r>
         <w:t xml:space="preserve"> </w:t>
       </w:r>
-      <w:hyperlink r:id="rId84">
+      <w:hyperlink r:id="rId66">
         <w:r>
           <w:rPr>
             <w:rStyle w:val="Hyperlink"/>
@@ -19593,7 +19359,7 @@
       <w:r>
         <w:t xml:space="preserve"> </w:t>
       </w:r>
-      <w:hyperlink r:id="rId85">
+      <w:hyperlink r:id="rId67">
         <w:r>
           <w:rPr>
             <w:rStyle w:val="Hyperlink"/>
@@ -19625,7 +19391,7 @@
       <w:r>
         <w:t xml:space="preserve"> </w:t>
       </w:r>
-      <w:hyperlink r:id="rId86">
+      <w:hyperlink r:id="rId68">
         <w:r>
           <w:rPr>
             <w:rStyle w:val="Hyperlink"/>
@@ -19657,7 +19423,7 @@
       <w:r>
         <w:t xml:space="preserve"> </w:t>
       </w:r>
-      <w:hyperlink r:id="rId87">
+      <w:hyperlink r:id="rId69">
         <w:r>
           <w:rPr>
             <w:rStyle w:val="Hyperlink"/>
@@ -19689,7 +19455,7 @@
       <w:r>
         <w:t xml:space="preserve"> </w:t>
       </w:r>
-      <w:hyperlink r:id="rId88">
+      <w:hyperlink r:id="rId70">
         <w:r>
           <w:rPr>
             <w:rStyle w:val="Hyperlink"/>
@@ -19721,7 +19487,7 @@
       <w:r>
         <w:t xml:space="preserve"> </w:t>
       </w:r>
-      <w:hyperlink r:id="rId89">
+      <w:hyperlink r:id="rId71">
         <w:r>
           <w:rPr>
             <w:rStyle w:val="Hyperlink"/>
@@ -19753,7 +19519,7 @@
       <w:r>
         <w:t xml:space="preserve"> </w:t>
       </w:r>
-      <w:hyperlink r:id="rId90">
+      <w:hyperlink r:id="rId72">
         <w:r>
           <w:rPr>
             <w:rStyle w:val="Hyperlink"/>
@@ -19785,7 +19551,7 @@
       <w:r>
         <w:t xml:space="preserve"> </w:t>
       </w:r>
-      <w:hyperlink r:id="rId91">
+      <w:hyperlink r:id="rId73">
         <w:r>
           <w:rPr>
             <w:rStyle w:val="Hyperlink"/>
@@ -19817,7 +19583,7 @@
       <w:r>
         <w:t xml:space="preserve"> </w:t>
       </w:r>
-      <w:hyperlink r:id="rId92">
+      <w:hyperlink r:id="rId74">
         <w:r>
           <w:rPr>
             <w:rStyle w:val="Hyperlink"/>
@@ -19852,7 +19618,7 @@
       <w:r>
         <w:t xml:space="preserve"> </w:t>
       </w:r>
-      <w:hyperlink r:id="rId93">
+      <w:hyperlink r:id="rId75">
         <w:r>
           <w:rPr>
             <w:rStyle w:val="Hyperlink"/>
@@ -19884,7 +19650,7 @@
       <w:r>
         <w:t xml:space="preserve"> </w:t>
       </w:r>
-      <w:hyperlink r:id="rId94">
+      <w:hyperlink r:id="rId76">
         <w:r>
           <w:rPr>
             <w:rStyle w:val="Hyperlink"/>
@@ -19916,7 +19682,7 @@
       <w:r>
         <w:t xml:space="preserve"> </w:t>
       </w:r>
-      <w:hyperlink r:id="rId95">
+      <w:hyperlink r:id="rId77">
         <w:r>
           <w:rPr>
             <w:rStyle w:val="Hyperlink"/>
@@ -19948,7 +19714,7 @@
       <w:r>
         <w:t xml:space="preserve"> </w:t>
       </w:r>
-      <w:hyperlink r:id="rId96">
+      <w:hyperlink r:id="rId78">
         <w:r>
           <w:rPr>
             <w:rStyle w:val="Hyperlink"/>
@@ -19980,7 +19746,7 @@
       <w:r>
         <w:t xml:space="preserve"> </w:t>
       </w:r>
-      <w:hyperlink r:id="rId97">
+      <w:hyperlink r:id="rId79">
         <w:r>
           <w:rPr>
             <w:rStyle w:val="Hyperlink"/>
@@ -20012,7 +19778,7 @@
       <w:r>
         <w:t xml:space="preserve"> </w:t>
       </w:r>
-      <w:hyperlink r:id="rId98">
+      <w:hyperlink r:id="rId80">
         <w:r>
           <w:rPr>
             <w:rStyle w:val="Hyperlink"/>
@@ -20044,7 +19810,7 @@
       <w:r>
         <w:t xml:space="preserve"> </w:t>
       </w:r>
-      <w:hyperlink r:id="rId99">
+      <w:hyperlink r:id="rId81">
         <w:r>
           <w:rPr>
             <w:rStyle w:val="Hyperlink"/>
@@ -20079,7 +19845,7 @@
       <w:r>
         <w:t xml:space="preserve"> </w:t>
       </w:r>
-      <w:hyperlink r:id="rId100">
+      <w:hyperlink r:id="rId82">
         <w:r>
           <w:rPr>
             <w:rStyle w:val="Hyperlink"/>
@@ -20117,7 +19883,7 @@
       <w:r>
         <w:t xml:space="preserve"> </w:t>
       </w:r>
-      <w:hyperlink r:id="rId101">
+      <w:hyperlink r:id="rId83">
         <w:r>
           <w:rPr>
             <w:rStyle w:val="Hyperlink"/>
@@ -20149,7 +19915,7 @@
       <w:r>
         <w:t xml:space="preserve"> </w:t>
       </w:r>
-      <w:hyperlink r:id="rId102">
+      <w:hyperlink r:id="rId84">
         <w:r>
           <w:rPr>
             <w:rStyle w:val="Hyperlink"/>
@@ -20181,7 +19947,7 @@
       <w:r>
         <w:t xml:space="preserve"> </w:t>
       </w:r>
-      <w:hyperlink r:id="rId103">
+      <w:hyperlink r:id="rId85">
         <w:r>
           <w:rPr>
             <w:rStyle w:val="Hyperlink"/>
@@ -20213,7 +19979,7 @@
       <w:r>
         <w:t xml:space="preserve"> </w:t>
       </w:r>
-      <w:hyperlink r:id="rId104">
+      <w:hyperlink r:id="rId86">
         <w:r>
           <w:rPr>
             <w:rStyle w:val="Hyperlink"/>
@@ -20245,7 +20011,7 @@
       <w:r>
         <w:t xml:space="preserve"> </w:t>
       </w:r>
-      <w:hyperlink r:id="rId105">
+      <w:hyperlink r:id="rId87">
         <w:r>
           <w:rPr>
             <w:rStyle w:val="Hyperlink"/>
@@ -20277,7 +20043,7 @@
       <w:r>
         <w:t xml:space="preserve"> </w:t>
       </w:r>
-      <w:hyperlink r:id="rId106">
+      <w:hyperlink r:id="rId88">
         <w:r>
           <w:rPr>
             <w:rStyle w:val="Hyperlink"/>
@@ -20309,7 +20075,7 @@
       <w:r>
         <w:t xml:space="preserve"> </w:t>
       </w:r>
-      <w:hyperlink r:id="rId107">
+      <w:hyperlink r:id="rId89">
         <w:r>
           <w:rPr>
             <w:rStyle w:val="Hyperlink"/>
@@ -20341,7 +20107,7 @@
       <w:r>
         <w:t xml:space="preserve"> </w:t>
       </w:r>
-      <w:hyperlink r:id="rId108">
+      <w:hyperlink r:id="rId90">
         <w:r>
           <w:rPr>
             <w:rStyle w:val="Hyperlink"/>
@@ -20373,7 +20139,7 @@
       <w:r>
         <w:t xml:space="preserve"> </w:t>
       </w:r>
-      <w:hyperlink r:id="rId109">
+      <w:hyperlink r:id="rId91">
         <w:r>
           <w:rPr>
             <w:rStyle w:val="Hyperlink"/>
@@ -20405,7 +20171,7 @@
       <w:r>
         <w:t xml:space="preserve"> </w:t>
       </w:r>
-      <w:hyperlink r:id="rId110">
+      <w:hyperlink r:id="rId92">
         <w:r>
           <w:rPr>
             <w:rStyle w:val="Hyperlink"/>
@@ -20437,7 +20203,7 @@
       <w:r>
         <w:t xml:space="preserve"> </w:t>
       </w:r>
-      <w:hyperlink r:id="rId111">
+      <w:hyperlink r:id="rId93">
         <w:r>
           <w:rPr>
             <w:rStyle w:val="Hyperlink"/>
@@ -20469,7 +20235,7 @@
       <w:r>
         <w:t xml:space="preserve"> </w:t>
       </w:r>
-      <w:hyperlink r:id="rId112">
+      <w:hyperlink r:id="rId94">
         <w:r>
           <w:rPr>
             <w:rStyle w:val="Hyperlink"/>
@@ -20501,7 +20267,7 @@
       <w:r>
         <w:t xml:space="preserve"> </w:t>
       </w:r>
-      <w:hyperlink r:id="rId113">
+      <w:hyperlink r:id="rId95">
         <w:r>
           <w:rPr>
             <w:rStyle w:val="Hyperlink"/>
@@ -20520,7 +20286,7 @@
       <w:r>
         <w:t xml:space="preserve"> </w:t>
       </w:r>
-      <w:hyperlink r:id="rId114">
+      <w:hyperlink r:id="rId96">
         <w:r>
           <w:rPr>
             <w:rStyle w:val="Hyperlink"/>
@@ -20558,7 +20324,7 @@
       <w:r>
         <w:t xml:space="preserve"> </w:t>
       </w:r>
-      <w:hyperlink r:id="rId115">
+      <w:hyperlink r:id="rId97">
         <w:r>
           <w:rPr>
             <w:rStyle w:val="Hyperlink"/>
@@ -20590,7 +20356,7 @@
       <w:r>
         <w:t xml:space="preserve"> </w:t>
       </w:r>
-      <w:hyperlink r:id="rId116">
+      <w:hyperlink r:id="rId98">
         <w:r>
           <w:rPr>
             <w:rStyle w:val="Hyperlink"/>
@@ -20622,7 +20388,7 @@
       <w:r>
         <w:t xml:space="preserve"> </w:t>
       </w:r>
-      <w:hyperlink r:id="rId117">
+      <w:hyperlink r:id="rId99">
         <w:r>
           <w:rPr>
             <w:rStyle w:val="Hyperlink"/>
@@ -20654,7 +20420,7 @@
       <w:r>
         <w:t xml:space="preserve"> </w:t>
       </w:r>
-      <w:hyperlink r:id="rId118">
+      <w:hyperlink r:id="rId100">
         <w:r>
           <w:rPr>
             <w:rStyle w:val="Hyperlink"/>
@@ -20686,7 +20452,7 @@
       <w:r>
         <w:t xml:space="preserve"> </w:t>
       </w:r>
-      <w:hyperlink r:id="rId119">
+      <w:hyperlink r:id="rId101">
         <w:r>
           <w:rPr>
             <w:rStyle w:val="Hyperlink"/>
@@ -20718,7 +20484,7 @@
       <w:r>
         <w:t xml:space="preserve"> </w:t>
       </w:r>
-      <w:hyperlink r:id="rId120">
+      <w:hyperlink r:id="rId102">
         <w:r>
           <w:rPr>
             <w:rStyle w:val="Hyperlink"/>
@@ -20750,7 +20516,7 @@
       <w:r>
         <w:t xml:space="preserve"> </w:t>
       </w:r>
-      <w:hyperlink r:id="rId121">
+      <w:hyperlink r:id="rId103">
         <w:r>
           <w:rPr>
             <w:rStyle w:val="Hyperlink"/>
@@ -20782,7 +20548,7 @@
       <w:r>
         <w:t xml:space="preserve"> </w:t>
       </w:r>
-      <w:hyperlink r:id="rId122">
+      <w:hyperlink r:id="rId104">
         <w:r>
           <w:rPr>
             <w:rStyle w:val="Hyperlink"/>
@@ -20814,7 +20580,7 @@
       <w:r>
         <w:t xml:space="preserve"> </w:t>
       </w:r>
-      <w:hyperlink r:id="rId123">
+      <w:hyperlink r:id="rId105">
         <w:r>
           <w:rPr>
             <w:rStyle w:val="Hyperlink"/>
@@ -20846,7 +20612,7 @@
       <w:r>
         <w:t xml:space="preserve"> </w:t>
       </w:r>
-      <w:hyperlink r:id="rId124">
+      <w:hyperlink r:id="rId106">
         <w:r>
           <w:rPr>
             <w:rStyle w:val="Hyperlink"/>
@@ -20878,7 +20644,7 @@
       <w:r>
         <w:t xml:space="preserve"> </w:t>
       </w:r>
-      <w:hyperlink r:id="rId125">
+      <w:hyperlink r:id="rId107">
         <w:r>
           <w:rPr>
             <w:rStyle w:val="Hyperlink"/>
@@ -20931,7 +20697,7 @@
       <w:r>
         <w:t xml:space="preserve"> </w:t>
       </w:r>
-      <w:hyperlink r:id="rId126">
+      <w:hyperlink r:id="rId108">
         <w:r>
           <w:rPr>
             <w:rStyle w:val="Hyperlink"/>
@@ -20984,7 +20750,7 @@
       <w:r>
         <w:t xml:space="preserve"> </w:t>
       </w:r>
-      <w:hyperlink r:id="rId127">
+      <w:hyperlink r:id="rId109">
         <w:r>
           <w:rPr>
             <w:rStyle w:val="Hyperlink"/>
@@ -21022,7 +20788,7 @@
       <w:r>
         <w:t xml:space="preserve"> </w:t>
       </w:r>
-      <w:hyperlink r:id="rId127">
+      <w:hyperlink r:id="rId109">
         <w:r>
           <w:rPr>
             <w:rStyle w:val="Hyperlink"/>
@@ -21060,7 +20826,7 @@
       <w:r>
         <w:t xml:space="preserve"> </w:t>
       </w:r>
-      <w:hyperlink r:id="rId127">
+      <w:hyperlink r:id="rId109">
         <w:r>
           <w:rPr>
             <w:rStyle w:val="Hyperlink"/>
@@ -21101,7 +20867,7 @@
       <w:r>
         <w:t xml:space="preserve"> </w:t>
       </w:r>
-      <w:hyperlink r:id="rId128">
+      <w:hyperlink r:id="rId110">
         <w:r>
           <w:rPr>
             <w:rStyle w:val="Hyperlink"/>
@@ -21139,7 +20905,7 @@
       <w:r>
         <w:t xml:space="preserve"> </w:t>
       </w:r>
-      <w:hyperlink r:id="rId129">
+      <w:hyperlink r:id="rId111">
         <w:r>
           <w:rPr>
             <w:rStyle w:val="Hyperlink"/>
@@ -21171,7 +20937,7 @@
       <w:r>
         <w:t xml:space="preserve"> </w:t>
       </w:r>
-      <w:hyperlink r:id="rId130">
+      <w:hyperlink r:id="rId112">
         <w:r>
           <w:rPr>
             <w:rStyle w:val="Hyperlink"/>
@@ -21203,7 +20969,7 @@
       <w:r>
         <w:t xml:space="preserve"> </w:t>
       </w:r>
-      <w:hyperlink r:id="rId131">
+      <w:hyperlink r:id="rId113">
         <w:r>
           <w:rPr>
             <w:rStyle w:val="Hyperlink"/>
@@ -21212,8 +20978,8 @@
         </w:r>
       </w:hyperlink>
     </w:p>
-    <w:bookmarkEnd w:id="132"/>
-    <w:bookmarkEnd w:id="133"/>
+    <w:bookmarkEnd w:id="114"/>
+    <w:bookmarkEnd w:id="115"/>
     <w:sectPr/>
   </w:body>
 </w:document>

</xml_diff>

<commit_message>
fix(P3): data-verified reconciliation (JED)
- Table III: 2023 TP 42.0->41.6 (verified via TP formula vs coefs CSV);
  re-mark all significance asterisks to match CSV p-values under standard
  convention (*** p<.001 ** p<.01 * p<.05 † p<.10).
- Add World Bank (2025b/2025c) refs (sourced verbatim from dissertation refs);
  remove orphan Wolfolds and Siegel (2019).
- Fix 4 orphaned ', ' appositives; consolidate repeated DAI Tier-1 caveat.
- Submitted _8500 file already consistent. Flagged: exporter-only p .660 vs
  .730 (not in CSV; SE implies .730 - author to confirm).
</commit_message>
<xml_diff>
--- a/p3/submission/jed_package/01_manuscript_blinded.docx
+++ b/p3/submission/jed_package/01_manuscript_blinded.docx
@@ -2,7 +2,7 @@
 <file path=word/document.xml><?xml version="1.0" encoding="utf-8"?>
 <w:document xmlns:w="http://schemas.openxmlformats.org/wordprocessingml/2006/main" xmlns:m="http://schemas.openxmlformats.org/officeDocument/2006/math" xmlns:r="http://schemas.openxmlformats.org/officeDocument/2006/relationships" xmlns:o="urn:schemas-microsoft-com:office:office" xmlns:v="urn:schemas-microsoft-com:vml" xmlns:w10="urn:schemas-microsoft-com:office:word" xmlns:a="http://schemas.openxmlformats.org/drawingml/2006/main" xmlns:pic="http://schemas.openxmlformats.org/drawingml/2006/picture" xmlns:wp="http://schemas.openxmlformats.org/drawingml/2006/wordprocessingDrawing">
   <w:body>
-    <w:bookmarkStart w:id="115" w:name="X0264dbef037d515bdd41c0931e5e2e7c8717b18"/>
+    <w:bookmarkStart w:id="133" w:name="X0264dbef037d515bdd41c0931e5e2e7c8717b18"/>
     <w:p>
       <w:pPr>
         <w:pStyle w:val="Heading1"/>
@@ -895,7 +895,7 @@
     </w:p>
     <w:bookmarkEnd w:id="25"/>
     <w:bookmarkEnd w:id="26"/>
-    <w:bookmarkStart w:id="31" w:name="X8bf20a63f0decf7b16e99d564b9958ec4fbbb23"/>
+    <w:bookmarkStart w:id="34" w:name="X8bf20a63f0decf7b16e99d564b9958ec4fbbb23"/>
     <w:p>
       <w:pPr>
         <w:pStyle w:val="Heading2"/>
@@ -1480,13 +1480,7 @@
         <w:t xml:space="preserve"> </w:t>
       </w:r>
       <w:r>
-        <w:t xml:space="preserve">Tier 3, digital process integration (electronic payment, supply-chain digitisation); Tier 4 ,</w:t>
-      </w:r>
-      <w:r>
-        <w:t xml:space="preserve"> </w:t>
-      </w:r>
-      <w:r>
-        <w:t xml:space="preserve">dynamic digital capability (data-driven decision-making, AI integration). The primary DAI_z</w:t>
+        <w:t xml:space="preserve">Tier 3, digital process integration (electronic payment, supply-chain digitisation); Tier 4, dynamic digital capability (data-driven decision-making, AI integration). The primary DAI_z</w:t>
       </w:r>
     </w:p>
     <w:p>
@@ -1559,26 +1553,8 @@
         <w:t xml:space="preserve">Because DAI_z is not advanced as a primary hypothesis in this study, no H3 is formulated in the present paper. The exploratory digital moderation probe that follows (§2.4) is designated H4 to preserve alignment with the broader dissertation framework, in which H3 conventionally corresponds to institutional moderation in multi-country papers (P5 China, P7 Multi-country). Readers expecting H1–H2–H3–H4 sequencing should note this deliberate gap and the rationale above.</w:t>
       </w:r>
     </w:p>
-    <w:p>
-      <w:pPr>
-        <w:pStyle w:val="BodyText"/>
-      </w:pPr>
-      <w:r>
-        <w:rPr>
-          <w:bCs/>
-          <w:b/>
-        </w:rPr>
-        <w:t xml:space="preserve">WBES-scope caveat.</w:t>
-      </w:r>
-      <w:r>
-        <w:t xml:space="preserve"> </w:t>
-      </w:r>
-      <w:r>
-        <w:t xml:space="preserve">Because the WBES Vietnam instrument carries only the website-presence binary (c22b) comparably across the 2009 / 2015 / 2023 waves, this paper does not attempt to test higher-tier digital-transformation mechanisms such as data-driven decision-making, AI integration, or ERP-based process digitisation. Any descriptive coefficient on DAI_z should be read as reflecting baseline digital-presence variation, not dynamic digital capability. This caveat shields the present analysis from over-claiming on the limited Tier-1 information that a single binary website indicator can provide.</w:t>
-      </w:r>
-    </w:p>
     <w:bookmarkEnd w:id="29"/>
-    <w:bookmarkStart w:id="30" w:name="Xa301591a4bdc42129e76c2a2b73514232150381"/>
+    <w:bookmarkStart w:id="33" w:name="Xa301591a4bdc42129e76c2a2b73514232150381"/>
     <w:p>
       <w:pPr>
         <w:pStyle w:val="Heading3"/>
@@ -1922,7 +1898,46 @@
         <w:pStyle w:val="BodyText"/>
       </w:pPr>
       <w:r>
-        <w:t xml:space="preserve">Figure 1: Conceptual model, TCI, DAI, and export intensity as determinants of firm performance (Vietnam, 3-wave)</w:t>
+        <w:drawing>
+          <wp:inline>
+            <wp:extent cx="5334000" cy="2930266"/>
+            <wp:effectExtent b="0" l="0" r="0" t="0"/>
+            <wp:docPr descr="Figure 1: Conceptual model, TCI, DAI, and export intensity as determinants of firm performance (Vietnam, 3-wave)" title="" id="31" name="Picture"/>
+            <a:graphic>
+              <a:graphicData uri="http://schemas.openxmlformats.org/drawingml/2006/picture">
+                <pic:pic>
+                  <pic:nvPicPr>
+                    <pic:cNvPr descr="figures/vietnam/figure_1_conceptual_model.png" id="32" name="Picture"/>
+                    <pic:cNvPicPr>
+                      <a:picLocks noChangeArrowheads="1" noChangeAspect="1"/>
+                    </pic:cNvPicPr>
+                  </pic:nvPicPr>
+                  <pic:blipFill>
+                    <a:blip r:embed="rId30"/>
+                    <a:stretch>
+                      <a:fillRect/>
+                    </a:stretch>
+                  </pic:blipFill>
+                  <pic:spPr bwMode="auto">
+                    <a:xfrm>
+                      <a:off x="0" y="0"/>
+                      <a:ext cx="5334000" cy="2930266"/>
+                    </a:xfrm>
+                    <a:prstGeom prst="rect">
+                      <a:avLst/>
+                    </a:prstGeom>
+                    <a:noFill/>
+                    <a:ln w="9525">
+                      <a:noFill/>
+                      <a:headEnd/>
+                      <a:tailEnd/>
+                    </a:ln>
+                  </pic:spPr>
+                </pic:pic>
+              </a:graphicData>
+            </a:graphic>
+          </wp:inline>
+        </w:drawing>
       </w:r>
     </w:p>
     <w:p>
@@ -1961,9 +1976,9 @@
         <w:t xml:space="preserve">Solid arrows represent hypothesised direct and curvilinear effects. Dashed arrows represent moderating effects. The independent variable, internationalisation intensity (FSTS, centred FSTS_c and FSTS_c²), is placed at left; the dependent variable, firm performance, measured as ln(labour productivity) = ln(annual revenue PPP / permanent workers), is placed at right, following left-to-right causal flow convention. H1 (inverted-U nonlinearity: β₁ &gt; 0, β₂ &lt; 0) is grounded in the Uppsala model (Johanson and Vahlne, 1977, 2009) and coordination-cost theory (Hitt et al., 1997). H2 specifies technological capability (TCI_z, Resource-Based View: Barney, 1991) as a level-shifting direct effect and secondary moderator on the FSTS–performance curve; instrument: industry-level TCI mean (causal IV identification). H4 treats website-based digital adoption (DAI_z, Tier-1 only) as an exploratory probe of the Digital Capability Lens (Banalieva and Dhanaraj, 2019); measurement constraint acknowledged, single binary indicator across 2009/2015/2023 waves limits inferential strength. (+) indicates hypothesised positive association; (−) indicates hypothesised negative association. Control variables (ln firm size, firm age, foreign ownership, broad-sector fixed effects, wave fixed effects) enter additively in all models but are omitted from the figure for clarity. ICRV context: Vietnam, Nhóm IV (Lower_mid_transition, ICRV Group 4 of 6; lower-middle-income transition economy; WGI Rule of Law ≈ −0.09 in 2023, World Bank). Data: WBES 2009, 2015, 2023; N = 2,958 (pooled), n_wave = 989/956/1,013.</w:t>
       </w:r>
     </w:p>
-    <w:bookmarkEnd w:id="30"/>
-    <w:bookmarkEnd w:id="31"/>
-    <w:bookmarkStart w:id="37" w:name="Xfd2f05febb90fd7f58b14547dd9b33901f267a5"/>
+    <w:bookmarkEnd w:id="33"/>
+    <w:bookmarkEnd w:id="34"/>
+    <w:bookmarkStart w:id="40" w:name="Xfd2f05febb90fd7f58b14547dd9b33901f267a5"/>
     <w:p>
       <w:pPr>
         <w:pStyle w:val="Heading2"/>
@@ -1972,7 +1987,7 @@
         <w:t xml:space="preserve">3. Data, variables, and empirical strategy</w:t>
       </w:r>
     </w:p>
-    <w:bookmarkStart w:id="32" w:name="X690a6f2a93b97075aa335e9e4cac18d5293d91d"/>
+    <w:bookmarkStart w:id="35" w:name="X690a6f2a93b97075aa335e9e4cac18d5293d91d"/>
     <w:p>
       <w:pPr>
         <w:pStyle w:val="Heading3"/>
@@ -2037,8 +2052,8 @@
         <w:t xml:space="preserve">across stages.</w:t>
       </w:r>
     </w:p>
-    <w:bookmarkEnd w:id="32"/>
-    <w:bookmarkStart w:id="33" w:name="Xbcf9f12e79107fa2c089aaf13fc6c4fb773f1c2"/>
+    <w:bookmarkEnd w:id="35"/>
+    <w:bookmarkStart w:id="36" w:name="Xbcf9f12e79107fa2c089aaf13fc6c4fb773f1c2"/>
     <w:p>
       <w:pPr>
         <w:pStyle w:val="Heading3"/>
@@ -2052,13 +2067,7 @@
         <w:pStyle w:val="FirstParagraph"/>
       </w:pPr>
       <w:r>
-        <w:t xml:space="preserve">Firm performance is measured by log labour productivity (lnLP). Internationalisation is measured by direct-export intensity (FSTS), mean-centred within wave (FSTS_c) and squared (FSTS_c²) so that linear and quadratic terms can be entered jointly to test for nonlinearity. The analysis uses two distinct capability constructs. The Technological Capability Index (TCI_z) is interpreted narrowly as a foreign-technology and standards capability measure ,</w:t>
-      </w:r>
-      <w:r>
-        <w:t xml:space="preserve"> </w:t>
-      </w:r>
-      <w:r>
-        <w:t xml:space="preserve">international quality certification and foreign-licensed technology, that proxies a firm's exposure to external technological standards rather than the full Cohen-Levinthal absorptive-capacity</w:t>
+        <w:t xml:space="preserve">Firm performance is measured by log labour productivity (lnLP). Internationalisation is measured by direct-export intensity (FSTS), mean-centred within wave (FSTS_c) and squared (FSTS_c²) so that linear and quadratic terms can be entered jointly to test for nonlinearity. The analysis uses two distinct capability constructs. The Technological Capability Index (TCI_z) is interpreted narrowly as a foreign-technology and standards capability measure (namely international quality certification and foreign-licensed technology) that proxies a firm's exposure to external technological standards rather than the full Cohen-Levinthal absorptive-capacity</w:t>
       </w:r>
       <w:r>
         <w:t xml:space="preserve"> </w:t>
@@ -2195,24 +2204,6 @@
       </w:r>
       <w:r>
         <w:t xml:space="preserve">because k33 and k38 are unavailable in the 2009 and 2015 waves.</w:t>
-      </w:r>
-    </w:p>
-    <w:p>
-      <w:pPr>
-        <w:pStyle w:val="BodyText"/>
-      </w:pPr>
-      <w:r>
-        <w:rPr>
-          <w:bCs/>
-          <w:b/>
-        </w:rPr>
-        <w:t xml:space="preserve">Construct-tier scope note.</w:t>
-      </w:r>
-      <w:r>
-        <w:t xml:space="preserve"> </w:t>
-      </w:r>
-      <w:r>
-        <w:t xml:space="preserve">The DAI_z construct in this paper (Tier 1 only: website binary c22b) is constrained by the WBES Vietnam instrument: only the website-presence binary is carried comparably across the 2009 / 2015 / 2023 waves, whereas richer Tier-2 transaction-enabling items such as electronic-payment intensity (k33, k38) appear only in the 2023 wave. The Vietnam Tier-1-only indicator (FSTS_c × DAI_z = −0.912, p = .043) is best read as construct-tier obsolescence: Tier-1 website presence has become a minimum-threshold credential in Vietnam's maturing digital environment and no longer differentiates firms' cross-border coordination capacity at high export intensity. The DAI_rich robustness composite available in the 2023 wave (Tier 1+2, §4.5 Panel B) provides within-wave sensitivity analysis on this scope-limitation question, but cross-wave comparability limits its use as the primary measure.</w:t>
       </w:r>
     </w:p>
     <w:p>
@@ -2930,8 +2921,8 @@
         <w:t xml:space="preserve">and 2023 respectively; pooled N is 2,958.</w:t>
       </w:r>
     </w:p>
-    <w:bookmarkEnd w:id="33"/>
-    <w:bookmarkStart w:id="34" w:name="Xc5fe1f3cf583535f12a87a680dcd317400b3da2"/>
+    <w:bookmarkEnd w:id="36"/>
+    <w:bookmarkStart w:id="37" w:name="Xc5fe1f3cf583535f12a87a680dcd317400b3da2"/>
     <w:p>
       <w:pPr>
         <w:pStyle w:val="Heading3"/>
@@ -3274,8 +3265,8 @@
         <w:t xml:space="preserve">All models are estimated by OLS with HC1 heteroscedasticity-consistent standard errors. Wave fixed effects (λ_t) are included in pooled specifications only. The M0–M8 sequence is estimated wave-by-wave and jointly on the pooled three-wave file, yielding four sets of estimates (2009, 2015, 2023, pooled).</w:t>
       </w:r>
     </w:p>
-    <w:bookmarkEnd w:id="34"/>
-    <w:bookmarkStart w:id="35" w:name="Xe803d156752d85865c6c4f44f4ca9bbe59bf0f9"/>
+    <w:bookmarkEnd w:id="37"/>
+    <w:bookmarkStart w:id="38" w:name="Xe803d156752d85865c6c4f44f4ca9bbe59bf0f9"/>
     <w:p>
       <w:pPr>
         <w:pStyle w:val="Heading3"/>
@@ -3354,8 +3345,8 @@
         <w:t xml:space="preserve">The repeated-cross-section data structure (three non-overlapping surveys of different firms) precludes within-firm fixed-effects estimation; the identification strategy therefore relies on the three complementary approaches above rather than panel differencing. All inferences are described as associations with the selection-robustness caveats noted above, consistent with the inferential conventions for cross-sectional WBES data (Antonakis et al., 2010; Shaver, 2020).</w:t>
       </w:r>
     </w:p>
-    <w:bookmarkEnd w:id="35"/>
-    <w:bookmarkStart w:id="36" w:name="X976281aae9d7cc6accc3a8a15180eec1c0b7e58"/>
+    <w:bookmarkEnd w:id="38"/>
+    <w:bookmarkStart w:id="39" w:name="X976281aae9d7cc6accc3a8a15180eec1c0b7e58"/>
     <w:p>
       <w:pPr>
         <w:pStyle w:val="Heading3"/>
@@ -3428,9 +3419,9 @@
         <w:t xml:space="preserve">of associational evidence (Aguinis et al., 2021; Shaver, 2020).</w:t>
       </w:r>
     </w:p>
-    <w:bookmarkEnd w:id="36"/>
-    <w:bookmarkEnd w:id="37"/>
-    <w:bookmarkStart w:id="45" w:name="X121719332867ee227f0a04b486098cee978c6e6"/>
+    <w:bookmarkEnd w:id="39"/>
+    <w:bookmarkEnd w:id="40"/>
+    <w:bookmarkStart w:id="63" w:name="X121719332867ee227f0a04b486098cee978c6e6"/>
     <w:p>
       <w:pPr>
         <w:pStyle w:val="Heading2"/>
@@ -3495,7 +3486,7 @@
         <w:t xml:space="preserve">/ 20.55), consistent with broader Vietnamese productivity convergence over the period.</w:t>
       </w:r>
     </w:p>
-    <w:bookmarkStart w:id="39" w:name="X0cdd773083ddb6504e3d3ab10ff1c76267ec612"/>
+    <w:bookmarkStart w:id="42" w:name="X0cdd773083ddb6504e3d3ab10ff1c76267ec612"/>
     <w:p>
       <w:pPr>
         <w:pStyle w:val="Heading3"/>
@@ -4140,7 +4131,7 @@
       <w:r>
         <w:t xml:space="preserve"> </w:t>
       </w:r>
-      <w:hyperlink r:id="rId38">
+      <w:hyperlink r:id="rId41">
         <w:r>
           <w:rPr>
             <w:rStyle w:val="Hyperlink"/>
@@ -4202,13 +4193,7 @@
         <w:t xml:space="preserve"> </w:t>
       </w:r>
       <w:r>
-        <w:t xml:space="preserve">in which the I–P curvature is unusually sharp while the digital channel compresses entirely ,</w:t>
-      </w:r>
-      <w:r>
-        <w:t xml:space="preserve"> </w:t>
-      </w:r>
-      <w:r>
-        <w:t xml:space="preserve">consistent with the productivity J-curve account in which firms invest in basic digital tools before</w:t>
+        <w:t xml:space="preserve">in which the I–P curvature is unusually sharp while the digital channel compresses entirely, consistent with the productivity J-curve account in which firms invest in basic digital tools before</w:t>
       </w:r>
       <w:r>
         <w:t xml:space="preserve"> </w:t>
@@ -4405,8 +4390,8 @@
         <w:t xml:space="preserve">higher export intensity rather than uniformly across the export-intensity range.</w:t>
       </w:r>
     </w:p>
-    <w:bookmarkEnd w:id="39"/>
-    <w:bookmarkStart w:id="40" w:name="Xaa4851a9c1b3e08eeca0ab72ae930e2b05bff75"/>
+    <w:bookmarkEnd w:id="42"/>
+    <w:bookmarkStart w:id="55" w:name="Xaa4851a9c1b3e08eeca0ab72ae930e2b05bff75"/>
     <w:p>
       <w:pPr>
         <w:pStyle w:val="Heading3"/>
@@ -5039,7 +5024,46 @@
         <w:pStyle w:val="BodyText"/>
       </w:pPr>
       <w:r>
-        <w:t xml:space="preserve">Figure 2a: Wave 2009, predicted ln(labour productivity) vs FSTS</w:t>
+        <w:drawing>
+          <wp:inline>
+            <wp:extent cx="5334000" cy="3555999"/>
+            <wp:effectExtent b="0" l="0" r="0" t="0"/>
+            <wp:docPr descr="Figure 2a: Wave 2009, predicted ln(labour productivity) vs FSTS" title="" id="44" name="Picture"/>
+            <a:graphic>
+              <a:graphicData uri="http://schemas.openxmlformats.org/drawingml/2006/picture">
+                <pic:pic>
+                  <pic:nvPicPr>
+                    <pic:cNvPr descr="figures/vietnam/figure_2a.png" id="45" name="Picture"/>
+                    <pic:cNvPicPr>
+                      <a:picLocks noChangeArrowheads="1" noChangeAspect="1"/>
+                    </pic:cNvPicPr>
+                  </pic:nvPicPr>
+                  <pic:blipFill>
+                    <a:blip r:embed="rId43"/>
+                    <a:stretch>
+                      <a:fillRect/>
+                    </a:stretch>
+                  </pic:blipFill>
+                  <pic:spPr bwMode="auto">
+                    <a:xfrm>
+                      <a:off x="0" y="0"/>
+                      <a:ext cx="5334000" cy="3555999"/>
+                    </a:xfrm>
+                    <a:prstGeom prst="rect">
+                      <a:avLst/>
+                    </a:prstGeom>
+                    <a:noFill/>
+                    <a:ln w="9525">
+                      <a:noFill/>
+                      <a:headEnd/>
+                      <a:tailEnd/>
+                    </a:ln>
+                  </pic:spPr>
+                </pic:pic>
+              </a:graphicData>
+            </a:graphic>
+          </wp:inline>
+        </w:drawing>
       </w:r>
     </w:p>
     <w:p>
@@ -5065,7 +5089,46 @@
         <w:pStyle w:val="BodyText"/>
       </w:pPr>
       <w:r>
-        <w:t xml:space="preserve">Figure 2b: Wave 2015, predicted ln(labour productivity) vs FSTS</w:t>
+        <w:drawing>
+          <wp:inline>
+            <wp:extent cx="5334000" cy="3555999"/>
+            <wp:effectExtent b="0" l="0" r="0" t="0"/>
+            <wp:docPr descr="Figure 2b: Wave 2015, predicted ln(labour productivity) vs FSTS" title="" id="47" name="Picture"/>
+            <a:graphic>
+              <a:graphicData uri="http://schemas.openxmlformats.org/drawingml/2006/picture">
+                <pic:pic>
+                  <pic:nvPicPr>
+                    <pic:cNvPr descr="figures/vietnam/figure_2b.png" id="48" name="Picture"/>
+                    <pic:cNvPicPr>
+                      <a:picLocks noChangeArrowheads="1" noChangeAspect="1"/>
+                    </pic:cNvPicPr>
+                  </pic:nvPicPr>
+                  <pic:blipFill>
+                    <a:blip r:embed="rId46"/>
+                    <a:stretch>
+                      <a:fillRect/>
+                    </a:stretch>
+                  </pic:blipFill>
+                  <pic:spPr bwMode="auto">
+                    <a:xfrm>
+                      <a:off x="0" y="0"/>
+                      <a:ext cx="5334000" cy="3555999"/>
+                    </a:xfrm>
+                    <a:prstGeom prst="rect">
+                      <a:avLst/>
+                    </a:prstGeom>
+                    <a:noFill/>
+                    <a:ln w="9525">
+                      <a:noFill/>
+                      <a:headEnd/>
+                      <a:tailEnd/>
+                    </a:ln>
+                  </pic:spPr>
+                </pic:pic>
+              </a:graphicData>
+            </a:graphic>
+          </wp:inline>
+        </w:drawing>
       </w:r>
     </w:p>
     <w:p>
@@ -5091,7 +5154,46 @@
         <w:pStyle w:val="BodyText"/>
       </w:pPr>
       <w:r>
-        <w:t xml:space="preserve">Figure 2c: Wave 2023, predicted ln(labour productivity) vs FSTS</w:t>
+        <w:drawing>
+          <wp:inline>
+            <wp:extent cx="5334000" cy="3555999"/>
+            <wp:effectExtent b="0" l="0" r="0" t="0"/>
+            <wp:docPr descr="Figure 2c: Wave 2023, predicted ln(labour productivity) vs FSTS" title="" id="50" name="Picture"/>
+            <a:graphic>
+              <a:graphicData uri="http://schemas.openxmlformats.org/drawingml/2006/picture">
+                <pic:pic>
+                  <pic:nvPicPr>
+                    <pic:cNvPr descr="figures/vietnam/figure_2c.png" id="51" name="Picture"/>
+                    <pic:cNvPicPr>
+                      <a:picLocks noChangeArrowheads="1" noChangeAspect="1"/>
+                    </pic:cNvPicPr>
+                  </pic:nvPicPr>
+                  <pic:blipFill>
+                    <a:blip r:embed="rId49"/>
+                    <a:stretch>
+                      <a:fillRect/>
+                    </a:stretch>
+                  </pic:blipFill>
+                  <pic:spPr bwMode="auto">
+                    <a:xfrm>
+                      <a:off x="0" y="0"/>
+                      <a:ext cx="5334000" cy="3555999"/>
+                    </a:xfrm>
+                    <a:prstGeom prst="rect">
+                      <a:avLst/>
+                    </a:prstGeom>
+                    <a:noFill/>
+                    <a:ln w="9525">
+                      <a:noFill/>
+                      <a:headEnd/>
+                      <a:tailEnd/>
+                    </a:ln>
+                  </pic:spPr>
+                </pic:pic>
+              </a:graphicData>
+            </a:graphic>
+          </wp:inline>
+        </w:drawing>
       </w:r>
     </w:p>
     <w:p>
@@ -5117,7 +5219,46 @@
         <w:pStyle w:val="BodyText"/>
       </w:pPr>
       <w:r>
-        <w:t xml:space="preserve">Figure 2d: Pooled (2009+2015+2023), predicted ln(labour productivity) vs FSTS</w:t>
+        <w:drawing>
+          <wp:inline>
+            <wp:extent cx="5334000" cy="3555999"/>
+            <wp:effectExtent b="0" l="0" r="0" t="0"/>
+            <wp:docPr descr="Figure 2d: Pooled (2009+2015+2023), predicted ln(labour productivity) vs FSTS" title="" id="53" name="Picture"/>
+            <a:graphic>
+              <a:graphicData uri="http://schemas.openxmlformats.org/drawingml/2006/picture">
+                <pic:pic>
+                  <pic:nvPicPr>
+                    <pic:cNvPr descr="figures/vietnam/figure_2d.png" id="54" name="Picture"/>
+                    <pic:cNvPicPr>
+                      <a:picLocks noChangeArrowheads="1" noChangeAspect="1"/>
+                    </pic:cNvPicPr>
+                  </pic:nvPicPr>
+                  <pic:blipFill>
+                    <a:blip r:embed="rId52"/>
+                    <a:stretch>
+                      <a:fillRect/>
+                    </a:stretch>
+                  </pic:blipFill>
+                  <pic:spPr bwMode="auto">
+                    <a:xfrm>
+                      <a:off x="0" y="0"/>
+                      <a:ext cx="5334000" cy="3555999"/>
+                    </a:xfrm>
+                    <a:prstGeom prst="rect">
+                      <a:avLst/>
+                    </a:prstGeom>
+                    <a:noFill/>
+                    <a:ln w="9525">
+                      <a:noFill/>
+                      <a:headEnd/>
+                      <a:tailEnd/>
+                    </a:ln>
+                  </pic:spPr>
+                </pic:pic>
+              </a:graphicData>
+            </a:graphic>
+          </wp:inline>
+        </w:drawing>
       </w:r>
     </w:p>
     <w:p>
@@ -5138,8 +5279,8 @@
         <w:t xml:space="preserve">Predicted ln(labour productivity) as a function of FSTS for the pooled sample (M2). Turning point ≈ 40% FSTS (Lind-Mehlum p &lt; .001).</w:t>
       </w:r>
     </w:p>
-    <w:bookmarkEnd w:id="40"/>
-    <w:bookmarkStart w:id="41" w:name="X41c3dce096fbfa1c0be6a58d0741b2aa56fb860"/>
+    <w:bookmarkEnd w:id="55"/>
+    <w:bookmarkStart w:id="59" w:name="X41c3dce096fbfa1c0be6a58d0741b2aa56fb860"/>
     <w:p>
       <w:pPr>
         <w:pStyle w:val="Heading3"/>
@@ -5319,7 +5460,46 @@
         <w:pStyle w:val="BodyText"/>
       </w:pPr>
       <w:r>
-        <w:t xml:space="preserve">Figure 3: Moderator marginal effects, TCI and DAI interactions with FSTS (Vietnam)</w:t>
+        <w:drawing>
+          <wp:inline>
+            <wp:extent cx="5334000" cy="2226365"/>
+            <wp:effectExtent b="0" l="0" r="0" t="0"/>
+            <wp:docPr descr="Figure 3: Moderator marginal effects, TCI and DAI interactions with FSTS (Vietnam)" title="" id="57" name="Picture"/>
+            <a:graphic>
+              <a:graphicData uri="http://schemas.openxmlformats.org/drawingml/2006/picture">
+                <pic:pic>
+                  <pic:nvPicPr>
+                    <pic:cNvPr descr="figures/vietnam/figure_3_moderator_marginals.png" id="58" name="Picture"/>
+                    <pic:cNvPicPr>
+                      <a:picLocks noChangeArrowheads="1" noChangeAspect="1"/>
+                    </pic:cNvPicPr>
+                  </pic:nvPicPr>
+                  <pic:blipFill>
+                    <a:blip r:embed="rId56"/>
+                    <a:stretch>
+                      <a:fillRect/>
+                    </a:stretch>
+                  </pic:blipFill>
+                  <pic:spPr bwMode="auto">
+                    <a:xfrm>
+                      <a:off x="0" y="0"/>
+                      <a:ext cx="5334000" cy="2226365"/>
+                    </a:xfrm>
+                    <a:prstGeom prst="rect">
+                      <a:avLst/>
+                    </a:prstGeom>
+                    <a:noFill/>
+                    <a:ln w="9525">
+                      <a:noFill/>
+                      <a:headEnd/>
+                      <a:tailEnd/>
+                    </a:ln>
+                  </pic:spPr>
+                </pic:pic>
+              </a:graphicData>
+            </a:graphic>
+          </wp:inline>
+        </w:drawing>
       </w:r>
     </w:p>
     <w:p>
@@ -5340,8 +5520,8 @@
         <w:t xml:space="preserve">Marginal effects of TCI_z and DAI_z on ln(labour productivity) across FSTS levels (M7/M8). TCI shows a stable positive level-shift across waves; DAI moderation is wave-specific, with the 2023 interaction showing attenuation at high FSTS (Type I moderation: slope-flattening, shape preserved).</w:t>
       </w:r>
     </w:p>
-    <w:bookmarkEnd w:id="41"/>
-    <w:bookmarkStart w:id="42" w:name="X3b4c7e0874095eca8ced8b4f3eaf74e392e9461"/>
+    <w:bookmarkEnd w:id="59"/>
+    <w:bookmarkStart w:id="60" w:name="X3b4c7e0874095eca8ced8b4f3eaf74e392e9461"/>
     <w:p>
       <w:pPr>
         <w:pStyle w:val="Heading3"/>
@@ -5412,8 +5592,8 @@
         <w:t xml:space="preserve">Table 3 summarises the directional interpretation of the focal coefficients from the full specifications by wave and for the pooled sample.</w:t>
       </w:r>
     </w:p>
-    <w:bookmarkEnd w:id="42"/>
-    <w:bookmarkStart w:id="44" w:name="Xa4c02e0b9d1c1dfbd229ca8e93a765eb24721f0"/>
+    <w:bookmarkEnd w:id="60"/>
+    <w:bookmarkStart w:id="62" w:name="Xa4c02e0b9d1c1dfbd229ca8e93a765eb24721f0"/>
     <w:p>
       <w:pPr>
         <w:pStyle w:val="Heading3"/>
@@ -5694,7 +5874,7 @@
         <w:t xml:space="preserve">turning-point magnitude.</w:t>
       </w:r>
     </w:p>
-    <w:bookmarkStart w:id="43" w:name="robustness-to-endogeneity-and-selection"/>
+    <w:bookmarkStart w:id="61" w:name="robustness-to-endogeneity-and-selection"/>
     <w:p>
       <w:pPr>
         <w:pStyle w:val="Heading4"/>
@@ -17116,7 +17296,7 @@
       <w:r>
         <w:t xml:space="preserve"> </w:t>
       </w:r>
-      <w:hyperlink r:id="rId38">
+      <w:hyperlink r:id="rId41">
         <w:r>
           <w:rPr>
             <w:rStyle w:val="Hyperlink"/>
@@ -17787,10 +17967,10 @@
         <w:t xml:space="preserve">Cross-wave coefficient equality tests following Paternoster et al. (1998). Failure to reject indicates coefficient stability across waves. FSTSc and FSTSc² comparisons support wave-specific heterogeneity in TCI and DAI direct effects but not in the I–P curvature parameters. Turning points (already reported in Table 5 above) are derived from M2 (lnLP = β₀ + β₁ FSTS_c + β₂ FSTS_c² + controls + sector FE [+ wave FE in pooled]) back-transformed to the raw FSTS scale; 95% CI uses the delta method; Lind–Mehlum p-values follow the Sasabuchi-style endpoint test (Lind and Mehlum, 2010). Source: WBES Vietnam 2009, 2015, 2023; authors' calculations.</w:t>
       </w:r>
     </w:p>
-    <w:bookmarkEnd w:id="43"/>
-    <w:bookmarkEnd w:id="44"/>
-    <w:bookmarkEnd w:id="45"/>
-    <w:bookmarkStart w:id="51" w:name="X735612638e4e736e4693e459c258977262c0dfc"/>
+    <w:bookmarkEnd w:id="61"/>
+    <w:bookmarkEnd w:id="62"/>
+    <w:bookmarkEnd w:id="63"/>
+    <w:bookmarkStart w:id="69" w:name="X735612638e4e736e4693e459c258977262c0dfc"/>
     <w:p>
       <w:pPr>
         <w:pStyle w:val="Heading2"/>
@@ -17820,7 +18000,7 @@
         <w:t xml:space="preserve">, 2026). This corroboration strengthens the interpretation that moderate export intensity generates genuine productivity gains in Vietnamese firms, not merely a compositional artefact of positive selection into exporting.</w:t>
       </w:r>
     </w:p>
-    <w:bookmarkStart w:id="46" w:name="Xa5f80b6bc0b8dd7b33d639445ac723c1ee9ad4a"/>
+    <w:bookmarkStart w:id="64" w:name="Xa5f80b6bc0b8dd7b33d639445ac723c1ee9ad4a"/>
     <w:p>
       <w:pPr>
         <w:pStyle w:val="Heading3"/>
@@ -17893,8 +18073,8 @@
         <w:t xml:space="preserve">stand in the broader trajectory of internationalisation and transition, as captured in repeated cross-sectional snapshots rather than within-firm longitudinal records.</w:t>
       </w:r>
     </w:p>
-    <w:bookmarkEnd w:id="46"/>
-    <w:bookmarkStart w:id="47" w:name="Xa30cb53845d80e9f381e97d931a6564a08369b5"/>
+    <w:bookmarkEnd w:id="64"/>
+    <w:bookmarkStart w:id="65" w:name="Xa30cb53845d80e9f381e97d931a6564a08369b5"/>
     <w:p>
       <w:pPr>
         <w:pStyle w:val="Heading3"/>
@@ -17994,13 +18174,7 @@
         <w:t xml:space="preserve"> </w:t>
       </w:r>
       <w:r>
-        <w:t xml:space="preserve">by 2023 close to a Tier-1 baseline indicator, the DAI_rich extension available only in 2023 ,</w:t>
-      </w:r>
-      <w:r>
-        <w:t xml:space="preserve"> </w:t>
-      </w:r>
-      <w:r>
-        <w:t xml:space="preserve">combining c22b with electronic-payment shares (k33, k38), produces a similarly directioned</w:t>
+        <w:t xml:space="preserve">by 2023 close to a Tier-1 baseline indicator, the DAI_rich extension available only in 2023 (combining c22b with electronic-payment shares k33, k38) produces a similarly directioned</w:t>
       </w:r>
       <w:r>
         <w:t xml:space="preserve"> </w:t>
@@ -18105,8 +18279,8 @@
         <w:t xml:space="preserve">a single label.</w:t>
       </w:r>
     </w:p>
-    <w:bookmarkEnd w:id="47"/>
-    <w:bookmarkStart w:id="48" w:name="X946dfeb74c2174371e94edd51e868f8bb309c10"/>
+    <w:bookmarkEnd w:id="65"/>
+    <w:bookmarkStart w:id="66" w:name="X946dfeb74c2174371e94edd51e868f8bb309c10"/>
     <w:p>
       <w:pPr>
         <w:pStyle w:val="Heading3"/>
@@ -18409,8 +18583,8 @@
         <w:t xml:space="preserve">indistinguishable across waves.</w:t>
       </w:r>
     </w:p>
-    <w:bookmarkEnd w:id="48"/>
-    <w:bookmarkStart w:id="49" w:name="Xd9a4ebc909e2b14dcfe03b7b8686207326328b4"/>
+    <w:bookmarkEnd w:id="66"/>
+    <w:bookmarkStart w:id="67" w:name="Xd9a4ebc909e2b14dcfe03b7b8686207326328b4"/>
     <w:p>
       <w:pPr>
         <w:pStyle w:val="Heading3"/>
@@ -18529,8 +18703,8 @@
         <w:t xml:space="preserve">Two cross-cutting principles emerge. First, managers should avoid conflating basic digital adoption with deeper technological capability, the constructs do not behave identically across periods or under identification-robust estimation, and Tier-1 digital expenditure does not substitute for the foreign-technology, standards, and process-integration investments that the TCI channel reflects. Second, allocation decisions should be staged against the empirically identified thresholds rather than against generic digital-transformation prescriptions: investment in incremental Tier-1 presence at high export intensity may absorb scarce capital with limited productivity return, while investment in TCI-channel capability around the 39–46 % band corresponds to where the cross-wave evidence is most consistent with a productivity-enhancing effect. The threshold-conditioned framing translates the step-function and Tier-1 saturation findings into actionable allocation guidance without overstating the causal status of the cross-sectional coefficients.</w:t>
       </w:r>
     </w:p>
-    <w:bookmarkEnd w:id="49"/>
-    <w:bookmarkStart w:id="50" w:name="X0d482379a65faf52764848d2b168aee0725ece4"/>
+    <w:bookmarkEnd w:id="67"/>
+    <w:bookmarkStart w:id="68" w:name="X0d482379a65faf52764848d2b168aee0725ece4"/>
     <w:p>
       <w:pPr>
         <w:pStyle w:val="Heading3"/>
@@ -18706,9 +18880,9 @@
         <w:t xml:space="preserve">, 2026), suggesting that the ascending limb documented in the WBES microdata reflects in part the economy-wide gains from trade opening that firm-level capability investments convert into sustained productivity advantage.</w:t>
       </w:r>
     </w:p>
-    <w:bookmarkEnd w:id="50"/>
-    <w:bookmarkEnd w:id="51"/>
-    <w:bookmarkStart w:id="52" w:name="Xf3d63d3bef15b3e862b66ed5bd48a577996a1bc"/>
+    <w:bookmarkEnd w:id="68"/>
+    <w:bookmarkEnd w:id="69"/>
+    <w:bookmarkStart w:id="70" w:name="Xf3d63d3bef15b3e862b66ed5bd48a577996a1bc"/>
     <w:p>
       <w:pPr>
         <w:pStyle w:val="Heading2"/>
@@ -18887,8 +19061,8 @@
         <w:t xml:space="preserve">Sixth, the analysis is limited to Vietnam as a single transitional economy at a particular stage of its digital and institutional development. Understanding how the DAI moderation pattern documented here, negative at high export intensity under Tier-1-only adoption, compares with patterns in other emerging markets at different institutional stages, or with patterns in digitally advanced economies where the same interaction is predicted to be positive, requires cross-setting comparative designs that systematically vary institutional transaction costs and digital infrastructure quality. Such designs would also allow more direct tests of the context-contingent framing developed in §2.1.</w:t>
       </w:r>
     </w:p>
-    <w:bookmarkEnd w:id="52"/>
-    <w:bookmarkStart w:id="53" w:name="X19cad7d15381a9dfa000caf49ac5c69889e188d"/>
+    <w:bookmarkEnd w:id="70"/>
+    <w:bookmarkStart w:id="71" w:name="X19cad7d15381a9dfa000caf49ac5c69889e188d"/>
     <w:p>
       <w:pPr>
         <w:pStyle w:val="Heading2"/>
@@ -18921,8 +19095,8 @@
         <w:t xml:space="preserve">The results also suggest that technological capability and the baseline website-presence indicator should not be treated as interchangeable, and that conflating them under a single "digital adoption" or "digital transformation" label would obscure their differing identification properties. Technological capability is comparatively stable and identification-robust across specifications. The baseline DAI_z control is more wave-sensitive and attenuates to a null under instrumental-variable estimation, consistent with Tier-1 proxy obsolescence as website ownership diffuses to near-universal levels in the Vietnamese firm population. Within the constraint of a single binary website indicator, this paper makes no claim about dynamic digital capability moderation; any such test awaits richer Tier 2–4 indicators not currently available cross-wave in the WBES Vietnam instrument.</w:t>
       </w:r>
     </w:p>
-    <w:bookmarkEnd w:id="53"/>
-    <w:bookmarkStart w:id="54" w:name="conflict-of-interest"/>
+    <w:bookmarkEnd w:id="71"/>
+    <w:bookmarkStart w:id="72" w:name="conflict-of-interest"/>
     <w:p>
       <w:pPr>
         <w:pStyle w:val="Heading2"/>
@@ -18939,8 +19113,8 @@
         <w:t xml:space="preserve">The authors declare no conflict of interest.</w:t>
       </w:r>
     </w:p>
-    <w:bookmarkEnd w:id="54"/>
-    <w:bookmarkStart w:id="55" w:name="funding"/>
+    <w:bookmarkEnd w:id="72"/>
+    <w:bookmarkStart w:id="73" w:name="funding"/>
     <w:p>
       <w:pPr>
         <w:pStyle w:val="Heading2"/>
@@ -18963,8 +19137,8 @@
         <w:t xml:space="preserve">not-for-profit sectors.</w:t>
       </w:r>
     </w:p>
-    <w:bookmarkEnd w:id="55"/>
-    <w:bookmarkStart w:id="56" w:name="data-availability-statement"/>
+    <w:bookmarkEnd w:id="73"/>
+    <w:bookmarkStart w:id="74" w:name="data-availability-statement"/>
     <w:p>
       <w:pPr>
         <w:pStyle w:val="Heading2"/>
@@ -19011,8 +19185,8 @@
         <w:t xml:space="preserve">and may be shared to the extent permitted by the data-access terms.</w:t>
       </w:r>
     </w:p>
-    <w:bookmarkEnd w:id="56"/>
-    <w:bookmarkStart w:id="57" w:name="ethics-statement"/>
+    <w:bookmarkEnd w:id="74"/>
+    <w:bookmarkStart w:id="75" w:name="ethics-statement"/>
     <w:p>
       <w:pPr>
         <w:pStyle w:val="Heading2"/>
@@ -19029,8 +19203,8 @@
         <w:t xml:space="preserve">This study uses secondary, de-identified, firm-level data from the World Bank Enterprise Surveys. It does not involve human participants, identifiable personal data, animals, or biological samples, and therefore did not require institutional ethical approval. The research was conducted in accordance with the data-access terms of the World Bank Enterprise Surveys.</w:t>
       </w:r>
     </w:p>
-    <w:bookmarkEnd w:id="57"/>
-    <w:bookmarkStart w:id="58" w:name="X799c23334c5944d058eaf15944a1408ff96b683"/>
+    <w:bookmarkEnd w:id="75"/>
+    <w:bookmarkStart w:id="76" w:name="X799c23334c5944d058eaf15944a1408ff96b683"/>
     <w:p>
       <w:pPr>
         <w:pStyle w:val="Heading2"/>
@@ -19047,8 +19221,8 @@
         <w:t xml:space="preserve">In preparing this manuscript, the author(s) used Grammarly, a writing-assistance tool, to help correct spelling, grammar, and punctuation in the author(s)' own original text. No generative artificial-intelligence tool was used to generate, draft, or create any substantive content, analysis, or interpretation. All conceptual framing, hypothesis development, empirical analysis, results interpretation, and final wording were produced by the human author(s), who take full responsibility for the content of the publication.</w:t>
       </w:r>
     </w:p>
-    <w:bookmarkEnd w:id="58"/>
-    <w:bookmarkStart w:id="59" w:name="acknowledgements"/>
+    <w:bookmarkEnd w:id="76"/>
+    <w:bookmarkStart w:id="77" w:name="acknowledgements"/>
     <w:p>
       <w:pPr>
         <w:pStyle w:val="Heading2"/>
@@ -19065,8 +19239,8 @@
         <w:t xml:space="preserve">[Acknowledgements removed for blind review; see separately submitted Title Page.]</w:t>
       </w:r>
     </w:p>
-    <w:bookmarkEnd w:id="59"/>
-    <w:bookmarkStart w:id="60" w:name="supplementary-materials"/>
+    <w:bookmarkEnd w:id="77"/>
+    <w:bookmarkStart w:id="78" w:name="supplementary-materials"/>
     <w:p>
       <w:pPr>
         <w:pStyle w:val="Heading2"/>
@@ -19118,8 +19292,8 @@
         </w:pict>
       </w:r>
     </w:p>
-    <w:bookmarkEnd w:id="60"/>
-    <w:bookmarkStart w:id="114" w:name="references"/>
+    <w:bookmarkEnd w:id="78"/>
+    <w:bookmarkStart w:id="132" w:name="references"/>
     <w:p>
       <w:pPr>
         <w:pStyle w:val="Heading2"/>
@@ -19159,7 +19333,7 @@
       <w:r>
         <w:t xml:space="preserve"> </w:t>
       </w:r>
-      <w:hyperlink r:id="rId61">
+      <w:hyperlink r:id="rId79">
         <w:r>
           <w:rPr>
             <w:rStyle w:val="Hyperlink"/>
@@ -19191,7 +19365,7 @@
       <w:r>
         <w:t xml:space="preserve"> </w:t>
       </w:r>
-      <w:hyperlink r:id="rId62">
+      <w:hyperlink r:id="rId80">
         <w:r>
           <w:rPr>
             <w:rStyle w:val="Hyperlink"/>
@@ -19223,7 +19397,7 @@
       <w:r>
         <w:t xml:space="preserve"> </w:t>
       </w:r>
-      <w:hyperlink r:id="rId63">
+      <w:hyperlink r:id="rId81">
         <w:r>
           <w:rPr>
             <w:rStyle w:val="Hyperlink"/>
@@ -19263,7 +19437,7 @@
       <w:r>
         <w:t xml:space="preserve"> </w:t>
       </w:r>
-      <w:hyperlink r:id="rId64">
+      <w:hyperlink r:id="rId82">
         <w:r>
           <w:rPr>
             <w:rStyle w:val="Hyperlink"/>
@@ -19295,7 +19469,7 @@
       <w:r>
         <w:t xml:space="preserve"> </w:t>
       </w:r>
-      <w:hyperlink r:id="rId65">
+      <w:hyperlink r:id="rId83">
         <w:r>
           <w:rPr>
             <w:rStyle w:val="Hyperlink"/>
@@ -19327,7 +19501,7 @@
       <w:r>
         <w:t xml:space="preserve"> </w:t>
       </w:r>
-      <w:hyperlink r:id="rId66">
+      <w:hyperlink r:id="rId84">
         <w:r>
           <w:rPr>
             <w:rStyle w:val="Hyperlink"/>
@@ -19359,7 +19533,7 @@
       <w:r>
         <w:t xml:space="preserve"> </w:t>
       </w:r>
-      <w:hyperlink r:id="rId67">
+      <w:hyperlink r:id="rId85">
         <w:r>
           <w:rPr>
             <w:rStyle w:val="Hyperlink"/>
@@ -19391,7 +19565,7 @@
       <w:r>
         <w:t xml:space="preserve"> </w:t>
       </w:r>
-      <w:hyperlink r:id="rId68">
+      <w:hyperlink r:id="rId86">
         <w:r>
           <w:rPr>
             <w:rStyle w:val="Hyperlink"/>
@@ -19423,7 +19597,7 @@
       <w:r>
         <w:t xml:space="preserve"> </w:t>
       </w:r>
-      <w:hyperlink r:id="rId69">
+      <w:hyperlink r:id="rId87">
         <w:r>
           <w:rPr>
             <w:rStyle w:val="Hyperlink"/>
@@ -19455,7 +19629,7 @@
       <w:r>
         <w:t xml:space="preserve"> </w:t>
       </w:r>
-      <w:hyperlink r:id="rId70">
+      <w:hyperlink r:id="rId88">
         <w:r>
           <w:rPr>
             <w:rStyle w:val="Hyperlink"/>
@@ -19487,7 +19661,7 @@
       <w:r>
         <w:t xml:space="preserve"> </w:t>
       </w:r>
-      <w:hyperlink r:id="rId71">
+      <w:hyperlink r:id="rId89">
         <w:r>
           <w:rPr>
             <w:rStyle w:val="Hyperlink"/>
@@ -19519,7 +19693,7 @@
       <w:r>
         <w:t xml:space="preserve"> </w:t>
       </w:r>
-      <w:hyperlink r:id="rId72">
+      <w:hyperlink r:id="rId90">
         <w:r>
           <w:rPr>
             <w:rStyle w:val="Hyperlink"/>
@@ -19551,7 +19725,7 @@
       <w:r>
         <w:t xml:space="preserve"> </w:t>
       </w:r>
-      <w:hyperlink r:id="rId73">
+      <w:hyperlink r:id="rId91">
         <w:r>
           <w:rPr>
             <w:rStyle w:val="Hyperlink"/>
@@ -19583,7 +19757,7 @@
       <w:r>
         <w:t xml:space="preserve"> </w:t>
       </w:r>
-      <w:hyperlink r:id="rId74">
+      <w:hyperlink r:id="rId92">
         <w:r>
           <w:rPr>
             <w:rStyle w:val="Hyperlink"/>
@@ -19618,7 +19792,7 @@
       <w:r>
         <w:t xml:space="preserve"> </w:t>
       </w:r>
-      <w:hyperlink r:id="rId75">
+      <w:hyperlink r:id="rId93">
         <w:r>
           <w:rPr>
             <w:rStyle w:val="Hyperlink"/>
@@ -19650,7 +19824,7 @@
       <w:r>
         <w:t xml:space="preserve"> </w:t>
       </w:r>
-      <w:hyperlink r:id="rId76">
+      <w:hyperlink r:id="rId94">
         <w:r>
           <w:rPr>
             <w:rStyle w:val="Hyperlink"/>
@@ -19682,7 +19856,7 @@
       <w:r>
         <w:t xml:space="preserve"> </w:t>
       </w:r>
-      <w:hyperlink r:id="rId77">
+      <w:hyperlink r:id="rId95">
         <w:r>
           <w:rPr>
             <w:rStyle w:val="Hyperlink"/>
@@ -19714,7 +19888,7 @@
       <w:r>
         <w:t xml:space="preserve"> </w:t>
       </w:r>
-      <w:hyperlink r:id="rId78">
+      <w:hyperlink r:id="rId96">
         <w:r>
           <w:rPr>
             <w:rStyle w:val="Hyperlink"/>
@@ -19746,7 +19920,7 @@
       <w:r>
         <w:t xml:space="preserve"> </w:t>
       </w:r>
-      <w:hyperlink r:id="rId79">
+      <w:hyperlink r:id="rId97">
         <w:r>
           <w:rPr>
             <w:rStyle w:val="Hyperlink"/>
@@ -19778,7 +19952,7 @@
       <w:r>
         <w:t xml:space="preserve"> </w:t>
       </w:r>
-      <w:hyperlink r:id="rId80">
+      <w:hyperlink r:id="rId98">
         <w:r>
           <w:rPr>
             <w:rStyle w:val="Hyperlink"/>
@@ -19810,7 +19984,7 @@
       <w:r>
         <w:t xml:space="preserve"> </w:t>
       </w:r>
-      <w:hyperlink r:id="rId81">
+      <w:hyperlink r:id="rId99">
         <w:r>
           <w:rPr>
             <w:rStyle w:val="Hyperlink"/>
@@ -19845,7 +20019,7 @@
       <w:r>
         <w:t xml:space="preserve"> </w:t>
       </w:r>
-      <w:hyperlink r:id="rId82">
+      <w:hyperlink r:id="rId100">
         <w:r>
           <w:rPr>
             <w:rStyle w:val="Hyperlink"/>
@@ -19883,7 +20057,7 @@
       <w:r>
         <w:t xml:space="preserve"> </w:t>
       </w:r>
-      <w:hyperlink r:id="rId83">
+      <w:hyperlink r:id="rId101">
         <w:r>
           <w:rPr>
             <w:rStyle w:val="Hyperlink"/>
@@ -19915,7 +20089,7 @@
       <w:r>
         <w:t xml:space="preserve"> </w:t>
       </w:r>
-      <w:hyperlink r:id="rId84">
+      <w:hyperlink r:id="rId102">
         <w:r>
           <w:rPr>
             <w:rStyle w:val="Hyperlink"/>
@@ -19947,7 +20121,7 @@
       <w:r>
         <w:t xml:space="preserve"> </w:t>
       </w:r>
-      <w:hyperlink r:id="rId85">
+      <w:hyperlink r:id="rId103">
         <w:r>
           <w:rPr>
             <w:rStyle w:val="Hyperlink"/>
@@ -19979,7 +20153,7 @@
       <w:r>
         <w:t xml:space="preserve"> </w:t>
       </w:r>
-      <w:hyperlink r:id="rId86">
+      <w:hyperlink r:id="rId104">
         <w:r>
           <w:rPr>
             <w:rStyle w:val="Hyperlink"/>
@@ -20011,7 +20185,7 @@
       <w:r>
         <w:t xml:space="preserve"> </w:t>
       </w:r>
-      <w:hyperlink r:id="rId87">
+      <w:hyperlink r:id="rId105">
         <w:r>
           <w:rPr>
             <w:rStyle w:val="Hyperlink"/>
@@ -20043,7 +20217,7 @@
       <w:r>
         <w:t xml:space="preserve"> </w:t>
       </w:r>
-      <w:hyperlink r:id="rId88">
+      <w:hyperlink r:id="rId106">
         <w:r>
           <w:rPr>
             <w:rStyle w:val="Hyperlink"/>
@@ -20075,7 +20249,7 @@
       <w:r>
         <w:t xml:space="preserve"> </w:t>
       </w:r>
-      <w:hyperlink r:id="rId89">
+      <w:hyperlink r:id="rId107">
         <w:r>
           <w:rPr>
             <w:rStyle w:val="Hyperlink"/>
@@ -20107,7 +20281,7 @@
       <w:r>
         <w:t xml:space="preserve"> </w:t>
       </w:r>
-      <w:hyperlink r:id="rId90">
+      <w:hyperlink r:id="rId108">
         <w:r>
           <w:rPr>
             <w:rStyle w:val="Hyperlink"/>
@@ -20139,7 +20313,7 @@
       <w:r>
         <w:t xml:space="preserve"> </w:t>
       </w:r>
-      <w:hyperlink r:id="rId91">
+      <w:hyperlink r:id="rId109">
         <w:r>
           <w:rPr>
             <w:rStyle w:val="Hyperlink"/>
@@ -20171,7 +20345,7 @@
       <w:r>
         <w:t xml:space="preserve"> </w:t>
       </w:r>
-      <w:hyperlink r:id="rId92">
+      <w:hyperlink r:id="rId110">
         <w:r>
           <w:rPr>
             <w:rStyle w:val="Hyperlink"/>
@@ -20203,7 +20377,7 @@
       <w:r>
         <w:t xml:space="preserve"> </w:t>
       </w:r>
-      <w:hyperlink r:id="rId93">
+      <w:hyperlink r:id="rId111">
         <w:r>
           <w:rPr>
             <w:rStyle w:val="Hyperlink"/>
@@ -20235,7 +20409,7 @@
       <w:r>
         <w:t xml:space="preserve"> </w:t>
       </w:r>
-      <w:hyperlink r:id="rId94">
+      <w:hyperlink r:id="rId112">
         <w:r>
           <w:rPr>
             <w:rStyle w:val="Hyperlink"/>
@@ -20267,7 +20441,7 @@
       <w:r>
         <w:t xml:space="preserve"> </w:t>
       </w:r>
-      <w:hyperlink r:id="rId95">
+      <w:hyperlink r:id="rId113">
         <w:r>
           <w:rPr>
             <w:rStyle w:val="Hyperlink"/>
@@ -20286,7 +20460,7 @@
       <w:r>
         <w:t xml:space="preserve"> </w:t>
       </w:r>
-      <w:hyperlink r:id="rId96">
+      <w:hyperlink r:id="rId114">
         <w:r>
           <w:rPr>
             <w:rStyle w:val="Hyperlink"/>
@@ -20324,7 +20498,7 @@
       <w:r>
         <w:t xml:space="preserve"> </w:t>
       </w:r>
-      <w:hyperlink r:id="rId97">
+      <w:hyperlink r:id="rId115">
         <w:r>
           <w:rPr>
             <w:rStyle w:val="Hyperlink"/>
@@ -20356,7 +20530,7 @@
       <w:r>
         <w:t xml:space="preserve"> </w:t>
       </w:r>
-      <w:hyperlink r:id="rId98">
+      <w:hyperlink r:id="rId116">
         <w:r>
           <w:rPr>
             <w:rStyle w:val="Hyperlink"/>
@@ -20388,7 +20562,7 @@
       <w:r>
         <w:t xml:space="preserve"> </w:t>
       </w:r>
-      <w:hyperlink r:id="rId99">
+      <w:hyperlink r:id="rId117">
         <w:r>
           <w:rPr>
             <w:rStyle w:val="Hyperlink"/>
@@ -20420,7 +20594,7 @@
       <w:r>
         <w:t xml:space="preserve"> </w:t>
       </w:r>
-      <w:hyperlink r:id="rId100">
+      <w:hyperlink r:id="rId118">
         <w:r>
           <w:rPr>
             <w:rStyle w:val="Hyperlink"/>
@@ -20452,7 +20626,7 @@
       <w:r>
         <w:t xml:space="preserve"> </w:t>
       </w:r>
-      <w:hyperlink r:id="rId101">
+      <w:hyperlink r:id="rId119">
         <w:r>
           <w:rPr>
             <w:rStyle w:val="Hyperlink"/>
@@ -20484,7 +20658,7 @@
       <w:r>
         <w:t xml:space="preserve"> </w:t>
       </w:r>
-      <w:hyperlink r:id="rId102">
+      <w:hyperlink r:id="rId120">
         <w:r>
           <w:rPr>
             <w:rStyle w:val="Hyperlink"/>
@@ -20516,7 +20690,7 @@
       <w:r>
         <w:t xml:space="preserve"> </w:t>
       </w:r>
-      <w:hyperlink r:id="rId103">
+      <w:hyperlink r:id="rId121">
         <w:r>
           <w:rPr>
             <w:rStyle w:val="Hyperlink"/>
@@ -20548,7 +20722,7 @@
       <w:r>
         <w:t xml:space="preserve"> </w:t>
       </w:r>
-      <w:hyperlink r:id="rId104">
+      <w:hyperlink r:id="rId122">
         <w:r>
           <w:rPr>
             <w:rStyle w:val="Hyperlink"/>
@@ -20580,7 +20754,7 @@
       <w:r>
         <w:t xml:space="preserve"> </w:t>
       </w:r>
-      <w:hyperlink r:id="rId105">
+      <w:hyperlink r:id="rId123">
         <w:r>
           <w:rPr>
             <w:rStyle w:val="Hyperlink"/>
@@ -20612,7 +20786,7 @@
       <w:r>
         <w:t xml:space="preserve"> </w:t>
       </w:r>
-      <w:hyperlink r:id="rId106">
+      <w:hyperlink r:id="rId124">
         <w:r>
           <w:rPr>
             <w:rStyle w:val="Hyperlink"/>
@@ -20644,7 +20818,7 @@
       <w:r>
         <w:t xml:space="preserve"> </w:t>
       </w:r>
-      <w:hyperlink r:id="rId107">
+      <w:hyperlink r:id="rId125">
         <w:r>
           <w:rPr>
             <w:rStyle w:val="Hyperlink"/>
@@ -20679,38 +20853,6 @@
         <w:pStyle w:val="BodyText"/>
       </w:pPr>
       <w:r>
-        <w:t xml:space="preserve">Wolfolds, S.E. and Siegel, J. (2019), "Misaccounting for endogeneity: the peril of relying on the Heckman two-step method without a valid instrument",</w:t>
-      </w:r>
-      <w:r>
-        <w:t xml:space="preserve"> </w:t>
-      </w:r>
-      <w:r>
-        <w:rPr>
-          <w:iCs/>
-          <w:i/>
-        </w:rPr>
-        <w:t xml:space="preserve">Strategic Management Journal</w:t>
-      </w:r>
-      <w:r>
-        <w:t xml:space="preserve">, Vol. 40 No. 3, pp.432-462,</w:t>
-      </w:r>
-      <w:r>
-        <w:t xml:space="preserve"> </w:t>
-      </w:r>
-      <w:hyperlink r:id="rId108">
-        <w:r>
-          <w:rPr>
-            <w:rStyle w:val="Hyperlink"/>
-          </w:rPr>
-          <w:t xml:space="preserve">https://doi.org/10.1002/smj.2995</w:t>
-        </w:r>
-      </w:hyperlink>
-    </w:p>
-    <w:p>
-      <w:pPr>
-        <w:pStyle w:val="BodyText"/>
-      </w:pPr>
-      <w:r>
         <w:t xml:space="preserve">Wooldridge, J.M. (2010),</w:t>
       </w:r>
       <w:r>
@@ -20750,7 +20892,7 @@
       <w:r>
         <w:t xml:space="preserve"> </w:t>
       </w:r>
-      <w:hyperlink r:id="rId109">
+      <w:hyperlink r:id="rId126">
         <w:r>
           <w:rPr>
             <w:rStyle w:val="Hyperlink"/>
@@ -20788,7 +20930,7 @@
       <w:r>
         <w:t xml:space="preserve"> </w:t>
       </w:r>
-      <w:hyperlink r:id="rId109">
+      <w:hyperlink r:id="rId126">
         <w:r>
           <w:rPr>
             <w:rStyle w:val="Hyperlink"/>
@@ -20826,7 +20968,7 @@
       <w:r>
         <w:t xml:space="preserve"> </w:t>
       </w:r>
-      <w:hyperlink r:id="rId109">
+      <w:hyperlink r:id="rId126">
         <w:r>
           <w:rPr>
             <w:rStyle w:val="Hyperlink"/>
@@ -20846,6 +20988,71 @@
         <w:pStyle w:val="BodyText"/>
       </w:pPr>
       <w:r>
+        <w:t xml:space="preserve">World Bank (2025b),</w:t>
+      </w:r>
+      <w:r>
+        <w:t xml:space="preserve"> </w:t>
+      </w:r>
+      <w:r>
+        <w:rPr>
+          <w:iCs/>
+          <w:i/>
+        </w:rPr>
+        <w:t xml:space="preserve">Viet Nam Economic Update: Nurturing High-Tech Talents</w:t>
+      </w:r>
+      <w:r>
+        <w:t xml:space="preserve"> </w:t>
+      </w:r>
+      <w:r>
+        <w:t xml:space="preserve">(Taking Stock, September 2025), World Bank Group, Washington, DC.</w:t>
+      </w:r>
+    </w:p>
+    <w:p>
+      <w:pPr>
+        <w:pStyle w:val="BodyText"/>
+      </w:pPr>
+      <w:r>
+        <w:t xml:space="preserve">World Bank (2025c),</w:t>
+      </w:r>
+      <w:r>
+        <w:t xml:space="preserve"> </w:t>
+      </w:r>
+      <w:r>
+        <w:rPr>
+          <w:iCs/>
+          <w:i/>
+        </w:rPr>
+        <w:t xml:space="preserve">Viet Nam Economy Snapshot: Finance, Competitiveness and Innovation</w:t>
+      </w:r>
+      <w:r>
+        <w:t xml:space="preserve"> </w:t>
+      </w:r>
+      <w:r>
+        <w:t xml:space="preserve">(Prosperity Data360), World Bank Group, available at:</w:t>
+      </w:r>
+      <w:r>
+        <w:t xml:space="preserve"> </w:t>
+      </w:r>
+      <w:hyperlink r:id="rId127">
+        <w:r>
+          <w:rPr>
+            <w:rStyle w:val="Hyperlink"/>
+          </w:rPr>
+          <w:t xml:space="preserve">https://www.worldbank.org/ext/en/country/vietnam</w:t>
+        </w:r>
+      </w:hyperlink>
+      <w:r>
+        <w:t xml:space="preserve"> </w:t>
+      </w:r>
+      <w:r>
+        <w:t xml:space="preserve">(accessed 9 May 2026).</w:t>
+      </w:r>
+    </w:p>
+    <w:p>
+      <w:pPr>
+        <w:pStyle w:val="BodyText"/>
+      </w:pPr>
+      <w:r>
         <w:t xml:space="preserve">World Bank (2026),</w:t>
       </w:r>
       <w:r>
@@ -20867,7 +21074,7 @@
       <w:r>
         <w:t xml:space="preserve"> </w:t>
       </w:r>
-      <w:hyperlink r:id="rId110">
+      <w:hyperlink r:id="rId128">
         <w:r>
           <w:rPr>
             <w:rStyle w:val="Hyperlink"/>
@@ -20905,7 +21112,7 @@
       <w:r>
         <w:t xml:space="preserve"> </w:t>
       </w:r>
-      <w:hyperlink r:id="rId111">
+      <w:hyperlink r:id="rId129">
         <w:r>
           <w:rPr>
             <w:rStyle w:val="Hyperlink"/>
@@ -20937,7 +21144,7 @@
       <w:r>
         <w:t xml:space="preserve"> </w:t>
       </w:r>
-      <w:hyperlink r:id="rId112">
+      <w:hyperlink r:id="rId130">
         <w:r>
           <w:rPr>
             <w:rStyle w:val="Hyperlink"/>
@@ -20969,7 +21176,7 @@
       <w:r>
         <w:t xml:space="preserve"> </w:t>
       </w:r>
-      <w:hyperlink r:id="rId113">
+      <w:hyperlink r:id="rId131">
         <w:r>
           <w:rPr>
             <w:rStyle w:val="Hyperlink"/>
@@ -20978,8 +21185,8 @@
         </w:r>
       </w:hyperlink>
     </w:p>
-    <w:bookmarkEnd w:id="114"/>
-    <w:bookmarkEnd w:id="115"/>
+    <w:bookmarkEnd w:id="132"/>
+    <w:bookmarkEnd w:id="133"/>
     <w:sectPr/>
   </w:body>
 </w:document>

</xml_diff>

<commit_message>
fix(p3,p5): finalize chosen submission targets (JED, IJOEM); deprecate the rest
Target journals confirmed on the Vietnamese-standards branch: P3 -> Journal of
Economic Development (jed_package), P5 -> International Journal of Emerging
Markets (ijoem_package).

P3 jed_package:
- anchor the two prose-only data-source mentions with formal citations:
  World Development Indicators (World Bank, 2026) and ITU fixed-broadband
  (International Telecommunication Union, 2026). All other org-author refs were
  already cited (World Bank 2010/2016/2024 as a grouped citation, 2025b/c, PM
  Vietnam 2020). Now citation-clean; docx rebuilt.

P5 ijoem_package: verified clean (the flagged 'Kabst'/'Birkinshaw' are
last-authors of cited multi-author entries; no change needed).

Deprecate non-chosen packages (DEPRECATED.md, matching the P6/P7 pattern):
P3 jabs/mbr/thunderbird; P5 apbr/cms.
</commit_message>
<xml_diff>
--- a/p3/submission/jed_package/01_manuscript_blinded.docx
+++ b/p3/submission/jed_package/01_manuscript_blinded.docx
@@ -1900,7 +1900,7 @@
       <w:r>
         <w:drawing>
           <wp:inline>
-            <wp:extent cx="5334000" cy="2930266"/>
+            <wp:extent cx="5753100" cy="3160501"/>
             <wp:effectExtent b="0" l="0" r="0" t="0"/>
             <wp:docPr descr="Figure 1: Conceptual model, TCI, DAI, and export intensity as determinants of firm performance (Vietnam, 3-wave)" title="" id="31" name="Picture"/>
             <a:graphic>
@@ -1921,7 +1921,7 @@
                   <pic:spPr bwMode="auto">
                     <a:xfrm>
                       <a:off x="0" y="0"/>
-                      <a:ext cx="5334000" cy="2930266"/>
+                      <a:ext cx="5753100" cy="3160501"/>
                     </a:xfrm>
                     <a:prstGeom prst="rect">
                       <a:avLst/>
@@ -5026,7 +5026,7 @@
       <w:r>
         <w:drawing>
           <wp:inline>
-            <wp:extent cx="5334000" cy="3555999"/>
+            <wp:extent cx="5753100" cy="3835399"/>
             <wp:effectExtent b="0" l="0" r="0" t="0"/>
             <wp:docPr descr="Figure 2a: Wave 2009, predicted ln(labour productivity) vs FSTS" title="" id="44" name="Picture"/>
             <a:graphic>
@@ -5047,7 +5047,7 @@
                   <pic:spPr bwMode="auto">
                     <a:xfrm>
                       <a:off x="0" y="0"/>
-                      <a:ext cx="5334000" cy="3555999"/>
+                      <a:ext cx="5753100" cy="3835399"/>
                     </a:xfrm>
                     <a:prstGeom prst="rect">
                       <a:avLst/>
@@ -5091,7 +5091,7 @@
       <w:r>
         <w:drawing>
           <wp:inline>
-            <wp:extent cx="5334000" cy="3555999"/>
+            <wp:extent cx="5753100" cy="3835399"/>
             <wp:effectExtent b="0" l="0" r="0" t="0"/>
             <wp:docPr descr="Figure 2b: Wave 2015, predicted ln(labour productivity) vs FSTS" title="" id="47" name="Picture"/>
             <a:graphic>
@@ -5112,7 +5112,7 @@
                   <pic:spPr bwMode="auto">
                     <a:xfrm>
                       <a:off x="0" y="0"/>
-                      <a:ext cx="5334000" cy="3555999"/>
+                      <a:ext cx="5753100" cy="3835399"/>
                     </a:xfrm>
                     <a:prstGeom prst="rect">
                       <a:avLst/>
@@ -5156,7 +5156,7 @@
       <w:r>
         <w:drawing>
           <wp:inline>
-            <wp:extent cx="5334000" cy="3555999"/>
+            <wp:extent cx="5753100" cy="3835399"/>
             <wp:effectExtent b="0" l="0" r="0" t="0"/>
             <wp:docPr descr="Figure 2c: Wave 2023, predicted ln(labour productivity) vs FSTS" title="" id="50" name="Picture"/>
             <a:graphic>
@@ -5177,7 +5177,7 @@
                   <pic:spPr bwMode="auto">
                     <a:xfrm>
                       <a:off x="0" y="0"/>
-                      <a:ext cx="5334000" cy="3555999"/>
+                      <a:ext cx="5753100" cy="3835399"/>
                     </a:xfrm>
                     <a:prstGeom prst="rect">
                       <a:avLst/>
@@ -5221,7 +5221,7 @@
       <w:r>
         <w:drawing>
           <wp:inline>
-            <wp:extent cx="5334000" cy="3555999"/>
+            <wp:extent cx="5753100" cy="3835399"/>
             <wp:effectExtent b="0" l="0" r="0" t="0"/>
             <wp:docPr descr="Figure 2d: Pooled (2009+2015+2023), predicted ln(labour productivity) vs FSTS" title="" id="53" name="Picture"/>
             <a:graphic>
@@ -5242,7 +5242,7 @@
                   <pic:spPr bwMode="auto">
                     <a:xfrm>
                       <a:off x="0" y="0"/>
-                      <a:ext cx="5334000" cy="3555999"/>
+                      <a:ext cx="5753100" cy="3835399"/>
                     </a:xfrm>
                     <a:prstGeom prst="rect">
                       <a:avLst/>
@@ -5462,7 +5462,7 @@
       <w:r>
         <w:drawing>
           <wp:inline>
-            <wp:extent cx="5334000" cy="2226365"/>
+            <wp:extent cx="5753100" cy="2401293"/>
             <wp:effectExtent b="0" l="0" r="0" t="0"/>
             <wp:docPr descr="Figure 3: Moderator marginal effects, TCI and DAI interactions with FSTS (Vietnam)" title="" id="57" name="Picture"/>
             <a:graphic>
@@ -5483,7 +5483,7 @@
                   <pic:spPr bwMode="auto">
                     <a:xfrm>
                       <a:off x="0" y="0"/>
-                      <a:ext cx="5334000" cy="2226365"/>
+                      <a:ext cx="5753100" cy="2401293"/>
                     </a:xfrm>
                     <a:prstGeom prst="rect">
                       <a:avLst/>
@@ -18464,7 +18464,7 @@
         <w:pStyle w:val="BodyText"/>
       </w:pPr>
       <w:r>
-        <w:t xml:space="preserve">World Bank World Development Indicators (WDI) record Vietnam's</w:t>
+        <w:t xml:space="preserve">World Bank World Development Indicators (WDI; World Bank, 2026) record Vietnam's</w:t>
       </w:r>
     </w:p>
     <w:p>
@@ -18484,7 +18484,7 @@
         <w:t xml:space="preserve"> </w:t>
       </w:r>
       <w:r>
-        <w:t xml:space="preserve">3 in 2009 to 8 in 2015 and to over 20 by 2023.</w:t>
+        <w:t xml:space="preserve">3 in 2009 to 8 in 2015 and to over 20 by 2023 (International Telecommunication Union, 2026).</w:t>
       </w:r>
     </w:p>
     <w:p>
@@ -21187,7 +21187,10 @@
     </w:p>
     <w:bookmarkEnd w:id="132"/>
     <w:bookmarkEnd w:id="133"/>
-    <w:sectPr/>
+    <w:sectPr>
+      <w:pgSz w:h="16838" w:w="11906"/>
+      <w:pgMar w:bottom="1417" w:left="1417" w:right="1417" w:top="1417"/>
+    </w:sectPr>
   </w:body>
 </w:document>
 </file>
@@ -21435,29 +21438,59 @@
   <w:style w:default="1" w:styleId="Normal" w:type="paragraph">
     <w:name w:val="Normal"/>
     <w:qFormat/>
+    <w:pPr>
+      <w:spacing w:line="276" w:lineRule="auto"/>
+      <w:jc w:val="both"/>
+    </w:pPr>
+    <w:rPr>
+      <w:rFonts w:ascii="Times New Roman" w:eastAsia="Times New Roman" w:hAnsi="Times New Roman"/>
+      <w:color w:val="000000"/>
+      <w:sz w:val="24"/>
+    </w:rPr>
   </w:style>
   <w:style w:styleId="BodyText" w:type="paragraph">
     <w:name w:val="Body Text"/>
     <w:basedOn w:val="Normal"/>
     <w:link w:val="BodyTextChar"/>
     <w:pPr>
-      <w:spacing w:after="180" w:before="180"/>
+      <w:spacing w:after="180" w:before="180" w:line="276" w:lineRule="auto"/>
+      <w:jc w:val="both"/>
     </w:pPr>
     <w:qFormat/>
+    <w:rPr>
+      <w:rFonts w:ascii="Times New Roman" w:eastAsia="Times New Roman" w:hAnsi="Times New Roman"/>
+      <w:color w:val="000000"/>
+      <w:sz w:val="24"/>
+    </w:rPr>
   </w:style>
   <w:style w:customStyle="1" w:styleId="FirstParagraph" w:type="paragraph">
     <w:name w:val="First Paragraph"/>
     <w:basedOn w:val="BodyText"/>
     <w:next w:val="BodyText"/>
     <w:qFormat/>
+    <w:pPr>
+      <w:spacing w:line="276" w:lineRule="auto"/>
+      <w:jc w:val="both"/>
+    </w:pPr>
+    <w:rPr>
+      <w:rFonts w:ascii="Times New Roman" w:eastAsia="Times New Roman" w:hAnsi="Times New Roman"/>
+      <w:color w:val="000000"/>
+      <w:sz w:val="24"/>
+    </w:rPr>
   </w:style>
   <w:style w:customStyle="1" w:styleId="Compact" w:type="paragraph">
     <w:name w:val="Compact"/>
     <w:basedOn w:val="BodyText"/>
     <w:qFormat/>
     <w:pPr>
-      <w:spacing w:after="36" w:before="36"/>
+      <w:spacing w:after="36" w:before="36" w:line="276" w:lineRule="auto"/>
+      <w:jc w:val="both"/>
     </w:pPr>
+    <w:rPr>
+      <w:rFonts w:ascii="Times New Roman" w:eastAsia="Times New Roman" w:hAnsi="Times New Roman"/>
+      <w:color w:val="000000"/>
+      <w:sz w:val="24"/>
+    </w:rPr>
   </w:style>
   <w:style w:styleId="Title" w:type="paragraph">
     <w:name w:val="Title"/>
@@ -21467,15 +21500,15 @@
     <w:pPr>
       <w:keepNext/>
       <w:keepLines/>
-      <w:spacing w:after="240" w:before="480"/>
-      <w:jc w:val="center"/>
+      <w:spacing w:after="240" w:before="480" w:line="276" w:lineRule="auto"/>
+      <w:jc w:val="both"/>
     </w:pPr>
     <w:rPr>
-      <w:rFonts w:asciiTheme="majorHAnsi" w:cstheme="majorBidi" w:eastAsiaTheme="majorEastAsia" w:hAnsiTheme="majorHAnsi"/>
+      <w:rFonts w:ascii="Times New Roman" w:asciiTheme="majorHAnsi" w:cstheme="majorBidi" w:eastAsia="Times New Roman" w:eastAsiaTheme="majorEastAsia" w:hAnsi="Times New Roman" w:hAnsiTheme="majorHAnsi"/>
       <w:b/>
       <w:bCs/>
-      <w:color w:themeColor="accent1" w:themeShade="B5" w:val="345A8A"/>
-      <w:sz w:val="36"/>
+      <w:color w:val="000000"/>
+      <w:sz w:val="24"/>
       <w:szCs w:val="36"/>
     </w:rPr>
   </w:style>
@@ -21487,11 +21520,13 @@
     <w:pPr>
       <w:keepNext/>
       <w:keepLines/>
-      <w:spacing w:after="240" w:before="240"/>
-      <w:jc w:val="center"/>
+      <w:spacing w:after="240" w:before="240" w:line="276" w:lineRule="auto"/>
+      <w:jc w:val="both"/>
     </w:pPr>
     <w:rPr>
-      <w:sz w:val="30"/>
+      <w:rFonts w:ascii="Times New Roman" w:eastAsia="Times New Roman" w:hAnsi="Times New Roman"/>
+      <w:color w:val="000000"/>
+      <w:sz w:val="24"/>
       <w:szCs w:val="30"/>
     </w:rPr>
   </w:style>
@@ -21502,8 +21537,14 @@
     <w:pPr>
       <w:keepNext/>
       <w:keepLines/>
-      <w:jc w:val="center"/>
+      <w:spacing w:line="276" w:lineRule="auto"/>
+      <w:jc w:val="both"/>
     </w:pPr>
+    <w:rPr>
+      <w:rFonts w:ascii="Times New Roman" w:eastAsia="Times New Roman" w:hAnsi="Times New Roman"/>
+      <w:color w:val="000000"/>
+      <w:sz w:val="24"/>
+    </w:rPr>
   </w:style>
   <w:style w:styleId="Date" w:type="paragraph">
     <w:name w:val="Date"/>
@@ -21512,8 +21553,14 @@
     <w:pPr>
       <w:keepNext/>
       <w:keepLines/>
-      <w:jc w:val="center"/>
+      <w:spacing w:line="276" w:lineRule="auto"/>
+      <w:jc w:val="both"/>
     </w:pPr>
+    <w:rPr>
+      <w:rFonts w:ascii="Times New Roman" w:eastAsia="Times New Roman" w:hAnsi="Times New Roman"/>
+      <w:color w:val="000000"/>
+      <w:sz w:val="24"/>
+    </w:rPr>
   </w:style>
   <w:style w:customStyle="1" w:styleId="AbstractTitle" w:type="paragraph">
     <w:name w:val="Abstract Title"/>
@@ -21523,15 +21570,15 @@
     <w:pPr>
       <w:keepNext/>
       <w:keepLines/>
-      <w:jc w:val="center"/>
-      <w:spacing w:after="0" w:before="300"/>
+      <w:jc w:val="both"/>
+      <w:spacing w:after="0" w:before="300" w:line="276" w:lineRule="auto"/>
     </w:pPr>
     <w:rPr>
-      <w:sz w:val="20"/>
+      <w:color w:val="000000"/>
+      <w:sz w:val="24"/>
       <w:szCs w:val="20"/>
+      <w:rFonts w:ascii="Times New Roman" w:eastAsia="Times New Roman" w:hAnsi="Times New Roman"/>
       <w:b/>
-      <w:color w:val="345A8A"/>
-      &gt;
     </w:rPr>
   </w:style>
   <w:style w:customStyle="1" w:styleId="Abstract" w:type="paragraph">
@@ -21542,10 +21589,13 @@
     <w:pPr>
       <w:keepNext/>
       <w:keepLines/>
-      <w:spacing w:after="300" w:before="100"/>
+      <w:spacing w:after="300" w:before="100" w:line="276" w:lineRule="auto"/>
+      <w:jc w:val="both"/>
     </w:pPr>
     <w:rPr>
-      <w:sz w:val="20"/>
+      <w:rFonts w:ascii="Times New Roman" w:eastAsia="Times New Roman" w:hAnsi="Times New Roman"/>
+      <w:color w:val="000000"/>
+      <w:sz w:val="24"/>
       <w:szCs w:val="20"/>
     </w:rPr>
   </w:style>
@@ -21554,8 +21604,15 @@
     <w:basedOn w:val="Normal"/>
     <w:next w:val="Bibliography"/>
     <w:qFormat/>
-    <w:pPr/>
-    <w:rPr/>
+    <w:pPr>
+      <w:spacing w:line="276" w:lineRule="auto"/>
+      <w:jc w:val="both"/>
+    </w:pPr>
+    <w:rPr>
+      <w:rFonts w:ascii="Times New Roman" w:eastAsia="Times New Roman" w:hAnsi="Times New Roman"/>
+      <w:color w:val="000000"/>
+      <w:sz w:val="24"/>
+    </w:rPr>
   </w:style>
   <w:style w:styleId="Heading1" w:type="paragraph">
     <w:name w:val="Heading 1"/>
@@ -21566,15 +21623,16 @@
     <w:pPr>
       <w:keepNext/>
       <w:keepLines/>
-      <w:spacing w:after="0" w:before="480"/>
+      <w:spacing w:after="0" w:before="480" w:line="276" w:lineRule="auto"/>
+      <w:jc w:val="both"/>
       <w:outlineLvl w:val="0"/>
     </w:pPr>
     <w:rPr>
-      <w:rFonts w:asciiTheme="majorHAnsi" w:cstheme="majorBidi" w:eastAsiaTheme="majorEastAsia" w:hAnsiTheme="majorHAnsi"/>
+      <w:rFonts w:ascii="Times New Roman" w:asciiTheme="majorHAnsi" w:cstheme="majorBidi" w:eastAsia="Times New Roman" w:eastAsiaTheme="majorEastAsia" w:hAnsi="Times New Roman" w:hAnsiTheme="majorHAnsi"/>
       <w:b/>
       <w:bCs/>
-      <w:color w:themeColor="accent1" w:val="4F81BD"/>
-      <w:sz w:val="32"/>
+      <w:color w:val="000000"/>
+      <w:sz w:val="24"/>
       <w:szCs w:val="32"/>
     </w:rPr>
   </w:style>
@@ -21588,15 +21646,16 @@
     <w:pPr>
       <w:keepNext/>
       <w:keepLines/>
-      <w:spacing w:after="0" w:before="200"/>
+      <w:spacing w:after="0" w:before="200" w:line="276" w:lineRule="auto"/>
+      <w:jc w:val="both"/>
       <w:outlineLvl w:val="1"/>
     </w:pPr>
     <w:rPr>
-      <w:rFonts w:asciiTheme="majorHAnsi" w:cstheme="majorBidi" w:eastAsiaTheme="majorEastAsia" w:hAnsiTheme="majorHAnsi"/>
+      <w:rFonts w:ascii="Times New Roman" w:asciiTheme="majorHAnsi" w:cstheme="majorBidi" w:eastAsia="Times New Roman" w:eastAsiaTheme="majorEastAsia" w:hAnsi="Times New Roman" w:hAnsiTheme="majorHAnsi"/>
       <w:b/>
       <w:bCs/>
-      <w:color w:themeColor="accent1" w:val="4F81BD"/>
-      <w:sz w:val="28"/>
+      <w:color w:val="000000"/>
+      <w:sz w:val="24"/>
       <w:szCs w:val="28"/>
     </w:rPr>
   </w:style>
@@ -21610,14 +21669,15 @@
     <w:pPr>
       <w:keepNext/>
       <w:keepLines/>
-      <w:spacing w:after="0" w:before="200"/>
+      <w:spacing w:after="0" w:before="200" w:line="276" w:lineRule="auto"/>
+      <w:jc w:val="both"/>
       <w:outlineLvl w:val="2"/>
     </w:pPr>
     <w:rPr>
-      <w:rFonts w:asciiTheme="majorHAnsi" w:cstheme="majorBidi" w:eastAsiaTheme="majorEastAsia" w:hAnsiTheme="majorHAnsi"/>
+      <w:rFonts w:ascii="Times New Roman" w:asciiTheme="majorHAnsi" w:cstheme="majorBidi" w:eastAsia="Times New Roman" w:eastAsiaTheme="majorEastAsia" w:hAnsi="Times New Roman" w:hAnsiTheme="majorHAnsi"/>
       <w:b/>
       <w:bCs/>
-      <w:color w:themeColor="accent1" w:val="4F81BD"/>
+      <w:color w:val="000000"/>
       <w:sz w:val="24"/>
       <w:szCs w:val="24"/>
     </w:rPr>
@@ -21632,14 +21692,15 @@
     <w:pPr>
       <w:keepNext/>
       <w:keepLines/>
-      <w:spacing w:after="0" w:before="200"/>
+      <w:spacing w:after="0" w:before="200" w:line="276" w:lineRule="auto"/>
+      <w:jc w:val="both"/>
       <w:outlineLvl w:val="3"/>
     </w:pPr>
     <w:rPr>
-      <w:rFonts w:asciiTheme="majorHAnsi" w:cstheme="majorBidi" w:eastAsiaTheme="majorEastAsia" w:hAnsiTheme="majorHAnsi"/>
+      <w:rFonts w:ascii="Times New Roman" w:asciiTheme="majorHAnsi" w:cstheme="majorBidi" w:eastAsia="Times New Roman" w:eastAsiaTheme="majorEastAsia" w:hAnsi="Times New Roman" w:hAnsiTheme="majorHAnsi"/>
       <w:i/>
       <w:bCs/>
-      <w:color w:themeColor="accent1" w:val="4F81BD"/>
+      <w:color w:val="000000"/>
       <w:sz w:val="24"/>
       <w:szCs w:val="24"/>
     </w:rPr>
@@ -21654,13 +21715,14 @@
     <w:pPr>
       <w:keepNext/>
       <w:keepLines/>
-      <w:spacing w:after="0" w:before="200"/>
+      <w:spacing w:after="0" w:before="200" w:line="276" w:lineRule="auto"/>
+      <w:jc w:val="both"/>
       <w:outlineLvl w:val="4"/>
     </w:pPr>
     <w:rPr>
-      <w:rFonts w:asciiTheme="majorHAnsi" w:cstheme="majorBidi" w:eastAsiaTheme="majorEastAsia" w:hAnsiTheme="majorHAnsi"/>
+      <w:rFonts w:ascii="Times New Roman" w:asciiTheme="majorHAnsi" w:cstheme="majorBidi" w:eastAsia="Times New Roman" w:eastAsiaTheme="majorEastAsia" w:hAnsi="Times New Roman" w:hAnsiTheme="majorHAnsi"/>
       <w:iCs/>
-      <w:color w:themeColor="accent1" w:val="4F81BD"/>
+      <w:color w:val="000000"/>
       <w:sz w:val="24"/>
       <w:szCs w:val="24"/>
     </w:rPr>
@@ -21675,12 +21737,13 @@
     <w:pPr>
       <w:keepNext/>
       <w:keepLines/>
-      <w:spacing w:after="0" w:before="200"/>
+      <w:spacing w:after="0" w:before="200" w:line="276" w:lineRule="auto"/>
+      <w:jc w:val="both"/>
       <w:outlineLvl w:val="5"/>
     </w:pPr>
     <w:rPr>
-      <w:rFonts w:asciiTheme="majorHAnsi" w:cstheme="majorBidi" w:eastAsiaTheme="majorEastAsia" w:hAnsiTheme="majorHAnsi"/>
-      <w:color w:themeColor="accent1" w:val="4F81BD"/>
+      <w:rFonts w:ascii="Times New Roman" w:asciiTheme="majorHAnsi" w:cstheme="majorBidi" w:eastAsia="Times New Roman" w:eastAsiaTheme="majorEastAsia" w:hAnsi="Times New Roman" w:hAnsiTheme="majorHAnsi"/>
+      <w:color w:val="000000"/>
       <w:sz w:val="24"/>
       <w:szCs w:val="24"/>
     </w:rPr>
@@ -21695,12 +21758,13 @@
     <w:pPr>
       <w:keepNext/>
       <w:keepLines/>
-      <w:spacing w:after="0" w:before="200"/>
+      <w:spacing w:after="0" w:before="200" w:line="276" w:lineRule="auto"/>
+      <w:jc w:val="both"/>
       <w:outlineLvl w:val="6"/>
     </w:pPr>
     <w:rPr>
-      <w:rFonts w:asciiTheme="majorHAnsi" w:cstheme="majorBidi" w:eastAsiaTheme="majorEastAsia" w:hAnsiTheme="majorHAnsi"/>
-      <w:color w:themeColor="accent1" w:val="4F81BD"/>
+      <w:rFonts w:ascii="Times New Roman" w:asciiTheme="majorHAnsi" w:cstheme="majorBidi" w:eastAsia="Times New Roman" w:eastAsiaTheme="majorEastAsia" w:hAnsi="Times New Roman" w:hAnsiTheme="majorHAnsi"/>
+      <w:color w:val="000000"/>
       <w:sz w:val="24"/>
       <w:szCs w:val="24"/>
     </w:rPr>
@@ -21715,12 +21779,13 @@
     <w:pPr>
       <w:keepNext/>
       <w:keepLines/>
-      <w:spacing w:after="0" w:before="200"/>
+      <w:spacing w:after="0" w:before="200" w:line="276" w:lineRule="auto"/>
+      <w:jc w:val="both"/>
       <w:outlineLvl w:val="7"/>
     </w:pPr>
     <w:rPr>
-      <w:rFonts w:asciiTheme="majorHAnsi" w:cstheme="majorBidi" w:eastAsiaTheme="majorEastAsia" w:hAnsiTheme="majorHAnsi"/>
-      <w:color w:themeColor="accent1" w:val="4F81BD"/>
+      <w:rFonts w:ascii="Times New Roman" w:asciiTheme="majorHAnsi" w:cstheme="majorBidi" w:eastAsia="Times New Roman" w:eastAsiaTheme="majorEastAsia" w:hAnsi="Times New Roman" w:hAnsiTheme="majorHAnsi"/>
+      <w:color w:val="000000"/>
       <w:sz w:val="24"/>
       <w:szCs w:val="24"/>
     </w:rPr>
@@ -21735,12 +21800,13 @@
     <w:pPr>
       <w:keepNext/>
       <w:keepLines/>
-      <w:spacing w:after="0" w:before="200"/>
+      <w:spacing w:after="0" w:before="200" w:line="276" w:lineRule="auto"/>
+      <w:jc w:val="both"/>
       <w:outlineLvl w:val="8"/>
     </w:pPr>
     <w:rPr>
-      <w:rFonts w:asciiTheme="majorHAnsi" w:cstheme="majorBidi" w:eastAsiaTheme="majorEastAsia" w:hAnsiTheme="majorHAnsi"/>
-      <w:color w:themeColor="accent1" w:val="4F81BD"/>
+      <w:rFonts w:ascii="Times New Roman" w:asciiTheme="majorHAnsi" w:cstheme="majorBidi" w:eastAsia="Times New Roman" w:eastAsiaTheme="majorEastAsia" w:hAnsi="Times New Roman" w:hAnsiTheme="majorHAnsi"/>
+      <w:color w:val="000000"/>
       <w:sz w:val="24"/>
       <w:szCs w:val="24"/>
     </w:rPr>
@@ -21753,9 +21819,15 @@
     <w:unhideWhenUsed/>
     <w:qFormat/>
     <w:pPr>
-      <w:spacing w:after="100" w:before="100"/>
+      <w:spacing w:after="100" w:before="100" w:line="276" w:lineRule="auto"/>
       <w:ind w:firstLine="0" w:left="480" w:right="480"/>
+      <w:jc w:val="both"/>
     </w:pPr>
+    <w:rPr>
+      <w:rFonts w:ascii="Times New Roman" w:eastAsia="Times New Roman" w:hAnsi="Times New Roman"/>
+      <w:color w:val="000000"/>
+      <w:sz w:val="24"/>
+    </w:rPr>
   </w:style>
   <w:style w:styleId="FootnoteText" w:type="paragraph">
     <w:name w:val="Footnote Text"/>
@@ -21764,11 +21836,25 @@
     <w:uiPriority w:val="9"/>
     <w:unhideWhenUsed/>
     <w:qFormat/>
+    <w:pPr>
+      <w:spacing w:line="276" w:lineRule="auto"/>
+      <w:jc w:val="both"/>
+    </w:pPr>
+    <w:rPr>
+      <w:rFonts w:ascii="Times New Roman" w:eastAsia="Times New Roman" w:hAnsi="Times New Roman"/>
+      <w:color w:val="000000"/>
+      <w:sz w:val="24"/>
+    </w:rPr>
   </w:style>
   <w:style w:default="1" w:styleId="DefaultParagraphFont" w:type="character">
     <w:name w:val="Default Paragraph Font"/>
     <w:semiHidden/>
     <w:unhideWhenUsed/>
+    <w:rPr>
+      <w:rFonts w:ascii="Times New Roman" w:eastAsia="Times New Roman" w:hAnsi="Times New Roman"/>
+      <w:color w:val="000000"/>
+      <w:sz w:val="24"/>
+    </w:rPr>
   </w:style>
   <w:style w:default="1" w:styleId="Table" w:type="table">
     <w:name w:val="Table"/>
@@ -21776,6 +21862,15 @@
     <w:semiHidden/>
     <w:unhideWhenUsed/>
     <w:qFormat/>
+    <w:pPr>
+      <w:spacing w:line="276" w:lineRule="auto"/>
+      <w:jc w:val="both"/>
+    </w:pPr>
+    <w:rPr>
+      <w:rFonts w:ascii="Times New Roman" w:eastAsia="Times New Roman" w:hAnsi="Times New Roman"/>
+      <w:color w:val="000000"/>
+      <w:sz w:val="24"/>
+    </w:rPr>
     <w:tblPr>
       <w:tblInd w:type="dxa" w:w="0"/>
       <w:tblCellMar>
@@ -21808,25 +21903,42 @@
     <w:pPr>
       <w:keepNext/>
       <w:keepLines/>
-      <w:spacing w:after="0"/>
+      <w:spacing w:after="0" w:line="276" w:lineRule="auto"/>
+      <w:jc w:val="both"/>
     </w:pPr>
     <w:rPr>
+      <w:rFonts w:ascii="Times New Roman" w:eastAsia="Times New Roman" w:hAnsi="Times New Roman"/>
       <w:b/>
+      <w:color w:val="000000"/>
+      <w:sz w:val="24"/>
     </w:rPr>
   </w:style>
   <w:style w:customStyle="1" w:styleId="Definition" w:type="paragraph">
     <w:name w:val="Definition"/>
     <w:basedOn w:val="Normal"/>
+    <w:pPr>
+      <w:spacing w:line="276" w:lineRule="auto"/>
+      <w:jc w:val="both"/>
+    </w:pPr>
+    <w:rPr>
+      <w:rFonts w:ascii="Times New Roman" w:eastAsia="Times New Roman" w:hAnsi="Times New Roman"/>
+      <w:color w:val="000000"/>
+      <w:sz w:val="24"/>
+    </w:rPr>
   </w:style>
   <w:style w:styleId="Caption" w:type="paragraph">
     <w:name w:val="Caption"/>
     <w:basedOn w:val="Normal"/>
     <w:link w:val="BodyTextChar"/>
     <w:pPr>
-      <w:spacing w:after="120" w:before="0"/>
+      <w:spacing w:after="120" w:before="0" w:line="276" w:lineRule="auto"/>
+      <w:jc w:val="both"/>
     </w:pPr>
     <w:rPr>
+      <w:rFonts w:ascii="Times New Roman" w:eastAsia="Times New Roman" w:hAnsi="Times New Roman"/>
       <w:i/>
+      <w:color w:val="000000"/>
+      <w:sz w:val="24"/>
     </w:rPr>
   </w:style>
   <w:style w:customStyle="1" w:styleId="TableCaption" w:type="paragraph">
@@ -21834,44 +21946,90 @@
     <w:basedOn w:val="Caption"/>
     <w:pPr>
       <w:keepNext/>
+      <w:spacing w:line="276" w:lineRule="auto"/>
+      <w:jc w:val="both"/>
     </w:pPr>
+    <w:rPr>
+      <w:rFonts w:ascii="Times New Roman" w:eastAsia="Times New Roman" w:hAnsi="Times New Roman"/>
+      <w:color w:val="000000"/>
+      <w:sz w:val="24"/>
+    </w:rPr>
   </w:style>
   <w:style w:customStyle="1" w:styleId="ImageCaption" w:type="paragraph">
     <w:name w:val="Image Caption"/>
     <w:basedOn w:val="Caption"/>
+    <w:pPr>
+      <w:spacing w:line="276" w:lineRule="auto"/>
+      <w:jc w:val="both"/>
+    </w:pPr>
+    <w:rPr>
+      <w:rFonts w:ascii="Times New Roman" w:eastAsia="Times New Roman" w:hAnsi="Times New Roman"/>
+      <w:color w:val="000000"/>
+      <w:sz w:val="24"/>
+    </w:rPr>
   </w:style>
   <w:style w:customStyle="1" w:styleId="Figure" w:type="paragraph">
     <w:name w:val="Figure"/>
     <w:basedOn w:val="Normal"/>
+    <w:pPr>
+      <w:spacing w:line="276" w:lineRule="auto"/>
+      <w:jc w:val="both"/>
+    </w:pPr>
+    <w:rPr>
+      <w:rFonts w:ascii="Times New Roman" w:eastAsia="Times New Roman" w:hAnsi="Times New Roman"/>
+      <w:color w:val="000000"/>
+      <w:sz w:val="24"/>
+    </w:rPr>
   </w:style>
   <w:style w:customStyle="1" w:styleId="CaptionedFigure" w:type="paragraph">
     <w:name w:val="Captioned Figure"/>
     <w:basedOn w:val="Figure"/>
     <w:pPr>
       <w:keepNext/>
+      <w:spacing w:line="276" w:lineRule="auto"/>
+      <w:jc w:val="both"/>
     </w:pPr>
+    <w:rPr>
+      <w:rFonts w:ascii="Times New Roman" w:eastAsia="Times New Roman" w:hAnsi="Times New Roman"/>
+      <w:color w:val="000000"/>
+      <w:sz w:val="24"/>
+    </w:rPr>
   </w:style>
   <w:style w:customStyle="1" w:styleId="BodyTextChar" w:type="character">
     <w:name w:val="Body Text Char"/>
     <w:basedOn w:val="DefaultParagraphFont"/>
     <w:link w:val="BodyText"/>
+    <w:rPr>
+      <w:rFonts w:ascii="Times New Roman" w:eastAsia="Times New Roman" w:hAnsi="Times New Roman"/>
+      <w:color w:val="000000"/>
+      <w:sz w:val="24"/>
+    </w:rPr>
   </w:style>
   <w:style w:customStyle="1" w:styleId="VerbatimChar" w:type="character">
     <w:name w:val="Verbatim Char"/>
     <w:basedOn w:val="BodyTextChar"/>
     <w:rPr>
-      <w:rFonts w:ascii="Consolas" w:hAnsi="Consolas"/>
-      <w:sz w:val="22"/>
+      <w:rFonts w:ascii="Times New Roman" w:eastAsia="Times New Roman" w:hAnsi="Times New Roman"/>
+      <w:color w:val="000000"/>
+      <w:sz w:val="24"/>
     </w:rPr>
   </w:style>
   <w:style w:customStyle="1" w:styleId="SectionNumber" w:type="character">
     <w:name w:val="Section Number"/>
     <w:basedOn w:val="BodyTextChar"/>
+    <w:rPr>
+      <w:rFonts w:ascii="Times New Roman" w:eastAsia="Times New Roman" w:hAnsi="Times New Roman"/>
+      <w:color w:val="000000"/>
+      <w:sz w:val="24"/>
+    </w:rPr>
   </w:style>
   <w:style w:styleId="FootnoteReference" w:type="character">
     <w:name w:val="Footnote Reference"/>
     <w:basedOn w:val="BodyTextChar"/>
     <w:rPr>
+      <w:rFonts w:ascii="Times New Roman" w:eastAsia="Times New Roman" w:hAnsi="Times New Roman"/>
+      <w:color w:val="000000"/>
+      <w:sz w:val="24"/>
       <w:vertAlign w:val="superscript"/>
     </w:rPr>
   </w:style>
@@ -21879,7 +22037,9 @@
     <w:name w:val="Hyperlink"/>
     <w:basedOn w:val="BodyTextChar"/>
     <w:rPr>
-      <w:color w:themeColor="accent1" w:val="4F81BD"/>
+      <w:rFonts w:ascii="Times New Roman" w:eastAsia="Times New Roman" w:hAnsi="Times New Roman"/>
+      <w:color w:val="000000"/>
+      <w:sz w:val="24"/>
     </w:rPr>
   </w:style>
   <w:style w:styleId="TOCHeading" w:type="paragraph">
@@ -21890,14 +22050,16 @@
     <w:unhideWhenUsed/>
     <w:qFormat/>
     <w:pPr>
-      <w:spacing w:before="240" w:line="259" w:lineRule="auto"/>
+      <w:spacing w:before="240" w:line="276" w:lineRule="auto"/>
+      <w:jc w:val="both"/>
       <w:outlineLvl w:val="9"/>
     </w:pPr>
     <w:rPr>
-      <w:rFonts w:asciiTheme="majorHAnsi" w:cstheme="majorBidi" w:eastAsiaTheme="majorEastAsia" w:hAnsiTheme="majorHAnsi"/>
+      <w:rFonts w:ascii="Times New Roman" w:asciiTheme="majorHAnsi" w:cstheme="majorBidi" w:eastAsia="Times New Roman" w:eastAsiaTheme="majorEastAsia" w:hAnsi="Times New Roman" w:hAnsiTheme="majorHAnsi"/>
       <w:b w:val="0"/>
       <w:bCs w:val="0"/>
-      <w:color w:themeColor="accent1" w:themeShade="BF" w:val="365F91"/>
+      <w:color w:val="000000"/>
+      <w:sz w:val="24"/>
     </w:rPr>
   </w:style>
   <w:style w:type="paragraph" w:customStyle="1" w:styleId="SourceCode">

</xml_diff>